<commit_message>
fix: se cambio de nombre al archivo
</commit_message>
<xml_diff>
--- a/public/plantillas/ACTA.docx
+++ b/public/plantillas/ACTA.docx
@@ -3609,6 +3609,13 @@
                 <w:sz w:val="10"/>
               </w:rPr>
             </w:pPr>
+            <w:r>
+              <w:rPr>
+                <w:rFonts w:ascii="Times New Roman"/>
+                <w:sz w:val="10"/>
+              </w:rPr>
+              <w:t xml:space="preserve"> </w:t>
+            </w:r>
           </w:p>
         </w:tc>
       </w:tr>
@@ -43520,7 +43527,7 @@
               </wp:anchor>
             </w:drawing>
           </mc:Choice>
-          <mc:Fallback xmlns:ve="http://schemas.openxmlformats.org/markup-compatibility/2006" xmlns:a="http://schemas.openxmlformats.org/drawingml/2006/main" xmlns:pic="http://schemas.openxmlformats.org/drawingml/2006/picture">
+          <mc:Fallback xmlns:pic="http://schemas.openxmlformats.org/drawingml/2006/picture" xmlns:a="http://schemas.openxmlformats.org/drawingml/2006/main" xmlns:ve="http://schemas.openxmlformats.org/markup-compatibility/2006">
             <w:pict>
               <v:rect style="position:absolute;margin-left:181.440002pt;margin-top:22.594032pt;width:99.239997pt;height:.839996pt;mso-position-horizontal-relative:page;mso-position-vertical-relative:paragraph;z-index:-15727104;mso-wrap-distance-left:0;mso-wrap-distance-right:0" id="docshape4" filled="true" fillcolor="#000000" stroked="false">
                 <v:fill type="solid"/>
@@ -43607,7 +43614,7 @@
               </wp:anchor>
             </w:drawing>
           </mc:Choice>
-          <mc:Fallback xmlns:ve="http://schemas.openxmlformats.org/markup-compatibility/2006" xmlns:a="http://schemas.openxmlformats.org/drawingml/2006/main" xmlns:pic="http://schemas.openxmlformats.org/drawingml/2006/picture">
+          <mc:Fallback xmlns:pic="http://schemas.openxmlformats.org/drawingml/2006/picture" xmlns:a="http://schemas.openxmlformats.org/drawingml/2006/main" xmlns:ve="http://schemas.openxmlformats.org/markup-compatibility/2006">
             <w:pict>
               <v:rect style="position:absolute;margin-left:440.039978pt;margin-top:22.594032pt;width:121.920047pt;height:.839996pt;mso-position-horizontal-relative:page;mso-position-vertical-relative:paragraph;z-index:-15726592;mso-wrap-distance-left:0;mso-wrap-distance-right:0" id="docshape5" filled="true" fillcolor="#000000" stroked="false">
                 <v:fill type="solid"/>

</xml_diff>

<commit_message>
fix: se agrego el turno a la plantilla de acta
</commit_message>
<xml_diff>
--- a/public/plantillas/ACTA.docx
+++ b/public/plantillas/ACTA.docx
@@ -290,7 +290,6 @@
         </w:rPr>
         <w:t>${</w:t>
       </w:r>
-      <w:proofErr w:type="spellStart"/>
       <w:r>
         <w:rPr>
           <w:rFonts w:ascii="Arial" w:hAnsi="Arial"/>
@@ -298,7 +297,6 @@
         </w:rPr>
         <w:t>anio</w:t>
       </w:r>
-      <w:proofErr w:type="spellEnd"/>
       <w:r>
         <w:rPr>
           <w:rFonts w:ascii="Arial" w:hAnsi="Arial"/>
@@ -477,14 +475,12 @@
               </w:rPr>
               <w:t>${</w:t>
             </w:r>
-            <w:proofErr w:type="spellStart"/>
             <w:r>
               <w:rPr>
                 <w:sz w:val="11"/>
               </w:rPr>
               <w:t>cetpro</w:t>
             </w:r>
-            <w:proofErr w:type="spellEnd"/>
             <w:r>
               <w:rPr>
                 <w:sz w:val="11"/>
@@ -1510,14 +1506,12 @@
               </w:rPr>
               <w:t xml:space="preserve"> </w:t>
             </w:r>
-            <w:proofErr w:type="spellStart"/>
             <w:r>
               <w:rPr>
                 <w:sz w:val="11"/>
               </w:rPr>
               <w:t>Nº</w:t>
             </w:r>
-            <w:proofErr w:type="spellEnd"/>
             <w:r>
               <w:rPr>
                 <w:spacing w:val="2"/>
@@ -1549,19 +1543,11 @@
                 <w:sz w:val="11"/>
               </w:rPr>
             </w:pPr>
-            <w:proofErr w:type="spellStart"/>
             <w:r>
               <w:rPr>
                 <w:sz w:val="11"/>
               </w:rPr>
-              <w:t>Nº</w:t>
-            </w:r>
-            <w:proofErr w:type="spellEnd"/>
-            <w:r>
-              <w:rPr>
-                <w:sz w:val="11"/>
-              </w:rPr>
-              <w:t xml:space="preserve"> </w:t>
+              <w:t xml:space="preserve">Nº </w:t>
             </w:r>
             <w:r>
               <w:rPr>
@@ -1661,19 +1647,11 @@
               </w:rPr>
               <w:t xml:space="preserve"> </w:t>
             </w:r>
-            <w:proofErr w:type="spellStart"/>
-            <w:r>
-              <w:rPr>
-                <w:sz w:val="10"/>
-              </w:rPr>
-              <w:t>N°</w:t>
-            </w:r>
-            <w:proofErr w:type="spellEnd"/>
-            <w:r>
-              <w:rPr>
-                <w:sz w:val="10"/>
-              </w:rPr>
-              <w:t xml:space="preserve"> 06335</w:t>
+            <w:r>
+              <w:rPr>
+                <w:sz w:val="10"/>
+              </w:rPr>
+              <w:t>N° 06335</w:t>
             </w:r>
             <w:r>
               <w:rPr>
@@ -4506,7 +4484,7 @@
                 <w:spacing w:val="-2"/>
                 <w:sz w:val="11"/>
               </w:rPr>
-              <w:t>TARDE</w:t>
+              <w:t>${turno}</w:t>
             </w:r>
           </w:p>
         </w:tc>
@@ -4546,7 +4524,6 @@
                 <w:sz w:val="9"/>
               </w:rPr>
             </w:pPr>
-            <w:proofErr w:type="spellStart"/>
             <w:r>
               <w:rPr>
                 <w:rFonts w:ascii="Arial" w:hAnsi="Arial"/>
@@ -4556,7 +4533,6 @@
               </w:rPr>
               <w:t>N.°</w:t>
             </w:r>
-            <w:proofErr w:type="spellEnd"/>
           </w:p>
         </w:tc>
         <w:tc>
@@ -4873,14 +4849,12 @@
                 <w:sz w:val="9"/>
               </w:rPr>
             </w:pPr>
-            <w:proofErr w:type="gramStart"/>
             <w:r>
               <w:rPr>
                 <w:sz w:val="9"/>
               </w:rPr>
               <w:t>TOTAL</w:t>
             </w:r>
-            <w:proofErr w:type="gramEnd"/>
             <w:r>
               <w:rPr>
                 <w:spacing w:val="-1"/>
@@ -19982,7 +19956,6 @@
                 <w:sz w:val="10"/>
               </w:rPr>
             </w:pPr>
-            <w:proofErr w:type="spellStart"/>
             <w:r>
               <w:rPr>
                 <w:rFonts w:ascii="Arial" w:hAnsi="Arial"/>
@@ -19992,7 +19965,6 @@
               </w:rPr>
               <w:t>N.°</w:t>
             </w:r>
-            <w:proofErr w:type="spellEnd"/>
           </w:p>
         </w:tc>
         <w:tc>
@@ -39019,16 +38991,12 @@
               </w:rPr>
               <w:t xml:space="preserve"> </w:t>
             </w:r>
-            <w:proofErr w:type="spellStart"/>
-            <w:proofErr w:type="gramStart"/>
             <w:r>
               <w:rPr>
                 <w:sz w:val="10"/>
               </w:rPr>
               <w:t>incidentes.Realizar</w:t>
             </w:r>
-            <w:proofErr w:type="spellEnd"/>
-            <w:proofErr w:type="gramEnd"/>
             <w:r>
               <w:rPr>
                 <w:spacing w:val="-4"/>
@@ -39099,17 +39067,8 @@
                 <w:spacing w:val="-5"/>
                 <w:sz w:val="10"/>
               </w:rPr>
-              <w:t xml:space="preserve"> </w:t>
-            </w:r>
-            <w:proofErr w:type="spellStart"/>
-            <w:r>
-              <w:rPr>
-                <w:spacing w:val="-5"/>
-                <w:sz w:val="10"/>
-              </w:rPr>
-              <w:t>co</w:t>
-            </w:r>
-            <w:proofErr w:type="spellEnd"/>
+              <w:t xml:space="preserve"> co</w:t>
+            </w:r>
           </w:p>
         </w:tc>
       </w:tr>
@@ -40406,7 +40365,6 @@
               </w:rPr>
               <w:t xml:space="preserve"> </w:t>
             </w:r>
-            <w:proofErr w:type="spellStart"/>
             <w:r>
               <w:rPr>
                 <w:spacing w:val="-2"/>
@@ -40414,7 +40372,6 @@
               </w:rPr>
               <w:t>respet</w:t>
             </w:r>
-            <w:proofErr w:type="spellEnd"/>
           </w:p>
         </w:tc>
       </w:tr>
@@ -43527,7 +43484,7 @@
               </wp:anchor>
             </w:drawing>
           </mc:Choice>
-          <mc:Fallback xmlns:pic="http://schemas.openxmlformats.org/drawingml/2006/picture" xmlns:a="http://schemas.openxmlformats.org/drawingml/2006/main" xmlns:ve="http://schemas.openxmlformats.org/markup-compatibility/2006">
+          <mc:Fallback xmlns:ve="http://schemas.openxmlformats.org/markup-compatibility/2006" xmlns:a="http://schemas.openxmlformats.org/drawingml/2006/main" xmlns:pic="http://schemas.openxmlformats.org/drawingml/2006/picture">
             <w:pict>
               <v:rect style="position:absolute;margin-left:181.440002pt;margin-top:22.594032pt;width:99.239997pt;height:.839996pt;mso-position-horizontal-relative:page;mso-position-vertical-relative:paragraph;z-index:-15727104;mso-wrap-distance-left:0;mso-wrap-distance-right:0" id="docshape4" filled="true" fillcolor="#000000" stroked="false">
                 <v:fill type="solid"/>
@@ -43614,7 +43571,7 @@
               </wp:anchor>
             </w:drawing>
           </mc:Choice>
-          <mc:Fallback xmlns:pic="http://schemas.openxmlformats.org/drawingml/2006/picture" xmlns:a="http://schemas.openxmlformats.org/drawingml/2006/main" xmlns:ve="http://schemas.openxmlformats.org/markup-compatibility/2006">
+          <mc:Fallback xmlns:ve="http://schemas.openxmlformats.org/markup-compatibility/2006" xmlns:a="http://schemas.openxmlformats.org/drawingml/2006/main" xmlns:pic="http://schemas.openxmlformats.org/drawingml/2006/picture">
             <w:pict>
               <v:rect style="position:absolute;margin-left:440.039978pt;margin-top:22.594032pt;width:121.920047pt;height:.839996pt;mso-position-horizontal-relative:page;mso-position-vertical-relative:paragraph;z-index:-15726592;mso-wrap-distance-left:0;mso-wrap-distance-right:0" id="docshape5" filled="true" fillcolor="#000000" stroked="false">
                 <v:fill type="solid"/>

</xml_diff>

<commit_message>
fix: se corrio un poco el margen de la plantilla
</commit_message>
<xml_diff>
--- a/public/plantillas/ACTA.docx
+++ b/public/plantillas/ACTA.docx
@@ -2,16 +2,6 @@
 <file path=word/document.xml><?xml version="1.0" encoding="utf-8"?>
 <w:document xmlns:wpc="http://schemas.microsoft.com/office/word/2010/wordprocessingCanvas" xmlns:cx="http://schemas.microsoft.com/office/drawing/2014/chartex" xmlns:cx1="http://schemas.microsoft.com/office/drawing/2015/9/8/chartex" xmlns:cx2="http://schemas.microsoft.com/office/drawing/2015/10/21/chartex" xmlns:cx3="http://schemas.microsoft.com/office/drawing/2016/5/9/chartex" xmlns:cx4="http://schemas.microsoft.com/office/drawing/2016/5/10/chartex" xmlns:cx5="http://schemas.microsoft.com/office/drawing/2016/5/11/chartex" xmlns:cx6="http://schemas.microsoft.com/office/drawing/2016/5/12/chartex" xmlns:cx7="http://schemas.microsoft.com/office/drawing/2016/5/13/chartex" xmlns:cx8="http://schemas.microsoft.com/office/drawing/2016/5/14/chartex" xmlns:mc="http://schemas.openxmlformats.org/markup-compatibility/2006" xmlns:aink="http://schemas.microsoft.com/office/drawing/2016/ink" xmlns:am3d="http://schemas.microsoft.com/office/drawing/2017/model3d" xmlns:o="urn:schemas-microsoft-com:office:office" xmlns:oel="http://schemas.microsoft.com/office/2019/extlst" xmlns:r="http://schemas.openxmlformats.org/officeDocument/2006/relationships" xmlns:m="http://schemas.openxmlformats.org/officeDocument/2006/math" xmlns:v="urn:schemas-microsoft-com:vml" xmlns:wp14="http://schemas.microsoft.com/office/word/2010/wordprocessingDrawing" xmlns:wp="http://schemas.openxmlformats.org/drawingml/2006/wordprocessingDrawing" xmlns:w10="urn:schemas-microsoft-com:office:word" xmlns:w="http://schemas.openxmlformats.org/wordprocessingml/2006/main" xmlns:w14="http://schemas.microsoft.com/office/word/2010/wordml" xmlns:w15="http://schemas.microsoft.com/office/word/2012/wordml" xmlns:w16cex="http://schemas.microsoft.com/office/word/2018/wordml/cex" xmlns:w16cid="http://schemas.microsoft.com/office/word/2016/wordml/cid" xmlns:w16="http://schemas.microsoft.com/office/word/2018/wordml" xmlns:w16sdtdh="http://schemas.microsoft.com/office/word/2020/wordml/sdtdatahash" xmlns:w16se="http://schemas.microsoft.com/office/word/2015/wordml/symex" xmlns:wpg="http://schemas.microsoft.com/office/word/2010/wordprocessingGroup" xmlns:wpi="http://schemas.microsoft.com/office/word/2010/wordprocessingInk" xmlns:wne="http://schemas.microsoft.com/office/word/2006/wordml" xmlns:wps="http://schemas.microsoft.com/office/word/2010/wordprocessingShape" mc:Ignorable="w14 w15 w16se w16cid w16 w16cex w16sdtdh wp14">
   <w:body>
-    <w:p>
-      <w:pPr>
-        <w:pStyle w:val="Textoindependiente"/>
-        <w:rPr>
-          <w:rFonts w:ascii="Times New Roman"/>
-          <w:b w:val="0"/>
-          <w:sz w:val="22"/>
-        </w:rPr>
-      </w:pPr>
-    </w:p>
     <w:p>
       <w:pPr>
         <w:pStyle w:val="Textoindependiente"/>
@@ -14302,18 +14292,7 @@
                 <w:spacing w:val="-5"/>
                 <w:sz w:val="13"/>
               </w:rPr>
-              <w:t>${u1_</w:t>
-            </w:r>
-            <w:r>
-              <w:rPr>
-                <w:rFonts w:ascii="Arial" w:hAnsi="Arial" w:cs="Arial"/>
-                <w:b/>
-                <w:color w:val="001F60"/>
-                <w:spacing w:val="-5"/>
-                <w:sz w:val="13"/>
-              </w:rPr>
-              <w:lastRenderedPageBreak/>
-              <w:t>14}</w:t>
+              <w:t>${u1_14}</w:t>
             </w:r>
           </w:p>
         </w:tc>
@@ -14349,19 +14328,7 @@
                 <w:spacing w:val="-5"/>
                 <w:sz w:val="13"/>
               </w:rPr>
-              <w:lastRenderedPageBreak/>
-              <w:t>${u2</w:t>
-            </w:r>
-            <w:r>
-              <w:rPr>
-                <w:rFonts w:ascii="Arial" w:hAnsi="Arial" w:cs="Arial"/>
-                <w:b/>
-                <w:color w:val="001F60"/>
-                <w:spacing w:val="-5"/>
-                <w:sz w:val="13"/>
-              </w:rPr>
-              <w:lastRenderedPageBreak/>
-              <w:t>_14}</w:t>
+              <w:t>${u2_14}</w:t>
             </w:r>
           </w:p>
         </w:tc>
@@ -14397,19 +14364,7 @@
                 <w:spacing w:val="-5"/>
                 <w:sz w:val="13"/>
               </w:rPr>
-              <w:lastRenderedPageBreak/>
-              <w:t>${u3_1</w:t>
-            </w:r>
-            <w:r>
-              <w:rPr>
-                <w:rFonts w:ascii="Arial" w:hAnsi="Arial" w:cs="Arial"/>
-                <w:b/>
-                <w:color w:val="001F60"/>
-                <w:spacing w:val="-5"/>
-                <w:sz w:val="13"/>
-              </w:rPr>
-              <w:lastRenderedPageBreak/>
-              <w:t>4}</w:t>
+              <w:t>${u3_14}</w:t>
             </w:r>
           </w:p>
         </w:tc>
@@ -14445,19 +14400,7 @@
                 <w:spacing w:val="-5"/>
                 <w:sz w:val="13"/>
               </w:rPr>
-              <w:lastRenderedPageBreak/>
-              <w:t>${u4</w:t>
-            </w:r>
-            <w:r>
-              <w:rPr>
-                <w:rFonts w:ascii="Arial" w:hAnsi="Arial" w:cs="Arial"/>
-                <w:b/>
-                <w:color w:val="001F60"/>
-                <w:spacing w:val="-5"/>
-                <w:sz w:val="13"/>
-              </w:rPr>
-              <w:lastRenderedPageBreak/>
-              <w:t>_14}</w:t>
+              <w:t>${u4_14}</w:t>
             </w:r>
           </w:p>
         </w:tc>
@@ -14493,19 +14436,7 @@
                 <w:spacing w:val="-5"/>
                 <w:sz w:val="13"/>
               </w:rPr>
-              <w:lastRenderedPageBreak/>
-              <w:t>${u5</w:t>
-            </w:r>
-            <w:r>
-              <w:rPr>
-                <w:rFonts w:ascii="Arial" w:hAnsi="Arial" w:cs="Arial"/>
-                <w:b/>
-                <w:color w:val="001F60"/>
-                <w:spacing w:val="-5"/>
-                <w:sz w:val="13"/>
-              </w:rPr>
-              <w:lastRenderedPageBreak/>
-              <w:t>_14}</w:t>
+              <w:t>${u5_14}</w:t>
             </w:r>
           </w:p>
         </w:tc>
@@ -14541,7 +14472,6 @@
                 <w:spacing w:val="-5"/>
                 <w:sz w:val="13"/>
               </w:rPr>
-              <w:lastRenderedPageBreak/>
               <w:t>${u6</w:t>
             </w:r>
             <w:r>
@@ -14553,16 +14483,6 @@
                 <w:sz w:val="13"/>
               </w:rPr>
               <w:br/>
-            </w:r>
-            <w:r>
-              <w:rPr>
-                <w:rFonts w:ascii="Arial" w:hAnsi="Arial" w:cs="Arial"/>
-                <w:b/>
-                <w:color w:val="001F60"/>
-                <w:spacing w:val="-5"/>
-                <w:sz w:val="13"/>
-              </w:rPr>
-              <w:lastRenderedPageBreak/>
               <w:t>_14}</w:t>
             </w:r>
           </w:p>
@@ -14599,7 +14519,6 @@
                 <w:spacing w:val="-5"/>
                 <w:sz w:val="13"/>
               </w:rPr>
-              <w:lastRenderedPageBreak/>
               <w:t>${u7</w:t>
             </w:r>
             <w:r>
@@ -14611,16 +14530,6 @@
                 <w:sz w:val="13"/>
               </w:rPr>
               <w:br/>
-            </w:r>
-            <w:r>
-              <w:rPr>
-                <w:rFonts w:ascii="Arial" w:hAnsi="Arial" w:cs="Arial"/>
-                <w:b/>
-                <w:color w:val="001F60"/>
-                <w:spacing w:val="-5"/>
-                <w:sz w:val="13"/>
-              </w:rPr>
-              <w:lastRenderedPageBreak/>
               <w:t>_14}</w:t>
             </w:r>
           </w:p>
@@ -14657,7 +14566,6 @@
                 <w:spacing w:val="-5"/>
                 <w:sz w:val="13"/>
               </w:rPr>
-              <w:lastRenderedPageBreak/>
               <w:t>${u8</w:t>
             </w:r>
             <w:r>
@@ -14669,16 +14577,6 @@
                 <w:sz w:val="13"/>
               </w:rPr>
               <w:br/>
-            </w:r>
-            <w:r>
-              <w:rPr>
-                <w:rFonts w:ascii="Arial" w:hAnsi="Arial" w:cs="Arial"/>
-                <w:b/>
-                <w:color w:val="001F60"/>
-                <w:spacing w:val="-5"/>
-                <w:sz w:val="13"/>
-              </w:rPr>
-              <w:lastRenderedPageBreak/>
               <w:t>_14}</w:t>
             </w:r>
           </w:p>
@@ -14715,7 +14613,6 @@
                 <w:spacing w:val="-5"/>
                 <w:sz w:val="13"/>
               </w:rPr>
-              <w:lastRenderedPageBreak/>
               <w:t>${u9</w:t>
             </w:r>
             <w:r>
@@ -14727,16 +14624,6 @@
                 <w:sz w:val="13"/>
               </w:rPr>
               <w:br/>
-            </w:r>
-            <w:r>
-              <w:rPr>
-                <w:rFonts w:ascii="Arial" w:hAnsi="Arial" w:cs="Arial"/>
-                <w:b/>
-                <w:color w:val="001F60"/>
-                <w:spacing w:val="-5"/>
-                <w:sz w:val="13"/>
-              </w:rPr>
-              <w:lastRenderedPageBreak/>
               <w:t>_14}</w:t>
             </w:r>
           </w:p>
@@ -14773,19 +14660,7 @@
                 <w:spacing w:val="-5"/>
                 <w:sz w:val="13"/>
               </w:rPr>
-              <w:lastRenderedPageBreak/>
-              <w:t>${u1</w:t>
-            </w:r>
-            <w:r>
-              <w:rPr>
-                <w:rFonts w:ascii="Arial" w:hAnsi="Arial" w:cs="Arial"/>
-                <w:b/>
-                <w:color w:val="001F60"/>
-                <w:spacing w:val="-5"/>
-                <w:sz w:val="13"/>
-              </w:rPr>
-              <w:lastRenderedPageBreak/>
-              <w:t>0</w:t>
+              <w:t>${u10</w:t>
             </w:r>
             <w:r>
               <w:rPr>
@@ -14854,18 +14729,7 @@
                 <w:spacing w:val="-5"/>
                 <w:sz w:val="13"/>
               </w:rPr>
-              <w:t>${logro</w:t>
-            </w:r>
-            <w:r>
-              <w:rPr>
-                <w:rFonts w:ascii="Arial" w:hAnsi="Arial" w:cs="Arial"/>
-                <w:b/>
-                <w:color w:val="001F60"/>
-                <w:spacing w:val="-5"/>
-                <w:sz w:val="13"/>
-              </w:rPr>
-              <w:lastRenderedPageBreak/>
-              <w:t>_14}</w:t>
+              <w:t>${logro_14}</w:t>
             </w:r>
           </w:p>
         </w:tc>
@@ -14897,17 +14761,7 @@
                 <w:spacing w:val="-5"/>
                 <w:sz w:val="13"/>
               </w:rPr>
-              <w:lastRenderedPageBreak/>
-              <w:t>${aprob</w:t>
-            </w:r>
-            <w:r>
-              <w:rPr>
-                <w:rFonts w:ascii="Arial" w:hAnsi="Arial" w:cs="Arial"/>
-                <w:spacing w:val="-5"/>
-                <w:sz w:val="13"/>
-              </w:rPr>
-              <w:lastRenderedPageBreak/>
-              <w:t>_14}</w:t>
+              <w:t>${aprob_14}</w:t>
             </w:r>
           </w:p>
         </w:tc>
@@ -14939,17 +14793,7 @@
                 <w:spacing w:val="-5"/>
                 <w:sz w:val="13"/>
               </w:rPr>
-              <w:lastRenderedPageBreak/>
-              <w:t>${desa</w:t>
-            </w:r>
-            <w:r>
-              <w:rPr>
-                <w:rFonts w:ascii="Arial" w:hAnsi="Arial" w:cs="Arial"/>
-                <w:spacing w:val="-5"/>
-                <w:sz w:val="13"/>
-              </w:rPr>
-              <w:lastRenderedPageBreak/>
-              <w:t>p_14}</w:t>
+              <w:t>${desap_14}</w:t>
             </w:r>
           </w:p>
         </w:tc>
@@ -14978,7 +14822,6 @@
                 <w:spacing w:val="-5"/>
                 <w:sz w:val="13"/>
               </w:rPr>
-              <w:lastRenderedPageBreak/>
               <w:t>${obs_1</w:t>
             </w:r>
             <w:r>
@@ -15028,6 +14871,7 @@
                 <w:spacing w:val="-10"/>
                 <w:sz w:val="10"/>
               </w:rPr>
+              <w:lastRenderedPageBreak/>
               <w:t>15</w:t>
             </w:r>
           </w:p>
@@ -33692,18 +33536,7 @@
                 <w:spacing w:val="-5"/>
                 <w:sz w:val="13"/>
               </w:rPr>
-              <w:t>3</w:t>
-            </w:r>
-            <w:r>
-              <w:rPr>
-                <w:rFonts w:ascii="Arial" w:hAnsi="Arial" w:cs="Arial"/>
-                <w:b/>
-                <w:color w:val="001F60"/>
-                <w:spacing w:val="-5"/>
-                <w:sz w:val="13"/>
-              </w:rPr>
-              <w:lastRenderedPageBreak/>
-              <w:t>5</w:t>
+              <w:t>35</w:t>
             </w:r>
             <w:r>
               <w:rPr>
@@ -33747,7 +33580,6 @@
                 <w:spacing w:val="-5"/>
                 <w:sz w:val="13"/>
               </w:rPr>
-              <w:lastRenderedPageBreak/>
               <w:t>${u2_</w:t>
             </w:r>
             <w:r>
@@ -33758,18 +33590,7 @@
                 <w:spacing w:val="-5"/>
                 <w:sz w:val="13"/>
               </w:rPr>
-              <w:t>3</w:t>
-            </w:r>
-            <w:r>
-              <w:rPr>
-                <w:rFonts w:ascii="Arial" w:hAnsi="Arial" w:cs="Arial"/>
-                <w:b/>
-                <w:color w:val="001F60"/>
-                <w:spacing w:val="-5"/>
-                <w:sz w:val="13"/>
-              </w:rPr>
-              <w:lastRenderedPageBreak/>
-              <w:t>5</w:t>
+              <w:t>35</w:t>
             </w:r>
             <w:r>
               <w:rPr>
@@ -33813,7 +33634,6 @@
                 <w:spacing w:val="-5"/>
                 <w:sz w:val="13"/>
               </w:rPr>
-              <w:lastRenderedPageBreak/>
               <w:t>${u3_</w:t>
             </w:r>
             <w:r>
@@ -33824,7 +33644,6 @@
                 <w:spacing w:val="-5"/>
                 <w:sz w:val="13"/>
               </w:rPr>
-              <w:lastRenderedPageBreak/>
               <w:t>35</w:t>
             </w:r>
             <w:r>
@@ -33869,7 +33688,6 @@
                 <w:spacing w:val="-5"/>
                 <w:sz w:val="13"/>
               </w:rPr>
-              <w:lastRenderedPageBreak/>
               <w:t>${u4_</w:t>
             </w:r>
             <w:r>
@@ -33880,7 +33698,6 @@
                 <w:spacing w:val="-5"/>
                 <w:sz w:val="13"/>
               </w:rPr>
-              <w:lastRenderedPageBreak/>
               <w:t>35</w:t>
             </w:r>
             <w:r>
@@ -33925,7 +33742,6 @@
                 <w:spacing w:val="-5"/>
                 <w:sz w:val="13"/>
               </w:rPr>
-              <w:lastRenderedPageBreak/>
               <w:t>${u5_</w:t>
             </w:r>
             <w:r>
@@ -33936,7 +33752,6 @@
                 <w:spacing w:val="-5"/>
                 <w:sz w:val="13"/>
               </w:rPr>
-              <w:lastRenderedPageBreak/>
               <w:t>35</w:t>
             </w:r>
             <w:r>
@@ -33981,7 +33796,6 @@
                 <w:spacing w:val="-5"/>
                 <w:sz w:val="13"/>
               </w:rPr>
-              <w:lastRenderedPageBreak/>
               <w:t>${u6_</w:t>
             </w:r>
             <w:r>
@@ -33992,7 +33806,6 @@
                 <w:spacing w:val="-5"/>
                 <w:sz w:val="13"/>
               </w:rPr>
-              <w:lastRenderedPageBreak/>
               <w:t>35</w:t>
             </w:r>
             <w:r>
@@ -34037,7 +33850,6 @@
                 <w:spacing w:val="-5"/>
                 <w:sz w:val="13"/>
               </w:rPr>
-              <w:lastRenderedPageBreak/>
               <w:t>${u7_</w:t>
             </w:r>
             <w:r>
@@ -34048,7 +33860,6 @@
                 <w:spacing w:val="-5"/>
                 <w:sz w:val="13"/>
               </w:rPr>
-              <w:lastRenderedPageBreak/>
               <w:t>35</w:t>
             </w:r>
             <w:r>
@@ -34093,7 +33904,6 @@
                 <w:spacing w:val="-5"/>
                 <w:sz w:val="13"/>
               </w:rPr>
-              <w:lastRenderedPageBreak/>
               <w:t>${u8_</w:t>
             </w:r>
             <w:r>
@@ -34104,7 +33914,6 @@
                 <w:spacing w:val="-5"/>
                 <w:sz w:val="13"/>
               </w:rPr>
-              <w:lastRenderedPageBreak/>
               <w:t>35</w:t>
             </w:r>
             <w:r>
@@ -34149,7 +33958,6 @@
                 <w:spacing w:val="-5"/>
                 <w:sz w:val="13"/>
               </w:rPr>
-              <w:lastRenderedPageBreak/>
               <w:t>${u9_</w:t>
             </w:r>
             <w:r>
@@ -34160,7 +33968,6 @@
                 <w:spacing w:val="-5"/>
                 <w:sz w:val="13"/>
               </w:rPr>
-              <w:lastRenderedPageBreak/>
               <w:t>35</w:t>
             </w:r>
             <w:r>
@@ -34205,19 +34012,7 @@
                 <w:spacing w:val="-5"/>
                 <w:sz w:val="13"/>
               </w:rPr>
-              <w:lastRenderedPageBreak/>
-              <w:t>${u10</w:t>
-            </w:r>
-            <w:r>
-              <w:rPr>
-                <w:rFonts w:ascii="Arial" w:hAnsi="Arial" w:cs="Arial"/>
-                <w:b/>
-                <w:color w:val="001F60"/>
-                <w:spacing w:val="-5"/>
-                <w:sz w:val="13"/>
-              </w:rPr>
-              <w:lastRenderedPageBreak/>
-              <w:t>_</w:t>
+              <w:t>${u10_</w:t>
             </w:r>
             <w:r>
               <w:rPr>
@@ -34290,18 +34085,7 @@
                 <w:spacing w:val="-5"/>
                 <w:sz w:val="13"/>
               </w:rPr>
-              <w:t>${logro</w:t>
-            </w:r>
-            <w:r>
-              <w:rPr>
-                <w:rFonts w:ascii="Arial" w:hAnsi="Arial" w:cs="Arial"/>
-                <w:b/>
-                <w:color w:val="001F60"/>
-                <w:spacing w:val="-5"/>
-                <w:sz w:val="13"/>
-              </w:rPr>
-              <w:lastRenderedPageBreak/>
-              <w:t>_</w:t>
+              <w:t>${logro_</w:t>
             </w:r>
             <w:r>
               <w:rPr>
@@ -34350,17 +34134,7 @@
                 <w:spacing w:val="-5"/>
                 <w:sz w:val="13"/>
               </w:rPr>
-              <w:lastRenderedPageBreak/>
-              <w:t>${aprob</w:t>
-            </w:r>
-            <w:r>
-              <w:rPr>
-                <w:rFonts w:ascii="Arial" w:hAnsi="Arial" w:cs="Arial"/>
-                <w:spacing w:val="-5"/>
-                <w:sz w:val="13"/>
-              </w:rPr>
-              <w:lastRenderedPageBreak/>
-              <w:t>_</w:t>
+              <w:t>${aprob_</w:t>
             </w:r>
             <w:r>
               <w:rPr>
@@ -34405,17 +34179,7 @@
                 <w:spacing w:val="-5"/>
                 <w:sz w:val="13"/>
               </w:rPr>
-              <w:lastRenderedPageBreak/>
-              <w:t>${desa</w:t>
-            </w:r>
-            <w:r>
-              <w:rPr>
-                <w:rFonts w:ascii="Arial" w:hAnsi="Arial" w:cs="Arial"/>
-                <w:spacing w:val="-5"/>
-                <w:sz w:val="13"/>
-              </w:rPr>
-              <w:lastRenderedPageBreak/>
-              <w:t>p_</w:t>
+              <w:t>${desap_</w:t>
             </w:r>
             <w:r>
               <w:rPr>
@@ -34459,7 +34223,6 @@
                 <w:spacing w:val="-5"/>
                 <w:sz w:val="13"/>
               </w:rPr>
-              <w:lastRenderedPageBreak/>
               <w:t>${obs_</w:t>
             </w:r>
             <w:r>
@@ -34644,6 +34407,139 @@
                 <w:spacing w:val="-5"/>
                 <w:sz w:val="13"/>
               </w:rPr>
+              <w:t>3</w:t>
+            </w:r>
+            <w:r>
+              <w:rPr>
+                <w:rFonts w:ascii="Arial" w:hAnsi="Arial" w:cs="Arial"/>
+                <w:b/>
+                <w:color w:val="001F60"/>
+                <w:spacing w:val="-5"/>
+                <w:sz w:val="13"/>
+              </w:rPr>
+              <w:lastRenderedPageBreak/>
+              <w:t>6</w:t>
+            </w:r>
+            <w:r>
+              <w:rPr>
+                <w:rFonts w:ascii="Arial" w:hAnsi="Arial" w:cs="Arial"/>
+                <w:b/>
+                <w:color w:val="001F60"/>
+                <w:spacing w:val="-5"/>
+                <w:sz w:val="13"/>
+              </w:rPr>
+              <w:t>}</w:t>
+            </w:r>
+          </w:p>
+        </w:tc>
+        <w:tc>
+          <w:tcPr>
+            <w:tcW w:w="422" w:type="dxa"/>
+            <w:tcBorders>
+              <w:top w:val="single" w:sz="4" w:space="0" w:color="000000"/>
+              <w:left w:val="single" w:sz="4" w:space="0" w:color="000000"/>
+              <w:bottom w:val="single" w:sz="4" w:space="0" w:color="000000"/>
+              <w:right w:val="single" w:sz="4" w:space="0" w:color="000000"/>
+            </w:tcBorders>
+          </w:tcPr>
+          <w:p>
+            <w:pPr>
+              <w:pStyle w:val="TableParagraph"/>
+              <w:jc w:val="center"/>
+              <w:rPr>
+                <w:rFonts w:ascii="Arial" w:hAnsi="Arial" w:cs="Arial"/>
+                <w:b/>
+                <w:color w:val="001F60"/>
+                <w:spacing w:val="-5"/>
+                <w:sz w:val="13"/>
+              </w:rPr>
+            </w:pPr>
+            <w:r>
+              <w:rPr>
+                <w:rFonts w:ascii="Arial" w:hAnsi="Arial" w:cs="Arial"/>
+                <w:b/>
+                <w:color w:val="001F60"/>
+                <w:spacing w:val="-5"/>
+                <w:sz w:val="13"/>
+              </w:rPr>
+              <w:lastRenderedPageBreak/>
+              <w:t>${u2_</w:t>
+            </w:r>
+            <w:r>
+              <w:rPr>
+                <w:rFonts w:ascii="Arial" w:hAnsi="Arial" w:cs="Arial"/>
+                <w:b/>
+                <w:color w:val="001F60"/>
+                <w:spacing w:val="-5"/>
+                <w:sz w:val="13"/>
+              </w:rPr>
+              <w:t>3</w:t>
+            </w:r>
+            <w:r>
+              <w:rPr>
+                <w:rFonts w:ascii="Arial" w:hAnsi="Arial" w:cs="Arial"/>
+                <w:b/>
+                <w:color w:val="001F60"/>
+                <w:spacing w:val="-5"/>
+                <w:sz w:val="13"/>
+              </w:rPr>
+              <w:lastRenderedPageBreak/>
+              <w:t>6</w:t>
+            </w:r>
+            <w:r>
+              <w:rPr>
+                <w:rFonts w:ascii="Arial" w:hAnsi="Arial" w:cs="Arial"/>
+                <w:b/>
+                <w:color w:val="001F60"/>
+                <w:spacing w:val="-5"/>
+                <w:sz w:val="13"/>
+              </w:rPr>
+              <w:t>}</w:t>
+            </w:r>
+          </w:p>
+        </w:tc>
+        <w:tc>
+          <w:tcPr>
+            <w:tcW w:w="348" w:type="dxa"/>
+            <w:tcBorders>
+              <w:top w:val="single" w:sz="4" w:space="0" w:color="000000"/>
+              <w:left w:val="single" w:sz="4" w:space="0" w:color="000000"/>
+              <w:bottom w:val="single" w:sz="4" w:space="0" w:color="000000"/>
+              <w:right w:val="single" w:sz="4" w:space="0" w:color="000000"/>
+            </w:tcBorders>
+          </w:tcPr>
+          <w:p>
+            <w:pPr>
+              <w:pStyle w:val="TableParagraph"/>
+              <w:jc w:val="center"/>
+              <w:rPr>
+                <w:rFonts w:ascii="Arial" w:hAnsi="Arial" w:cs="Arial"/>
+                <w:b/>
+                <w:color w:val="001F60"/>
+                <w:spacing w:val="-5"/>
+                <w:sz w:val="13"/>
+              </w:rPr>
+            </w:pPr>
+            <w:r>
+              <w:rPr>
+                <w:rFonts w:ascii="Arial" w:hAnsi="Arial" w:cs="Arial"/>
+                <w:b/>
+                <w:color w:val="001F60"/>
+                <w:spacing w:val="-5"/>
+                <w:sz w:val="13"/>
+              </w:rPr>
+              <w:lastRenderedPageBreak/>
+              <w:t>${u3_</w:t>
+            </w:r>
+            <w:r>
+              <w:rPr>
+                <w:rFonts w:ascii="Arial" w:hAnsi="Arial" w:cs="Arial"/>
+                <w:b/>
+                <w:color w:val="001F60"/>
+                <w:spacing w:val="-5"/>
+                <w:sz w:val="13"/>
+              </w:rPr>
+              <w:lastRenderedPageBreak/>
               <w:t>36</w:t>
             </w:r>
             <w:r>
@@ -34660,44 +34556,46 @@
         </w:tc>
         <w:tc>
           <w:tcPr>
-            <w:tcW w:w="422" w:type="dxa"/>
-            <w:tcBorders>
-              <w:top w:val="single" w:sz="4" w:space="0" w:color="000000"/>
-              <w:left w:val="single" w:sz="4" w:space="0" w:color="000000"/>
-              <w:bottom w:val="single" w:sz="4" w:space="0" w:color="000000"/>
-              <w:right w:val="single" w:sz="4" w:space="0" w:color="000000"/>
-            </w:tcBorders>
-          </w:tcPr>
-          <w:p>
-            <w:pPr>
-              <w:pStyle w:val="TableParagraph"/>
-              <w:jc w:val="center"/>
-              <w:rPr>
-                <w:rFonts w:ascii="Arial" w:hAnsi="Arial" w:cs="Arial"/>
-                <w:b/>
-                <w:color w:val="001F60"/>
-                <w:spacing w:val="-5"/>
-                <w:sz w:val="13"/>
-              </w:rPr>
-            </w:pPr>
-            <w:r>
-              <w:rPr>
-                <w:rFonts w:ascii="Arial" w:hAnsi="Arial" w:cs="Arial"/>
-                <w:b/>
-                <w:color w:val="001F60"/>
-                <w:spacing w:val="-5"/>
-                <w:sz w:val="13"/>
-              </w:rPr>
-              <w:t>${u2_</w:t>
-            </w:r>
-            <w:r>
-              <w:rPr>
-                <w:rFonts w:ascii="Arial" w:hAnsi="Arial" w:cs="Arial"/>
-                <w:b/>
-                <w:color w:val="001F60"/>
-                <w:spacing w:val="-5"/>
-                <w:sz w:val="13"/>
-              </w:rPr>
+            <w:tcW w:w="348" w:type="dxa"/>
+            <w:tcBorders>
+              <w:top w:val="single" w:sz="4" w:space="0" w:color="000000"/>
+              <w:left w:val="single" w:sz="4" w:space="0" w:color="000000"/>
+              <w:bottom w:val="single" w:sz="4" w:space="0" w:color="000000"/>
+              <w:right w:val="single" w:sz="4" w:space="0" w:color="000000"/>
+            </w:tcBorders>
+          </w:tcPr>
+          <w:p>
+            <w:pPr>
+              <w:pStyle w:val="TableParagraph"/>
+              <w:jc w:val="center"/>
+              <w:rPr>
+                <w:rFonts w:ascii="Arial" w:hAnsi="Arial" w:cs="Arial"/>
+                <w:b/>
+                <w:color w:val="001F60"/>
+                <w:spacing w:val="-5"/>
+                <w:sz w:val="13"/>
+              </w:rPr>
+            </w:pPr>
+            <w:r>
+              <w:rPr>
+                <w:rFonts w:ascii="Arial" w:hAnsi="Arial" w:cs="Arial"/>
+                <w:b/>
+                <w:color w:val="001F60"/>
+                <w:spacing w:val="-5"/>
+                <w:sz w:val="13"/>
+              </w:rPr>
+              <w:lastRenderedPageBreak/>
+              <w:t>${u4_</w:t>
+            </w:r>
+            <w:r>
+              <w:rPr>
+                <w:rFonts w:ascii="Arial" w:hAnsi="Arial" w:cs="Arial"/>
+                <w:b/>
+                <w:color w:val="001F60"/>
+                <w:spacing w:val="-5"/>
+                <w:sz w:val="13"/>
+              </w:rPr>
+              <w:lastRenderedPageBreak/>
               <w:t>36</w:t>
             </w:r>
             <w:r>
@@ -34742,16 +34640,18 @@
                 <w:spacing w:val="-5"/>
                 <w:sz w:val="13"/>
               </w:rPr>
-              <w:t>${u3_</w:t>
-            </w:r>
-            <w:r>
-              <w:rPr>
-                <w:rFonts w:ascii="Arial" w:hAnsi="Arial" w:cs="Arial"/>
-                <w:b/>
-                <w:color w:val="001F60"/>
-                <w:spacing w:val="-5"/>
-                <w:sz w:val="13"/>
-              </w:rPr>
+              <w:lastRenderedPageBreak/>
+              <w:t>${u5_</w:t>
+            </w:r>
+            <w:r>
+              <w:rPr>
+                <w:rFonts w:ascii="Arial" w:hAnsi="Arial" w:cs="Arial"/>
+                <w:b/>
+                <w:color w:val="001F60"/>
+                <w:spacing w:val="-5"/>
+                <w:sz w:val="13"/>
+              </w:rPr>
+              <w:lastRenderedPageBreak/>
               <w:t>36</w:t>
             </w:r>
             <w:r>
@@ -34796,16 +34696,18 @@
                 <w:spacing w:val="-5"/>
                 <w:sz w:val="13"/>
               </w:rPr>
-              <w:t>${u4_</w:t>
-            </w:r>
-            <w:r>
-              <w:rPr>
-                <w:rFonts w:ascii="Arial" w:hAnsi="Arial" w:cs="Arial"/>
-                <w:b/>
-                <w:color w:val="001F60"/>
-                <w:spacing w:val="-5"/>
-                <w:sz w:val="13"/>
-              </w:rPr>
+              <w:lastRenderedPageBreak/>
+              <w:t>${u6_</w:t>
+            </w:r>
+            <w:r>
+              <w:rPr>
+                <w:rFonts w:ascii="Arial" w:hAnsi="Arial" w:cs="Arial"/>
+                <w:b/>
+                <w:color w:val="001F60"/>
+                <w:spacing w:val="-5"/>
+                <w:sz w:val="13"/>
+              </w:rPr>
+              <w:lastRenderedPageBreak/>
               <w:t>36</w:t>
             </w:r>
             <w:r>
@@ -34850,16 +34752,18 @@
                 <w:spacing w:val="-5"/>
                 <w:sz w:val="13"/>
               </w:rPr>
-              <w:t>${u5_</w:t>
-            </w:r>
-            <w:r>
-              <w:rPr>
-                <w:rFonts w:ascii="Arial" w:hAnsi="Arial" w:cs="Arial"/>
-                <w:b/>
-                <w:color w:val="001F60"/>
-                <w:spacing w:val="-5"/>
-                <w:sz w:val="13"/>
-              </w:rPr>
+              <w:lastRenderedPageBreak/>
+              <w:t>${u7_</w:t>
+            </w:r>
+            <w:r>
+              <w:rPr>
+                <w:rFonts w:ascii="Arial" w:hAnsi="Arial" w:cs="Arial"/>
+                <w:b/>
+                <w:color w:val="001F60"/>
+                <w:spacing w:val="-5"/>
+                <w:sz w:val="13"/>
+              </w:rPr>
+              <w:lastRenderedPageBreak/>
               <w:t>36</w:t>
             </w:r>
             <w:r>
@@ -34904,16 +34808,18 @@
                 <w:spacing w:val="-5"/>
                 <w:sz w:val="13"/>
               </w:rPr>
-              <w:t>${u6_</w:t>
-            </w:r>
-            <w:r>
-              <w:rPr>
-                <w:rFonts w:ascii="Arial" w:hAnsi="Arial" w:cs="Arial"/>
-                <w:b/>
-                <w:color w:val="001F60"/>
-                <w:spacing w:val="-5"/>
-                <w:sz w:val="13"/>
-              </w:rPr>
+              <w:lastRenderedPageBreak/>
+              <w:t>${u8_</w:t>
+            </w:r>
+            <w:r>
+              <w:rPr>
+                <w:rFonts w:ascii="Arial" w:hAnsi="Arial" w:cs="Arial"/>
+                <w:b/>
+                <w:color w:val="001F60"/>
+                <w:spacing w:val="-5"/>
+                <w:sz w:val="13"/>
+              </w:rPr>
+              <w:lastRenderedPageBreak/>
               <w:t>36</w:t>
             </w:r>
             <w:r>
@@ -34958,16 +34864,18 @@
                 <w:spacing w:val="-5"/>
                 <w:sz w:val="13"/>
               </w:rPr>
-              <w:t>${u7_</w:t>
-            </w:r>
-            <w:r>
-              <w:rPr>
-                <w:rFonts w:ascii="Arial" w:hAnsi="Arial" w:cs="Arial"/>
-                <w:b/>
-                <w:color w:val="001F60"/>
-                <w:spacing w:val="-5"/>
-                <w:sz w:val="13"/>
-              </w:rPr>
+              <w:lastRenderedPageBreak/>
+              <w:t>${u9_</w:t>
+            </w:r>
+            <w:r>
+              <w:rPr>
+                <w:rFonts w:ascii="Arial" w:hAnsi="Arial" w:cs="Arial"/>
+                <w:b/>
+                <w:color w:val="001F60"/>
+                <w:spacing w:val="-5"/>
+                <w:sz w:val="13"/>
+              </w:rPr>
+              <w:lastRenderedPageBreak/>
               <w:t>36</w:t>
             </w:r>
             <w:r>
@@ -35012,115 +34920,19 @@
                 <w:spacing w:val="-5"/>
                 <w:sz w:val="13"/>
               </w:rPr>
-              <w:t>${u8_</w:t>
-            </w:r>
-            <w:r>
-              <w:rPr>
-                <w:rFonts w:ascii="Arial" w:hAnsi="Arial" w:cs="Arial"/>
-                <w:b/>
-                <w:color w:val="001F60"/>
-                <w:spacing w:val="-5"/>
-                <w:sz w:val="13"/>
-              </w:rPr>
-              <w:t>36</w:t>
-            </w:r>
-            <w:r>
-              <w:rPr>
-                <w:rFonts w:ascii="Arial" w:hAnsi="Arial" w:cs="Arial"/>
-                <w:b/>
-                <w:color w:val="001F60"/>
-                <w:spacing w:val="-5"/>
-                <w:sz w:val="13"/>
-              </w:rPr>
-              <w:t>}</w:t>
-            </w:r>
-          </w:p>
-        </w:tc>
-        <w:tc>
-          <w:tcPr>
-            <w:tcW w:w="348" w:type="dxa"/>
-            <w:tcBorders>
-              <w:top w:val="single" w:sz="4" w:space="0" w:color="000000"/>
-              <w:left w:val="single" w:sz="4" w:space="0" w:color="000000"/>
-              <w:bottom w:val="single" w:sz="4" w:space="0" w:color="000000"/>
-              <w:right w:val="single" w:sz="4" w:space="0" w:color="000000"/>
-            </w:tcBorders>
-          </w:tcPr>
-          <w:p>
-            <w:pPr>
-              <w:pStyle w:val="TableParagraph"/>
-              <w:jc w:val="center"/>
-              <w:rPr>
-                <w:rFonts w:ascii="Arial" w:hAnsi="Arial" w:cs="Arial"/>
-                <w:b/>
-                <w:color w:val="001F60"/>
-                <w:spacing w:val="-5"/>
-                <w:sz w:val="13"/>
-              </w:rPr>
-            </w:pPr>
-            <w:r>
-              <w:rPr>
-                <w:rFonts w:ascii="Arial" w:hAnsi="Arial" w:cs="Arial"/>
-                <w:b/>
-                <w:color w:val="001F60"/>
-                <w:spacing w:val="-5"/>
-                <w:sz w:val="13"/>
-              </w:rPr>
-              <w:t>${u9_</w:t>
-            </w:r>
-            <w:r>
-              <w:rPr>
-                <w:rFonts w:ascii="Arial" w:hAnsi="Arial" w:cs="Arial"/>
-                <w:b/>
-                <w:color w:val="001F60"/>
-                <w:spacing w:val="-5"/>
-                <w:sz w:val="13"/>
-              </w:rPr>
-              <w:t>36</w:t>
-            </w:r>
-            <w:r>
-              <w:rPr>
-                <w:rFonts w:ascii="Arial" w:hAnsi="Arial" w:cs="Arial"/>
-                <w:b/>
-                <w:color w:val="001F60"/>
-                <w:spacing w:val="-5"/>
-                <w:sz w:val="13"/>
-              </w:rPr>
-              <w:t>}</w:t>
-            </w:r>
-          </w:p>
-        </w:tc>
-        <w:tc>
-          <w:tcPr>
-            <w:tcW w:w="348" w:type="dxa"/>
-            <w:tcBorders>
-              <w:top w:val="single" w:sz="4" w:space="0" w:color="000000"/>
-              <w:left w:val="single" w:sz="4" w:space="0" w:color="000000"/>
-              <w:bottom w:val="single" w:sz="4" w:space="0" w:color="000000"/>
-              <w:right w:val="single" w:sz="4" w:space="0" w:color="000000"/>
-            </w:tcBorders>
-          </w:tcPr>
-          <w:p>
-            <w:pPr>
-              <w:pStyle w:val="TableParagraph"/>
-              <w:jc w:val="center"/>
-              <w:rPr>
-                <w:rFonts w:ascii="Arial" w:hAnsi="Arial" w:cs="Arial"/>
-                <w:b/>
-                <w:color w:val="001F60"/>
-                <w:spacing w:val="-5"/>
-                <w:sz w:val="13"/>
-              </w:rPr>
-            </w:pPr>
-            <w:r>
-              <w:rPr>
-                <w:rFonts w:ascii="Arial" w:hAnsi="Arial" w:cs="Arial"/>
-                <w:b/>
-                <w:color w:val="001F60"/>
-                <w:spacing w:val="-5"/>
-                <w:sz w:val="13"/>
-              </w:rPr>
-              <w:t>${u10_</w:t>
+              <w:lastRenderedPageBreak/>
+              <w:t>${u10</w:t>
+            </w:r>
+            <w:r>
+              <w:rPr>
+                <w:rFonts w:ascii="Arial" w:hAnsi="Arial" w:cs="Arial"/>
+                <w:b/>
+                <w:color w:val="001F60"/>
+                <w:spacing w:val="-5"/>
+                <w:sz w:val="13"/>
+              </w:rPr>
+              <w:lastRenderedPageBreak/>
+              <w:t>_</w:t>
             </w:r>
             <w:r>
               <w:rPr>
@@ -35193,7 +35005,18 @@
                 <w:spacing w:val="-5"/>
                 <w:sz w:val="13"/>
               </w:rPr>
-              <w:t>${logro_</w:t>
+              <w:t>${logro</w:t>
+            </w:r>
+            <w:r>
+              <w:rPr>
+                <w:rFonts w:ascii="Arial" w:hAnsi="Arial" w:cs="Arial"/>
+                <w:b/>
+                <w:color w:val="001F60"/>
+                <w:spacing w:val="-5"/>
+                <w:sz w:val="13"/>
+              </w:rPr>
+              <w:lastRenderedPageBreak/>
+              <w:t>_</w:t>
             </w:r>
             <w:r>
               <w:rPr>
@@ -35242,6 +35065,7 @@
                 <w:spacing w:val="-5"/>
                 <w:sz w:val="13"/>
               </w:rPr>
+              <w:lastRenderedPageBreak/>
               <w:t>${aprob</w:t>
             </w:r>
             <w:r>
@@ -35250,6 +35074,7 @@
                 <w:spacing w:val="-5"/>
                 <w:sz w:val="13"/>
               </w:rPr>
+              <w:lastRenderedPageBreak/>
               <w:t>_36</w:t>
             </w:r>
             <w:r>
@@ -35287,7 +35112,17 @@
                 <w:spacing w:val="-5"/>
                 <w:sz w:val="13"/>
               </w:rPr>
-              <w:t>${desap</w:t>
+              <w:lastRenderedPageBreak/>
+              <w:t>${desa</w:t>
+            </w:r>
+            <w:r>
+              <w:rPr>
+                <w:rFonts w:ascii="Arial" w:hAnsi="Arial" w:cs="Arial"/>
+                <w:spacing w:val="-5"/>
+                <w:sz w:val="13"/>
+              </w:rPr>
+              <w:lastRenderedPageBreak/>
+              <w:t>p</w:t>
             </w:r>
             <w:r>
               <w:rPr>
@@ -35331,6 +35166,7 @@
                 <w:spacing w:val="-5"/>
                 <w:sz w:val="13"/>
               </w:rPr>
+              <w:lastRenderedPageBreak/>
               <w:t>${obs_</w:t>
             </w:r>
             <w:r>
@@ -41866,16 +41702,6 @@
           <w:sz w:val="20"/>
         </w:rPr>
       </w:pPr>
-    </w:p>
-    <w:p>
-      <w:pPr>
-        <w:pStyle w:val="Textoindependiente"/>
-        <w:spacing w:before="197"/>
-        <w:jc w:val="center"/>
-        <w:rPr>
-          <w:sz w:val="20"/>
-        </w:rPr>
-      </w:pPr>
       <w:r>
         <w:rPr>
           <w:noProof/>

</xml_diff>

<commit_message>
fix: Se mejoro el acta
</commit_message>
<xml_diff>
--- a/public/plantillas/ACTA.docx
+++ b/public/plantillas/ACTA.docx
@@ -280,6 +280,7 @@
         </w:rPr>
         <w:t>${</w:t>
       </w:r>
+      <w:proofErr w:type="spellStart"/>
       <w:r>
         <w:rPr>
           <w:rFonts w:ascii="Arial" w:hAnsi="Arial"/>
@@ -287,6 +288,7 @@
         </w:rPr>
         <w:t>anio</w:t>
       </w:r>
+      <w:proofErr w:type="spellEnd"/>
       <w:r>
         <w:rPr>
           <w:rFonts w:ascii="Arial" w:hAnsi="Arial"/>
@@ -465,12 +467,14 @@
               </w:rPr>
               <w:t>${</w:t>
             </w:r>
+            <w:proofErr w:type="spellStart"/>
             <w:r>
               <w:rPr>
                 <w:sz w:val="11"/>
               </w:rPr>
               <w:t>cetpro</w:t>
             </w:r>
+            <w:proofErr w:type="spellEnd"/>
             <w:r>
               <w:rPr>
                 <w:sz w:val="11"/>
@@ -1496,12 +1500,14 @@
               </w:rPr>
               <w:t xml:space="preserve"> </w:t>
             </w:r>
+            <w:proofErr w:type="spellStart"/>
             <w:r>
               <w:rPr>
                 <w:sz w:val="11"/>
               </w:rPr>
               <w:t>Nº</w:t>
             </w:r>
+            <w:proofErr w:type="spellEnd"/>
             <w:r>
               <w:rPr>
                 <w:spacing w:val="2"/>
@@ -1533,11 +1539,19 @@
                 <w:sz w:val="11"/>
               </w:rPr>
             </w:pPr>
+            <w:proofErr w:type="spellStart"/>
             <w:r>
               <w:rPr>
                 <w:sz w:val="11"/>
               </w:rPr>
-              <w:t xml:space="preserve">Nº </w:t>
+              <w:t>Nº</w:t>
+            </w:r>
+            <w:proofErr w:type="spellEnd"/>
+            <w:r>
+              <w:rPr>
+                <w:sz w:val="11"/>
+              </w:rPr>
+              <w:t xml:space="preserve"> </w:t>
             </w:r>
             <w:r>
               <w:rPr>
@@ -1637,11 +1651,19 @@
               </w:rPr>
               <w:t xml:space="preserve"> </w:t>
             </w:r>
+            <w:proofErr w:type="spellStart"/>
             <w:r>
               <w:rPr>
                 <w:sz w:val="10"/>
               </w:rPr>
-              <w:t>N° 06335</w:t>
+              <w:t>N°</w:t>
+            </w:r>
+            <w:proofErr w:type="spellEnd"/>
+            <w:r>
+              <w:rPr>
+                <w:sz w:val="10"/>
+              </w:rPr>
+              <w:t xml:space="preserve"> 06335</w:t>
             </w:r>
             <w:r>
               <w:rPr>
@@ -4514,6 +4536,7 @@
                 <w:sz w:val="9"/>
               </w:rPr>
             </w:pPr>
+            <w:proofErr w:type="spellStart"/>
             <w:r>
               <w:rPr>
                 <w:rFonts w:ascii="Arial" w:hAnsi="Arial"/>
@@ -4523,6 +4546,7 @@
               </w:rPr>
               <w:t>N.°</w:t>
             </w:r>
+            <w:proofErr w:type="spellEnd"/>
           </w:p>
         </w:tc>
         <w:tc>
@@ -4839,12 +4863,14 @@
                 <w:sz w:val="9"/>
               </w:rPr>
             </w:pPr>
+            <w:proofErr w:type="gramStart"/>
             <w:r>
               <w:rPr>
                 <w:sz w:val="9"/>
               </w:rPr>
               <w:t>TOTAL</w:t>
             </w:r>
+            <w:proofErr w:type="gramEnd"/>
             <w:r>
               <w:rPr>
                 <w:spacing w:val="-1"/>
@@ -18946,6 +18972,7 @@
                 <w:sz w:val="10"/>
               </w:rPr>
             </w:pPr>
+            <w:proofErr w:type="spellStart"/>
             <w:r>
               <w:rPr>
                 <w:rFonts w:ascii="Arial" w:hAnsi="Arial"/>
@@ -18955,6 +18982,7 @@
               </w:rPr>
               <w:t>N.°</w:t>
             </w:r>
+            <w:proofErr w:type="spellEnd"/>
           </w:p>
         </w:tc>
         <w:tc>
@@ -39296,7 +39324,7 @@
         <mc:AlternateContent>
           <mc:Choice Requires="wps">
             <w:drawing>
-              <wp:anchor distT="0" distB="0" distL="0" distR="0" simplePos="0" relativeHeight="15731200" behindDoc="0" locked="0" layoutInCell="1" allowOverlap="1" wp14:anchorId="79F62BF2" wp14:editId="3AE0203D">
+              <wp:anchor distT="0" distB="0" distL="0" distR="0" simplePos="0" relativeHeight="15731200" behindDoc="0" locked="0" layoutInCell="1" allowOverlap="1" wp14:anchorId="79F62BF2" wp14:editId="0C9E5F20">
                 <wp:simplePos x="0" y="0"/>
                 <wp:positionH relativeFrom="page">
                   <wp:posOffset>3876675</wp:posOffset>
@@ -39304,7 +39332,7 @@
                 <wp:positionV relativeFrom="paragraph">
                   <wp:posOffset>167640</wp:posOffset>
                 </wp:positionV>
-                <wp:extent cx="4159250" cy="342900"/>
+                <wp:extent cx="4159250" cy="361950"/>
                 <wp:effectExtent l="0" t="0" r="0" b="0"/>
                 <wp:wrapNone/>
                 <wp:docPr id="4" name="Textbox 4"/>
@@ -39320,7 +39348,7 @@
                       <wps:spPr>
                         <a:xfrm>
                           <a:off x="0" y="0"/>
-                          <a:ext cx="4159250" cy="342900"/>
+                          <a:ext cx="4159250" cy="361950"/>
                         </a:xfrm>
                         <a:prstGeom prst="rect">
                           <a:avLst/>
@@ -41548,7 +41576,7 @@
           </mc:Choice>
           <mc:Fallback>
             <w:pict>
-              <v:shape w14:anchorId="79F62BF2" id="Textbox 4" o:spid="_x0000_s1027" type="#_x0000_t202" style="position:absolute;margin-left:305.25pt;margin-top:13.2pt;width:327.5pt;height:27pt;z-index:15731200;visibility:visible;mso-wrap-style:square;mso-height-percent:0;mso-wrap-distance-left:0;mso-wrap-distance-top:0;mso-wrap-distance-right:0;mso-wrap-distance-bottom:0;mso-position-horizontal:absolute;mso-position-horizontal-relative:page;mso-position-vertical:absolute;mso-position-vertical-relative:text;mso-height-percent:0;mso-height-relative:margin;v-text-anchor:top" o:gfxdata="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" filled="f" stroked="f">
+              <v:shape w14:anchorId="79F62BF2" id="Textbox 4" o:spid="_x0000_s1027" type="#_x0000_t202" style="position:absolute;margin-left:305.25pt;margin-top:13.2pt;width:327.5pt;height:28.5pt;z-index:15731200;visibility:visible;mso-wrap-style:square;mso-height-percent:0;mso-wrap-distance-left:0;mso-wrap-distance-top:0;mso-wrap-distance-right:0;mso-wrap-distance-bottom:0;mso-position-horizontal:absolute;mso-position-horizontal-relative:page;mso-position-vertical:absolute;mso-position-vertical-relative:text;mso-height-percent:0;mso-height-relative:margin;v-text-anchor:top" o:gfxdata="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" filled="f" stroked="f">
                 <v:textbox inset="0,0,0,0">
                   <w:txbxContent>
                     <w:tbl>

</xml_diff>

<commit_message>
fix: Se agrego creditos, horas, capacidades al word
</commit_message>
<xml_diff>
--- a/public/plantillas/ACTA.docx
+++ b/public/plantillas/ACTA.docx
@@ -72,133 +72,6 @@
             </a:graphic>
           </wp:anchor>
         </w:drawing>
-      </w:r>
-      <w:r>
-        <w:rPr>
-          <w:rFonts w:ascii="Arial" w:hAnsi="Arial"/>
-          <w:b/>
-          <w:noProof/>
-        </w:rPr>
-        <mc:AlternateContent>
-          <mc:Choice Requires="wps">
-            <w:drawing>
-              <wp:anchor distT="0" distB="0" distL="0" distR="0" simplePos="0" relativeHeight="15729664" behindDoc="0" locked="0" layoutInCell="1" allowOverlap="1" wp14:anchorId="61DAEF52" wp14:editId="68361339">
-                <wp:simplePos x="0" y="0"/>
-                <wp:positionH relativeFrom="page">
-                  <wp:posOffset>6942346</wp:posOffset>
-                </wp:positionH>
-                <wp:positionV relativeFrom="paragraph">
-                  <wp:posOffset>870392</wp:posOffset>
-                </wp:positionV>
-                <wp:extent cx="90170" cy="417195"/>
-                <wp:effectExtent l="0" t="0" r="0" b="0"/>
-                <wp:wrapNone/>
-                <wp:docPr id="3" name="Textbox 3"/>
-                <wp:cNvGraphicFramePr>
-                  <a:graphicFrameLocks xmlns:a="http://schemas.openxmlformats.org/drawingml/2006/main"/>
-                </wp:cNvGraphicFramePr>
-                <a:graphic xmlns:a="http://schemas.openxmlformats.org/drawingml/2006/main">
-                  <a:graphicData uri="http://schemas.microsoft.com/office/word/2010/wordprocessingShape">
-                    <wps:wsp>
-                      <wps:cNvSpPr txBox="1">
-                        <a:spLocks/>
-                      </wps:cNvSpPr>
-                      <wps:spPr>
-                        <a:xfrm>
-                          <a:off x="0" y="0"/>
-                          <a:ext cx="90170" cy="417195"/>
-                        </a:xfrm>
-                        <a:prstGeom prst="rect">
-                          <a:avLst/>
-                        </a:prstGeom>
-                      </wps:spPr>
-                      <wps:txbx>
-                        <w:txbxContent>
-                          <w:p>
-                            <w:pPr>
-                              <w:spacing w:before="18"/>
-                              <w:ind w:left="20"/>
-                              <w:rPr>
-                                <w:sz w:val="9"/>
-                              </w:rPr>
-                            </w:pPr>
-                            <w:r>
-                              <w:rPr>
-                                <w:sz w:val="9"/>
-                              </w:rPr>
-                              <w:t>RMATIVAS</w:t>
-                            </w:r>
-                            <w:r>
-                              <w:rPr>
-                                <w:spacing w:val="-2"/>
-                                <w:sz w:val="9"/>
-                              </w:rPr>
-                              <w:t xml:space="preserve"> </w:t>
-                            </w:r>
-                            <w:r>
-                              <w:rPr>
-                                <w:spacing w:val="-5"/>
-                                <w:sz w:val="9"/>
-                              </w:rPr>
-                              <w:t>EN</w:t>
-                            </w:r>
-                          </w:p>
-                        </w:txbxContent>
-                      </wps:txbx>
-                      <wps:bodyPr vert="vert270" wrap="square" lIns="0" tIns="0" rIns="0" bIns="0" rtlCol="0">
-                        <a:noAutofit/>
-                      </wps:bodyPr>
-                    </wps:wsp>
-                  </a:graphicData>
-                </a:graphic>
-              </wp:anchor>
-            </w:drawing>
-          </mc:Choice>
-          <mc:Fallback>
-            <w:pict>
-              <v:shapetype w14:anchorId="61DAEF52" id="_x0000_t202" coordsize="21600,21600" o:spt="202" path="m,l,21600r21600,l21600,xe">
-                <v:stroke joinstyle="miter"/>
-                <v:path gradientshapeok="t" o:connecttype="rect"/>
-              </v:shapetype>
-              <v:shape id="Textbox 3" o:spid="_x0000_s1026" type="#_x0000_t202" style="position:absolute;left:0;text-align:left;margin-left:546.65pt;margin-top:68.55pt;width:7.1pt;height:32.85pt;z-index:15729664;visibility:visible;mso-wrap-style:square;mso-wrap-distance-left:0;mso-wrap-distance-top:0;mso-wrap-distance-right:0;mso-wrap-distance-bottom:0;mso-position-horizontal:absolute;mso-position-horizontal-relative:page;mso-position-vertical:absolute;mso-position-vertical-relative:text;v-text-anchor:top" o:gfxdata="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" filled="f" stroked="f">
-                <v:textbox style="layout-flow:vertical;mso-layout-flow-alt:bottom-to-top" inset="0,0,0,0">
-                  <w:txbxContent>
-                    <w:p>
-                      <w:pPr>
-                        <w:spacing w:before="18"/>
-                        <w:ind w:left="20"/>
-                        <w:rPr>
-                          <w:sz w:val="9"/>
-                        </w:rPr>
-                      </w:pPr>
-                      <w:r>
-                        <w:rPr>
-                          <w:sz w:val="9"/>
-                        </w:rPr>
-                        <w:t>RMATIVAS</w:t>
-                      </w:r>
-                      <w:r>
-                        <w:rPr>
-                          <w:spacing w:val="-2"/>
-                          <w:sz w:val="9"/>
-                        </w:rPr>
-                        <w:t xml:space="preserve"> </w:t>
-                      </w:r>
-                      <w:r>
-                        <w:rPr>
-                          <w:spacing w:val="-5"/>
-                          <w:sz w:val="9"/>
-                        </w:rPr>
-                        <w:t>EN</w:t>
-                      </w:r>
-                    </w:p>
-                  </w:txbxContent>
-                </v:textbox>
-                <w10:wrap anchorx="page"/>
-              </v:shape>
-            </w:pict>
-          </mc:Fallback>
-        </mc:AlternateContent>
       </w:r>
       <w:r>
         <w:rPr>
@@ -1020,7 +893,6 @@
             <w:tcBorders>
               <w:top w:val="single" w:sz="4" w:space="0" w:color="000000"/>
               <w:left w:val="single" w:sz="4" w:space="0" w:color="000000"/>
-              <w:bottom w:val="nil"/>
               <w:right w:val="single" w:sz="4" w:space="0" w:color="000000"/>
             </w:tcBorders>
             <w:textDirection w:val="btLr"/>
@@ -1028,54 +900,31 @@
           <w:p>
             <w:pPr>
               <w:pStyle w:val="TableParagraph"/>
-              <w:spacing w:before="64"/>
-              <w:rPr>
-                <w:rFonts w:ascii="Arial"/>
-                <w:b/>
+              <w:spacing w:before="55" w:line="261" w:lineRule="auto"/>
+              <w:ind w:left="113" w:right="-22"/>
+              <w:rPr>
                 <w:sz w:val="9"/>
               </w:rPr>
             </w:pPr>
-          </w:p>
-          <w:p>
-            <w:pPr>
-              <w:pStyle w:val="TableParagraph"/>
-              <w:ind w:left="-8"/>
+            <w:r>
               <w:rPr>
                 <w:sz w:val="9"/>
               </w:rPr>
-            </w:pPr>
+              <w:t>${</w:t>
+            </w:r>
+            <w:proofErr w:type="spellStart"/>
             <w:r>
               <w:rPr>
                 <w:sz w:val="9"/>
               </w:rPr>
-              <w:t>S</w:t>
-            </w:r>
-            <w:r>
-              <w:rPr>
-                <w:spacing w:val="-1"/>
+              <w:t>efsrt</w:t>
+            </w:r>
+            <w:proofErr w:type="spellEnd"/>
+            <w:r>
+              <w:rPr>
                 <w:sz w:val="9"/>
               </w:rPr>
-              <w:t xml:space="preserve"> </w:t>
-            </w:r>
-            <w:r>
-              <w:rPr>
-                <w:sz w:val="9"/>
-              </w:rPr>
-              <w:t>DE</w:t>
-            </w:r>
-            <w:r>
-              <w:rPr>
-                <w:spacing w:val="-1"/>
-                <w:sz w:val="9"/>
-              </w:rPr>
-              <w:t xml:space="preserve"> </w:t>
-            </w:r>
-            <w:r>
-              <w:rPr>
-                <w:spacing w:val="-2"/>
-                <w:sz w:val="9"/>
-              </w:rPr>
-              <w:t>TRABAJO</w:t>
+              <w:t>}</w:t>
             </w:r>
           </w:p>
         </w:tc>
@@ -1898,15 +1747,16 @@
             <w:tcW w:w="349" w:type="dxa"/>
             <w:vMerge/>
             <w:tcBorders>
-              <w:top w:val="nil"/>
-              <w:left w:val="single" w:sz="4" w:space="0" w:color="000000"/>
-              <w:bottom w:val="nil"/>
+              <w:left w:val="single" w:sz="4" w:space="0" w:color="000000"/>
               <w:right w:val="single" w:sz="4" w:space="0" w:color="000000"/>
             </w:tcBorders>
             <w:textDirection w:val="btLr"/>
           </w:tcPr>
           <w:p>
             <w:pPr>
+              <w:pStyle w:val="TableParagraph"/>
+              <w:spacing w:before="55" w:line="261" w:lineRule="auto"/>
+              <w:ind w:left="179" w:right="-22" w:firstLine="79"/>
               <w:rPr>
                 <w:sz w:val="2"/>
                 <w:szCs w:val="2"/>
@@ -2528,15 +2378,16 @@
             <w:tcW w:w="349" w:type="dxa"/>
             <w:vMerge/>
             <w:tcBorders>
-              <w:top w:val="nil"/>
-              <w:left w:val="single" w:sz="4" w:space="0" w:color="000000"/>
-              <w:bottom w:val="nil"/>
+              <w:left w:val="single" w:sz="4" w:space="0" w:color="000000"/>
               <w:right w:val="single" w:sz="4" w:space="0" w:color="000000"/>
             </w:tcBorders>
             <w:textDirection w:val="btLr"/>
           </w:tcPr>
           <w:p>
             <w:pPr>
+              <w:pStyle w:val="TableParagraph"/>
+              <w:spacing w:before="55" w:line="261" w:lineRule="auto"/>
+              <w:ind w:left="179" w:right="-22" w:firstLine="79"/>
               <w:rPr>
                 <w:sz w:val="2"/>
                 <w:szCs w:val="2"/>
@@ -2947,11 +2798,9 @@
         <w:tc>
           <w:tcPr>
             <w:tcW w:w="349" w:type="dxa"/>
-            <w:vMerge w:val="restart"/>
-            <w:tcBorders>
-              <w:top w:val="nil"/>
-              <w:left w:val="single" w:sz="4" w:space="0" w:color="000000"/>
-              <w:bottom w:val="single" w:sz="4" w:space="0" w:color="000000"/>
+            <w:vMerge/>
+            <w:tcBorders>
+              <w:left w:val="single" w:sz="4" w:space="0" w:color="000000"/>
               <w:right w:val="single" w:sz="4" w:space="0" w:color="000000"/>
             </w:tcBorders>
             <w:textDirection w:val="btLr"/>
@@ -2965,52 +2814,6 @@
                 <w:sz w:val="9"/>
               </w:rPr>
             </w:pPr>
-            <w:r>
-              <w:rPr>
-                <w:sz w:val="9"/>
-              </w:rPr>
-              <w:t>EXPERIENCIAS</w:t>
-            </w:r>
-            <w:r>
-              <w:rPr>
-                <w:spacing w:val="-7"/>
-                <w:sz w:val="9"/>
-              </w:rPr>
-              <w:t xml:space="preserve"> </w:t>
-            </w:r>
-            <w:r>
-              <w:rPr>
-                <w:sz w:val="9"/>
-              </w:rPr>
-              <w:t>FO</w:t>
-            </w:r>
-            <w:r>
-              <w:rPr>
-                <w:spacing w:val="40"/>
-                <w:sz w:val="9"/>
-              </w:rPr>
-              <w:t xml:space="preserve"> </w:t>
-            </w:r>
-            <w:r>
-              <w:rPr>
-                <w:sz w:val="9"/>
-              </w:rPr>
-              <w:t>SITUACIONES</w:t>
-            </w:r>
-            <w:r>
-              <w:rPr>
-                <w:spacing w:val="-3"/>
-                <w:sz w:val="9"/>
-              </w:rPr>
-              <w:t xml:space="preserve"> </w:t>
-            </w:r>
-            <w:r>
-              <w:rPr>
-                <w:spacing w:val="-2"/>
-                <w:sz w:val="9"/>
-              </w:rPr>
-              <w:t>REALE</w:t>
-            </w:r>
           </w:p>
         </w:tc>
         <w:tc>
@@ -3429,9 +3232,7 @@
             <w:tcW w:w="349" w:type="dxa"/>
             <w:vMerge/>
             <w:tcBorders>
-              <w:top w:val="nil"/>
-              <w:left w:val="single" w:sz="4" w:space="0" w:color="000000"/>
-              <w:bottom w:val="single" w:sz="4" w:space="0" w:color="000000"/>
+              <w:left w:val="single" w:sz="4" w:space="0" w:color="000000"/>
               <w:right w:val="single" w:sz="4" w:space="0" w:color="000000"/>
             </w:tcBorders>
             <w:textDirection w:val="btLr"/>
@@ -3935,9 +3736,7 @@
             <w:tcW w:w="349" w:type="dxa"/>
             <w:vMerge/>
             <w:tcBorders>
-              <w:top w:val="nil"/>
-              <w:left w:val="single" w:sz="4" w:space="0" w:color="000000"/>
-              <w:bottom w:val="single" w:sz="4" w:space="0" w:color="000000"/>
+              <w:left w:val="single" w:sz="4" w:space="0" w:color="000000"/>
               <w:right w:val="single" w:sz="4" w:space="0" w:color="000000"/>
             </w:tcBorders>
             <w:textDirection w:val="btLr"/>
@@ -4144,21 +3943,7 @@
               <w:rPr>
                 <w:sz w:val="11"/>
               </w:rPr>
-              <w:t>LOS MANGOS</w:t>
-            </w:r>
-            <w:r>
-              <w:rPr>
-                <w:spacing w:val="1"/>
-                <w:sz w:val="11"/>
-              </w:rPr>
-              <w:t xml:space="preserve"> </w:t>
-            </w:r>
-            <w:r>
-              <w:rPr>
-                <w:spacing w:val="-5"/>
-                <w:sz w:val="11"/>
-              </w:rPr>
-              <w:t>145</w:t>
+              <w:t>LOS ALMENDROS CUADRA 5</w:t>
             </w:r>
           </w:p>
         </w:tc>
@@ -4363,7 +4148,6 @@
             <w:tcW w:w="349" w:type="dxa"/>
             <w:vMerge/>
             <w:tcBorders>
-              <w:top w:val="nil"/>
               <w:left w:val="single" w:sz="4" w:space="0" w:color="000000"/>
               <w:bottom w:val="single" w:sz="4" w:space="0" w:color="000000"/>
               <w:right w:val="single" w:sz="4" w:space="0" w:color="000000"/>
@@ -5044,6 +4828,7 @@
                 <w:rFonts w:ascii="Arial"/>
                 <w:b/>
                 <w:sz w:val="10"/>
+                <w:lang w:val="es-PE"/>
               </w:rPr>
             </w:pPr>
             <w:r>
@@ -5052,7 +4837,7 @@
                 <w:b/>
                 <w:sz w:val="10"/>
               </w:rPr>
-              <w:t>2</w:t>
+              <w:t>$</w:t>
             </w:r>
             <w:r>
               <w:rPr>
@@ -5060,23 +4845,33 @@
                 <w:b/>
                 <w:sz w:val="10"/>
               </w:rPr>
-              <w:t xml:space="preserve"> </w:t>
+              <w:t>{</w:t>
             </w:r>
             <w:r>
               <w:rPr>
                 <w:rFonts w:ascii="Arial"/>
                 <w:b/>
                 <w:sz w:val="10"/>
-              </w:rPr>
-              <w:t>/</w:t>
+                <w:lang w:val="es-PE"/>
+              </w:rPr>
+              <w:t>c/h_</w:t>
             </w:r>
             <w:r>
               <w:rPr>
                 <w:rFonts w:ascii="Arial"/>
                 <w:b/>
                 <w:sz w:val="10"/>
-              </w:rPr>
-              <w:t xml:space="preserve"> 32</w:t>
+                <w:lang w:val="es-PE"/>
+              </w:rPr>
+              <w:t>u1</w:t>
+            </w:r>
+            <w:r>
+              <w:rPr>
+                <w:rFonts w:ascii="Arial"/>
+                <w:b/>
+                <w:sz w:val="10"/>
+              </w:rPr>
+              <w:t>}</w:t>
             </w:r>
           </w:p>
         </w:tc>
@@ -5107,42 +4902,62 @@
                 <w:b/>
                 <w:sz w:val="10"/>
               </w:rPr>
+              <w:t>$</w:t>
+            </w:r>
+            <w:r>
+              <w:rPr>
+                <w:rFonts w:ascii="Arial"/>
+                <w:b/>
+                <w:sz w:val="10"/>
+              </w:rPr>
+              <w:t>{</w:t>
+            </w:r>
+            <w:r>
+              <w:rPr>
+                <w:rFonts w:ascii="Arial"/>
+                <w:b/>
+                <w:sz w:val="10"/>
+                <w:lang w:val="es-PE"/>
+              </w:rPr>
+              <w:t>c/</w:t>
+            </w:r>
+            <w:proofErr w:type="spellStart"/>
+            <w:r>
+              <w:rPr>
+                <w:rFonts w:ascii="Arial"/>
+                <w:b/>
+                <w:sz w:val="10"/>
+                <w:lang w:val="es-PE"/>
+              </w:rPr>
+              <w:t>h_</w:t>
+            </w:r>
+            <w:r>
+              <w:rPr>
+                <w:rFonts w:ascii="Arial"/>
+                <w:b/>
+                <w:sz w:val="10"/>
+                <w:u w:val="single"/>
+                <w:lang w:val="es-PE"/>
+              </w:rPr>
+              <w:t>u</w:t>
+            </w:r>
+            <w:proofErr w:type="spellEnd"/>
+            <w:r>
+              <w:rPr>
+                <w:rFonts w:ascii="Arial"/>
+                <w:b/>
+                <w:sz w:val="10"/>
+                <w:u w:val="single"/>
+              </w:rPr>
               <w:t>2</w:t>
             </w:r>
             <w:r>
               <w:rPr>
                 <w:rFonts w:ascii="Arial"/>
                 <w:b/>
-                <w:spacing w:val="-1"/>
                 <w:sz w:val="10"/>
               </w:rPr>
-              <w:t xml:space="preserve"> </w:t>
-            </w:r>
-            <w:r>
-              <w:rPr>
-                <w:rFonts w:ascii="Arial"/>
-                <w:b/>
-                <w:sz w:val="10"/>
-              </w:rPr>
-              <w:t>/</w:t>
-            </w:r>
-            <w:r>
-              <w:rPr>
-                <w:rFonts w:ascii="Arial"/>
-                <w:b/>
-                <w:spacing w:val="1"/>
-                <w:sz w:val="10"/>
-              </w:rPr>
-              <w:t xml:space="preserve"> </w:t>
-            </w:r>
-            <w:r>
-              <w:rPr>
-                <w:rFonts w:ascii="Arial"/>
-                <w:b/>
-                <w:spacing w:val="-5"/>
-                <w:sz w:val="10"/>
-              </w:rPr>
-              <w:t>48</w:t>
+              <w:t>}</w:t>
             </w:r>
           </w:p>
         </w:tc>
@@ -5173,42 +4988,56 @@
                 <w:b/>
                 <w:sz w:val="10"/>
               </w:rPr>
-              <w:t>2</w:t>
+              <w:t>$</w:t>
             </w:r>
             <w:r>
               <w:rPr>
                 <w:rFonts w:ascii="Arial"/>
                 <w:b/>
-                <w:spacing w:val="-1"/>
                 <w:sz w:val="10"/>
               </w:rPr>
-              <w:t xml:space="preserve"> </w:t>
+              <w:t>{</w:t>
             </w:r>
             <w:r>
               <w:rPr>
                 <w:rFonts w:ascii="Arial"/>
                 <w:b/>
                 <w:sz w:val="10"/>
-              </w:rPr>
-              <w:t>/</w:t>
+                <w:lang w:val="es-PE"/>
+              </w:rPr>
+              <w:t>c/h</w:t>
             </w:r>
             <w:r>
               <w:rPr>
                 <w:rFonts w:ascii="Arial"/>
                 <w:b/>
-                <w:spacing w:val="2"/>
                 <w:sz w:val="10"/>
               </w:rPr>
-              <w:t xml:space="preserve"> </w:t>
+              <w:t>_</w:t>
             </w:r>
             <w:r>
               <w:rPr>
                 <w:rFonts w:ascii="Arial"/>
                 <w:b/>
-                <w:spacing w:val="-5"/>
                 <w:sz w:val="10"/>
               </w:rPr>
-              <w:t>48</w:t>
+              <w:t>u</w:t>
+            </w:r>
+            <w:r>
+              <w:rPr>
+                <w:rFonts w:ascii="Arial"/>
+                <w:b/>
+                <w:sz w:val="10"/>
+              </w:rPr>
+              <w:t>3</w:t>
+            </w:r>
+            <w:r>
+              <w:rPr>
+                <w:rFonts w:ascii="Arial"/>
+                <w:b/>
+                <w:sz w:val="10"/>
+              </w:rPr>
+              <w:t>}</w:t>
             </w:r>
           </w:p>
         </w:tc>
@@ -5239,42 +5068,48 @@
                 <w:b/>
                 <w:sz w:val="10"/>
               </w:rPr>
-              <w:t>3</w:t>
+              <w:t>$</w:t>
             </w:r>
             <w:r>
               <w:rPr>
                 <w:rFonts w:ascii="Arial"/>
                 <w:b/>
-                <w:spacing w:val="-1"/>
                 <w:sz w:val="10"/>
               </w:rPr>
-              <w:t xml:space="preserve"> </w:t>
+              <w:t>{</w:t>
             </w:r>
             <w:r>
               <w:rPr>
                 <w:rFonts w:ascii="Arial"/>
                 <w:b/>
                 <w:sz w:val="10"/>
-              </w:rPr>
-              <w:t>/</w:t>
+                <w:lang w:val="es-PE"/>
+              </w:rPr>
+              <w:t>c/h</w:t>
             </w:r>
             <w:r>
               <w:rPr>
                 <w:rFonts w:ascii="Arial"/>
                 <w:b/>
-                <w:spacing w:val="1"/>
                 <w:sz w:val="10"/>
               </w:rPr>
-              <w:t xml:space="preserve"> </w:t>
+              <w:t>_u</w:t>
             </w:r>
             <w:r>
               <w:rPr>
                 <w:rFonts w:ascii="Arial"/>
                 <w:b/>
-                <w:spacing w:val="-5"/>
                 <w:sz w:val="10"/>
               </w:rPr>
-              <w:t>64</w:t>
+              <w:t>4</w:t>
+            </w:r>
+            <w:r>
+              <w:rPr>
+                <w:rFonts w:ascii="Arial"/>
+                <w:b/>
+                <w:sz w:val="10"/>
+              </w:rPr>
+              <w:t>}</w:t>
             </w:r>
           </w:p>
         </w:tc>
@@ -5305,42 +5140,48 @@
                 <w:b/>
                 <w:sz w:val="10"/>
               </w:rPr>
-              <w:t>2</w:t>
+              <w:t>$</w:t>
             </w:r>
             <w:r>
               <w:rPr>
                 <w:rFonts w:ascii="Arial"/>
                 <w:b/>
-                <w:spacing w:val="-1"/>
                 <w:sz w:val="10"/>
               </w:rPr>
-              <w:t xml:space="preserve"> </w:t>
+              <w:t>{</w:t>
             </w:r>
             <w:r>
               <w:rPr>
                 <w:rFonts w:ascii="Arial"/>
                 <w:b/>
                 <w:sz w:val="10"/>
-              </w:rPr>
-              <w:t>/</w:t>
+                <w:lang w:val="es-PE"/>
+              </w:rPr>
+              <w:t>c/h</w:t>
             </w:r>
             <w:r>
               <w:rPr>
                 <w:rFonts w:ascii="Arial"/>
                 <w:b/>
-                <w:spacing w:val="2"/>
                 <w:sz w:val="10"/>
               </w:rPr>
-              <w:t xml:space="preserve"> </w:t>
+              <w:t>_u</w:t>
             </w:r>
             <w:r>
               <w:rPr>
                 <w:rFonts w:ascii="Arial"/>
                 <w:b/>
-                <w:spacing w:val="-5"/>
                 <w:sz w:val="10"/>
               </w:rPr>
-              <w:t>48</w:t>
+              <w:t>5</w:t>
+            </w:r>
+            <w:r>
+              <w:rPr>
+                <w:rFonts w:ascii="Arial"/>
+                <w:b/>
+                <w:sz w:val="10"/>
+              </w:rPr>
+              <w:t>}</w:t>
             </w:r>
           </w:p>
         </w:tc>
@@ -5371,42 +5212,48 @@
                 <w:b/>
                 <w:sz w:val="10"/>
               </w:rPr>
-              <w:t>2</w:t>
+              <w:t>$</w:t>
             </w:r>
             <w:r>
               <w:rPr>
                 <w:rFonts w:ascii="Arial"/>
                 <w:b/>
-                <w:spacing w:val="-1"/>
                 <w:sz w:val="10"/>
               </w:rPr>
-              <w:t xml:space="preserve"> </w:t>
+              <w:t>{</w:t>
             </w:r>
             <w:r>
               <w:rPr>
                 <w:rFonts w:ascii="Arial"/>
                 <w:b/>
                 <w:sz w:val="10"/>
-              </w:rPr>
-              <w:t>/</w:t>
+                <w:lang w:val="es-PE"/>
+              </w:rPr>
+              <w:t>c/h</w:t>
             </w:r>
             <w:r>
               <w:rPr>
                 <w:rFonts w:ascii="Arial"/>
                 <w:b/>
-                <w:spacing w:val="1"/>
                 <w:sz w:val="10"/>
               </w:rPr>
-              <w:t xml:space="preserve"> </w:t>
+              <w:t>_u</w:t>
             </w:r>
             <w:r>
               <w:rPr>
                 <w:rFonts w:ascii="Arial"/>
                 <w:b/>
-                <w:spacing w:val="-5"/>
                 <w:sz w:val="10"/>
               </w:rPr>
-              <w:t>48</w:t>
+              <w:t>6</w:t>
+            </w:r>
+            <w:r>
+              <w:rPr>
+                <w:rFonts w:ascii="Arial"/>
+                <w:b/>
+                <w:sz w:val="10"/>
+              </w:rPr>
+              <w:t>}</w:t>
             </w:r>
           </w:p>
         </w:tc>
@@ -5422,11 +5269,62 @@
           <w:p>
             <w:pPr>
               <w:pStyle w:val="TableParagraph"/>
+              <w:spacing w:before="57"/>
+              <w:jc w:val="center"/>
               <w:rPr>
                 <w:rFonts w:ascii="Times New Roman"/>
                 <w:sz w:val="10"/>
               </w:rPr>
             </w:pPr>
+            <w:r>
+              <w:rPr>
+                <w:rFonts w:ascii="Arial"/>
+                <w:b/>
+                <w:sz w:val="10"/>
+              </w:rPr>
+              <w:t>$</w:t>
+            </w:r>
+            <w:r>
+              <w:rPr>
+                <w:rFonts w:ascii="Arial"/>
+                <w:b/>
+                <w:sz w:val="10"/>
+              </w:rPr>
+              <w:t>{</w:t>
+            </w:r>
+            <w:r>
+              <w:rPr>
+                <w:rFonts w:ascii="Arial"/>
+                <w:b/>
+                <w:sz w:val="10"/>
+                <w:lang w:val="es-PE"/>
+              </w:rPr>
+              <w:t>c/h</w:t>
+            </w:r>
+            <w:r>
+              <w:rPr>
+                <w:rFonts w:ascii="Arial"/>
+                <w:b/>
+                <w:sz w:val="10"/>
+              </w:rPr>
+              <w:t>_u</w:t>
+            </w:r>
+            <w:r>
+              <w:rPr>
+                <w:rFonts w:ascii="Arial"/>
+                <w:b/>
+                <w:sz w:val="10"/>
+              </w:rPr>
+              <w:t>7</w:t>
+            </w:r>
+            <w:r>
+              <w:rPr>
+                <w:rFonts w:ascii="Arial"/>
+                <w:b/>
+                <w:sz w:val="10"/>
+              </w:rPr>
+              <w:t>}</w:t>
+            </w:r>
           </w:p>
         </w:tc>
         <w:tc>
@@ -5441,11 +5339,134 @@
           <w:p>
             <w:pPr>
               <w:pStyle w:val="TableParagraph"/>
+              <w:spacing w:before="57"/>
+              <w:ind w:left="31" w:right="6"/>
+              <w:jc w:val="center"/>
+              <w:rPr>
+                <w:rFonts w:ascii="Arial"/>
+                <w:b/>
+                <w:sz w:val="10"/>
+              </w:rPr>
+            </w:pPr>
+            <w:r>
+              <w:rPr>
+                <w:rFonts w:ascii="Arial"/>
+                <w:b/>
+                <w:sz w:val="10"/>
+              </w:rPr>
+              <w:t>$</w:t>
+            </w:r>
+            <w:r>
+              <w:rPr>
+                <w:rFonts w:ascii="Arial"/>
+                <w:b/>
+                <w:sz w:val="10"/>
+              </w:rPr>
+              <w:t>{</w:t>
+            </w:r>
+            <w:r>
+              <w:rPr>
+                <w:rFonts w:ascii="Arial"/>
+                <w:b/>
+                <w:sz w:val="10"/>
+                <w:lang w:val="es-PE"/>
+              </w:rPr>
+              <w:t>c/h</w:t>
+            </w:r>
+            <w:r>
+              <w:rPr>
+                <w:rFonts w:ascii="Arial"/>
+                <w:b/>
+                <w:sz w:val="10"/>
+              </w:rPr>
+              <w:t>_u</w:t>
+            </w:r>
+            <w:r>
+              <w:rPr>
+                <w:rFonts w:ascii="Arial"/>
+                <w:b/>
+                <w:sz w:val="10"/>
+              </w:rPr>
+              <w:t>8</w:t>
+            </w:r>
+            <w:r>
+              <w:rPr>
+                <w:rFonts w:ascii="Arial"/>
+                <w:b/>
+                <w:sz w:val="10"/>
+              </w:rPr>
+              <w:t>}</w:t>
+            </w:r>
+          </w:p>
+        </w:tc>
+        <w:tc>
+          <w:tcPr>
+            <w:tcW w:w="349" w:type="dxa"/>
+            <w:tcBorders>
+              <w:top w:val="single" w:sz="4" w:space="0" w:color="000000"/>
+              <w:left w:val="single" w:sz="4" w:space="0" w:color="000000"/>
+              <w:right w:val="single" w:sz="4" w:space="0" w:color="000000"/>
+            </w:tcBorders>
+          </w:tcPr>
+          <w:p>
+            <w:pPr>
+              <w:pStyle w:val="TableParagraph"/>
+              <w:spacing w:before="57"/>
+              <w:jc w:val="center"/>
               <w:rPr>
                 <w:rFonts w:ascii="Times New Roman"/>
                 <w:sz w:val="10"/>
               </w:rPr>
             </w:pPr>
+            <w:r>
+              <w:rPr>
+                <w:rFonts w:ascii="Arial"/>
+                <w:b/>
+                <w:sz w:val="10"/>
+              </w:rPr>
+              <w:t>$</w:t>
+            </w:r>
+            <w:r>
+              <w:rPr>
+                <w:rFonts w:ascii="Arial"/>
+                <w:b/>
+                <w:sz w:val="10"/>
+              </w:rPr>
+              <w:t>{</w:t>
+            </w:r>
+            <w:r>
+              <w:rPr>
+                <w:rFonts w:ascii="Arial"/>
+                <w:b/>
+                <w:sz w:val="10"/>
+                <w:lang w:val="es-PE"/>
+              </w:rPr>
+              <w:t>c/h</w:t>
+            </w:r>
+            <w:r>
+              <w:rPr>
+                <w:rFonts w:ascii="Arial"/>
+                <w:b/>
+                <w:sz w:val="10"/>
+              </w:rPr>
+              <w:t>_u</w:t>
+            </w:r>
+            <w:r>
+              <w:rPr>
+                <w:rFonts w:ascii="Arial"/>
+                <w:b/>
+                <w:sz w:val="10"/>
+              </w:rPr>
+              <w:t>9</w:t>
+            </w:r>
+            <w:r>
+              <w:rPr>
+                <w:rFonts w:ascii="Arial"/>
+                <w:b/>
+                <w:sz w:val="10"/>
+              </w:rPr>
+              <w:t>}</w:t>
+            </w:r>
           </w:p>
         </w:tc>
         <w:tc>
@@ -5460,11 +5481,62 @@
           <w:p>
             <w:pPr>
               <w:pStyle w:val="TableParagraph"/>
+              <w:spacing w:before="57"/>
+              <w:jc w:val="center"/>
               <w:rPr>
                 <w:rFonts w:ascii="Times New Roman"/>
                 <w:sz w:val="10"/>
               </w:rPr>
             </w:pPr>
+            <w:r>
+              <w:rPr>
+                <w:rFonts w:ascii="Arial"/>
+                <w:b/>
+                <w:sz w:val="10"/>
+              </w:rPr>
+              <w:t>$</w:t>
+            </w:r>
+            <w:r>
+              <w:rPr>
+                <w:rFonts w:ascii="Arial"/>
+                <w:b/>
+                <w:sz w:val="10"/>
+              </w:rPr>
+              <w:t>{</w:t>
+            </w:r>
+            <w:r>
+              <w:rPr>
+                <w:rFonts w:ascii="Arial"/>
+                <w:b/>
+                <w:sz w:val="10"/>
+                <w:lang w:val="es-PE"/>
+              </w:rPr>
+              <w:t>c/h</w:t>
+            </w:r>
+            <w:r>
+              <w:rPr>
+                <w:rFonts w:ascii="Arial"/>
+                <w:b/>
+                <w:sz w:val="10"/>
+              </w:rPr>
+              <w:t>_u1</w:t>
+            </w:r>
+            <w:r>
+              <w:rPr>
+                <w:rFonts w:ascii="Arial"/>
+                <w:b/>
+                <w:sz w:val="10"/>
+              </w:rPr>
+              <w:t>0</w:t>
+            </w:r>
+            <w:r>
+              <w:rPr>
+                <w:rFonts w:ascii="Arial"/>
+                <w:b/>
+                <w:sz w:val="10"/>
+              </w:rPr>
+              <w:t>}</w:t>
+            </w:r>
           </w:p>
         </w:tc>
         <w:tc>
@@ -5479,49 +5551,37 @@
           <w:p>
             <w:pPr>
               <w:pStyle w:val="TableParagraph"/>
-              <w:rPr>
-                <w:rFonts w:ascii="Times New Roman"/>
+              <w:spacing w:before="57"/>
+              <w:jc w:val="center"/>
+              <w:rPr>
+                <w:rFonts w:ascii="Arial"/>
+                <w:b/>
                 <w:sz w:val="10"/>
               </w:rPr>
             </w:pPr>
-          </w:p>
-        </w:tc>
-        <w:tc>
-          <w:tcPr>
-            <w:tcW w:w="349" w:type="dxa"/>
-            <w:tcBorders>
-              <w:top w:val="single" w:sz="4" w:space="0" w:color="000000"/>
-              <w:left w:val="single" w:sz="4" w:space="0" w:color="000000"/>
-              <w:right w:val="single" w:sz="4" w:space="0" w:color="000000"/>
-            </w:tcBorders>
-          </w:tcPr>
-          <w:p>
-            <w:pPr>
-              <w:pStyle w:val="TableParagraph"/>
-              <w:spacing w:before="57"/>
-              <w:ind w:left="22"/>
+            <w:r>
               <w:rPr>
                 <w:rFonts w:ascii="Arial"/>
                 <w:b/>
                 <w:sz w:val="10"/>
               </w:rPr>
-            </w:pPr>
+              <w:t>$</w:t>
+            </w:r>
             <w:r>
               <w:rPr>
                 <w:rFonts w:ascii="Arial"/>
                 <w:b/>
                 <w:sz w:val="10"/>
               </w:rPr>
-              <w:t>6</w:t>
+              <w:t>{</w:t>
             </w:r>
             <w:r>
               <w:rPr>
                 <w:rFonts w:ascii="Arial"/>
                 <w:b/>
-                <w:spacing w:val="-1"/>
                 <w:sz w:val="10"/>
               </w:rPr>
-              <w:t xml:space="preserve"> </w:t>
+              <w:t>c</w:t>
             </w:r>
             <w:r>
               <w:rPr>
@@ -5531,23 +5591,39 @@
               </w:rPr>
               <w:t>/</w:t>
             </w:r>
+            <w:proofErr w:type="spellStart"/>
             <w:r>
               <w:rPr>
                 <w:rFonts w:ascii="Arial"/>
                 <w:b/>
-                <w:spacing w:val="1"/>
                 <w:sz w:val="10"/>
               </w:rPr>
-              <w:t xml:space="preserve"> </w:t>
+              <w:t>h</w:t>
             </w:r>
             <w:r>
               <w:rPr>
                 <w:rFonts w:ascii="Arial"/>
                 <w:b/>
-                <w:spacing w:val="-5"/>
                 <w:sz w:val="10"/>
               </w:rPr>
-              <w:t>192</w:t>
+              <w:t>_</w:t>
+            </w:r>
+            <w:r>
+              <w:rPr>
+                <w:rFonts w:ascii="Arial"/>
+                <w:b/>
+                <w:sz w:val="10"/>
+              </w:rPr>
+              <w:t>efsrt</w:t>
+            </w:r>
+            <w:proofErr w:type="spellEnd"/>
+            <w:r>
+              <w:rPr>
+                <w:rFonts w:ascii="Arial"/>
+                <w:b/>
+                <w:sz w:val="10"/>
+              </w:rPr>
+              <w:t>}</w:t>
             </w:r>
           </w:p>
         </w:tc>
@@ -6139,16 +6215,30 @@
               <w:bottom w:val="single" w:sz="4" w:space="0" w:color="000000"/>
               <w:right w:val="single" w:sz="4" w:space="0" w:color="000000"/>
             </w:tcBorders>
-          </w:tcPr>
-          <w:p>
-            <w:pPr>
-              <w:pStyle w:val="TableParagraph"/>
-              <w:jc w:val="center"/>
-              <w:rPr>
-                <w:rFonts w:ascii="Arial" w:hAnsi="Arial" w:cs="Arial"/>
-                <w:sz w:val="10"/>
-              </w:rPr>
-            </w:pPr>
+            <w:vAlign w:val="bottom"/>
+          </w:tcPr>
+          <w:p>
+            <w:pPr>
+              <w:pStyle w:val="TableParagraph"/>
+              <w:jc w:val="center"/>
+              <w:rPr>
+                <w:rFonts w:ascii="Arial" w:hAnsi="Arial" w:cs="Arial"/>
+                <w:b/>
+                <w:color w:val="001F60"/>
+                <w:spacing w:val="-5"/>
+                <w:sz w:val="13"/>
+              </w:rPr>
+            </w:pPr>
+            <w:r>
+              <w:rPr>
+                <w:rFonts w:ascii="Arial" w:hAnsi="Arial" w:cs="Arial"/>
+                <w:b/>
+                <w:color w:val="001F60"/>
+                <w:spacing w:val="-5"/>
+                <w:sz w:val="13"/>
+              </w:rPr>
+              <w:t>${nota_efsrt1}</w:t>
+            </w:r>
           </w:p>
         </w:tc>
         <w:tc>
@@ -6742,16 +6832,30 @@
               <w:bottom w:val="single" w:sz="4" w:space="0" w:color="000000"/>
               <w:right w:val="single" w:sz="4" w:space="0" w:color="000000"/>
             </w:tcBorders>
-          </w:tcPr>
-          <w:p>
-            <w:pPr>
-              <w:pStyle w:val="TableParagraph"/>
-              <w:jc w:val="center"/>
-              <w:rPr>
-                <w:rFonts w:ascii="Arial" w:hAnsi="Arial" w:cs="Arial"/>
-                <w:sz w:val="10"/>
-              </w:rPr>
-            </w:pPr>
+            <w:vAlign w:val="bottom"/>
+          </w:tcPr>
+          <w:p>
+            <w:pPr>
+              <w:pStyle w:val="TableParagraph"/>
+              <w:jc w:val="center"/>
+              <w:rPr>
+                <w:rFonts w:ascii="Arial" w:hAnsi="Arial" w:cs="Arial"/>
+                <w:b/>
+                <w:color w:val="001F60"/>
+                <w:spacing w:val="-5"/>
+                <w:sz w:val="13"/>
+              </w:rPr>
+            </w:pPr>
+            <w:r>
+              <w:rPr>
+                <w:rFonts w:ascii="Arial" w:hAnsi="Arial" w:cs="Arial"/>
+                <w:b/>
+                <w:color w:val="001F60"/>
+                <w:spacing w:val="-5"/>
+                <w:sz w:val="13"/>
+              </w:rPr>
+              <w:t>${nota_efsrt2}</w:t>
+            </w:r>
           </w:p>
         </w:tc>
         <w:tc>
@@ -7370,16 +7474,30 @@
               <w:bottom w:val="single" w:sz="4" w:space="0" w:color="000000"/>
               <w:right w:val="single" w:sz="4" w:space="0" w:color="000000"/>
             </w:tcBorders>
-          </w:tcPr>
-          <w:p>
-            <w:pPr>
-              <w:pStyle w:val="TableParagraph"/>
-              <w:jc w:val="center"/>
-              <w:rPr>
-                <w:rFonts w:ascii="Arial" w:hAnsi="Arial" w:cs="Arial"/>
-                <w:sz w:val="10"/>
-              </w:rPr>
-            </w:pPr>
+            <w:vAlign w:val="bottom"/>
+          </w:tcPr>
+          <w:p>
+            <w:pPr>
+              <w:pStyle w:val="TableParagraph"/>
+              <w:jc w:val="center"/>
+              <w:rPr>
+                <w:rFonts w:ascii="Arial" w:hAnsi="Arial" w:cs="Arial"/>
+                <w:b/>
+                <w:color w:val="001F60"/>
+                <w:spacing w:val="-5"/>
+                <w:sz w:val="13"/>
+              </w:rPr>
+            </w:pPr>
+            <w:r>
+              <w:rPr>
+                <w:rFonts w:ascii="Arial" w:hAnsi="Arial" w:cs="Arial"/>
+                <w:b/>
+                <w:color w:val="001F60"/>
+                <w:spacing w:val="-5"/>
+                <w:sz w:val="13"/>
+              </w:rPr>
+              <w:t>${nota_efsrt3}</w:t>
+            </w:r>
           </w:p>
         </w:tc>
         <w:tc>
@@ -7997,16 +8115,30 @@
               <w:bottom w:val="single" w:sz="4" w:space="0" w:color="000000"/>
               <w:right w:val="single" w:sz="4" w:space="0" w:color="000000"/>
             </w:tcBorders>
-          </w:tcPr>
-          <w:p>
-            <w:pPr>
-              <w:pStyle w:val="TableParagraph"/>
-              <w:jc w:val="center"/>
-              <w:rPr>
-                <w:rFonts w:ascii="Arial" w:hAnsi="Arial" w:cs="Arial"/>
-                <w:sz w:val="10"/>
-              </w:rPr>
-            </w:pPr>
+            <w:vAlign w:val="bottom"/>
+          </w:tcPr>
+          <w:p>
+            <w:pPr>
+              <w:pStyle w:val="TableParagraph"/>
+              <w:jc w:val="center"/>
+              <w:rPr>
+                <w:rFonts w:ascii="Arial" w:hAnsi="Arial" w:cs="Arial"/>
+                <w:b/>
+                <w:color w:val="001F60"/>
+                <w:spacing w:val="-5"/>
+                <w:sz w:val="13"/>
+              </w:rPr>
+            </w:pPr>
+            <w:r>
+              <w:rPr>
+                <w:rFonts w:ascii="Arial" w:hAnsi="Arial" w:cs="Arial"/>
+                <w:b/>
+                <w:color w:val="001F60"/>
+                <w:spacing w:val="-5"/>
+                <w:sz w:val="13"/>
+              </w:rPr>
+              <w:t>${nota_efsrt4}</w:t>
+            </w:r>
           </w:p>
         </w:tc>
         <w:tc>
@@ -8613,16 +8745,30 @@
               <w:bottom w:val="single" w:sz="4" w:space="0" w:color="000000"/>
               <w:right w:val="single" w:sz="4" w:space="0" w:color="000000"/>
             </w:tcBorders>
-          </w:tcPr>
-          <w:p>
-            <w:pPr>
-              <w:pStyle w:val="TableParagraph"/>
-              <w:jc w:val="center"/>
-              <w:rPr>
-                <w:rFonts w:ascii="Arial" w:hAnsi="Arial" w:cs="Arial"/>
-                <w:sz w:val="10"/>
-              </w:rPr>
-            </w:pPr>
+            <w:vAlign w:val="bottom"/>
+          </w:tcPr>
+          <w:p>
+            <w:pPr>
+              <w:pStyle w:val="TableParagraph"/>
+              <w:jc w:val="center"/>
+              <w:rPr>
+                <w:rFonts w:ascii="Arial" w:hAnsi="Arial" w:cs="Arial"/>
+                <w:b/>
+                <w:color w:val="001F60"/>
+                <w:spacing w:val="-5"/>
+                <w:sz w:val="13"/>
+              </w:rPr>
+            </w:pPr>
+            <w:r>
+              <w:rPr>
+                <w:rFonts w:ascii="Arial" w:hAnsi="Arial" w:cs="Arial"/>
+                <w:b/>
+                <w:color w:val="001F60"/>
+                <w:spacing w:val="-5"/>
+                <w:sz w:val="13"/>
+              </w:rPr>
+              <w:t>${nota_efsrt5}</w:t>
+            </w:r>
           </w:p>
         </w:tc>
         <w:tc>
@@ -9284,16 +9430,30 @@
               <w:bottom w:val="single" w:sz="4" w:space="0" w:color="000000"/>
               <w:right w:val="single" w:sz="4" w:space="0" w:color="000000"/>
             </w:tcBorders>
-          </w:tcPr>
-          <w:p>
-            <w:pPr>
-              <w:pStyle w:val="TableParagraph"/>
-              <w:jc w:val="center"/>
-              <w:rPr>
-                <w:rFonts w:ascii="Arial" w:hAnsi="Arial" w:cs="Arial"/>
-                <w:sz w:val="10"/>
-              </w:rPr>
-            </w:pPr>
+            <w:vAlign w:val="bottom"/>
+          </w:tcPr>
+          <w:p>
+            <w:pPr>
+              <w:pStyle w:val="TableParagraph"/>
+              <w:jc w:val="center"/>
+              <w:rPr>
+                <w:rFonts w:ascii="Arial" w:hAnsi="Arial" w:cs="Arial"/>
+                <w:b/>
+                <w:color w:val="001F60"/>
+                <w:spacing w:val="-5"/>
+                <w:sz w:val="13"/>
+              </w:rPr>
+            </w:pPr>
+            <w:r>
+              <w:rPr>
+                <w:rFonts w:ascii="Arial" w:hAnsi="Arial" w:cs="Arial"/>
+                <w:b/>
+                <w:color w:val="001F60"/>
+                <w:spacing w:val="-5"/>
+                <w:sz w:val="13"/>
+              </w:rPr>
+              <w:t>${nota_efsrt6}</w:t>
+            </w:r>
           </w:p>
         </w:tc>
         <w:tc>
@@ -9959,16 +10119,30 @@
               <w:bottom w:val="single" w:sz="4" w:space="0" w:color="000000"/>
               <w:right w:val="single" w:sz="4" w:space="0" w:color="000000"/>
             </w:tcBorders>
-          </w:tcPr>
-          <w:p>
-            <w:pPr>
-              <w:pStyle w:val="TableParagraph"/>
-              <w:jc w:val="center"/>
-              <w:rPr>
-                <w:rFonts w:ascii="Arial" w:hAnsi="Arial" w:cs="Arial"/>
-                <w:sz w:val="10"/>
-              </w:rPr>
-            </w:pPr>
+            <w:vAlign w:val="bottom"/>
+          </w:tcPr>
+          <w:p>
+            <w:pPr>
+              <w:pStyle w:val="TableParagraph"/>
+              <w:jc w:val="center"/>
+              <w:rPr>
+                <w:rFonts w:ascii="Arial" w:hAnsi="Arial" w:cs="Arial"/>
+                <w:b/>
+                <w:color w:val="001F60"/>
+                <w:spacing w:val="-5"/>
+                <w:sz w:val="13"/>
+              </w:rPr>
+            </w:pPr>
+            <w:r>
+              <w:rPr>
+                <w:rFonts w:ascii="Arial" w:hAnsi="Arial" w:cs="Arial"/>
+                <w:b/>
+                <w:color w:val="001F60"/>
+                <w:spacing w:val="-5"/>
+                <w:sz w:val="13"/>
+              </w:rPr>
+              <w:t>${nota_efsrt7}</w:t>
+            </w:r>
           </w:p>
         </w:tc>
         <w:tc>
@@ -10634,16 +10808,30 @@
               <w:bottom w:val="single" w:sz="4" w:space="0" w:color="000000"/>
               <w:right w:val="single" w:sz="4" w:space="0" w:color="000000"/>
             </w:tcBorders>
-          </w:tcPr>
-          <w:p>
-            <w:pPr>
-              <w:pStyle w:val="TableParagraph"/>
-              <w:jc w:val="center"/>
-              <w:rPr>
-                <w:rFonts w:ascii="Arial" w:hAnsi="Arial" w:cs="Arial"/>
-                <w:sz w:val="10"/>
-              </w:rPr>
-            </w:pPr>
+            <w:vAlign w:val="bottom"/>
+          </w:tcPr>
+          <w:p>
+            <w:pPr>
+              <w:pStyle w:val="TableParagraph"/>
+              <w:jc w:val="center"/>
+              <w:rPr>
+                <w:rFonts w:ascii="Arial" w:hAnsi="Arial" w:cs="Arial"/>
+                <w:b/>
+                <w:color w:val="001F60"/>
+                <w:spacing w:val="-5"/>
+                <w:sz w:val="13"/>
+              </w:rPr>
+            </w:pPr>
+            <w:r>
+              <w:rPr>
+                <w:rFonts w:ascii="Arial" w:hAnsi="Arial" w:cs="Arial"/>
+                <w:b/>
+                <w:color w:val="001F60"/>
+                <w:spacing w:val="-5"/>
+                <w:sz w:val="13"/>
+              </w:rPr>
+              <w:t>${nota_efsrt8}</w:t>
+            </w:r>
           </w:p>
         </w:tc>
         <w:tc>
@@ -11309,16 +11497,30 @@
               <w:bottom w:val="single" w:sz="4" w:space="0" w:color="000000"/>
               <w:right w:val="single" w:sz="4" w:space="0" w:color="000000"/>
             </w:tcBorders>
-          </w:tcPr>
-          <w:p>
-            <w:pPr>
-              <w:pStyle w:val="TableParagraph"/>
-              <w:jc w:val="center"/>
-              <w:rPr>
-                <w:rFonts w:ascii="Arial" w:hAnsi="Arial" w:cs="Arial"/>
-                <w:sz w:val="10"/>
-              </w:rPr>
-            </w:pPr>
+            <w:vAlign w:val="bottom"/>
+          </w:tcPr>
+          <w:p>
+            <w:pPr>
+              <w:pStyle w:val="TableParagraph"/>
+              <w:jc w:val="center"/>
+              <w:rPr>
+                <w:rFonts w:ascii="Arial" w:hAnsi="Arial" w:cs="Arial"/>
+                <w:b/>
+                <w:color w:val="001F60"/>
+                <w:spacing w:val="-5"/>
+                <w:sz w:val="13"/>
+              </w:rPr>
+            </w:pPr>
+            <w:r>
+              <w:rPr>
+                <w:rFonts w:ascii="Arial" w:hAnsi="Arial" w:cs="Arial"/>
+                <w:b/>
+                <w:color w:val="001F60"/>
+                <w:spacing w:val="-5"/>
+                <w:sz w:val="13"/>
+              </w:rPr>
+              <w:t>${nota_efsrt9}</w:t>
+            </w:r>
           </w:p>
         </w:tc>
         <w:tc>
@@ -11984,16 +12186,30 @@
               <w:bottom w:val="single" w:sz="4" w:space="0" w:color="000000"/>
               <w:right w:val="single" w:sz="4" w:space="0" w:color="000000"/>
             </w:tcBorders>
-          </w:tcPr>
-          <w:p>
-            <w:pPr>
-              <w:pStyle w:val="TableParagraph"/>
-              <w:jc w:val="center"/>
-              <w:rPr>
-                <w:rFonts w:ascii="Arial" w:hAnsi="Arial" w:cs="Arial"/>
-                <w:sz w:val="10"/>
-              </w:rPr>
-            </w:pPr>
+            <w:vAlign w:val="bottom"/>
+          </w:tcPr>
+          <w:p>
+            <w:pPr>
+              <w:pStyle w:val="TableParagraph"/>
+              <w:jc w:val="center"/>
+              <w:rPr>
+                <w:rFonts w:ascii="Arial" w:hAnsi="Arial" w:cs="Arial"/>
+                <w:b/>
+                <w:color w:val="001F60"/>
+                <w:spacing w:val="-5"/>
+                <w:sz w:val="13"/>
+              </w:rPr>
+            </w:pPr>
+            <w:r>
+              <w:rPr>
+                <w:rFonts w:ascii="Arial" w:hAnsi="Arial" w:cs="Arial"/>
+                <w:b/>
+                <w:color w:val="001F60"/>
+                <w:spacing w:val="-5"/>
+                <w:sz w:val="13"/>
+              </w:rPr>
+              <w:t>${nota_efsrt10}</w:t>
+            </w:r>
           </w:p>
         </w:tc>
         <w:tc>
@@ -12659,16 +12875,30 @@
               <w:bottom w:val="single" w:sz="4" w:space="0" w:color="000000"/>
               <w:right w:val="single" w:sz="4" w:space="0" w:color="000000"/>
             </w:tcBorders>
-          </w:tcPr>
-          <w:p>
-            <w:pPr>
-              <w:pStyle w:val="TableParagraph"/>
-              <w:jc w:val="center"/>
-              <w:rPr>
-                <w:rFonts w:ascii="Arial" w:hAnsi="Arial" w:cs="Arial"/>
-                <w:sz w:val="10"/>
-              </w:rPr>
-            </w:pPr>
+            <w:vAlign w:val="bottom"/>
+          </w:tcPr>
+          <w:p>
+            <w:pPr>
+              <w:pStyle w:val="TableParagraph"/>
+              <w:jc w:val="center"/>
+              <w:rPr>
+                <w:rFonts w:ascii="Arial" w:hAnsi="Arial" w:cs="Arial"/>
+                <w:b/>
+                <w:color w:val="001F60"/>
+                <w:spacing w:val="-5"/>
+                <w:sz w:val="13"/>
+              </w:rPr>
+            </w:pPr>
+            <w:r>
+              <w:rPr>
+                <w:rFonts w:ascii="Arial" w:hAnsi="Arial" w:cs="Arial"/>
+                <w:b/>
+                <w:color w:val="001F60"/>
+                <w:spacing w:val="-5"/>
+                <w:sz w:val="13"/>
+              </w:rPr>
+              <w:t>${nota_efsrt11}</w:t>
+            </w:r>
           </w:p>
         </w:tc>
         <w:tc>
@@ -13334,16 +13564,30 @@
               <w:bottom w:val="single" w:sz="4" w:space="0" w:color="000000"/>
               <w:right w:val="single" w:sz="4" w:space="0" w:color="000000"/>
             </w:tcBorders>
-          </w:tcPr>
-          <w:p>
-            <w:pPr>
-              <w:pStyle w:val="TableParagraph"/>
-              <w:jc w:val="center"/>
-              <w:rPr>
-                <w:rFonts w:ascii="Arial" w:hAnsi="Arial" w:cs="Arial"/>
-                <w:sz w:val="10"/>
-              </w:rPr>
-            </w:pPr>
+            <w:vAlign w:val="bottom"/>
+          </w:tcPr>
+          <w:p>
+            <w:pPr>
+              <w:pStyle w:val="TableParagraph"/>
+              <w:jc w:val="center"/>
+              <w:rPr>
+                <w:rFonts w:ascii="Arial" w:hAnsi="Arial" w:cs="Arial"/>
+                <w:b/>
+                <w:color w:val="001F60"/>
+                <w:spacing w:val="-5"/>
+                <w:sz w:val="13"/>
+              </w:rPr>
+            </w:pPr>
+            <w:r>
+              <w:rPr>
+                <w:rFonts w:ascii="Arial" w:hAnsi="Arial" w:cs="Arial"/>
+                <w:b/>
+                <w:color w:val="001F60"/>
+                <w:spacing w:val="-5"/>
+                <w:sz w:val="13"/>
+              </w:rPr>
+              <w:t>${nota_efsrt12}</w:t>
+            </w:r>
           </w:p>
         </w:tc>
         <w:tc>
@@ -14009,16 +14253,30 @@
               <w:bottom w:val="single" w:sz="4" w:space="0" w:color="000000"/>
               <w:right w:val="single" w:sz="4" w:space="0" w:color="000000"/>
             </w:tcBorders>
-          </w:tcPr>
-          <w:p>
-            <w:pPr>
-              <w:pStyle w:val="TableParagraph"/>
-              <w:jc w:val="center"/>
-              <w:rPr>
-                <w:rFonts w:ascii="Arial" w:hAnsi="Arial" w:cs="Arial"/>
-                <w:sz w:val="10"/>
-              </w:rPr>
-            </w:pPr>
+            <w:vAlign w:val="bottom"/>
+          </w:tcPr>
+          <w:p>
+            <w:pPr>
+              <w:pStyle w:val="TableParagraph"/>
+              <w:jc w:val="center"/>
+              <w:rPr>
+                <w:rFonts w:ascii="Arial" w:hAnsi="Arial" w:cs="Arial"/>
+                <w:b/>
+                <w:color w:val="001F60"/>
+                <w:spacing w:val="-5"/>
+                <w:sz w:val="13"/>
+              </w:rPr>
+            </w:pPr>
+            <w:r>
+              <w:rPr>
+                <w:rFonts w:ascii="Arial" w:hAnsi="Arial" w:cs="Arial"/>
+                <w:b/>
+                <w:color w:val="001F60"/>
+                <w:spacing w:val="-5"/>
+                <w:sz w:val="13"/>
+              </w:rPr>
+              <w:t>${nota_efsrt13}</w:t>
+            </w:r>
           </w:p>
         </w:tc>
         <w:tc>
@@ -14196,6 +14454,7 @@
                 <w:spacing w:val="-10"/>
                 <w:sz w:val="10"/>
               </w:rPr>
+              <w:lastRenderedPageBreak/>
               <w:t>14</w:t>
             </w:r>
           </w:p>
@@ -14684,16 +14943,30 @@
               <w:bottom w:val="single" w:sz="4" w:space="0" w:color="000000"/>
               <w:right w:val="single" w:sz="4" w:space="0" w:color="000000"/>
             </w:tcBorders>
-          </w:tcPr>
-          <w:p>
-            <w:pPr>
-              <w:pStyle w:val="TableParagraph"/>
-              <w:jc w:val="center"/>
-              <w:rPr>
-                <w:rFonts w:ascii="Arial" w:hAnsi="Arial" w:cs="Arial"/>
-                <w:sz w:val="10"/>
-              </w:rPr>
-            </w:pPr>
+            <w:vAlign w:val="bottom"/>
+          </w:tcPr>
+          <w:p>
+            <w:pPr>
+              <w:pStyle w:val="TableParagraph"/>
+              <w:jc w:val="center"/>
+              <w:rPr>
+                <w:rFonts w:ascii="Arial" w:hAnsi="Arial" w:cs="Arial"/>
+                <w:b/>
+                <w:color w:val="001F60"/>
+                <w:spacing w:val="-5"/>
+                <w:sz w:val="13"/>
+              </w:rPr>
+            </w:pPr>
+            <w:r>
+              <w:rPr>
+                <w:rFonts w:ascii="Arial" w:hAnsi="Arial" w:cs="Arial"/>
+                <w:b/>
+                <w:color w:val="001F60"/>
+                <w:spacing w:val="-5"/>
+                <w:sz w:val="13"/>
+              </w:rPr>
+              <w:t>${nota_efsrt14}</w:t>
+            </w:r>
           </w:p>
         </w:tc>
         <w:tc>
@@ -14871,7 +15144,6 @@
                 <w:spacing w:val="-10"/>
                 <w:sz w:val="10"/>
               </w:rPr>
-              <w:lastRenderedPageBreak/>
               <w:t>15</w:t>
             </w:r>
           </w:p>
@@ -15360,16 +15632,30 @@
               <w:bottom w:val="single" w:sz="4" w:space="0" w:color="000000"/>
               <w:right w:val="single" w:sz="4" w:space="0" w:color="000000"/>
             </w:tcBorders>
-          </w:tcPr>
-          <w:p>
-            <w:pPr>
-              <w:pStyle w:val="TableParagraph"/>
-              <w:jc w:val="center"/>
-              <w:rPr>
-                <w:rFonts w:ascii="Arial" w:hAnsi="Arial" w:cs="Arial"/>
-                <w:sz w:val="10"/>
-              </w:rPr>
-            </w:pPr>
+            <w:vAlign w:val="bottom"/>
+          </w:tcPr>
+          <w:p>
+            <w:pPr>
+              <w:pStyle w:val="TableParagraph"/>
+              <w:jc w:val="center"/>
+              <w:rPr>
+                <w:rFonts w:ascii="Arial" w:hAnsi="Arial" w:cs="Arial"/>
+                <w:b/>
+                <w:color w:val="001F60"/>
+                <w:spacing w:val="-5"/>
+                <w:sz w:val="13"/>
+              </w:rPr>
+            </w:pPr>
+            <w:r>
+              <w:rPr>
+                <w:rFonts w:ascii="Arial" w:hAnsi="Arial" w:cs="Arial"/>
+                <w:b/>
+                <w:color w:val="001F60"/>
+                <w:spacing w:val="-5"/>
+                <w:sz w:val="13"/>
+              </w:rPr>
+              <w:t>${nota_efsrt15}</w:t>
+            </w:r>
           </w:p>
         </w:tc>
         <w:tc>
@@ -16035,16 +16321,30 @@
               <w:bottom w:val="single" w:sz="4" w:space="0" w:color="000000"/>
               <w:right w:val="single" w:sz="4" w:space="0" w:color="000000"/>
             </w:tcBorders>
-          </w:tcPr>
-          <w:p>
-            <w:pPr>
-              <w:pStyle w:val="TableParagraph"/>
-              <w:jc w:val="center"/>
-              <w:rPr>
-                <w:rFonts w:ascii="Arial" w:hAnsi="Arial" w:cs="Arial"/>
-                <w:sz w:val="10"/>
-              </w:rPr>
-            </w:pPr>
+            <w:vAlign w:val="bottom"/>
+          </w:tcPr>
+          <w:p>
+            <w:pPr>
+              <w:pStyle w:val="TableParagraph"/>
+              <w:jc w:val="center"/>
+              <w:rPr>
+                <w:rFonts w:ascii="Arial" w:hAnsi="Arial" w:cs="Arial"/>
+                <w:b/>
+                <w:color w:val="001F60"/>
+                <w:spacing w:val="-5"/>
+                <w:sz w:val="13"/>
+              </w:rPr>
+            </w:pPr>
+            <w:r>
+              <w:rPr>
+                <w:rFonts w:ascii="Arial" w:hAnsi="Arial" w:cs="Arial"/>
+                <w:b/>
+                <w:color w:val="001F60"/>
+                <w:spacing w:val="-5"/>
+                <w:sz w:val="13"/>
+              </w:rPr>
+              <w:t>${nota_efsrt16}</w:t>
+            </w:r>
           </w:p>
         </w:tc>
         <w:tc>
@@ -16666,16 +16966,30 @@
               <w:bottom w:val="single" w:sz="4" w:space="0" w:color="000000"/>
               <w:right w:val="single" w:sz="4" w:space="0" w:color="000000"/>
             </w:tcBorders>
-          </w:tcPr>
-          <w:p>
-            <w:pPr>
-              <w:pStyle w:val="TableParagraph"/>
-              <w:jc w:val="center"/>
-              <w:rPr>
-                <w:rFonts w:ascii="Arial" w:hAnsi="Arial" w:cs="Arial"/>
-                <w:sz w:val="10"/>
-              </w:rPr>
-            </w:pPr>
+            <w:vAlign w:val="bottom"/>
+          </w:tcPr>
+          <w:p>
+            <w:pPr>
+              <w:pStyle w:val="TableParagraph"/>
+              <w:jc w:val="center"/>
+              <w:rPr>
+                <w:rFonts w:ascii="Arial" w:hAnsi="Arial" w:cs="Arial"/>
+                <w:b/>
+                <w:color w:val="001F60"/>
+                <w:spacing w:val="-5"/>
+                <w:sz w:val="13"/>
+              </w:rPr>
+            </w:pPr>
+            <w:r>
+              <w:rPr>
+                <w:rFonts w:ascii="Arial" w:hAnsi="Arial" w:cs="Arial"/>
+                <w:b/>
+                <w:color w:val="001F60"/>
+                <w:spacing w:val="-5"/>
+                <w:sz w:val="13"/>
+              </w:rPr>
+              <w:t>${nota_efsrt17}</w:t>
+            </w:r>
           </w:p>
         </w:tc>
         <w:tc>
@@ -17297,16 +17611,30 @@
               <w:bottom w:val="single" w:sz="4" w:space="0" w:color="000000"/>
               <w:right w:val="single" w:sz="4" w:space="0" w:color="000000"/>
             </w:tcBorders>
-          </w:tcPr>
-          <w:p>
-            <w:pPr>
-              <w:pStyle w:val="TableParagraph"/>
-              <w:jc w:val="center"/>
-              <w:rPr>
-                <w:rFonts w:ascii="Arial" w:hAnsi="Arial" w:cs="Arial"/>
-                <w:sz w:val="10"/>
-              </w:rPr>
-            </w:pPr>
+            <w:vAlign w:val="bottom"/>
+          </w:tcPr>
+          <w:p>
+            <w:pPr>
+              <w:pStyle w:val="TableParagraph"/>
+              <w:jc w:val="center"/>
+              <w:rPr>
+                <w:rFonts w:ascii="Arial" w:hAnsi="Arial" w:cs="Arial"/>
+                <w:b/>
+                <w:color w:val="001F60"/>
+                <w:spacing w:val="-5"/>
+                <w:sz w:val="13"/>
+              </w:rPr>
+            </w:pPr>
+            <w:r>
+              <w:rPr>
+                <w:rFonts w:ascii="Arial" w:hAnsi="Arial" w:cs="Arial"/>
+                <w:b/>
+                <w:color w:val="001F60"/>
+                <w:spacing w:val="-5"/>
+                <w:sz w:val="13"/>
+              </w:rPr>
+              <w:t>${nota_efsrt18}</w:t>
+            </w:r>
           </w:p>
         </w:tc>
         <w:tc>
@@ -17972,16 +18300,30 @@
               <w:bottom w:val="single" w:sz="4" w:space="0" w:color="000000"/>
               <w:right w:val="single" w:sz="4" w:space="0" w:color="000000"/>
             </w:tcBorders>
-          </w:tcPr>
-          <w:p>
-            <w:pPr>
-              <w:pStyle w:val="TableParagraph"/>
-              <w:jc w:val="center"/>
-              <w:rPr>
-                <w:rFonts w:ascii="Arial" w:hAnsi="Arial" w:cs="Arial"/>
-                <w:sz w:val="10"/>
-              </w:rPr>
-            </w:pPr>
+            <w:vAlign w:val="bottom"/>
+          </w:tcPr>
+          <w:p>
+            <w:pPr>
+              <w:pStyle w:val="TableParagraph"/>
+              <w:jc w:val="center"/>
+              <w:rPr>
+                <w:rFonts w:ascii="Arial" w:hAnsi="Arial" w:cs="Arial"/>
+                <w:b/>
+                <w:color w:val="001F60"/>
+                <w:spacing w:val="-5"/>
+                <w:sz w:val="13"/>
+              </w:rPr>
+            </w:pPr>
+            <w:r>
+              <w:rPr>
+                <w:rFonts w:ascii="Arial" w:hAnsi="Arial" w:cs="Arial"/>
+                <w:b/>
+                <w:color w:val="001F60"/>
+                <w:spacing w:val="-5"/>
+                <w:sz w:val="13"/>
+              </w:rPr>
+              <w:t>${nota_efsrt19}</w:t>
+            </w:r>
           </w:p>
         </w:tc>
         <w:tc>
@@ -18639,16 +18981,30 @@
               <w:left w:val="single" w:sz="4" w:space="0" w:color="000000"/>
               <w:right w:val="single" w:sz="4" w:space="0" w:color="000000"/>
             </w:tcBorders>
-          </w:tcPr>
-          <w:p>
-            <w:pPr>
-              <w:pStyle w:val="TableParagraph"/>
-              <w:jc w:val="center"/>
-              <w:rPr>
-                <w:rFonts w:ascii="Arial" w:hAnsi="Arial" w:cs="Arial"/>
-                <w:sz w:val="10"/>
-              </w:rPr>
-            </w:pPr>
+            <w:vAlign w:val="bottom"/>
+          </w:tcPr>
+          <w:p>
+            <w:pPr>
+              <w:pStyle w:val="TableParagraph"/>
+              <w:jc w:val="center"/>
+              <w:rPr>
+                <w:rFonts w:ascii="Arial" w:hAnsi="Arial" w:cs="Arial"/>
+                <w:b/>
+                <w:color w:val="001F60"/>
+                <w:spacing w:val="-5"/>
+                <w:sz w:val="13"/>
+              </w:rPr>
+            </w:pPr>
+            <w:r>
+              <w:rPr>
+                <w:rFonts w:ascii="Arial" w:hAnsi="Arial" w:cs="Arial"/>
+                <w:b/>
+                <w:color w:val="001F60"/>
+                <w:spacing w:val="-5"/>
+                <w:sz w:val="13"/>
+              </w:rPr>
+              <w:t>${nota_efsrt20}</w:t>
+            </w:r>
           </w:p>
         </w:tc>
         <w:tc>
@@ -19957,59 +20313,21 @@
               <w:rPr>
                 <w:sz w:val="9"/>
               </w:rPr>
-              <w:t>EXPERIENCIAS FORMATIVAS EN</w:t>
-            </w:r>
-            <w:r>
-              <w:rPr>
-                <w:spacing w:val="40"/>
+              <w:t>${</w:t>
+            </w:r>
+            <w:proofErr w:type="spellStart"/>
+            <w:r>
+              <w:rPr>
                 <w:sz w:val="9"/>
               </w:rPr>
-              <w:t xml:space="preserve"> </w:t>
-            </w:r>
+              <w:t>efsrt</w:t>
+            </w:r>
+            <w:proofErr w:type="spellEnd"/>
             <w:r>
               <w:rPr>
                 <w:sz w:val="9"/>
               </w:rPr>
-              <w:t>SITUACIONES</w:t>
-            </w:r>
-            <w:r>
-              <w:rPr>
-                <w:spacing w:val="-7"/>
-                <w:sz w:val="9"/>
-              </w:rPr>
-              <w:t xml:space="preserve"> </w:t>
-            </w:r>
-            <w:r>
-              <w:rPr>
-                <w:sz w:val="9"/>
-              </w:rPr>
-              <w:t>REALES</w:t>
-            </w:r>
-            <w:r>
-              <w:rPr>
-                <w:spacing w:val="-5"/>
-                <w:sz w:val="9"/>
-              </w:rPr>
-              <w:t xml:space="preserve"> </w:t>
-            </w:r>
-            <w:r>
-              <w:rPr>
-                <w:sz w:val="9"/>
-              </w:rPr>
-              <w:t>DE</w:t>
-            </w:r>
-            <w:r>
-              <w:rPr>
-                <w:spacing w:val="-7"/>
-                <w:sz w:val="9"/>
-              </w:rPr>
-              <w:t xml:space="preserve"> </w:t>
-            </w:r>
-            <w:r>
-              <w:rPr>
-                <w:sz w:val="9"/>
-              </w:rPr>
-              <w:t>TRABAJO</w:t>
+              <w:t>}</w:t>
             </w:r>
           </w:p>
         </w:tc>
@@ -20602,42 +20920,33 @@
                 <w:b/>
                 <w:sz w:val="10"/>
               </w:rPr>
-              <w:t>2</w:t>
+              <w:t>${</w:t>
             </w:r>
             <w:r>
               <w:rPr>
                 <w:rFonts w:ascii="Arial"/>
                 <w:b/>
-                <w:spacing w:val="-1"/>
                 <w:sz w:val="10"/>
-              </w:rPr>
-              <w:t xml:space="preserve"> </w:t>
+                <w:lang w:val="es-PE"/>
+              </w:rPr>
+              <w:t>c/h_</w:t>
             </w:r>
             <w:r>
               <w:rPr>
                 <w:rFonts w:ascii="Arial"/>
                 <w:b/>
                 <w:sz w:val="10"/>
-              </w:rPr>
-              <w:t>/</w:t>
+                <w:lang w:val="es-PE"/>
+              </w:rPr>
+              <w:t>u1</w:t>
             </w:r>
             <w:r>
               <w:rPr>
                 <w:rFonts w:ascii="Arial"/>
                 <w:b/>
-                <w:spacing w:val="1"/>
                 <w:sz w:val="10"/>
               </w:rPr>
-              <w:t xml:space="preserve"> </w:t>
-            </w:r>
-            <w:r>
-              <w:rPr>
-                <w:rFonts w:ascii="Arial"/>
-                <w:b/>
-                <w:spacing w:val="-5"/>
-                <w:sz w:val="10"/>
-              </w:rPr>
-              <w:t>32</w:t>
+              <w:t>}</w:t>
             </w:r>
           </w:p>
         </w:tc>
@@ -20667,42 +20976,54 @@
                 <w:b/>
                 <w:sz w:val="10"/>
               </w:rPr>
+              <w:t>${</w:t>
+            </w:r>
+            <w:r>
+              <w:rPr>
+                <w:rFonts w:ascii="Arial"/>
+                <w:b/>
+                <w:sz w:val="10"/>
+                <w:lang w:val="es-PE"/>
+              </w:rPr>
+              <w:t>c/</w:t>
+            </w:r>
+            <w:proofErr w:type="spellStart"/>
+            <w:r>
+              <w:rPr>
+                <w:rFonts w:ascii="Arial"/>
+                <w:b/>
+                <w:sz w:val="10"/>
+                <w:lang w:val="es-PE"/>
+              </w:rPr>
+              <w:t>h_</w:t>
+            </w:r>
+            <w:r>
+              <w:rPr>
+                <w:rFonts w:ascii="Arial"/>
+                <w:b/>
+                <w:sz w:val="10"/>
+                <w:u w:val="single"/>
+                <w:lang w:val="es-PE"/>
+              </w:rPr>
+              <w:t>u</w:t>
+            </w:r>
+            <w:proofErr w:type="spellEnd"/>
+            <w:r>
+              <w:rPr>
+                <w:rFonts w:ascii="Arial"/>
+                <w:b/>
+                <w:sz w:val="10"/>
+                <w:u w:val="single"/>
+              </w:rPr>
               <w:t>2</w:t>
             </w:r>
             <w:r>
               <w:rPr>
                 <w:rFonts w:ascii="Arial"/>
                 <w:b/>
-                <w:spacing w:val="-1"/>
                 <w:sz w:val="10"/>
               </w:rPr>
-              <w:t xml:space="preserve"> </w:t>
-            </w:r>
-            <w:r>
-              <w:rPr>
-                <w:rFonts w:ascii="Arial"/>
-                <w:b/>
-                <w:sz w:val="10"/>
-              </w:rPr>
-              <w:t>/</w:t>
-            </w:r>
-            <w:r>
-              <w:rPr>
-                <w:rFonts w:ascii="Arial"/>
-                <w:b/>
-                <w:spacing w:val="1"/>
-                <w:sz w:val="10"/>
-              </w:rPr>
-              <w:t xml:space="preserve"> </w:t>
-            </w:r>
-            <w:r>
-              <w:rPr>
-                <w:rFonts w:ascii="Arial"/>
-                <w:b/>
-                <w:spacing w:val="-5"/>
-                <w:sz w:val="10"/>
-              </w:rPr>
-              <w:t>48</w:t>
+              <w:t>}</w:t>
             </w:r>
           </w:p>
         </w:tc>
@@ -20732,16 +21053,16 @@
                 <w:b/>
                 <w:sz w:val="10"/>
               </w:rPr>
-              <w:t>2</w:t>
+              <w:t>${</w:t>
             </w:r>
             <w:r>
               <w:rPr>
                 <w:rFonts w:ascii="Arial"/>
                 <w:b/>
-                <w:spacing w:val="-1"/>
                 <w:sz w:val="10"/>
-              </w:rPr>
-              <w:t xml:space="preserve"> </w:t>
+                <w:lang w:val="es-PE"/>
+              </w:rPr>
+              <w:t>c/h</w:t>
             </w:r>
             <w:r>
               <w:rPr>
@@ -20749,25 +21070,7 @@
                 <w:b/>
                 <w:sz w:val="10"/>
               </w:rPr>
-              <w:t>/</w:t>
-            </w:r>
-            <w:r>
-              <w:rPr>
-                <w:rFonts w:ascii="Arial"/>
-                <w:b/>
-                <w:spacing w:val="2"/>
-                <w:sz w:val="10"/>
-              </w:rPr>
-              <w:t xml:space="preserve"> </w:t>
-            </w:r>
-            <w:r>
-              <w:rPr>
-                <w:rFonts w:ascii="Arial"/>
-                <w:b/>
-                <w:spacing w:val="-5"/>
-                <w:sz w:val="10"/>
-              </w:rPr>
-              <w:t>48</w:t>
+              <w:t>_u3}</w:t>
             </w:r>
           </w:p>
         </w:tc>
@@ -20797,16 +21100,16 @@
                 <w:b/>
                 <w:sz w:val="10"/>
               </w:rPr>
-              <w:t>3</w:t>
+              <w:t>${</w:t>
             </w:r>
             <w:r>
               <w:rPr>
                 <w:rFonts w:ascii="Arial"/>
                 <w:b/>
-                <w:spacing w:val="-1"/>
                 <w:sz w:val="10"/>
-              </w:rPr>
-              <w:t xml:space="preserve"> </w:t>
+                <w:lang w:val="es-PE"/>
+              </w:rPr>
+              <w:t>c/h</w:t>
             </w:r>
             <w:r>
               <w:rPr>
@@ -20814,25 +21117,7 @@
                 <w:b/>
                 <w:sz w:val="10"/>
               </w:rPr>
-              <w:t>/</w:t>
-            </w:r>
-            <w:r>
-              <w:rPr>
-                <w:rFonts w:ascii="Arial"/>
-                <w:b/>
-                <w:spacing w:val="1"/>
-                <w:sz w:val="10"/>
-              </w:rPr>
-              <w:t xml:space="preserve"> </w:t>
-            </w:r>
-            <w:r>
-              <w:rPr>
-                <w:rFonts w:ascii="Arial"/>
-                <w:b/>
-                <w:spacing w:val="-5"/>
-                <w:sz w:val="10"/>
-              </w:rPr>
-              <w:t>64</w:t>
+              <w:t>_u4}</w:t>
             </w:r>
           </w:p>
         </w:tc>
@@ -20862,16 +21147,16 @@
                 <w:b/>
                 <w:sz w:val="10"/>
               </w:rPr>
-              <w:t>2</w:t>
+              <w:t>${</w:t>
             </w:r>
             <w:r>
               <w:rPr>
                 <w:rFonts w:ascii="Arial"/>
                 <w:b/>
-                <w:spacing w:val="-1"/>
                 <w:sz w:val="10"/>
-              </w:rPr>
-              <w:t xml:space="preserve"> </w:t>
+                <w:lang w:val="es-PE"/>
+              </w:rPr>
+              <w:t>c/h</w:t>
             </w:r>
             <w:r>
               <w:rPr>
@@ -20879,25 +21164,7 @@
                 <w:b/>
                 <w:sz w:val="10"/>
               </w:rPr>
-              <w:t>/</w:t>
-            </w:r>
-            <w:r>
-              <w:rPr>
-                <w:rFonts w:ascii="Arial"/>
-                <w:b/>
-                <w:spacing w:val="2"/>
-                <w:sz w:val="10"/>
-              </w:rPr>
-              <w:t xml:space="preserve"> </w:t>
-            </w:r>
-            <w:r>
-              <w:rPr>
-                <w:rFonts w:ascii="Arial"/>
-                <w:b/>
-                <w:spacing w:val="-5"/>
-                <w:sz w:val="10"/>
-              </w:rPr>
-              <w:t>48</w:t>
+              <w:t>_u5}</w:t>
             </w:r>
           </w:p>
         </w:tc>
@@ -20927,16 +21194,16 @@
                 <w:b/>
                 <w:sz w:val="10"/>
               </w:rPr>
-              <w:t>2</w:t>
+              <w:t>${</w:t>
             </w:r>
             <w:r>
               <w:rPr>
                 <w:rFonts w:ascii="Arial"/>
                 <w:b/>
-                <w:spacing w:val="-1"/>
                 <w:sz w:val="10"/>
-              </w:rPr>
-              <w:t xml:space="preserve"> </w:t>
+                <w:lang w:val="es-PE"/>
+              </w:rPr>
+              <w:t>c/h</w:t>
             </w:r>
             <w:r>
               <w:rPr>
@@ -20944,25 +21211,7 @@
                 <w:b/>
                 <w:sz w:val="10"/>
               </w:rPr>
-              <w:t>/</w:t>
-            </w:r>
-            <w:r>
-              <w:rPr>
-                <w:rFonts w:ascii="Arial"/>
-                <w:b/>
-                <w:spacing w:val="1"/>
-                <w:sz w:val="10"/>
-              </w:rPr>
-              <w:t xml:space="preserve"> </w:t>
-            </w:r>
-            <w:r>
-              <w:rPr>
-                <w:rFonts w:ascii="Arial"/>
-                <w:b/>
-                <w:spacing w:val="-5"/>
-                <w:sz w:val="10"/>
-              </w:rPr>
-              <w:t>48</w:t>
+              <w:t>_u6}</w:t>
             </w:r>
           </w:p>
         </w:tc>
@@ -20978,11 +21227,38 @@
           <w:p>
             <w:pPr>
               <w:pStyle w:val="TableParagraph"/>
+              <w:spacing w:before="57"/>
+              <w:ind w:left="63"/>
               <w:rPr>
                 <w:rFonts w:ascii="Times New Roman"/>
                 <w:sz w:val="8"/>
               </w:rPr>
             </w:pPr>
+            <w:r>
+              <w:rPr>
+                <w:rFonts w:ascii="Arial"/>
+                <w:b/>
+                <w:sz w:val="10"/>
+              </w:rPr>
+              <w:t>${</w:t>
+            </w:r>
+            <w:r>
+              <w:rPr>
+                <w:rFonts w:ascii="Arial"/>
+                <w:b/>
+                <w:sz w:val="10"/>
+                <w:lang w:val="es-PE"/>
+              </w:rPr>
+              <w:t>c/h</w:t>
+            </w:r>
+            <w:r>
+              <w:rPr>
+                <w:rFonts w:ascii="Arial"/>
+                <w:b/>
+                <w:sz w:val="10"/>
+              </w:rPr>
+              <w:t>_u7}</w:t>
+            </w:r>
           </w:p>
         </w:tc>
         <w:tc>
@@ -20997,11 +21273,39 @@
           <w:p>
             <w:pPr>
               <w:pStyle w:val="TableParagraph"/>
-              <w:rPr>
-                <w:rFonts w:ascii="Times New Roman"/>
-                <w:sz w:val="8"/>
-              </w:rPr>
-            </w:pPr>
+              <w:spacing w:before="57"/>
+              <w:ind w:left="63"/>
+              <w:rPr>
+                <w:rFonts w:ascii="Arial"/>
+                <w:b/>
+                <w:sz w:val="10"/>
+              </w:rPr>
+            </w:pPr>
+            <w:r>
+              <w:rPr>
+                <w:rFonts w:ascii="Arial"/>
+                <w:b/>
+                <w:sz w:val="10"/>
+              </w:rPr>
+              <w:t>${</w:t>
+            </w:r>
+            <w:r>
+              <w:rPr>
+                <w:rFonts w:ascii="Arial"/>
+                <w:b/>
+                <w:sz w:val="10"/>
+                <w:lang w:val="es-PE"/>
+              </w:rPr>
+              <w:t>c/h</w:t>
+            </w:r>
+            <w:r>
+              <w:rPr>
+                <w:rFonts w:ascii="Arial"/>
+                <w:b/>
+                <w:sz w:val="10"/>
+              </w:rPr>
+              <w:t>_u8}</w:t>
+            </w:r>
           </w:p>
         </w:tc>
         <w:tc>
@@ -21016,11 +21320,39 @@
           <w:p>
             <w:pPr>
               <w:pStyle w:val="TableParagraph"/>
-              <w:rPr>
-                <w:rFonts w:ascii="Times New Roman"/>
-                <w:sz w:val="8"/>
-              </w:rPr>
-            </w:pPr>
+              <w:spacing w:before="57"/>
+              <w:ind w:left="63"/>
+              <w:rPr>
+                <w:rFonts w:ascii="Arial"/>
+                <w:b/>
+                <w:sz w:val="10"/>
+              </w:rPr>
+            </w:pPr>
+            <w:r>
+              <w:rPr>
+                <w:rFonts w:ascii="Arial"/>
+                <w:b/>
+                <w:sz w:val="10"/>
+              </w:rPr>
+              <w:t>${</w:t>
+            </w:r>
+            <w:r>
+              <w:rPr>
+                <w:rFonts w:ascii="Arial"/>
+                <w:b/>
+                <w:sz w:val="10"/>
+                <w:lang w:val="es-PE"/>
+              </w:rPr>
+              <w:t>c/h</w:t>
+            </w:r>
+            <w:r>
+              <w:rPr>
+                <w:rFonts w:ascii="Arial"/>
+                <w:b/>
+                <w:sz w:val="10"/>
+              </w:rPr>
+              <w:t>_u9}</w:t>
+            </w:r>
           </w:p>
         </w:tc>
         <w:tc>
@@ -21035,11 +21367,39 @@
           <w:p>
             <w:pPr>
               <w:pStyle w:val="TableParagraph"/>
-              <w:rPr>
-                <w:rFonts w:ascii="Times New Roman"/>
-                <w:sz w:val="8"/>
-              </w:rPr>
-            </w:pPr>
+              <w:spacing w:before="57"/>
+              <w:ind w:left="63"/>
+              <w:rPr>
+                <w:rFonts w:ascii="Arial"/>
+                <w:b/>
+                <w:sz w:val="10"/>
+              </w:rPr>
+            </w:pPr>
+            <w:r>
+              <w:rPr>
+                <w:rFonts w:ascii="Arial"/>
+                <w:b/>
+                <w:sz w:val="10"/>
+              </w:rPr>
+              <w:t>${</w:t>
+            </w:r>
+            <w:r>
+              <w:rPr>
+                <w:rFonts w:ascii="Arial"/>
+                <w:b/>
+                <w:sz w:val="10"/>
+                <w:lang w:val="es-PE"/>
+              </w:rPr>
+              <w:t>c/h</w:t>
+            </w:r>
+            <w:r>
+              <w:rPr>
+                <w:rFonts w:ascii="Arial"/>
+                <w:b/>
+                <w:sz w:val="10"/>
+              </w:rPr>
+              <w:t>_u10}</w:t>
+            </w:r>
           </w:p>
         </w:tc>
         <w:tc>
@@ -21055,7 +21415,7 @@
             <w:pPr>
               <w:pStyle w:val="TableParagraph"/>
               <w:spacing w:before="57"/>
-              <w:ind w:left="34" w:right="-15"/>
+              <w:ind w:left="63"/>
               <w:rPr>
                 <w:rFonts w:ascii="Arial"/>
                 <w:b/>
@@ -21068,42 +21428,25 @@
                 <w:b/>
                 <w:sz w:val="10"/>
               </w:rPr>
-              <w:t>6</w:t>
-            </w:r>
+              <w:t>${c/</w:t>
+            </w:r>
+            <w:proofErr w:type="spellStart"/>
             <w:r>
               <w:rPr>
                 <w:rFonts w:ascii="Arial"/>
                 <w:b/>
-                <w:spacing w:val="-1"/>
                 <w:sz w:val="10"/>
               </w:rPr>
-              <w:t xml:space="preserve"> </w:t>
-            </w:r>
+              <w:t>h_efsrt</w:t>
+            </w:r>
+            <w:proofErr w:type="spellEnd"/>
             <w:r>
               <w:rPr>
                 <w:rFonts w:ascii="Arial"/>
                 <w:b/>
                 <w:sz w:val="10"/>
               </w:rPr>
-              <w:t>/</w:t>
-            </w:r>
-            <w:r>
-              <w:rPr>
-                <w:rFonts w:ascii="Arial"/>
-                <w:b/>
-                <w:spacing w:val="1"/>
-                <w:sz w:val="10"/>
-              </w:rPr>
-              <w:t xml:space="preserve"> </w:t>
-            </w:r>
-            <w:r>
-              <w:rPr>
-                <w:rFonts w:ascii="Arial"/>
-                <w:b/>
-                <w:spacing w:val="-5"/>
-                <w:sz w:val="10"/>
-              </w:rPr>
-              <w:t>192</w:t>
+              <w:t>}</w:t>
             </w:r>
           </w:p>
         </w:tc>
@@ -21847,16 +22190,30 @@
               <w:bottom w:val="single" w:sz="4" w:space="0" w:color="000000"/>
               <w:right w:val="single" w:sz="4" w:space="0" w:color="000000"/>
             </w:tcBorders>
-          </w:tcPr>
-          <w:p>
-            <w:pPr>
-              <w:pStyle w:val="TableParagraph"/>
-              <w:jc w:val="center"/>
-              <w:rPr>
-                <w:rFonts w:ascii="Arial" w:hAnsi="Arial" w:cs="Arial"/>
-                <w:sz w:val="8"/>
-              </w:rPr>
-            </w:pPr>
+            <w:vAlign w:val="bottom"/>
+          </w:tcPr>
+          <w:p>
+            <w:pPr>
+              <w:pStyle w:val="TableParagraph"/>
+              <w:jc w:val="center"/>
+              <w:rPr>
+                <w:rFonts w:ascii="Arial" w:hAnsi="Arial" w:cs="Arial"/>
+                <w:b/>
+                <w:color w:val="001F60"/>
+                <w:spacing w:val="-5"/>
+                <w:sz w:val="13"/>
+              </w:rPr>
+            </w:pPr>
+            <w:r>
+              <w:rPr>
+                <w:rFonts w:ascii="Arial" w:hAnsi="Arial" w:cs="Arial"/>
+                <w:b/>
+                <w:color w:val="001F60"/>
+                <w:spacing w:val="-5"/>
+                <w:sz w:val="13"/>
+              </w:rPr>
+              <w:t>${nota_efsrt21}</w:t>
+            </w:r>
           </w:p>
         </w:tc>
         <w:tc>
@@ -22718,16 +23075,30 @@
               <w:bottom w:val="single" w:sz="4" w:space="0" w:color="000000"/>
               <w:right w:val="single" w:sz="4" w:space="0" w:color="000000"/>
             </w:tcBorders>
-          </w:tcPr>
-          <w:p>
-            <w:pPr>
-              <w:pStyle w:val="TableParagraph"/>
-              <w:jc w:val="center"/>
-              <w:rPr>
-                <w:rFonts w:ascii="Arial" w:hAnsi="Arial" w:cs="Arial"/>
-                <w:sz w:val="8"/>
-              </w:rPr>
-            </w:pPr>
+            <w:vAlign w:val="bottom"/>
+          </w:tcPr>
+          <w:p>
+            <w:pPr>
+              <w:pStyle w:val="TableParagraph"/>
+              <w:jc w:val="center"/>
+              <w:rPr>
+                <w:rFonts w:ascii="Arial" w:hAnsi="Arial" w:cs="Arial"/>
+                <w:b/>
+                <w:color w:val="001F60"/>
+                <w:spacing w:val="-5"/>
+                <w:sz w:val="13"/>
+              </w:rPr>
+            </w:pPr>
+            <w:r>
+              <w:rPr>
+                <w:rFonts w:ascii="Arial" w:hAnsi="Arial" w:cs="Arial"/>
+                <w:b/>
+                <w:color w:val="001F60"/>
+                <w:spacing w:val="-5"/>
+                <w:sz w:val="13"/>
+              </w:rPr>
+              <w:t>${nota_efsrt22}</w:t>
+            </w:r>
           </w:p>
         </w:tc>
         <w:tc>
@@ -23591,16 +23962,30 @@
               <w:bottom w:val="single" w:sz="4" w:space="0" w:color="000000"/>
               <w:right w:val="single" w:sz="4" w:space="0" w:color="000000"/>
             </w:tcBorders>
-          </w:tcPr>
-          <w:p>
-            <w:pPr>
-              <w:pStyle w:val="TableParagraph"/>
-              <w:jc w:val="center"/>
-              <w:rPr>
-                <w:rFonts w:ascii="Arial" w:hAnsi="Arial" w:cs="Arial"/>
-                <w:sz w:val="8"/>
-              </w:rPr>
-            </w:pPr>
+            <w:vAlign w:val="bottom"/>
+          </w:tcPr>
+          <w:p>
+            <w:pPr>
+              <w:pStyle w:val="TableParagraph"/>
+              <w:jc w:val="center"/>
+              <w:rPr>
+                <w:rFonts w:ascii="Arial" w:hAnsi="Arial" w:cs="Arial"/>
+                <w:b/>
+                <w:color w:val="001F60"/>
+                <w:spacing w:val="-5"/>
+                <w:sz w:val="13"/>
+              </w:rPr>
+            </w:pPr>
+            <w:r>
+              <w:rPr>
+                <w:rFonts w:ascii="Arial" w:hAnsi="Arial" w:cs="Arial"/>
+                <w:b/>
+                <w:color w:val="001F60"/>
+                <w:spacing w:val="-5"/>
+                <w:sz w:val="13"/>
+              </w:rPr>
+              <w:t>${nota_efsrt23}</w:t>
+            </w:r>
           </w:p>
         </w:tc>
         <w:tc>
@@ -24464,16 +24849,30 @@
               <w:bottom w:val="single" w:sz="4" w:space="0" w:color="000000"/>
               <w:right w:val="single" w:sz="4" w:space="0" w:color="000000"/>
             </w:tcBorders>
-          </w:tcPr>
-          <w:p>
-            <w:pPr>
-              <w:pStyle w:val="TableParagraph"/>
-              <w:jc w:val="center"/>
-              <w:rPr>
-                <w:rFonts w:ascii="Arial" w:hAnsi="Arial" w:cs="Arial"/>
-                <w:sz w:val="8"/>
-              </w:rPr>
-            </w:pPr>
+            <w:vAlign w:val="bottom"/>
+          </w:tcPr>
+          <w:p>
+            <w:pPr>
+              <w:pStyle w:val="TableParagraph"/>
+              <w:jc w:val="center"/>
+              <w:rPr>
+                <w:rFonts w:ascii="Arial" w:hAnsi="Arial" w:cs="Arial"/>
+                <w:b/>
+                <w:color w:val="001F60"/>
+                <w:spacing w:val="-5"/>
+                <w:sz w:val="13"/>
+              </w:rPr>
+            </w:pPr>
+            <w:r>
+              <w:rPr>
+                <w:rFonts w:ascii="Arial" w:hAnsi="Arial" w:cs="Arial"/>
+                <w:b/>
+                <w:color w:val="001F60"/>
+                <w:spacing w:val="-5"/>
+                <w:sz w:val="13"/>
+              </w:rPr>
+              <w:t>${nota_efsrt24}</w:t>
+            </w:r>
           </w:p>
         </w:tc>
         <w:tc>
@@ -25335,16 +25734,30 @@
               <w:bottom w:val="single" w:sz="4" w:space="0" w:color="000000"/>
               <w:right w:val="single" w:sz="4" w:space="0" w:color="000000"/>
             </w:tcBorders>
-          </w:tcPr>
-          <w:p>
-            <w:pPr>
-              <w:pStyle w:val="TableParagraph"/>
-              <w:jc w:val="center"/>
-              <w:rPr>
-                <w:rFonts w:ascii="Times New Roman"/>
-                <w:sz w:val="8"/>
-              </w:rPr>
-            </w:pPr>
+            <w:vAlign w:val="bottom"/>
+          </w:tcPr>
+          <w:p>
+            <w:pPr>
+              <w:pStyle w:val="TableParagraph"/>
+              <w:jc w:val="center"/>
+              <w:rPr>
+                <w:rFonts w:ascii="Arial" w:hAnsi="Arial" w:cs="Arial"/>
+                <w:b/>
+                <w:color w:val="001F60"/>
+                <w:spacing w:val="-5"/>
+                <w:sz w:val="13"/>
+              </w:rPr>
+            </w:pPr>
+            <w:r>
+              <w:rPr>
+                <w:rFonts w:ascii="Arial" w:hAnsi="Arial" w:cs="Arial"/>
+                <w:b/>
+                <w:color w:val="001F60"/>
+                <w:spacing w:val="-5"/>
+                <w:sz w:val="13"/>
+              </w:rPr>
+              <w:t>${nota_efsrt25}</w:t>
+            </w:r>
           </w:p>
         </w:tc>
         <w:tc>
@@ -26206,16 +26619,30 @@
               <w:bottom w:val="single" w:sz="4" w:space="0" w:color="000000"/>
               <w:right w:val="single" w:sz="4" w:space="0" w:color="000000"/>
             </w:tcBorders>
-          </w:tcPr>
-          <w:p>
-            <w:pPr>
-              <w:pStyle w:val="TableParagraph"/>
-              <w:jc w:val="center"/>
-              <w:rPr>
-                <w:rFonts w:ascii="Times New Roman"/>
-                <w:sz w:val="8"/>
-              </w:rPr>
-            </w:pPr>
+            <w:vAlign w:val="bottom"/>
+          </w:tcPr>
+          <w:p>
+            <w:pPr>
+              <w:pStyle w:val="TableParagraph"/>
+              <w:jc w:val="center"/>
+              <w:rPr>
+                <w:rFonts w:ascii="Arial" w:hAnsi="Arial" w:cs="Arial"/>
+                <w:b/>
+                <w:color w:val="001F60"/>
+                <w:spacing w:val="-5"/>
+                <w:sz w:val="13"/>
+              </w:rPr>
+            </w:pPr>
+            <w:r>
+              <w:rPr>
+                <w:rFonts w:ascii="Arial" w:hAnsi="Arial" w:cs="Arial"/>
+                <w:b/>
+                <w:color w:val="001F60"/>
+                <w:spacing w:val="-5"/>
+                <w:sz w:val="13"/>
+              </w:rPr>
+              <w:t>${nota_efsrt26}</w:t>
+            </w:r>
           </w:p>
         </w:tc>
         <w:tc>
@@ -27077,16 +27504,30 @@
               <w:bottom w:val="single" w:sz="4" w:space="0" w:color="000000"/>
               <w:right w:val="single" w:sz="4" w:space="0" w:color="000000"/>
             </w:tcBorders>
-          </w:tcPr>
-          <w:p>
-            <w:pPr>
-              <w:pStyle w:val="TableParagraph"/>
-              <w:jc w:val="center"/>
-              <w:rPr>
-                <w:rFonts w:ascii="Times New Roman"/>
-                <w:sz w:val="8"/>
-              </w:rPr>
-            </w:pPr>
+            <w:vAlign w:val="bottom"/>
+          </w:tcPr>
+          <w:p>
+            <w:pPr>
+              <w:pStyle w:val="TableParagraph"/>
+              <w:jc w:val="center"/>
+              <w:rPr>
+                <w:rFonts w:ascii="Arial" w:hAnsi="Arial" w:cs="Arial"/>
+                <w:b/>
+                <w:color w:val="001F60"/>
+                <w:spacing w:val="-5"/>
+                <w:sz w:val="13"/>
+              </w:rPr>
+            </w:pPr>
+            <w:r>
+              <w:rPr>
+                <w:rFonts w:ascii="Arial" w:hAnsi="Arial" w:cs="Arial"/>
+                <w:b/>
+                <w:color w:val="001F60"/>
+                <w:spacing w:val="-5"/>
+                <w:sz w:val="13"/>
+              </w:rPr>
+              <w:t>${nota_efsrt27}</w:t>
+            </w:r>
           </w:p>
         </w:tc>
         <w:tc>
@@ -27948,16 +28389,30 @@
               <w:bottom w:val="single" w:sz="4" w:space="0" w:color="000000"/>
               <w:right w:val="single" w:sz="4" w:space="0" w:color="000000"/>
             </w:tcBorders>
-          </w:tcPr>
-          <w:p>
-            <w:pPr>
-              <w:pStyle w:val="TableParagraph"/>
-              <w:jc w:val="center"/>
-              <w:rPr>
-                <w:rFonts w:ascii="Times New Roman"/>
-                <w:sz w:val="8"/>
-              </w:rPr>
-            </w:pPr>
+            <w:vAlign w:val="bottom"/>
+          </w:tcPr>
+          <w:p>
+            <w:pPr>
+              <w:pStyle w:val="TableParagraph"/>
+              <w:jc w:val="center"/>
+              <w:rPr>
+                <w:rFonts w:ascii="Arial" w:hAnsi="Arial" w:cs="Arial"/>
+                <w:b/>
+                <w:color w:val="001F60"/>
+                <w:spacing w:val="-5"/>
+                <w:sz w:val="13"/>
+              </w:rPr>
+            </w:pPr>
+            <w:r>
+              <w:rPr>
+                <w:rFonts w:ascii="Arial" w:hAnsi="Arial" w:cs="Arial"/>
+                <w:b/>
+                <w:color w:val="001F60"/>
+                <w:spacing w:val="-5"/>
+                <w:sz w:val="13"/>
+              </w:rPr>
+              <w:t>${nota_efsrt28}</w:t>
+            </w:r>
           </w:p>
         </w:tc>
         <w:tc>
@@ -28819,16 +29274,30 @@
               <w:bottom w:val="single" w:sz="4" w:space="0" w:color="000000"/>
               <w:right w:val="single" w:sz="4" w:space="0" w:color="000000"/>
             </w:tcBorders>
-          </w:tcPr>
-          <w:p>
-            <w:pPr>
-              <w:pStyle w:val="TableParagraph"/>
-              <w:jc w:val="center"/>
-              <w:rPr>
-                <w:rFonts w:ascii="Times New Roman"/>
-                <w:sz w:val="8"/>
-              </w:rPr>
-            </w:pPr>
+            <w:vAlign w:val="bottom"/>
+          </w:tcPr>
+          <w:p>
+            <w:pPr>
+              <w:pStyle w:val="TableParagraph"/>
+              <w:jc w:val="center"/>
+              <w:rPr>
+                <w:rFonts w:ascii="Arial" w:hAnsi="Arial" w:cs="Arial"/>
+                <w:b/>
+                <w:color w:val="001F60"/>
+                <w:spacing w:val="-5"/>
+                <w:sz w:val="13"/>
+              </w:rPr>
+            </w:pPr>
+            <w:r>
+              <w:rPr>
+                <w:rFonts w:ascii="Arial" w:hAnsi="Arial" w:cs="Arial"/>
+                <w:b/>
+                <w:color w:val="001F60"/>
+                <w:spacing w:val="-5"/>
+                <w:sz w:val="13"/>
+              </w:rPr>
+              <w:t>${nota_efsrt29}</w:t>
+            </w:r>
           </w:p>
         </w:tc>
         <w:tc>
@@ -29048,6 +29517,7 @@
                 <w:spacing w:val="-5"/>
                 <w:sz w:val="10"/>
               </w:rPr>
+              <w:lastRenderedPageBreak/>
               <w:t>30</w:t>
             </w:r>
           </w:p>
@@ -29690,16 +30160,30 @@
               <w:bottom w:val="single" w:sz="4" w:space="0" w:color="000000"/>
               <w:right w:val="single" w:sz="4" w:space="0" w:color="000000"/>
             </w:tcBorders>
-          </w:tcPr>
-          <w:p>
-            <w:pPr>
-              <w:pStyle w:val="TableParagraph"/>
-              <w:jc w:val="center"/>
-              <w:rPr>
-                <w:rFonts w:ascii="Times New Roman"/>
-                <w:sz w:val="8"/>
-              </w:rPr>
-            </w:pPr>
+            <w:vAlign w:val="bottom"/>
+          </w:tcPr>
+          <w:p>
+            <w:pPr>
+              <w:pStyle w:val="TableParagraph"/>
+              <w:jc w:val="center"/>
+              <w:rPr>
+                <w:rFonts w:ascii="Arial" w:hAnsi="Arial" w:cs="Arial"/>
+                <w:b/>
+                <w:color w:val="001F60"/>
+                <w:spacing w:val="-5"/>
+                <w:sz w:val="13"/>
+              </w:rPr>
+            </w:pPr>
+            <w:r>
+              <w:rPr>
+                <w:rFonts w:ascii="Arial" w:hAnsi="Arial" w:cs="Arial"/>
+                <w:b/>
+                <w:color w:val="001F60"/>
+                <w:spacing w:val="-5"/>
+                <w:sz w:val="13"/>
+              </w:rPr>
+              <w:t>${nota_efsrt30}</w:t>
+            </w:r>
           </w:p>
         </w:tc>
         <w:tc>
@@ -30561,16 +31045,30 @@
               <w:bottom w:val="single" w:sz="4" w:space="0" w:color="000000"/>
               <w:right w:val="single" w:sz="4" w:space="0" w:color="000000"/>
             </w:tcBorders>
-          </w:tcPr>
-          <w:p>
-            <w:pPr>
-              <w:pStyle w:val="TableParagraph"/>
-              <w:jc w:val="center"/>
-              <w:rPr>
-                <w:rFonts w:ascii="Times New Roman"/>
-                <w:sz w:val="8"/>
-              </w:rPr>
-            </w:pPr>
+            <w:vAlign w:val="bottom"/>
+          </w:tcPr>
+          <w:p>
+            <w:pPr>
+              <w:pStyle w:val="TableParagraph"/>
+              <w:jc w:val="center"/>
+              <w:rPr>
+                <w:rFonts w:ascii="Arial" w:hAnsi="Arial" w:cs="Arial"/>
+                <w:b/>
+                <w:color w:val="001F60"/>
+                <w:spacing w:val="-5"/>
+                <w:sz w:val="13"/>
+              </w:rPr>
+            </w:pPr>
+            <w:r>
+              <w:rPr>
+                <w:rFonts w:ascii="Arial" w:hAnsi="Arial" w:cs="Arial"/>
+                <w:b/>
+                <w:color w:val="001F60"/>
+                <w:spacing w:val="-5"/>
+                <w:sz w:val="13"/>
+              </w:rPr>
+              <w:t>${nota_efsrt31}</w:t>
+            </w:r>
           </w:p>
         </w:tc>
         <w:tc>
@@ -31432,16 +31930,30 @@
               <w:bottom w:val="single" w:sz="4" w:space="0" w:color="000000"/>
               <w:right w:val="single" w:sz="4" w:space="0" w:color="000000"/>
             </w:tcBorders>
-          </w:tcPr>
-          <w:p>
-            <w:pPr>
-              <w:pStyle w:val="TableParagraph"/>
-              <w:jc w:val="center"/>
-              <w:rPr>
-                <w:rFonts w:ascii="Times New Roman"/>
-                <w:sz w:val="8"/>
-              </w:rPr>
-            </w:pPr>
+            <w:vAlign w:val="bottom"/>
+          </w:tcPr>
+          <w:p>
+            <w:pPr>
+              <w:pStyle w:val="TableParagraph"/>
+              <w:jc w:val="center"/>
+              <w:rPr>
+                <w:rFonts w:ascii="Arial" w:hAnsi="Arial" w:cs="Arial"/>
+                <w:b/>
+                <w:color w:val="001F60"/>
+                <w:spacing w:val="-5"/>
+                <w:sz w:val="13"/>
+              </w:rPr>
+            </w:pPr>
+            <w:r>
+              <w:rPr>
+                <w:rFonts w:ascii="Arial" w:hAnsi="Arial" w:cs="Arial"/>
+                <w:b/>
+                <w:color w:val="001F60"/>
+                <w:spacing w:val="-5"/>
+                <w:sz w:val="13"/>
+              </w:rPr>
+              <w:t>${nota_efsrt32}</w:t>
+            </w:r>
           </w:p>
         </w:tc>
         <w:tc>
@@ -32303,16 +32815,30 @@
               <w:bottom w:val="single" w:sz="4" w:space="0" w:color="000000"/>
               <w:right w:val="single" w:sz="4" w:space="0" w:color="000000"/>
             </w:tcBorders>
-          </w:tcPr>
-          <w:p>
-            <w:pPr>
-              <w:pStyle w:val="TableParagraph"/>
-              <w:jc w:val="center"/>
-              <w:rPr>
-                <w:rFonts w:ascii="Times New Roman"/>
-                <w:sz w:val="8"/>
-              </w:rPr>
-            </w:pPr>
+            <w:vAlign w:val="bottom"/>
+          </w:tcPr>
+          <w:p>
+            <w:pPr>
+              <w:pStyle w:val="TableParagraph"/>
+              <w:jc w:val="center"/>
+              <w:rPr>
+                <w:rFonts w:ascii="Arial" w:hAnsi="Arial" w:cs="Arial"/>
+                <w:b/>
+                <w:color w:val="001F60"/>
+                <w:spacing w:val="-5"/>
+                <w:sz w:val="13"/>
+              </w:rPr>
+            </w:pPr>
+            <w:r>
+              <w:rPr>
+                <w:rFonts w:ascii="Arial" w:hAnsi="Arial" w:cs="Arial"/>
+                <w:b/>
+                <w:color w:val="001F60"/>
+                <w:spacing w:val="-5"/>
+                <w:sz w:val="13"/>
+              </w:rPr>
+              <w:t>${nota_efsrt33}</w:t>
+            </w:r>
           </w:p>
         </w:tc>
         <w:tc>
@@ -33174,16 +33700,30 @@
               <w:bottom w:val="single" w:sz="4" w:space="0" w:color="000000"/>
               <w:right w:val="single" w:sz="4" w:space="0" w:color="000000"/>
             </w:tcBorders>
-          </w:tcPr>
-          <w:p>
-            <w:pPr>
-              <w:pStyle w:val="TableParagraph"/>
-              <w:jc w:val="center"/>
-              <w:rPr>
-                <w:rFonts w:ascii="Times New Roman"/>
-                <w:sz w:val="8"/>
-              </w:rPr>
-            </w:pPr>
+            <w:vAlign w:val="bottom"/>
+          </w:tcPr>
+          <w:p>
+            <w:pPr>
+              <w:pStyle w:val="TableParagraph"/>
+              <w:jc w:val="center"/>
+              <w:rPr>
+                <w:rFonts w:ascii="Arial" w:hAnsi="Arial" w:cs="Arial"/>
+                <w:b/>
+                <w:color w:val="001F60"/>
+                <w:spacing w:val="-5"/>
+                <w:sz w:val="13"/>
+              </w:rPr>
+            </w:pPr>
+            <w:r>
+              <w:rPr>
+                <w:rFonts w:ascii="Arial" w:hAnsi="Arial" w:cs="Arial"/>
+                <w:b/>
+                <w:color w:val="001F60"/>
+                <w:spacing w:val="-5"/>
+                <w:sz w:val="13"/>
+              </w:rPr>
+              <w:t>${nota_efsrt34}</w:t>
+            </w:r>
           </w:p>
         </w:tc>
         <w:tc>
@@ -34045,16 +34585,30 @@
               <w:bottom w:val="single" w:sz="4" w:space="0" w:color="000000"/>
               <w:right w:val="single" w:sz="4" w:space="0" w:color="000000"/>
             </w:tcBorders>
-          </w:tcPr>
-          <w:p>
-            <w:pPr>
-              <w:pStyle w:val="TableParagraph"/>
-              <w:jc w:val="center"/>
-              <w:rPr>
-                <w:rFonts w:ascii="Times New Roman"/>
-                <w:sz w:val="8"/>
-              </w:rPr>
-            </w:pPr>
+            <w:vAlign w:val="bottom"/>
+          </w:tcPr>
+          <w:p>
+            <w:pPr>
+              <w:pStyle w:val="TableParagraph"/>
+              <w:jc w:val="center"/>
+              <w:rPr>
+                <w:rFonts w:ascii="Arial" w:hAnsi="Arial" w:cs="Arial"/>
+                <w:b/>
+                <w:color w:val="001F60"/>
+                <w:spacing w:val="-5"/>
+                <w:sz w:val="13"/>
+              </w:rPr>
+            </w:pPr>
+            <w:r>
+              <w:rPr>
+                <w:rFonts w:ascii="Arial" w:hAnsi="Arial" w:cs="Arial"/>
+                <w:b/>
+                <w:color w:val="001F60"/>
+                <w:spacing w:val="-5"/>
+                <w:sz w:val="13"/>
+              </w:rPr>
+              <w:t>${nota_efsrt35}</w:t>
+            </w:r>
           </w:p>
         </w:tc>
         <w:tc>
@@ -34417,7 +34971,6 @@
                 <w:spacing w:val="-5"/>
                 <w:sz w:val="13"/>
               </w:rPr>
-              <w:lastRenderedPageBreak/>
               <w:t>6}</w:t>
             </w:r>
           </w:p>
@@ -34452,7 +35005,6 @@
                 <w:spacing w:val="-5"/>
                 <w:sz w:val="13"/>
               </w:rPr>
-              <w:lastRenderedPageBreak/>
               <w:t>${u2_</w:t>
             </w:r>
             <w:r>
@@ -34463,18 +35015,7 @@
                 <w:spacing w:val="-5"/>
                 <w:sz w:val="13"/>
               </w:rPr>
-              <w:t>3</w:t>
-            </w:r>
-            <w:r>
-              <w:rPr>
-                <w:rFonts w:ascii="Arial" w:hAnsi="Arial" w:cs="Arial"/>
-                <w:b/>
-                <w:color w:val="001F60"/>
-                <w:spacing w:val="-5"/>
-                <w:sz w:val="13"/>
-              </w:rPr>
-              <w:lastRenderedPageBreak/>
-              <w:t>6</w:t>
+              <w:t>36</w:t>
             </w:r>
             <w:r>
               <w:rPr>
@@ -34518,7 +35059,6 @@
                 <w:spacing w:val="-5"/>
                 <w:sz w:val="13"/>
               </w:rPr>
-              <w:lastRenderedPageBreak/>
               <w:t>${u3_</w:t>
             </w:r>
             <w:r>
@@ -34529,7 +35069,6 @@
                 <w:spacing w:val="-5"/>
                 <w:sz w:val="13"/>
               </w:rPr>
-              <w:lastRenderedPageBreak/>
               <w:t>36</w:t>
             </w:r>
             <w:r>
@@ -34574,7 +35113,6 @@
                 <w:spacing w:val="-5"/>
                 <w:sz w:val="13"/>
               </w:rPr>
-              <w:lastRenderedPageBreak/>
               <w:t>${u4_</w:t>
             </w:r>
             <w:r>
@@ -34585,7 +35123,6 @@
                 <w:spacing w:val="-5"/>
                 <w:sz w:val="13"/>
               </w:rPr>
-              <w:lastRenderedPageBreak/>
               <w:t>36</w:t>
             </w:r>
             <w:r>
@@ -34630,7 +35167,6 @@
                 <w:spacing w:val="-5"/>
                 <w:sz w:val="13"/>
               </w:rPr>
-              <w:lastRenderedPageBreak/>
               <w:t>${u5_</w:t>
             </w:r>
             <w:r>
@@ -34641,7 +35177,6 @@
                 <w:spacing w:val="-5"/>
                 <w:sz w:val="13"/>
               </w:rPr>
-              <w:lastRenderedPageBreak/>
               <w:t>36</w:t>
             </w:r>
             <w:r>
@@ -34686,7 +35221,6 @@
                 <w:spacing w:val="-5"/>
                 <w:sz w:val="13"/>
               </w:rPr>
-              <w:lastRenderedPageBreak/>
               <w:t>${u6_</w:t>
             </w:r>
             <w:r>
@@ -34697,7 +35231,6 @@
                 <w:spacing w:val="-5"/>
                 <w:sz w:val="13"/>
               </w:rPr>
-              <w:lastRenderedPageBreak/>
               <w:t>36</w:t>
             </w:r>
             <w:r>
@@ -34742,7 +35275,6 @@
                 <w:spacing w:val="-5"/>
                 <w:sz w:val="13"/>
               </w:rPr>
-              <w:lastRenderedPageBreak/>
               <w:t>${u7_</w:t>
             </w:r>
             <w:r>
@@ -34753,7 +35285,6 @@
                 <w:spacing w:val="-5"/>
                 <w:sz w:val="13"/>
               </w:rPr>
-              <w:lastRenderedPageBreak/>
               <w:t>36</w:t>
             </w:r>
             <w:r>
@@ -34798,7 +35329,6 @@
                 <w:spacing w:val="-5"/>
                 <w:sz w:val="13"/>
               </w:rPr>
-              <w:lastRenderedPageBreak/>
               <w:t>${u8_</w:t>
             </w:r>
             <w:r>
@@ -34809,7 +35339,6 @@
                 <w:spacing w:val="-5"/>
                 <w:sz w:val="13"/>
               </w:rPr>
-              <w:lastRenderedPageBreak/>
               <w:t>36</w:t>
             </w:r>
             <w:r>
@@ -34854,7 +35383,6 @@
                 <w:spacing w:val="-5"/>
                 <w:sz w:val="13"/>
               </w:rPr>
-              <w:lastRenderedPageBreak/>
               <w:t>${u9_</w:t>
             </w:r>
             <w:r>
@@ -34865,7 +35393,6 @@
                 <w:spacing w:val="-5"/>
                 <w:sz w:val="13"/>
               </w:rPr>
-              <w:lastRenderedPageBreak/>
               <w:t>36</w:t>
             </w:r>
             <w:r>
@@ -34910,19 +35437,7 @@
                 <w:spacing w:val="-5"/>
                 <w:sz w:val="13"/>
               </w:rPr>
-              <w:lastRenderedPageBreak/>
-              <w:t>${u10</w:t>
-            </w:r>
-            <w:r>
-              <w:rPr>
-                <w:rFonts w:ascii="Arial" w:hAnsi="Arial" w:cs="Arial"/>
-                <w:b/>
-                <w:color w:val="001F60"/>
-                <w:spacing w:val="-5"/>
-                <w:sz w:val="13"/>
-              </w:rPr>
-              <w:lastRenderedPageBreak/>
-              <w:t>_</w:t>
+              <w:t>${u10_</w:t>
             </w:r>
             <w:r>
               <w:rPr>
@@ -34955,6 +35470,42 @@
               <w:bottom w:val="single" w:sz="4" w:space="0" w:color="000000"/>
               <w:right w:val="single" w:sz="4" w:space="0" w:color="000000"/>
             </w:tcBorders>
+            <w:vAlign w:val="bottom"/>
+          </w:tcPr>
+          <w:p>
+            <w:pPr>
+              <w:pStyle w:val="TableParagraph"/>
+              <w:jc w:val="center"/>
+              <w:rPr>
+                <w:rFonts w:ascii="Arial" w:hAnsi="Arial" w:cs="Arial"/>
+                <w:b/>
+                <w:color w:val="001F60"/>
+                <w:spacing w:val="-5"/>
+                <w:sz w:val="13"/>
+              </w:rPr>
+            </w:pPr>
+            <w:r>
+              <w:rPr>
+                <w:rFonts w:ascii="Arial" w:hAnsi="Arial" w:cs="Arial"/>
+                <w:b/>
+                <w:color w:val="001F60"/>
+                <w:spacing w:val="-5"/>
+                <w:sz w:val="13"/>
+              </w:rPr>
+              <w:t>${nota_efsrt36}</w:t>
+            </w:r>
+          </w:p>
+        </w:tc>
+        <w:tc>
+          <w:tcPr>
+            <w:tcW w:w="468" w:type="dxa"/>
+            <w:tcBorders>
+              <w:top w:val="single" w:sz="4" w:space="0" w:color="000000"/>
+              <w:left w:val="single" w:sz="4" w:space="0" w:color="000000"/>
+              <w:bottom w:val="single" w:sz="4" w:space="0" w:color="000000"/>
+              <w:right w:val="single" w:sz="4" w:space="0" w:color="000000"/>
+            </w:tcBorders>
+            <w:shd w:val="clear" w:color="auto" w:fill="F2F2F2"/>
           </w:tcPr>
           <w:p>
             <w:pPr>
@@ -34965,6 +35516,36 @@
                 <w:sz w:val="8"/>
               </w:rPr>
             </w:pPr>
+            <w:r>
+              <w:rPr>
+                <w:rFonts w:ascii="Arial" w:hAnsi="Arial" w:cs="Arial"/>
+                <w:b/>
+                <w:color w:val="001F60"/>
+                <w:spacing w:val="-5"/>
+                <w:sz w:val="13"/>
+              </w:rPr>
+              <w:t>${logro_</w:t>
+            </w:r>
+            <w:r>
+              <w:rPr>
+                <w:rFonts w:ascii="Arial" w:hAnsi="Arial" w:cs="Arial"/>
+                <w:b/>
+                <w:color w:val="001F60"/>
+                <w:spacing w:val="-5"/>
+                <w:sz w:val="13"/>
+              </w:rPr>
+              <w:t>36</w:t>
+            </w:r>
+            <w:r>
+              <w:rPr>
+                <w:rFonts w:ascii="Arial" w:hAnsi="Arial" w:cs="Arial"/>
+                <w:b/>
+                <w:color w:val="001F60"/>
+                <w:spacing w:val="-5"/>
+                <w:sz w:val="13"/>
+              </w:rPr>
+              <w:t>}</w:t>
+            </w:r>
           </w:p>
         </w:tc>
         <w:tc>
@@ -34976,7 +35557,6 @@
               <w:bottom w:val="single" w:sz="4" w:space="0" w:color="000000"/>
               <w:right w:val="single" w:sz="4" w:space="0" w:color="000000"/>
             </w:tcBorders>
-            <w:shd w:val="clear" w:color="auto" w:fill="F2F2F2"/>
           </w:tcPr>
           <w:p>
             <w:pPr>
@@ -34990,39 +35570,22 @@
             <w:r>
               <w:rPr>
                 <w:rFonts w:ascii="Arial" w:hAnsi="Arial" w:cs="Arial"/>
-                <w:b/>
-                <w:color w:val="001F60"/>
-                <w:spacing w:val="-5"/>
-                <w:sz w:val="13"/>
-              </w:rPr>
-              <w:t>${logro</w:t>
-            </w:r>
-            <w:r>
-              <w:rPr>
-                <w:rFonts w:ascii="Arial" w:hAnsi="Arial" w:cs="Arial"/>
-                <w:b/>
-                <w:color w:val="001F60"/>
-                <w:spacing w:val="-5"/>
-                <w:sz w:val="13"/>
-              </w:rPr>
-              <w:lastRenderedPageBreak/>
-              <w:t>_</w:t>
-            </w:r>
-            <w:r>
-              <w:rPr>
-                <w:rFonts w:ascii="Arial" w:hAnsi="Arial" w:cs="Arial"/>
-                <w:b/>
-                <w:color w:val="001F60"/>
-                <w:spacing w:val="-5"/>
-                <w:sz w:val="13"/>
-              </w:rPr>
-              <w:t>36</w:t>
-            </w:r>
-            <w:r>
-              <w:rPr>
-                <w:rFonts w:ascii="Arial" w:hAnsi="Arial" w:cs="Arial"/>
-                <w:b/>
-                <w:color w:val="001F60"/>
+                <w:spacing w:val="-5"/>
+                <w:sz w:val="13"/>
+              </w:rPr>
+              <w:t>${aprob</w:t>
+            </w:r>
+            <w:r>
+              <w:rPr>
+                <w:rFonts w:ascii="Arial" w:hAnsi="Arial" w:cs="Arial"/>
+                <w:spacing w:val="-5"/>
+                <w:sz w:val="13"/>
+              </w:rPr>
+              <w:t>_36</w:t>
+            </w:r>
+            <w:r>
+              <w:rPr>
+                <w:rFonts w:ascii="Arial" w:hAnsi="Arial" w:cs="Arial"/>
                 <w:spacing w:val="-5"/>
                 <w:sz w:val="13"/>
               </w:rPr>
@@ -35032,7 +35595,7 @@
         </w:tc>
         <w:tc>
           <w:tcPr>
-            <w:tcW w:w="468" w:type="dxa"/>
+            <w:tcW w:w="408" w:type="dxa"/>
             <w:tcBorders>
               <w:top w:val="single" w:sz="4" w:space="0" w:color="000000"/>
               <w:left w:val="single" w:sz="4" w:space="0" w:color="000000"/>
@@ -35055,16 +35618,14 @@
                 <w:spacing w:val="-5"/>
                 <w:sz w:val="13"/>
               </w:rPr>
-              <w:lastRenderedPageBreak/>
-              <w:t>${aprob</w:t>
-            </w:r>
-            <w:r>
-              <w:rPr>
-                <w:rFonts w:ascii="Arial" w:hAnsi="Arial" w:cs="Arial"/>
-                <w:spacing w:val="-5"/>
-                <w:sz w:val="13"/>
-              </w:rPr>
-              <w:lastRenderedPageBreak/>
+              <w:t>${desap</w:t>
+            </w:r>
+            <w:r>
+              <w:rPr>
+                <w:rFonts w:ascii="Arial" w:hAnsi="Arial" w:cs="Arial"/>
+                <w:spacing w:val="-5"/>
+                <w:sz w:val="13"/>
+              </w:rPr>
               <w:t>_36</w:t>
             </w:r>
             <w:r>
@@ -35079,12 +35640,11 @@
         </w:tc>
         <w:tc>
           <w:tcPr>
-            <w:tcW w:w="408" w:type="dxa"/>
-            <w:tcBorders>
-              <w:top w:val="single" w:sz="4" w:space="0" w:color="000000"/>
-              <w:left w:val="single" w:sz="4" w:space="0" w:color="000000"/>
-              <w:bottom w:val="single" w:sz="4" w:space="0" w:color="000000"/>
-              <w:right w:val="single" w:sz="4" w:space="0" w:color="000000"/>
+            <w:tcW w:w="2598" w:type="dxa"/>
+            <w:tcBorders>
+              <w:top w:val="single" w:sz="4" w:space="0" w:color="000000"/>
+              <w:left w:val="single" w:sz="4" w:space="0" w:color="000000"/>
+              <w:bottom w:val="single" w:sz="4" w:space="0" w:color="000000"/>
             </w:tcBorders>
           </w:tcPr>
           <w:p>
@@ -35102,61 +35662,6 @@
                 <w:spacing w:val="-5"/>
                 <w:sz w:val="13"/>
               </w:rPr>
-              <w:lastRenderedPageBreak/>
-              <w:t>${desa</w:t>
-            </w:r>
-            <w:r>
-              <w:rPr>
-                <w:rFonts w:ascii="Arial" w:hAnsi="Arial" w:cs="Arial"/>
-                <w:spacing w:val="-5"/>
-                <w:sz w:val="13"/>
-              </w:rPr>
-              <w:lastRenderedPageBreak/>
-              <w:t>p</w:t>
-            </w:r>
-            <w:r>
-              <w:rPr>
-                <w:rFonts w:ascii="Arial" w:hAnsi="Arial" w:cs="Arial"/>
-                <w:spacing w:val="-5"/>
-                <w:sz w:val="13"/>
-              </w:rPr>
-              <w:t>_36</w:t>
-            </w:r>
-            <w:r>
-              <w:rPr>
-                <w:rFonts w:ascii="Arial" w:hAnsi="Arial" w:cs="Arial"/>
-                <w:spacing w:val="-5"/>
-                <w:sz w:val="13"/>
-              </w:rPr>
-              <w:t>}</w:t>
-            </w:r>
-          </w:p>
-        </w:tc>
-        <w:tc>
-          <w:tcPr>
-            <w:tcW w:w="2598" w:type="dxa"/>
-            <w:tcBorders>
-              <w:top w:val="single" w:sz="4" w:space="0" w:color="000000"/>
-              <w:left w:val="single" w:sz="4" w:space="0" w:color="000000"/>
-              <w:bottom w:val="single" w:sz="4" w:space="0" w:color="000000"/>
-            </w:tcBorders>
-          </w:tcPr>
-          <w:p>
-            <w:pPr>
-              <w:pStyle w:val="TableParagraph"/>
-              <w:jc w:val="center"/>
-              <w:rPr>
-                <w:rFonts w:ascii="Times New Roman"/>
-                <w:sz w:val="8"/>
-              </w:rPr>
-            </w:pPr>
-            <w:r>
-              <w:rPr>
-                <w:rFonts w:ascii="Arial" w:hAnsi="Arial" w:cs="Arial"/>
-                <w:spacing w:val="-5"/>
-                <w:sz w:val="13"/>
-              </w:rPr>
-              <w:lastRenderedPageBreak/>
               <w:t>${obs_</w:t>
             </w:r>
             <w:r>
@@ -35850,16 +36355,30 @@
               <w:bottom w:val="single" w:sz="4" w:space="0" w:color="000000"/>
               <w:right w:val="single" w:sz="4" w:space="0" w:color="000000"/>
             </w:tcBorders>
-          </w:tcPr>
-          <w:p>
-            <w:pPr>
-              <w:pStyle w:val="TableParagraph"/>
-              <w:jc w:val="center"/>
-              <w:rPr>
-                <w:rFonts w:ascii="Times New Roman"/>
-                <w:sz w:val="8"/>
-              </w:rPr>
-            </w:pPr>
+            <w:vAlign w:val="bottom"/>
+          </w:tcPr>
+          <w:p>
+            <w:pPr>
+              <w:pStyle w:val="TableParagraph"/>
+              <w:jc w:val="center"/>
+              <w:rPr>
+                <w:rFonts w:ascii="Arial" w:hAnsi="Arial" w:cs="Arial"/>
+                <w:b/>
+                <w:color w:val="001F60"/>
+                <w:spacing w:val="-5"/>
+                <w:sz w:val="13"/>
+              </w:rPr>
+            </w:pPr>
+            <w:r>
+              <w:rPr>
+                <w:rFonts w:ascii="Arial" w:hAnsi="Arial" w:cs="Arial"/>
+                <w:b/>
+                <w:color w:val="001F60"/>
+                <w:spacing w:val="-5"/>
+                <w:sz w:val="13"/>
+              </w:rPr>
+              <w:t>${nota_efsrt37}</w:t>
+            </w:r>
           </w:p>
         </w:tc>
         <w:tc>
@@ -36721,16 +37240,30 @@
               <w:bottom w:val="single" w:sz="4" w:space="0" w:color="000000"/>
               <w:right w:val="single" w:sz="4" w:space="0" w:color="000000"/>
             </w:tcBorders>
-          </w:tcPr>
-          <w:p>
-            <w:pPr>
-              <w:pStyle w:val="TableParagraph"/>
-              <w:jc w:val="center"/>
-              <w:rPr>
-                <w:rFonts w:ascii="Times New Roman"/>
-                <w:sz w:val="8"/>
-              </w:rPr>
-            </w:pPr>
+            <w:vAlign w:val="bottom"/>
+          </w:tcPr>
+          <w:p>
+            <w:pPr>
+              <w:pStyle w:val="TableParagraph"/>
+              <w:jc w:val="center"/>
+              <w:rPr>
+                <w:rFonts w:ascii="Arial" w:hAnsi="Arial" w:cs="Arial"/>
+                <w:b/>
+                <w:color w:val="001F60"/>
+                <w:spacing w:val="-5"/>
+                <w:sz w:val="13"/>
+              </w:rPr>
+            </w:pPr>
+            <w:r>
+              <w:rPr>
+                <w:rFonts w:ascii="Arial" w:hAnsi="Arial" w:cs="Arial"/>
+                <w:b/>
+                <w:color w:val="001F60"/>
+                <w:spacing w:val="-5"/>
+                <w:sz w:val="13"/>
+              </w:rPr>
+              <w:t>${nota_efsrt38}</w:t>
+            </w:r>
           </w:p>
         </w:tc>
         <w:tc>
@@ -37592,16 +38125,30 @@
               <w:bottom w:val="single" w:sz="4" w:space="0" w:color="000000"/>
               <w:right w:val="single" w:sz="4" w:space="0" w:color="000000"/>
             </w:tcBorders>
-          </w:tcPr>
-          <w:p>
-            <w:pPr>
-              <w:pStyle w:val="TableParagraph"/>
-              <w:jc w:val="center"/>
-              <w:rPr>
-                <w:rFonts w:ascii="Times New Roman"/>
-                <w:sz w:val="8"/>
-              </w:rPr>
-            </w:pPr>
+            <w:vAlign w:val="bottom"/>
+          </w:tcPr>
+          <w:p>
+            <w:pPr>
+              <w:pStyle w:val="TableParagraph"/>
+              <w:jc w:val="center"/>
+              <w:rPr>
+                <w:rFonts w:ascii="Arial" w:hAnsi="Arial" w:cs="Arial"/>
+                <w:b/>
+                <w:color w:val="001F60"/>
+                <w:spacing w:val="-5"/>
+                <w:sz w:val="13"/>
+              </w:rPr>
+            </w:pPr>
+            <w:r>
+              <w:rPr>
+                <w:rFonts w:ascii="Arial" w:hAnsi="Arial" w:cs="Arial"/>
+                <w:b/>
+                <w:color w:val="001F60"/>
+                <w:spacing w:val="-5"/>
+                <w:sz w:val="13"/>
+              </w:rPr>
+              <w:t>${nota_efsrt39}</w:t>
+            </w:r>
           </w:p>
         </w:tc>
         <w:tc>
@@ -38449,16 +38996,30 @@
               <w:left w:val="single" w:sz="4" w:space="0" w:color="000000"/>
               <w:right w:val="single" w:sz="4" w:space="0" w:color="000000"/>
             </w:tcBorders>
-          </w:tcPr>
-          <w:p>
-            <w:pPr>
-              <w:pStyle w:val="TableParagraph"/>
-              <w:jc w:val="center"/>
-              <w:rPr>
-                <w:rFonts w:ascii="Times New Roman"/>
-                <w:sz w:val="8"/>
-              </w:rPr>
-            </w:pPr>
+            <w:vAlign w:val="bottom"/>
+          </w:tcPr>
+          <w:p>
+            <w:pPr>
+              <w:pStyle w:val="TableParagraph"/>
+              <w:jc w:val="center"/>
+              <w:rPr>
+                <w:rFonts w:ascii="Arial" w:hAnsi="Arial" w:cs="Arial"/>
+                <w:b/>
+                <w:color w:val="001F60"/>
+                <w:spacing w:val="-5"/>
+                <w:sz w:val="13"/>
+              </w:rPr>
+            </w:pPr>
+            <w:r>
+              <w:rPr>
+                <w:rFonts w:ascii="Arial" w:hAnsi="Arial" w:cs="Arial"/>
+                <w:b/>
+                <w:color w:val="001F60"/>
+                <w:spacing w:val="-5"/>
+                <w:sz w:val="13"/>
+              </w:rPr>
+              <w:t>${nota_efsrt40}</w:t>
+            </w:r>
           </w:p>
         </w:tc>
         <w:tc>
@@ -38776,12 +39337,16 @@
               <w:spacing w:before="16"/>
               <w:ind w:left="21"/>
               <w:rPr>
+                <w:rFonts w:ascii="Arial" w:hAnsi="Arial" w:cs="Arial"/>
                 <w:sz w:val="10"/>
-              </w:rPr>
-            </w:pPr>
-            <w:r>
-              <w:rPr>
+                <w:szCs w:val="10"/>
+              </w:rPr>
+            </w:pPr>
+            <w:r>
+              <w:rPr>
+                <w:rFonts w:ascii="Arial" w:hAnsi="Arial" w:cs="Arial"/>
                 <w:sz w:val="10"/>
+                <w:szCs w:val="10"/>
               </w:rPr>
               <w:t>${titulo_u1}</w:t>
             </w:r>
@@ -38802,9 +39367,20 @@
               <w:spacing w:before="16"/>
               <w:ind w:right="-15"/>
               <w:rPr>
+                <w:rFonts w:ascii="Arial" w:hAnsi="Arial" w:cs="Arial"/>
                 <w:sz w:val="10"/>
-              </w:rPr>
-            </w:pPr>
+                <w:szCs w:val="10"/>
+              </w:rPr>
+            </w:pPr>
+            <w:r>
+              <w:rPr>
+                <w:rFonts w:ascii="Arial" w:hAnsi="Arial" w:cs="Arial"/>
+                <w:color w:val="000000"/>
+                <w:sz w:val="10"/>
+                <w:szCs w:val="10"/>
+              </w:rPr>
+              <w:t>${capacidad_u1}</w:t>
+            </w:r>
           </w:p>
         </w:tc>
       </w:tr>
@@ -38827,12 +39403,16 @@
               <w:spacing w:before="16"/>
               <w:ind w:left="21"/>
               <w:rPr>
+                <w:rFonts w:ascii="Arial" w:hAnsi="Arial" w:cs="Arial"/>
                 <w:sz w:val="10"/>
-              </w:rPr>
-            </w:pPr>
-            <w:r>
-              <w:rPr>
+                <w:szCs w:val="10"/>
+              </w:rPr>
+            </w:pPr>
+            <w:r>
+              <w:rPr>
+                <w:rFonts w:ascii="Arial" w:hAnsi="Arial" w:cs="Arial"/>
                 <w:sz w:val="10"/>
+                <w:szCs w:val="10"/>
               </w:rPr>
               <w:t>${titulo_u2}</w:t>
             </w:r>
@@ -38852,9 +39432,20 @@
               <w:pStyle w:val="TableParagraph"/>
               <w:spacing w:before="16"/>
               <w:rPr>
+                <w:rFonts w:ascii="Arial" w:hAnsi="Arial" w:cs="Arial"/>
                 <w:sz w:val="10"/>
-              </w:rPr>
-            </w:pPr>
+                <w:szCs w:val="10"/>
+              </w:rPr>
+            </w:pPr>
+            <w:r>
+              <w:rPr>
+                <w:rFonts w:ascii="Arial" w:hAnsi="Arial" w:cs="Arial"/>
+                <w:color w:val="000000"/>
+                <w:sz w:val="10"/>
+                <w:szCs w:val="10"/>
+              </w:rPr>
+              <w:t>${capacidad_u2}</w:t>
+            </w:r>
           </w:p>
         </w:tc>
       </w:tr>
@@ -38877,12 +39468,16 @@
               <w:spacing w:before="16"/>
               <w:ind w:left="21"/>
               <w:rPr>
+                <w:rFonts w:ascii="Arial" w:hAnsi="Arial" w:cs="Arial"/>
                 <w:sz w:val="10"/>
-              </w:rPr>
-            </w:pPr>
-            <w:r>
-              <w:rPr>
+                <w:szCs w:val="10"/>
+              </w:rPr>
+            </w:pPr>
+            <w:r>
+              <w:rPr>
+                <w:rFonts w:ascii="Arial" w:hAnsi="Arial" w:cs="Arial"/>
                 <w:sz w:val="10"/>
+                <w:szCs w:val="10"/>
               </w:rPr>
               <w:t>${titulo_u3}</w:t>
             </w:r>
@@ -38902,9 +39497,20 @@
               <w:pStyle w:val="TableParagraph"/>
               <w:spacing w:before="16"/>
               <w:rPr>
+                <w:rFonts w:ascii="Arial" w:hAnsi="Arial" w:cs="Arial"/>
                 <w:sz w:val="10"/>
-              </w:rPr>
-            </w:pPr>
+                <w:szCs w:val="10"/>
+              </w:rPr>
+            </w:pPr>
+            <w:r>
+              <w:rPr>
+                <w:rFonts w:ascii="Arial" w:hAnsi="Arial" w:cs="Arial"/>
+                <w:color w:val="000000"/>
+                <w:sz w:val="10"/>
+                <w:szCs w:val="10"/>
+              </w:rPr>
+              <w:t>${capacidad_u3}</w:t>
+            </w:r>
           </w:p>
         </w:tc>
       </w:tr>
@@ -38927,12 +39533,16 @@
               <w:spacing w:before="16"/>
               <w:ind w:left="21"/>
               <w:rPr>
+                <w:rFonts w:ascii="Arial" w:hAnsi="Arial" w:cs="Arial"/>
                 <w:sz w:val="10"/>
-              </w:rPr>
-            </w:pPr>
-            <w:r>
-              <w:rPr>
+                <w:szCs w:val="10"/>
+              </w:rPr>
+            </w:pPr>
+            <w:r>
+              <w:rPr>
+                <w:rFonts w:ascii="Arial" w:hAnsi="Arial" w:cs="Arial"/>
                 <w:sz w:val="10"/>
+                <w:szCs w:val="10"/>
               </w:rPr>
               <w:t>${titulo_u4}</w:t>
             </w:r>
@@ -38952,9 +39562,20 @@
               <w:pStyle w:val="TableParagraph"/>
               <w:spacing w:before="16"/>
               <w:rPr>
+                <w:rFonts w:ascii="Arial" w:hAnsi="Arial" w:cs="Arial"/>
                 <w:sz w:val="10"/>
-              </w:rPr>
-            </w:pPr>
+                <w:szCs w:val="10"/>
+              </w:rPr>
+            </w:pPr>
+            <w:r>
+              <w:rPr>
+                <w:rFonts w:ascii="Arial" w:hAnsi="Arial" w:cs="Arial"/>
+                <w:color w:val="000000"/>
+                <w:sz w:val="10"/>
+                <w:szCs w:val="10"/>
+              </w:rPr>
+              <w:t>${capacidad_u4}</w:t>
+            </w:r>
           </w:p>
         </w:tc>
       </w:tr>
@@ -38977,12 +39598,16 @@
               <w:spacing w:before="16"/>
               <w:ind w:left="21"/>
               <w:rPr>
+                <w:rFonts w:ascii="Arial" w:hAnsi="Arial" w:cs="Arial"/>
                 <w:sz w:val="10"/>
-              </w:rPr>
-            </w:pPr>
-            <w:r>
-              <w:rPr>
+                <w:szCs w:val="10"/>
+              </w:rPr>
+            </w:pPr>
+            <w:r>
+              <w:rPr>
+                <w:rFonts w:ascii="Arial" w:hAnsi="Arial" w:cs="Arial"/>
                 <w:sz w:val="10"/>
+                <w:szCs w:val="10"/>
               </w:rPr>
               <w:t>${titulo_u5}</w:t>
             </w:r>
@@ -39002,9 +39627,20 @@
               <w:pStyle w:val="TableParagraph"/>
               <w:spacing w:before="16"/>
               <w:rPr>
+                <w:rFonts w:ascii="Arial" w:hAnsi="Arial" w:cs="Arial"/>
                 <w:sz w:val="10"/>
-              </w:rPr>
-            </w:pPr>
+                <w:szCs w:val="10"/>
+              </w:rPr>
+            </w:pPr>
+            <w:r>
+              <w:rPr>
+                <w:rFonts w:ascii="Arial" w:hAnsi="Arial" w:cs="Arial"/>
+                <w:color w:val="000000"/>
+                <w:sz w:val="10"/>
+                <w:szCs w:val="10"/>
+              </w:rPr>
+              <w:t>${capacidad_u5}</w:t>
+            </w:r>
           </w:p>
         </w:tc>
       </w:tr>
@@ -39027,12 +39663,16 @@
               <w:spacing w:before="16"/>
               <w:ind w:left="21"/>
               <w:rPr>
+                <w:rFonts w:ascii="Arial" w:hAnsi="Arial" w:cs="Arial"/>
                 <w:sz w:val="10"/>
-              </w:rPr>
-            </w:pPr>
-            <w:r>
-              <w:rPr>
+                <w:szCs w:val="10"/>
+              </w:rPr>
+            </w:pPr>
+            <w:r>
+              <w:rPr>
+                <w:rFonts w:ascii="Arial" w:hAnsi="Arial" w:cs="Arial"/>
                 <w:sz w:val="10"/>
+                <w:szCs w:val="10"/>
               </w:rPr>
               <w:t>${titulo_u6}</w:t>
             </w:r>
@@ -39052,9 +39692,20 @@
               <w:pStyle w:val="TableParagraph"/>
               <w:spacing w:before="16"/>
               <w:rPr>
+                <w:rFonts w:ascii="Arial" w:hAnsi="Arial" w:cs="Arial"/>
                 <w:sz w:val="10"/>
-              </w:rPr>
-            </w:pPr>
+                <w:szCs w:val="10"/>
+              </w:rPr>
+            </w:pPr>
+            <w:r>
+              <w:rPr>
+                <w:rFonts w:ascii="Arial" w:hAnsi="Arial" w:cs="Arial"/>
+                <w:color w:val="000000"/>
+                <w:sz w:val="10"/>
+                <w:szCs w:val="10"/>
+              </w:rPr>
+              <w:t>${capacidad_u6}</w:t>
+            </w:r>
           </w:p>
         </w:tc>
       </w:tr>
@@ -39077,26 +39728,18 @@
               <w:spacing w:before="16"/>
               <w:ind w:left="21"/>
               <w:rPr>
+                <w:rFonts w:ascii="Arial" w:hAnsi="Arial" w:cs="Arial"/>
                 <w:sz w:val="10"/>
-              </w:rPr>
-            </w:pPr>
-            <w:r>
-              <w:rPr>
+                <w:szCs w:val="10"/>
+              </w:rPr>
+            </w:pPr>
+            <w:r>
+              <w:rPr>
+                <w:rFonts w:ascii="Arial" w:hAnsi="Arial" w:cs="Arial"/>
                 <w:sz w:val="10"/>
-              </w:rPr>
-              <w:t>${titulo_u</w:t>
-            </w:r>
-            <w:r>
-              <w:rPr>
-                <w:sz w:val="10"/>
-              </w:rPr>
-              <w:t>7</w:t>
-            </w:r>
-            <w:r>
-              <w:rPr>
-                <w:sz w:val="10"/>
-              </w:rPr>
-              <w:t>}</w:t>
+                <w:szCs w:val="10"/>
+              </w:rPr>
+              <w:t>${titulo_u7}</w:t>
             </w:r>
           </w:p>
         </w:tc>
@@ -39115,9 +39758,20 @@
               <w:spacing w:before="16"/>
               <w:ind w:left="27"/>
               <w:rPr>
+                <w:rFonts w:ascii="Arial" w:hAnsi="Arial" w:cs="Arial"/>
                 <w:sz w:val="10"/>
-              </w:rPr>
-            </w:pPr>
+                <w:szCs w:val="10"/>
+              </w:rPr>
+            </w:pPr>
+            <w:r>
+              <w:rPr>
+                <w:rFonts w:ascii="Arial" w:hAnsi="Arial" w:cs="Arial"/>
+                <w:color w:val="000000"/>
+                <w:sz w:val="10"/>
+                <w:szCs w:val="10"/>
+              </w:rPr>
+              <w:t>${capacidad_u7}</w:t>
+            </w:r>
           </w:p>
         </w:tc>
       </w:tr>
@@ -39140,26 +39794,18 @@
               <w:spacing w:before="16"/>
               <w:ind w:left="21"/>
               <w:rPr>
+                <w:rFonts w:ascii="Arial" w:hAnsi="Arial" w:cs="Arial"/>
                 <w:sz w:val="10"/>
-              </w:rPr>
-            </w:pPr>
-            <w:r>
-              <w:rPr>
+                <w:szCs w:val="10"/>
+              </w:rPr>
+            </w:pPr>
+            <w:r>
+              <w:rPr>
+                <w:rFonts w:ascii="Arial" w:hAnsi="Arial" w:cs="Arial"/>
                 <w:sz w:val="10"/>
-              </w:rPr>
-              <w:t>${titulo_u</w:t>
-            </w:r>
-            <w:r>
-              <w:rPr>
-                <w:sz w:val="10"/>
-              </w:rPr>
-              <w:t>8</w:t>
-            </w:r>
-            <w:r>
-              <w:rPr>
-                <w:sz w:val="10"/>
-              </w:rPr>
-              <w:t>}</w:t>
+                <w:szCs w:val="10"/>
+              </w:rPr>
+              <w:t>${titulo_u8}</w:t>
             </w:r>
           </w:p>
         </w:tc>
@@ -39178,9 +39824,20 @@
               <w:spacing w:before="16"/>
               <w:ind w:left="27"/>
               <w:rPr>
+                <w:rFonts w:ascii="Arial" w:hAnsi="Arial" w:cs="Arial"/>
                 <w:sz w:val="10"/>
-              </w:rPr>
-            </w:pPr>
+                <w:szCs w:val="10"/>
+              </w:rPr>
+            </w:pPr>
+            <w:r>
+              <w:rPr>
+                <w:rFonts w:ascii="Arial" w:hAnsi="Arial" w:cs="Arial"/>
+                <w:color w:val="000000"/>
+                <w:sz w:val="10"/>
+                <w:szCs w:val="10"/>
+              </w:rPr>
+              <w:t>${capacidad_u8}</w:t>
+            </w:r>
           </w:p>
         </w:tc>
       </w:tr>
@@ -39203,26 +39860,18 @@
               <w:spacing w:before="16"/>
               <w:ind w:left="21"/>
               <w:rPr>
+                <w:rFonts w:ascii="Arial" w:hAnsi="Arial" w:cs="Arial"/>
                 <w:sz w:val="10"/>
-              </w:rPr>
-            </w:pPr>
-            <w:r>
-              <w:rPr>
+                <w:szCs w:val="10"/>
+              </w:rPr>
+            </w:pPr>
+            <w:r>
+              <w:rPr>
+                <w:rFonts w:ascii="Arial" w:hAnsi="Arial" w:cs="Arial"/>
                 <w:sz w:val="10"/>
-              </w:rPr>
-              <w:t>${titulo_u</w:t>
-            </w:r>
-            <w:r>
-              <w:rPr>
-                <w:sz w:val="10"/>
-              </w:rPr>
-              <w:t>9</w:t>
-            </w:r>
-            <w:r>
-              <w:rPr>
-                <w:sz w:val="10"/>
-              </w:rPr>
-              <w:t>}</w:t>
+                <w:szCs w:val="10"/>
+              </w:rPr>
+              <w:t>${titulo_u9}</w:t>
             </w:r>
           </w:p>
         </w:tc>
@@ -39241,9 +39890,20 @@
               <w:spacing w:before="16"/>
               <w:ind w:left="27"/>
               <w:rPr>
+                <w:rFonts w:ascii="Arial" w:hAnsi="Arial" w:cs="Arial"/>
                 <w:sz w:val="10"/>
-              </w:rPr>
-            </w:pPr>
+                <w:szCs w:val="10"/>
+              </w:rPr>
+            </w:pPr>
+            <w:r>
+              <w:rPr>
+                <w:rFonts w:ascii="Arial" w:hAnsi="Arial" w:cs="Arial"/>
+                <w:color w:val="000000"/>
+                <w:sz w:val="10"/>
+                <w:szCs w:val="10"/>
+              </w:rPr>
+              <w:t>${capacidad_u9}</w:t>
+            </w:r>
           </w:p>
         </w:tc>
       </w:tr>
@@ -39265,26 +39925,18 @@
               <w:spacing w:before="16"/>
               <w:ind w:left="21"/>
               <w:rPr>
+                <w:rFonts w:ascii="Arial" w:hAnsi="Arial" w:cs="Arial"/>
                 <w:sz w:val="10"/>
-              </w:rPr>
-            </w:pPr>
-            <w:r>
-              <w:rPr>
+                <w:szCs w:val="10"/>
+              </w:rPr>
+            </w:pPr>
+            <w:r>
+              <w:rPr>
+                <w:rFonts w:ascii="Arial" w:hAnsi="Arial" w:cs="Arial"/>
                 <w:sz w:val="10"/>
-              </w:rPr>
-              <w:t>${titulo_u</w:t>
-            </w:r>
-            <w:r>
-              <w:rPr>
-                <w:sz w:val="10"/>
-              </w:rPr>
-              <w:t>10</w:t>
-            </w:r>
-            <w:r>
-              <w:rPr>
-                <w:sz w:val="10"/>
-              </w:rPr>
-              <w:t>}</w:t>
+                <w:szCs w:val="10"/>
+              </w:rPr>
+              <w:t>${titulo_u10}</w:t>
             </w:r>
           </w:p>
         </w:tc>
@@ -39302,9 +39954,20 @@
               <w:spacing w:before="16"/>
               <w:ind w:left="27"/>
               <w:rPr>
+                <w:rFonts w:ascii="Arial" w:hAnsi="Arial" w:cs="Arial"/>
                 <w:sz w:val="10"/>
-              </w:rPr>
-            </w:pPr>
+                <w:szCs w:val="10"/>
+              </w:rPr>
+            </w:pPr>
+            <w:r>
+              <w:rPr>
+                <w:rFonts w:ascii="Arial" w:hAnsi="Arial" w:cs="Arial"/>
+                <w:color w:val="000000"/>
+                <w:sz w:val="10"/>
+                <w:szCs w:val="10"/>
+              </w:rPr>
+              <w:t>${capacidad_u10}</w:t>
+            </w:r>
           </w:p>
         </w:tc>
       </w:tr>
@@ -41576,7 +42239,11 @@
           </mc:Choice>
           <mc:Fallback>
             <w:pict>
-              <v:shape w14:anchorId="79F62BF2" id="Textbox 4" o:spid="_x0000_s1027" type="#_x0000_t202" style="position:absolute;margin-left:305.25pt;margin-top:13.2pt;width:327.5pt;height:28.5pt;z-index:15731200;visibility:visible;mso-wrap-style:square;mso-height-percent:0;mso-wrap-distance-left:0;mso-wrap-distance-top:0;mso-wrap-distance-right:0;mso-wrap-distance-bottom:0;mso-position-horizontal:absolute;mso-position-horizontal-relative:page;mso-position-vertical:absolute;mso-position-vertical-relative:text;mso-height-percent:0;mso-height-relative:margin;v-text-anchor:top" o:gfxdata="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" filled="f" stroked="f">
+              <v:shapetype w14:anchorId="79F62BF2" id="_x0000_t202" coordsize="21600,21600" o:spt="202" path="m,l,21600r21600,l21600,xe">
+                <v:stroke joinstyle="miter"/>
+                <v:path gradientshapeok="t" o:connecttype="rect"/>
+              </v:shapetype>
+              <v:shape id="Textbox 4" o:spid="_x0000_s1026" type="#_x0000_t202" style="position:absolute;margin-left:305.25pt;margin-top:13.2pt;width:327.5pt;height:28.5pt;z-index:15731200;visibility:visible;mso-wrap-style:square;mso-height-percent:0;mso-wrap-distance-left:0;mso-wrap-distance-top:0;mso-wrap-distance-right:0;mso-wrap-distance-bottom:0;mso-position-horizontal:absolute;mso-position-horizontal-relative:page;mso-position-vertical:absolute;mso-position-vertical-relative:text;mso-height-percent:0;mso-height-relative:margin;v-text-anchor:top" o:gfxdata="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" filled="f" stroked="f">
                 <v:textbox inset="0,0,0,0">
                   <w:txbxContent>
                     <w:tbl>
@@ -44098,12 +44765,12 @@
               </wp:anchor>
             </w:drawing>
           </mc:Choice>
-          <mc:Fallback xmlns:ve="http://schemas.openxmlformats.org/markup-compatibility/2006" xmlns:a="http://schemas.openxmlformats.org/drawingml/2006/main" xmlns:pic="http://schemas.openxmlformats.org/drawingml/2006/picture">
+          <mc:Fallback>
             <w:pict>
-              <v:rect style="position:absolute;margin-left:181.440002pt;margin-top:22.594032pt;width:99.239997pt;height:.839996pt;mso-position-horizontal-relative:page;mso-position-vertical-relative:paragraph;z-index:-15727104;mso-wrap-distance-left:0;mso-wrap-distance-right:0" id="docshape4" filled="true" fillcolor="#000000" stroked="false">
-                <v:fill type="solid"/>
-                <w10:wrap type="topAndBottom"/>
-              </v:rect>
+              <v:shape w14:anchorId="7829A55D" id="Graphic 5" o:spid="_x0000_s1026" style="position:absolute;margin-left:181.45pt;margin-top:22.6pt;width:99.25pt;height:.85pt;z-index:-15727104;visibility:visible;mso-wrap-style:square;mso-wrap-distance-left:0;mso-wrap-distance-top:0;mso-wrap-distance-right:0;mso-wrap-distance-bottom:0;mso-position-horizontal:absolute;mso-position-horizontal-relative:page;mso-position-vertical:absolute;mso-position-vertical-relative:text;v-text-anchor:top" coordsize="1260475,10795" o:gfxdata="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" path="m1260347,10667l,10667,,,1260347,r,10667xe" fillcolor="black" stroked="f">
+                <v:path arrowok="t"/>
+                <w10:wrap type="topAndBottom" anchorx="page"/>
+              </v:shape>
             </w:pict>
           </mc:Fallback>
         </mc:AlternateContent>
@@ -44185,12 +44852,12 @@
               </wp:anchor>
             </w:drawing>
           </mc:Choice>
-          <mc:Fallback xmlns:ve="http://schemas.openxmlformats.org/markup-compatibility/2006" xmlns:a="http://schemas.openxmlformats.org/drawingml/2006/main" xmlns:pic="http://schemas.openxmlformats.org/drawingml/2006/picture">
+          <mc:Fallback>
             <w:pict>
-              <v:rect style="position:absolute;margin-left:440.039978pt;margin-top:22.594032pt;width:121.920047pt;height:.839996pt;mso-position-horizontal-relative:page;mso-position-vertical-relative:paragraph;z-index:-15726592;mso-wrap-distance-left:0;mso-wrap-distance-right:0" id="docshape5" filled="true" fillcolor="#000000" stroked="false">
-                <v:fill type="solid"/>
-                <w10:wrap type="topAndBottom"/>
-              </v:rect>
+              <v:shape w14:anchorId="370CACA0" id="Graphic 6" o:spid="_x0000_s1026" style="position:absolute;margin-left:440.05pt;margin-top:22.6pt;width:121.95pt;height:.85pt;z-index:-15726592;visibility:visible;mso-wrap-style:square;mso-wrap-distance-left:0;mso-wrap-distance-top:0;mso-wrap-distance-right:0;mso-wrap-distance-bottom:0;mso-position-horizontal:absolute;mso-position-horizontal-relative:page;mso-position-vertical:absolute;mso-position-vertical-relative:text;v-text-anchor:top" coordsize="1548765,10795" o:gfxdata="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" path="m1548384,10667l,10667,,,1548384,r,10667xe" fillcolor="black" stroked="f">
+                <v:path arrowok="t"/>
+                <w10:wrap type="topAndBottom" anchorx="page"/>
+              </v:shape>
             </w:pict>
           </mc:Fallback>
         </mc:AlternateContent>
@@ -44706,7 +45373,6 @@
   <w:style w:type="character" w:default="1" w:styleId="Fuentedeprrafopredeter">
     <w:name w:val="Default Paragraph Font"/>
     <w:uiPriority w:val="1"/>
-    <w:semiHidden/>
     <w:unhideWhenUsed/>
   </w:style>
   <w:style w:type="table" w:default="1" w:styleId="Tablanormal">

</xml_diff>

<commit_message>
fix: se añadio creditos/horas totales por FC y Modulo de PE
</commit_message>
<xml_diff>
--- a/public/plantillas/ACTA.docx
+++ b/public/plantillas/ACTA.docx
@@ -1,6 +1,6 @@
 
 <file path=word/document.xml><?xml version="1.0" encoding="utf-8"?>
-<w:document xmlns:wpc="http://schemas.microsoft.com/office/word/2010/wordprocessingCanvas" xmlns:cx="http://schemas.microsoft.com/office/drawing/2014/chartex" xmlns:cx1="http://schemas.microsoft.com/office/drawing/2015/9/8/chartex" xmlns:cx2="http://schemas.microsoft.com/office/drawing/2015/10/21/chartex" xmlns:cx3="http://schemas.microsoft.com/office/drawing/2016/5/9/chartex" xmlns:cx4="http://schemas.microsoft.com/office/drawing/2016/5/10/chartex" xmlns:cx5="http://schemas.microsoft.com/office/drawing/2016/5/11/chartex" xmlns:cx6="http://schemas.microsoft.com/office/drawing/2016/5/12/chartex" xmlns:cx7="http://schemas.microsoft.com/office/drawing/2016/5/13/chartex" xmlns:cx8="http://schemas.microsoft.com/office/drawing/2016/5/14/chartex" xmlns:mc="http://schemas.openxmlformats.org/markup-compatibility/2006" xmlns:aink="http://schemas.microsoft.com/office/drawing/2016/ink" xmlns:am3d="http://schemas.microsoft.com/office/drawing/2017/model3d" xmlns:o="urn:schemas-microsoft-com:office:office" xmlns:oel="http://schemas.microsoft.com/office/2019/extlst" xmlns:r="http://schemas.openxmlformats.org/officeDocument/2006/relationships" xmlns:m="http://schemas.openxmlformats.org/officeDocument/2006/math" xmlns:v="urn:schemas-microsoft-com:vml" xmlns:wp14="http://schemas.microsoft.com/office/word/2010/wordprocessingDrawing" xmlns:wp="http://schemas.openxmlformats.org/drawingml/2006/wordprocessingDrawing" xmlns:w10="urn:schemas-microsoft-com:office:word" xmlns:w="http://schemas.openxmlformats.org/wordprocessingml/2006/main" xmlns:w14="http://schemas.microsoft.com/office/word/2010/wordml" xmlns:w15="http://schemas.microsoft.com/office/word/2012/wordml" xmlns:w16cex="http://schemas.microsoft.com/office/word/2018/wordml/cex" xmlns:w16cid="http://schemas.microsoft.com/office/word/2016/wordml/cid" xmlns:w16="http://schemas.microsoft.com/office/word/2018/wordml" xmlns:w16sdtdh="http://schemas.microsoft.com/office/word/2020/wordml/sdtdatahash" xmlns:w16se="http://schemas.microsoft.com/office/word/2015/wordml/symex" xmlns:wpg="http://schemas.microsoft.com/office/word/2010/wordprocessingGroup" xmlns:wpi="http://schemas.microsoft.com/office/word/2010/wordprocessingInk" xmlns:wne="http://schemas.microsoft.com/office/word/2006/wordml" xmlns:wps="http://schemas.microsoft.com/office/word/2010/wordprocessingShape" mc:Ignorable="w14 w15 w16se w16cid w16 w16cex w16sdtdh wp14">
+<w:document xmlns:wpc="http://schemas.microsoft.com/office/word/2010/wordprocessingCanvas" xmlns:cx="http://schemas.microsoft.com/office/drawing/2014/chartex" xmlns:cx1="http://schemas.microsoft.com/office/drawing/2015/9/8/chartex" xmlns:cx2="http://schemas.microsoft.com/office/drawing/2015/10/21/chartex" xmlns:cx3="http://schemas.microsoft.com/office/drawing/2016/5/9/chartex" xmlns:cx4="http://schemas.microsoft.com/office/drawing/2016/5/10/chartex" xmlns:cx5="http://schemas.microsoft.com/office/drawing/2016/5/11/chartex" xmlns:cx6="http://schemas.microsoft.com/office/drawing/2016/5/12/chartex" xmlns:cx7="http://schemas.microsoft.com/office/drawing/2016/5/13/chartex" xmlns:cx8="http://schemas.microsoft.com/office/drawing/2016/5/14/chartex" xmlns:mc="http://schemas.openxmlformats.org/markup-compatibility/2006" xmlns:aink="http://schemas.microsoft.com/office/drawing/2016/ink" xmlns:am3d="http://schemas.microsoft.com/office/drawing/2017/model3d" xmlns:o="urn:schemas-microsoft-com:office:office" xmlns:oel="http://schemas.microsoft.com/office/2019/extlst" xmlns:r="http://schemas.openxmlformats.org/officeDocument/2006/relationships" xmlns:m="http://schemas.openxmlformats.org/officeDocument/2006/math" xmlns:v="urn:schemas-microsoft-com:vml" xmlns:wp14="http://schemas.microsoft.com/office/word/2010/wordprocessingDrawing" xmlns:wp="http://schemas.openxmlformats.org/drawingml/2006/wordprocessingDrawing" xmlns:w10="urn:schemas-microsoft-com:office:word" xmlns:w="http://schemas.openxmlformats.org/wordprocessingml/2006/main" xmlns:w14="http://schemas.microsoft.com/office/word/2010/wordml" xmlns:w15="http://schemas.microsoft.com/office/word/2012/wordml" xmlns:w16cex="http://schemas.microsoft.com/office/word/2018/wordml/cex" xmlns:w16cid="http://schemas.microsoft.com/office/word/2016/wordml/cid" xmlns:w16="http://schemas.microsoft.com/office/word/2018/wordml" xmlns:w16du="http://schemas.microsoft.com/office/word/2023/wordml/word16du" xmlns:w16sdtdh="http://schemas.microsoft.com/office/word/2020/wordml/sdtdatahash" xmlns:w16sdtfl="http://schemas.microsoft.com/office/word/2024/wordml/sdtformatlock" xmlns:w16se="http://schemas.microsoft.com/office/word/2015/wordml/symex" xmlns:wpg="http://schemas.microsoft.com/office/word/2010/wordprocessingGroup" xmlns:wpi="http://schemas.microsoft.com/office/word/2010/wordprocessingInk" xmlns:wne="http://schemas.microsoft.com/office/word/2006/wordml" xmlns:wps="http://schemas.microsoft.com/office/word/2010/wordprocessingShape" mc:Ignorable="w14 w15 w16se w16cid w16 w16cex w16sdtdh w16sdtfl w16du wp14">
   <w:body>
     <w:p>
       <w:pPr>
@@ -153,7 +153,6 @@
         </w:rPr>
         <w:t>${</w:t>
       </w:r>
-      <w:proofErr w:type="spellStart"/>
       <w:r>
         <w:rPr>
           <w:rFonts w:ascii="Arial" w:hAnsi="Arial"/>
@@ -161,7 +160,6 @@
         </w:rPr>
         <w:t>anio</w:t>
       </w:r>
-      <w:proofErr w:type="spellEnd"/>
       <w:r>
         <w:rPr>
           <w:rFonts w:ascii="Arial" w:hAnsi="Arial"/>
@@ -340,14 +338,12 @@
               </w:rPr>
               <w:t>${</w:t>
             </w:r>
-            <w:proofErr w:type="spellStart"/>
             <w:r>
               <w:rPr>
                 <w:sz w:val="11"/>
               </w:rPr>
               <w:t>cetpro</w:t>
             </w:r>
-            <w:proofErr w:type="spellEnd"/>
             <w:r>
               <w:rPr>
                 <w:sz w:val="11"/>
@@ -910,21 +906,7 @@
               <w:rPr>
                 <w:sz w:val="9"/>
               </w:rPr>
-              <w:t>${</w:t>
-            </w:r>
-            <w:proofErr w:type="spellStart"/>
-            <w:r>
-              <w:rPr>
-                <w:sz w:val="9"/>
-              </w:rPr>
-              <w:t>efsrt</w:t>
-            </w:r>
-            <w:proofErr w:type="spellEnd"/>
-            <w:r>
-              <w:rPr>
-                <w:sz w:val="9"/>
-              </w:rPr>
-              <w:t>}</w:t>
+              <w:t>${efsrt}</w:t>
             </w:r>
           </w:p>
         </w:tc>
@@ -1349,14 +1331,12 @@
               </w:rPr>
               <w:t xml:space="preserve"> </w:t>
             </w:r>
-            <w:proofErr w:type="spellStart"/>
             <w:r>
               <w:rPr>
                 <w:sz w:val="11"/>
               </w:rPr>
               <w:t>Nº</w:t>
             </w:r>
-            <w:proofErr w:type="spellEnd"/>
             <w:r>
               <w:rPr>
                 <w:spacing w:val="2"/>
@@ -1388,19 +1368,11 @@
                 <w:sz w:val="11"/>
               </w:rPr>
             </w:pPr>
-            <w:proofErr w:type="spellStart"/>
             <w:r>
               <w:rPr>
                 <w:sz w:val="11"/>
               </w:rPr>
-              <w:t>Nº</w:t>
-            </w:r>
-            <w:proofErr w:type="spellEnd"/>
-            <w:r>
-              <w:rPr>
-                <w:sz w:val="11"/>
-              </w:rPr>
-              <w:t xml:space="preserve"> </w:t>
+              <w:t xml:space="preserve">Nº </w:t>
             </w:r>
             <w:r>
               <w:rPr>
@@ -1500,19 +1472,11 @@
               </w:rPr>
               <w:t xml:space="preserve"> </w:t>
             </w:r>
-            <w:proofErr w:type="spellStart"/>
             <w:r>
               <w:rPr>
                 <w:sz w:val="10"/>
               </w:rPr>
-              <w:t>N°</w:t>
-            </w:r>
-            <w:proofErr w:type="spellEnd"/>
-            <w:r>
-              <w:rPr>
-                <w:sz w:val="10"/>
-              </w:rPr>
-              <w:t xml:space="preserve"> 06335</w:t>
+              <w:t>N° 06335</w:t>
             </w:r>
             <w:r>
               <w:rPr>
@@ -4320,7 +4284,6 @@
                 <w:sz w:val="9"/>
               </w:rPr>
             </w:pPr>
-            <w:proofErr w:type="spellStart"/>
             <w:r>
               <w:rPr>
                 <w:rFonts w:ascii="Arial" w:hAnsi="Arial"/>
@@ -4330,7 +4293,6 @@
               </w:rPr>
               <w:t>N.°</w:t>
             </w:r>
-            <w:proofErr w:type="spellEnd"/>
           </w:p>
         </w:tc>
         <w:tc>
@@ -4647,14 +4609,12 @@
                 <w:sz w:val="9"/>
               </w:rPr>
             </w:pPr>
-            <w:proofErr w:type="gramStart"/>
             <w:r>
               <w:rPr>
                 <w:sz w:val="9"/>
               </w:rPr>
               <w:t>TOTAL</w:t>
             </w:r>
-            <w:proofErr w:type="gramEnd"/>
             <w:r>
               <w:rPr>
                 <w:spacing w:val="-1"/>
@@ -4720,27 +4680,7 @@
               <w:rPr>
                 <w:sz w:val="11"/>
               </w:rPr>
-              <w:t>19</w:t>
-            </w:r>
-            <w:r>
-              <w:rPr>
-                <w:spacing w:val="3"/>
-                <w:sz w:val="11"/>
-              </w:rPr>
-              <w:t xml:space="preserve"> </w:t>
-            </w:r>
-            <w:r>
-              <w:rPr>
-                <w:sz w:val="11"/>
-              </w:rPr>
-              <w:t xml:space="preserve">/ </w:t>
-            </w:r>
-            <w:r>
-              <w:rPr>
-                <w:spacing w:val="-5"/>
-                <w:sz w:val="11"/>
-              </w:rPr>
-              <w:t>300</w:t>
+              <w:t>${chtotal}</w:t>
             </w:r>
           </w:p>
         </w:tc>
@@ -4919,17 +4859,7 @@
                 <w:sz w:val="10"/>
                 <w:lang w:val="es-PE"/>
               </w:rPr>
-              <w:t>c/</w:t>
-            </w:r>
-            <w:proofErr w:type="spellStart"/>
-            <w:r>
-              <w:rPr>
-                <w:rFonts w:ascii="Arial"/>
-                <w:b/>
-                <w:sz w:val="10"/>
-                <w:lang w:val="es-PE"/>
-              </w:rPr>
-              <w:t>h_</w:t>
+              <w:t>c/h_</w:t>
             </w:r>
             <w:r>
               <w:rPr>
@@ -4941,7 +4871,6 @@
               </w:rPr>
               <w:t>u</w:t>
             </w:r>
-            <w:proofErr w:type="spellEnd"/>
             <w:r>
               <w:rPr>
                 <w:rFonts w:ascii="Arial"/>
@@ -5093,15 +5022,7 @@
                 <w:b/>
                 <w:sz w:val="10"/>
               </w:rPr>
-              <w:t>_u</w:t>
-            </w:r>
-            <w:r>
-              <w:rPr>
-                <w:rFonts w:ascii="Arial"/>
-                <w:b/>
-                <w:sz w:val="10"/>
-              </w:rPr>
-              <w:t>4</w:t>
+              <w:t>_u4</w:t>
             </w:r>
             <w:r>
               <w:rPr>
@@ -5165,15 +5086,7 @@
                 <w:b/>
                 <w:sz w:val="10"/>
               </w:rPr>
-              <w:t>_u</w:t>
-            </w:r>
-            <w:r>
-              <w:rPr>
-                <w:rFonts w:ascii="Arial"/>
-                <w:b/>
-                <w:sz w:val="10"/>
-              </w:rPr>
-              <w:t>5</w:t>
+              <w:t>_u5</w:t>
             </w:r>
             <w:r>
               <w:rPr>
@@ -5237,15 +5150,7 @@
                 <w:b/>
                 <w:sz w:val="10"/>
               </w:rPr>
-              <w:t>_u</w:t>
-            </w:r>
-            <w:r>
-              <w:rPr>
-                <w:rFonts w:ascii="Arial"/>
-                <w:b/>
-                <w:sz w:val="10"/>
-              </w:rPr>
-              <w:t>6</w:t>
+              <w:t>_u6</w:t>
             </w:r>
             <w:r>
               <w:rPr>
@@ -5307,15 +5212,7 @@
                 <w:b/>
                 <w:sz w:val="10"/>
               </w:rPr>
-              <w:t>_u</w:t>
-            </w:r>
-            <w:r>
-              <w:rPr>
-                <w:rFonts w:ascii="Arial"/>
-                <w:b/>
-                <w:sz w:val="10"/>
-              </w:rPr>
-              <w:t>7</w:t>
+              <w:t>_u7</w:t>
             </w:r>
             <w:r>
               <w:rPr>
@@ -5379,15 +5276,7 @@
                 <w:b/>
                 <w:sz w:val="10"/>
               </w:rPr>
-              <w:t>_u</w:t>
-            </w:r>
-            <w:r>
-              <w:rPr>
-                <w:rFonts w:ascii="Arial"/>
-                <w:b/>
-                <w:sz w:val="10"/>
-              </w:rPr>
-              <w:t>8</w:t>
+              <w:t>_u8</w:t>
             </w:r>
             <w:r>
               <w:rPr>
@@ -5449,15 +5338,7 @@
                 <w:b/>
                 <w:sz w:val="10"/>
               </w:rPr>
-              <w:t>_u</w:t>
-            </w:r>
-            <w:r>
-              <w:rPr>
-                <w:rFonts w:ascii="Arial"/>
-                <w:b/>
-                <w:sz w:val="10"/>
-              </w:rPr>
-              <w:t>9</w:t>
+              <w:t>_u9</w:t>
             </w:r>
             <w:r>
               <w:rPr>
@@ -5519,7 +5400,7 @@
                 <w:b/>
                 <w:sz w:val="10"/>
               </w:rPr>
-              <w:t>_u1</w:t>
+              <w:t>_u10</w:t>
             </w:r>
             <w:r>
               <w:rPr>
@@ -5527,45 +5408,45 @@
                 <w:b/>
                 <w:sz w:val="10"/>
               </w:rPr>
-              <w:t>0</w:t>
-            </w:r>
-            <w:r>
+              <w:t>}</w:t>
+            </w:r>
+          </w:p>
+        </w:tc>
+        <w:tc>
+          <w:tcPr>
+            <w:tcW w:w="349" w:type="dxa"/>
+            <w:tcBorders>
+              <w:top w:val="single" w:sz="4" w:space="0" w:color="000000"/>
+              <w:left w:val="single" w:sz="4" w:space="0" w:color="000000"/>
+              <w:right w:val="single" w:sz="4" w:space="0" w:color="000000"/>
+            </w:tcBorders>
+          </w:tcPr>
+          <w:p>
+            <w:pPr>
+              <w:pStyle w:val="TableParagraph"/>
+              <w:spacing w:before="57"/>
+              <w:jc w:val="center"/>
               <w:rPr>
                 <w:rFonts w:ascii="Arial"/>
                 <w:b/>
                 <w:sz w:val="10"/>
               </w:rPr>
-              <w:t>}</w:t>
-            </w:r>
-          </w:p>
-        </w:tc>
-        <w:tc>
-          <w:tcPr>
-            <w:tcW w:w="349" w:type="dxa"/>
-            <w:tcBorders>
-              <w:top w:val="single" w:sz="4" w:space="0" w:color="000000"/>
-              <w:left w:val="single" w:sz="4" w:space="0" w:color="000000"/>
-              <w:right w:val="single" w:sz="4" w:space="0" w:color="000000"/>
-            </w:tcBorders>
-          </w:tcPr>
-          <w:p>
-            <w:pPr>
-              <w:pStyle w:val="TableParagraph"/>
-              <w:spacing w:before="57"/>
-              <w:jc w:val="center"/>
+            </w:pPr>
+            <w:r>
               <w:rPr>
                 <w:rFonts w:ascii="Arial"/>
                 <w:b/>
                 <w:sz w:val="10"/>
               </w:rPr>
-            </w:pPr>
+              <w:t>$</w:t>
+            </w:r>
             <w:r>
               <w:rPr>
                 <w:rFonts w:ascii="Arial"/>
                 <w:b/>
                 <w:sz w:val="10"/>
               </w:rPr>
-              <w:t>$</w:t>
+              <w:t>{</w:t>
             </w:r>
             <w:r>
               <w:rPr>
@@ -5573,7 +5454,7 @@
                 <w:b/>
                 <w:sz w:val="10"/>
               </w:rPr>
-              <w:t>{</w:t>
+              <w:t>c</w:t>
             </w:r>
             <w:r>
               <w:rPr>
@@ -5581,7 +5462,7 @@
                 <w:b/>
                 <w:sz w:val="10"/>
               </w:rPr>
-              <w:t>c</w:t>
+              <w:t>/h</w:t>
             </w:r>
             <w:r>
               <w:rPr>
@@ -5589,34 +5470,16 @@
                 <w:b/>
                 <w:sz w:val="10"/>
               </w:rPr>
-              <w:t>/</w:t>
-            </w:r>
-            <w:proofErr w:type="spellStart"/>
+              <w:t>_</w:t>
+            </w:r>
             <w:r>
               <w:rPr>
                 <w:rFonts w:ascii="Arial"/>
                 <w:b/>
                 <w:sz w:val="10"/>
               </w:rPr>
-              <w:t>h</w:t>
-            </w:r>
-            <w:r>
-              <w:rPr>
-                <w:rFonts w:ascii="Arial"/>
-                <w:b/>
-                <w:sz w:val="10"/>
-              </w:rPr>
-              <w:t>_</w:t>
-            </w:r>
-            <w:r>
-              <w:rPr>
-                <w:rFonts w:ascii="Arial"/>
-                <w:b/>
-                <w:sz w:val="10"/>
-              </w:rPr>
               <w:t>efsrt</w:t>
             </w:r>
-            <w:proofErr w:type="spellEnd"/>
             <w:r>
               <w:rPr>
                 <w:rFonts w:ascii="Arial"/>
@@ -19328,7 +19191,6 @@
                 <w:sz w:val="10"/>
               </w:rPr>
             </w:pPr>
-            <w:proofErr w:type="spellStart"/>
             <w:r>
               <w:rPr>
                 <w:rFonts w:ascii="Arial" w:hAnsi="Arial"/>
@@ -19338,7 +19200,6 @@
               </w:rPr>
               <w:t>N.°</w:t>
             </w:r>
-            <w:proofErr w:type="spellEnd"/>
           </w:p>
         </w:tc>
         <w:tc>
@@ -20313,21 +20174,7 @@
               <w:rPr>
                 <w:sz w:val="9"/>
               </w:rPr>
-              <w:t>${</w:t>
-            </w:r>
-            <w:proofErr w:type="spellStart"/>
-            <w:r>
-              <w:rPr>
-                <w:sz w:val="9"/>
-              </w:rPr>
-              <w:t>efsrt</w:t>
-            </w:r>
-            <w:proofErr w:type="spellEnd"/>
-            <w:r>
-              <w:rPr>
-                <w:sz w:val="9"/>
-              </w:rPr>
-              <w:t>}</w:t>
+              <w:t>${efsrt}</w:t>
             </w:r>
           </w:p>
         </w:tc>
@@ -20985,17 +20832,7 @@
                 <w:sz w:val="10"/>
                 <w:lang w:val="es-PE"/>
               </w:rPr>
-              <w:t>c/</w:t>
-            </w:r>
-            <w:proofErr w:type="spellStart"/>
-            <w:r>
-              <w:rPr>
-                <w:rFonts w:ascii="Arial"/>
-                <w:b/>
-                <w:sz w:val="10"/>
-                <w:lang w:val="es-PE"/>
-              </w:rPr>
-              <w:t>h_</w:t>
+              <w:t>c/h_</w:t>
             </w:r>
             <w:r>
               <w:rPr>
@@ -21007,7 +20844,6 @@
               </w:rPr>
               <w:t>u</w:t>
             </w:r>
-            <w:proofErr w:type="spellEnd"/>
             <w:r>
               <w:rPr>
                 <w:rFonts w:ascii="Arial"/>
@@ -21428,25 +21264,7 @@
                 <w:b/>
                 <w:sz w:val="10"/>
               </w:rPr>
-              <w:t>${c/</w:t>
-            </w:r>
-            <w:proofErr w:type="spellStart"/>
-            <w:r>
-              <w:rPr>
-                <w:rFonts w:ascii="Arial"/>
-                <w:b/>
-                <w:sz w:val="10"/>
-              </w:rPr>
-              <w:t>h_efsrt</w:t>
-            </w:r>
-            <w:proofErr w:type="spellEnd"/>
-            <w:r>
-              <w:rPr>
-                <w:rFonts w:ascii="Arial"/>
-                <w:b/>
-                <w:sz w:val="10"/>
-              </w:rPr>
-              <w:t>}</w:t>
+              <w:t>${c/h_efsrt}</w:t>
             </w:r>
           </w:p>
         </w:tc>
@@ -44767,7 +44585,7 @@
           </mc:Choice>
           <mc:Fallback>
             <w:pict>
-              <v:shape w14:anchorId="7829A55D" id="Graphic 5" o:spid="_x0000_s1026" style="position:absolute;margin-left:181.45pt;margin-top:22.6pt;width:99.25pt;height:.85pt;z-index:-15727104;visibility:visible;mso-wrap-style:square;mso-wrap-distance-left:0;mso-wrap-distance-top:0;mso-wrap-distance-right:0;mso-wrap-distance-bottom:0;mso-position-horizontal:absolute;mso-position-horizontal-relative:page;mso-position-vertical:absolute;mso-position-vertical-relative:text;v-text-anchor:top" coordsize="1260475,10795" o:gfxdata="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" path="m1260347,10667l,10667,,,1260347,r,10667xe" fillcolor="black" stroked="f">
+              <v:shape w14:anchorId="3392401A" id="Graphic 5" o:spid="_x0000_s1026" style="position:absolute;margin-left:181.45pt;margin-top:22.6pt;width:99.25pt;height:.85pt;z-index:-15727104;visibility:visible;mso-wrap-style:square;mso-wrap-distance-left:0;mso-wrap-distance-top:0;mso-wrap-distance-right:0;mso-wrap-distance-bottom:0;mso-position-horizontal:absolute;mso-position-horizontal-relative:page;mso-position-vertical:absolute;mso-position-vertical-relative:text;v-text-anchor:top" coordsize="1260475,10795" o:gfxdata="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" path="m1260347,10667l,10667,,,1260347,r,10667xe" fillcolor="black" stroked="f">
                 <v:path arrowok="t"/>
                 <w10:wrap type="topAndBottom" anchorx="page"/>
               </v:shape>
@@ -44854,7 +44672,7 @@
           </mc:Choice>
           <mc:Fallback>
             <w:pict>
-              <v:shape w14:anchorId="370CACA0" id="Graphic 6" o:spid="_x0000_s1026" style="position:absolute;margin-left:440.05pt;margin-top:22.6pt;width:121.95pt;height:.85pt;z-index:-15726592;visibility:visible;mso-wrap-style:square;mso-wrap-distance-left:0;mso-wrap-distance-top:0;mso-wrap-distance-right:0;mso-wrap-distance-bottom:0;mso-position-horizontal:absolute;mso-position-horizontal-relative:page;mso-position-vertical:absolute;mso-position-vertical-relative:text;v-text-anchor:top" coordsize="1548765,10795" o:gfxdata="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" path="m1548384,10667l,10667,,,1548384,r,10667xe" fillcolor="black" stroked="f">
+              <v:shape w14:anchorId="6A72BF2B" id="Graphic 6" o:spid="_x0000_s1026" style="position:absolute;margin-left:440.05pt;margin-top:22.6pt;width:121.95pt;height:.85pt;z-index:-15726592;visibility:visible;mso-wrap-style:square;mso-wrap-distance-left:0;mso-wrap-distance-top:0;mso-wrap-distance-right:0;mso-wrap-distance-bottom:0;mso-position-horizontal:absolute;mso-position-horizontal-relative:page;mso-position-vertical:absolute;mso-position-vertical-relative:text;v-text-anchor:top" coordsize="1548765,10795" o:gfxdata="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" path="m1548384,10667l,10667,,,1548384,r,10667xe" fillcolor="black" stroked="f">
                 <v:path arrowok="t"/>
                 <w10:wrap type="topAndBottom" anchorx="page"/>
               </v:shape>
@@ -44910,7 +44728,7 @@
 </file>
 
 <file path=word/endnotes.xml><?xml version="1.0" encoding="utf-8"?>
-<w:endnotes xmlns:wpc="http://schemas.microsoft.com/office/word/2010/wordprocessingCanvas" xmlns:cx="http://schemas.microsoft.com/office/drawing/2014/chartex" xmlns:cx1="http://schemas.microsoft.com/office/drawing/2015/9/8/chartex" xmlns:cx2="http://schemas.microsoft.com/office/drawing/2015/10/21/chartex" xmlns:cx3="http://schemas.microsoft.com/office/drawing/2016/5/9/chartex" xmlns:cx4="http://schemas.microsoft.com/office/drawing/2016/5/10/chartex" xmlns:cx5="http://schemas.microsoft.com/office/drawing/2016/5/11/chartex" xmlns:cx6="http://schemas.microsoft.com/office/drawing/2016/5/12/chartex" xmlns:cx7="http://schemas.microsoft.com/office/drawing/2016/5/13/chartex" xmlns:cx8="http://schemas.microsoft.com/office/drawing/2016/5/14/chartex" xmlns:mc="http://schemas.openxmlformats.org/markup-compatibility/2006" xmlns:aink="http://schemas.microsoft.com/office/drawing/2016/ink" xmlns:am3d="http://schemas.microsoft.com/office/drawing/2017/model3d" xmlns:o="urn:schemas-microsoft-com:office:office" xmlns:oel="http://schemas.microsoft.com/office/2019/extlst" xmlns:r="http://schemas.openxmlformats.org/officeDocument/2006/relationships" xmlns:m="http://schemas.openxmlformats.org/officeDocument/2006/math" xmlns:v="urn:schemas-microsoft-com:vml" xmlns:wp14="http://schemas.microsoft.com/office/word/2010/wordprocessingDrawing" xmlns:wp="http://schemas.openxmlformats.org/drawingml/2006/wordprocessingDrawing" xmlns:w10="urn:schemas-microsoft-com:office:word" xmlns:w="http://schemas.openxmlformats.org/wordprocessingml/2006/main" xmlns:w14="http://schemas.microsoft.com/office/word/2010/wordml" xmlns:w15="http://schemas.microsoft.com/office/word/2012/wordml" xmlns:w16cex="http://schemas.microsoft.com/office/word/2018/wordml/cex" xmlns:w16cid="http://schemas.microsoft.com/office/word/2016/wordml/cid" xmlns:w16="http://schemas.microsoft.com/office/word/2018/wordml" xmlns:w16sdtdh="http://schemas.microsoft.com/office/word/2020/wordml/sdtdatahash" xmlns:w16se="http://schemas.microsoft.com/office/word/2015/wordml/symex" xmlns:wpg="http://schemas.microsoft.com/office/word/2010/wordprocessingGroup" xmlns:wpi="http://schemas.microsoft.com/office/word/2010/wordprocessingInk" xmlns:wne="http://schemas.microsoft.com/office/word/2006/wordml" xmlns:wps="http://schemas.microsoft.com/office/word/2010/wordprocessingShape" mc:Ignorable="w14 w15 w16se w16cid w16 w16cex w16sdtdh wp14">
+<w:endnotes xmlns:wpc="http://schemas.microsoft.com/office/word/2010/wordprocessingCanvas" xmlns:cx="http://schemas.microsoft.com/office/drawing/2014/chartex" xmlns:cx1="http://schemas.microsoft.com/office/drawing/2015/9/8/chartex" xmlns:cx2="http://schemas.microsoft.com/office/drawing/2015/10/21/chartex" xmlns:cx3="http://schemas.microsoft.com/office/drawing/2016/5/9/chartex" xmlns:cx4="http://schemas.microsoft.com/office/drawing/2016/5/10/chartex" xmlns:cx5="http://schemas.microsoft.com/office/drawing/2016/5/11/chartex" xmlns:cx6="http://schemas.microsoft.com/office/drawing/2016/5/12/chartex" xmlns:cx7="http://schemas.microsoft.com/office/drawing/2016/5/13/chartex" xmlns:cx8="http://schemas.microsoft.com/office/drawing/2016/5/14/chartex" xmlns:mc="http://schemas.openxmlformats.org/markup-compatibility/2006" xmlns:aink="http://schemas.microsoft.com/office/drawing/2016/ink" xmlns:am3d="http://schemas.microsoft.com/office/drawing/2017/model3d" xmlns:o="urn:schemas-microsoft-com:office:office" xmlns:oel="http://schemas.microsoft.com/office/2019/extlst" xmlns:r="http://schemas.openxmlformats.org/officeDocument/2006/relationships" xmlns:m="http://schemas.openxmlformats.org/officeDocument/2006/math" xmlns:v="urn:schemas-microsoft-com:vml" xmlns:wp14="http://schemas.microsoft.com/office/word/2010/wordprocessingDrawing" xmlns:wp="http://schemas.openxmlformats.org/drawingml/2006/wordprocessingDrawing" xmlns:w10="urn:schemas-microsoft-com:office:word" xmlns:w="http://schemas.openxmlformats.org/wordprocessingml/2006/main" xmlns:w14="http://schemas.microsoft.com/office/word/2010/wordml" xmlns:w15="http://schemas.microsoft.com/office/word/2012/wordml" xmlns:w16cex="http://schemas.microsoft.com/office/word/2018/wordml/cex" xmlns:w16cid="http://schemas.microsoft.com/office/word/2016/wordml/cid" xmlns:w16="http://schemas.microsoft.com/office/word/2018/wordml" xmlns:w16du="http://schemas.microsoft.com/office/word/2023/wordml/word16du" xmlns:w16sdtdh="http://schemas.microsoft.com/office/word/2020/wordml/sdtdatahash" xmlns:w16sdtfl="http://schemas.microsoft.com/office/word/2024/wordml/sdtformatlock" xmlns:w16se="http://schemas.microsoft.com/office/word/2015/wordml/symex" xmlns:wpg="http://schemas.microsoft.com/office/word/2010/wordprocessingGroup" xmlns:wpi="http://schemas.microsoft.com/office/word/2010/wordprocessingInk" xmlns:wne="http://schemas.microsoft.com/office/word/2006/wordml" xmlns:wps="http://schemas.microsoft.com/office/word/2010/wordprocessingShape" mc:Ignorable="w14 w15 w16se w16cid w16 w16cex w16sdtdh w16sdtfl w16du wp14">
   <w:endnote w:type="separator" w:id="-1">
     <w:p>
       <w:r>
@@ -44929,7 +44747,7 @@
 </file>
 
 <file path=word/footnotes.xml><?xml version="1.0" encoding="utf-8"?>
-<w:footnotes xmlns:wpc="http://schemas.microsoft.com/office/word/2010/wordprocessingCanvas" xmlns:cx="http://schemas.microsoft.com/office/drawing/2014/chartex" xmlns:cx1="http://schemas.microsoft.com/office/drawing/2015/9/8/chartex" xmlns:cx2="http://schemas.microsoft.com/office/drawing/2015/10/21/chartex" xmlns:cx3="http://schemas.microsoft.com/office/drawing/2016/5/9/chartex" xmlns:cx4="http://schemas.microsoft.com/office/drawing/2016/5/10/chartex" xmlns:cx5="http://schemas.microsoft.com/office/drawing/2016/5/11/chartex" xmlns:cx6="http://schemas.microsoft.com/office/drawing/2016/5/12/chartex" xmlns:cx7="http://schemas.microsoft.com/office/drawing/2016/5/13/chartex" xmlns:cx8="http://schemas.microsoft.com/office/drawing/2016/5/14/chartex" xmlns:mc="http://schemas.openxmlformats.org/markup-compatibility/2006" xmlns:aink="http://schemas.microsoft.com/office/drawing/2016/ink" xmlns:am3d="http://schemas.microsoft.com/office/drawing/2017/model3d" xmlns:o="urn:schemas-microsoft-com:office:office" xmlns:oel="http://schemas.microsoft.com/office/2019/extlst" xmlns:r="http://schemas.openxmlformats.org/officeDocument/2006/relationships" xmlns:m="http://schemas.openxmlformats.org/officeDocument/2006/math" xmlns:v="urn:schemas-microsoft-com:vml" xmlns:wp14="http://schemas.microsoft.com/office/word/2010/wordprocessingDrawing" xmlns:wp="http://schemas.openxmlformats.org/drawingml/2006/wordprocessingDrawing" xmlns:w10="urn:schemas-microsoft-com:office:word" xmlns:w="http://schemas.openxmlformats.org/wordprocessingml/2006/main" xmlns:w14="http://schemas.microsoft.com/office/word/2010/wordml" xmlns:w15="http://schemas.microsoft.com/office/word/2012/wordml" xmlns:w16cex="http://schemas.microsoft.com/office/word/2018/wordml/cex" xmlns:w16cid="http://schemas.microsoft.com/office/word/2016/wordml/cid" xmlns:w16="http://schemas.microsoft.com/office/word/2018/wordml" xmlns:w16sdtdh="http://schemas.microsoft.com/office/word/2020/wordml/sdtdatahash" xmlns:w16se="http://schemas.microsoft.com/office/word/2015/wordml/symex" xmlns:wpg="http://schemas.microsoft.com/office/word/2010/wordprocessingGroup" xmlns:wpi="http://schemas.microsoft.com/office/word/2010/wordprocessingInk" xmlns:wne="http://schemas.microsoft.com/office/word/2006/wordml" xmlns:wps="http://schemas.microsoft.com/office/word/2010/wordprocessingShape" mc:Ignorable="w14 w15 w16se w16cid w16 w16cex w16sdtdh wp14">
+<w:footnotes xmlns:wpc="http://schemas.microsoft.com/office/word/2010/wordprocessingCanvas" xmlns:cx="http://schemas.microsoft.com/office/drawing/2014/chartex" xmlns:cx1="http://schemas.microsoft.com/office/drawing/2015/9/8/chartex" xmlns:cx2="http://schemas.microsoft.com/office/drawing/2015/10/21/chartex" xmlns:cx3="http://schemas.microsoft.com/office/drawing/2016/5/9/chartex" xmlns:cx4="http://schemas.microsoft.com/office/drawing/2016/5/10/chartex" xmlns:cx5="http://schemas.microsoft.com/office/drawing/2016/5/11/chartex" xmlns:cx6="http://schemas.microsoft.com/office/drawing/2016/5/12/chartex" xmlns:cx7="http://schemas.microsoft.com/office/drawing/2016/5/13/chartex" xmlns:cx8="http://schemas.microsoft.com/office/drawing/2016/5/14/chartex" xmlns:mc="http://schemas.openxmlformats.org/markup-compatibility/2006" xmlns:aink="http://schemas.microsoft.com/office/drawing/2016/ink" xmlns:am3d="http://schemas.microsoft.com/office/drawing/2017/model3d" xmlns:o="urn:schemas-microsoft-com:office:office" xmlns:oel="http://schemas.microsoft.com/office/2019/extlst" xmlns:r="http://schemas.openxmlformats.org/officeDocument/2006/relationships" xmlns:m="http://schemas.openxmlformats.org/officeDocument/2006/math" xmlns:v="urn:schemas-microsoft-com:vml" xmlns:wp14="http://schemas.microsoft.com/office/word/2010/wordprocessingDrawing" xmlns:wp="http://schemas.openxmlformats.org/drawingml/2006/wordprocessingDrawing" xmlns:w10="urn:schemas-microsoft-com:office:word" xmlns:w="http://schemas.openxmlformats.org/wordprocessingml/2006/main" xmlns:w14="http://schemas.microsoft.com/office/word/2010/wordml" xmlns:w15="http://schemas.microsoft.com/office/word/2012/wordml" xmlns:w16cex="http://schemas.microsoft.com/office/word/2018/wordml/cex" xmlns:w16cid="http://schemas.microsoft.com/office/word/2016/wordml/cid" xmlns:w16="http://schemas.microsoft.com/office/word/2018/wordml" xmlns:w16du="http://schemas.microsoft.com/office/word/2023/wordml/word16du" xmlns:w16sdtdh="http://schemas.microsoft.com/office/word/2020/wordml/sdtdatahash" xmlns:w16sdtfl="http://schemas.microsoft.com/office/word/2024/wordml/sdtformatlock" xmlns:w16se="http://schemas.microsoft.com/office/word/2015/wordml/symex" xmlns:wpg="http://schemas.microsoft.com/office/word/2010/wordprocessingGroup" xmlns:wpi="http://schemas.microsoft.com/office/word/2010/wordprocessingInk" xmlns:wne="http://schemas.microsoft.com/office/word/2006/wordml" xmlns:wps="http://schemas.microsoft.com/office/word/2010/wordprocessingShape" mc:Ignorable="w14 w15 w16se w16cid w16 w16cex w16sdtdh w16sdtfl w16du wp14">
   <w:footnote w:type="separator" w:id="-1">
     <w:p>
       <w:r>
@@ -44948,7 +44766,7 @@
 </file>
 
 <file path=word/styles.xml><?xml version="1.0" encoding="utf-8"?>
-<w:styles xmlns:mc="http://schemas.openxmlformats.org/markup-compatibility/2006" xmlns:r="http://schemas.openxmlformats.org/officeDocument/2006/relationships" xmlns:w="http://schemas.openxmlformats.org/wordprocessingml/2006/main" xmlns:w14="http://schemas.microsoft.com/office/word/2010/wordml" xmlns:w15="http://schemas.microsoft.com/office/word/2012/wordml" xmlns:w16cex="http://schemas.microsoft.com/office/word/2018/wordml/cex" xmlns:w16cid="http://schemas.microsoft.com/office/word/2016/wordml/cid" xmlns:w16="http://schemas.microsoft.com/office/word/2018/wordml" xmlns:w16sdtdh="http://schemas.microsoft.com/office/word/2020/wordml/sdtdatahash" xmlns:w16se="http://schemas.microsoft.com/office/word/2015/wordml/symex" mc:Ignorable="w14 w15 w16se w16cid w16 w16cex w16sdtdh">
+<w:styles xmlns:mc="http://schemas.openxmlformats.org/markup-compatibility/2006" xmlns:r="http://schemas.openxmlformats.org/officeDocument/2006/relationships" xmlns:w="http://schemas.openxmlformats.org/wordprocessingml/2006/main" xmlns:w14="http://schemas.microsoft.com/office/word/2010/wordml" xmlns:w15="http://schemas.microsoft.com/office/word/2012/wordml" xmlns:w16cex="http://schemas.microsoft.com/office/word/2018/wordml/cex" xmlns:w16cid="http://schemas.microsoft.com/office/word/2016/wordml/cid" xmlns:w16="http://schemas.microsoft.com/office/word/2018/wordml" xmlns:w16du="http://schemas.microsoft.com/office/word/2023/wordml/word16du" xmlns:w16sdtdh="http://schemas.microsoft.com/office/word/2020/wordml/sdtdatahash" xmlns:w16sdtfl="http://schemas.microsoft.com/office/word/2024/wordml/sdtformatlock" xmlns:w16se="http://schemas.microsoft.com/office/word/2015/wordml/symex" mc:Ignorable="w14 w15 w16se w16cid w16 w16cex w16sdtdh w16sdtfl w16du">
   <w:docDefaults>
     <w:rPrDefault>
       <w:rPr>
@@ -45373,6 +45191,7 @@
   <w:style w:type="character" w:default="1" w:styleId="Fuentedeprrafopredeter">
     <w:name w:val="Default Paragraph Font"/>
     <w:uiPriority w:val="1"/>
+    <w:semiHidden/>
     <w:unhideWhenUsed/>
   </w:style>
   <w:style w:type="table" w:default="1" w:styleId="Tablanormal">

</xml_diff>

<commit_message>
fix: se añadio color al scrool en todo el panel
</commit_message>
<xml_diff>
--- a/public/plantillas/ACTA.docx
+++ b/public/plantillas/ACTA.docx
@@ -1,6 +1,6 @@
 
 <file path=word/document.xml><?xml version="1.0" encoding="utf-8"?>
-<w:document xmlns:wpc="http://schemas.microsoft.com/office/word/2010/wordprocessingCanvas" xmlns:cx="http://schemas.microsoft.com/office/drawing/2014/chartex" xmlns:cx1="http://schemas.microsoft.com/office/drawing/2015/9/8/chartex" xmlns:cx2="http://schemas.microsoft.com/office/drawing/2015/10/21/chartex" xmlns:cx3="http://schemas.microsoft.com/office/drawing/2016/5/9/chartex" xmlns:cx4="http://schemas.microsoft.com/office/drawing/2016/5/10/chartex" xmlns:cx5="http://schemas.microsoft.com/office/drawing/2016/5/11/chartex" xmlns:cx6="http://schemas.microsoft.com/office/drawing/2016/5/12/chartex" xmlns:cx7="http://schemas.microsoft.com/office/drawing/2016/5/13/chartex" xmlns:cx8="http://schemas.microsoft.com/office/drawing/2016/5/14/chartex" xmlns:mc="http://schemas.openxmlformats.org/markup-compatibility/2006" xmlns:aink="http://schemas.microsoft.com/office/drawing/2016/ink" xmlns:am3d="http://schemas.microsoft.com/office/drawing/2017/model3d" xmlns:o="urn:schemas-microsoft-com:office:office" xmlns:oel="http://schemas.microsoft.com/office/2019/extlst" xmlns:r="http://schemas.openxmlformats.org/officeDocument/2006/relationships" xmlns:m="http://schemas.openxmlformats.org/officeDocument/2006/math" xmlns:v="urn:schemas-microsoft-com:vml" xmlns:wp14="http://schemas.microsoft.com/office/word/2010/wordprocessingDrawing" xmlns:wp="http://schemas.openxmlformats.org/drawingml/2006/wordprocessingDrawing" xmlns:w10="urn:schemas-microsoft-com:office:word" xmlns:w="http://schemas.openxmlformats.org/wordprocessingml/2006/main" xmlns:w14="http://schemas.microsoft.com/office/word/2010/wordml" xmlns:w15="http://schemas.microsoft.com/office/word/2012/wordml" xmlns:w16cex="http://schemas.microsoft.com/office/word/2018/wordml/cex" xmlns:w16cid="http://schemas.microsoft.com/office/word/2016/wordml/cid" xmlns:w16="http://schemas.microsoft.com/office/word/2018/wordml" xmlns:w16du="http://schemas.microsoft.com/office/word/2023/wordml/word16du" xmlns:w16sdtdh="http://schemas.microsoft.com/office/word/2020/wordml/sdtdatahash" xmlns:w16sdtfl="http://schemas.microsoft.com/office/word/2024/wordml/sdtformatlock" xmlns:w16se="http://schemas.microsoft.com/office/word/2015/wordml/symex" xmlns:wpg="http://schemas.microsoft.com/office/word/2010/wordprocessingGroup" xmlns:wpi="http://schemas.microsoft.com/office/word/2010/wordprocessingInk" xmlns:wne="http://schemas.microsoft.com/office/word/2006/wordml" xmlns:wps="http://schemas.microsoft.com/office/word/2010/wordprocessingShape" mc:Ignorable="w14 w15 w16se w16cid w16 w16cex w16sdtdh w16sdtfl w16du wp14">
+<w:document xmlns:wpc="http://schemas.microsoft.com/office/word/2010/wordprocessingCanvas" xmlns:cx="http://schemas.microsoft.com/office/drawing/2014/chartex" xmlns:cx1="http://schemas.microsoft.com/office/drawing/2015/9/8/chartex" xmlns:cx2="http://schemas.microsoft.com/office/drawing/2015/10/21/chartex" xmlns:cx3="http://schemas.microsoft.com/office/drawing/2016/5/9/chartex" xmlns:cx4="http://schemas.microsoft.com/office/drawing/2016/5/10/chartex" xmlns:cx5="http://schemas.microsoft.com/office/drawing/2016/5/11/chartex" xmlns:cx6="http://schemas.microsoft.com/office/drawing/2016/5/12/chartex" xmlns:cx7="http://schemas.microsoft.com/office/drawing/2016/5/13/chartex" xmlns:cx8="http://schemas.microsoft.com/office/drawing/2016/5/14/chartex" xmlns:mc="http://schemas.openxmlformats.org/markup-compatibility/2006" xmlns:aink="http://schemas.microsoft.com/office/drawing/2016/ink" xmlns:am3d="http://schemas.microsoft.com/office/drawing/2017/model3d" xmlns:o="urn:schemas-microsoft-com:office:office" xmlns:oel="http://schemas.microsoft.com/office/2019/extlst" xmlns:r="http://schemas.openxmlformats.org/officeDocument/2006/relationships" xmlns:m="http://schemas.openxmlformats.org/officeDocument/2006/math" xmlns:v="urn:schemas-microsoft-com:vml" xmlns:wp14="http://schemas.microsoft.com/office/word/2010/wordprocessingDrawing" xmlns:wp="http://schemas.openxmlformats.org/drawingml/2006/wordprocessingDrawing" xmlns:w10="urn:schemas-microsoft-com:office:word" xmlns:w="http://schemas.openxmlformats.org/wordprocessingml/2006/main" xmlns:w14="http://schemas.microsoft.com/office/word/2010/wordml" xmlns:w15="http://schemas.microsoft.com/office/word/2012/wordml" xmlns:w16cex="http://schemas.microsoft.com/office/word/2018/wordml/cex" xmlns:w16cid="http://schemas.microsoft.com/office/word/2016/wordml/cid" xmlns:w16="http://schemas.microsoft.com/office/word/2018/wordml" xmlns:w16sdtdh="http://schemas.microsoft.com/office/word/2020/wordml/sdtdatahash" xmlns:w16se="http://schemas.microsoft.com/office/word/2015/wordml/symex" xmlns:wpg="http://schemas.microsoft.com/office/word/2010/wordprocessingGroup" xmlns:wpi="http://schemas.microsoft.com/office/word/2010/wordprocessingInk" xmlns:wne="http://schemas.microsoft.com/office/word/2006/wordml" xmlns:wps="http://schemas.microsoft.com/office/word/2010/wordprocessingShape" mc:Ignorable="w14 w15 w16se w16cid w16 w16cex w16sdtdh wp14">
   <w:body>
     <w:p>
       <w:pPr>
@@ -153,6 +153,7 @@
         </w:rPr>
         <w:t>${</w:t>
       </w:r>
+      <w:proofErr w:type="spellStart"/>
       <w:r>
         <w:rPr>
           <w:rFonts w:ascii="Arial" w:hAnsi="Arial"/>
@@ -160,6 +161,7 @@
         </w:rPr>
         <w:t>anio</w:t>
       </w:r>
+      <w:proofErr w:type="spellEnd"/>
       <w:r>
         <w:rPr>
           <w:rFonts w:ascii="Arial" w:hAnsi="Arial"/>
@@ -338,12 +340,14 @@
               </w:rPr>
               <w:t>${</w:t>
             </w:r>
+            <w:proofErr w:type="spellStart"/>
             <w:r>
               <w:rPr>
                 <w:sz w:val="11"/>
               </w:rPr>
               <w:t>cetpro</w:t>
             </w:r>
+            <w:proofErr w:type="spellEnd"/>
             <w:r>
               <w:rPr>
                 <w:sz w:val="11"/>
@@ -906,7 +910,21 @@
               <w:rPr>
                 <w:sz w:val="9"/>
               </w:rPr>
-              <w:t>${efsrt}</w:t>
+              <w:t>${</w:t>
+            </w:r>
+            <w:proofErr w:type="spellStart"/>
+            <w:r>
+              <w:rPr>
+                <w:sz w:val="9"/>
+              </w:rPr>
+              <w:t>efsrt</w:t>
+            </w:r>
+            <w:proofErr w:type="spellEnd"/>
+            <w:r>
+              <w:rPr>
+                <w:sz w:val="9"/>
+              </w:rPr>
+              <w:t>}</w:t>
             </w:r>
           </w:p>
         </w:tc>
@@ -1331,12 +1349,14 @@
               </w:rPr>
               <w:t xml:space="preserve"> </w:t>
             </w:r>
+            <w:proofErr w:type="spellStart"/>
             <w:r>
               <w:rPr>
                 <w:sz w:val="11"/>
               </w:rPr>
               <w:t>Nº</w:t>
             </w:r>
+            <w:proofErr w:type="spellEnd"/>
             <w:r>
               <w:rPr>
                 <w:spacing w:val="2"/>
@@ -1368,11 +1388,19 @@
                 <w:sz w:val="11"/>
               </w:rPr>
             </w:pPr>
+            <w:proofErr w:type="spellStart"/>
             <w:r>
               <w:rPr>
                 <w:sz w:val="11"/>
               </w:rPr>
-              <w:t xml:space="preserve">Nº </w:t>
+              <w:t>Nº</w:t>
+            </w:r>
+            <w:proofErr w:type="spellEnd"/>
+            <w:r>
+              <w:rPr>
+                <w:sz w:val="11"/>
+              </w:rPr>
+              <w:t xml:space="preserve"> </w:t>
             </w:r>
             <w:r>
               <w:rPr>
@@ -1472,11 +1500,19 @@
               </w:rPr>
               <w:t xml:space="preserve"> </w:t>
             </w:r>
+            <w:proofErr w:type="spellStart"/>
             <w:r>
               <w:rPr>
                 <w:sz w:val="10"/>
               </w:rPr>
-              <w:t>N° 06335</w:t>
+              <w:t>N°</w:t>
+            </w:r>
+            <w:proofErr w:type="spellEnd"/>
+            <w:r>
+              <w:rPr>
+                <w:sz w:val="10"/>
+              </w:rPr>
+              <w:t xml:space="preserve"> 06335</w:t>
             </w:r>
             <w:r>
               <w:rPr>
@@ -4284,6 +4320,7 @@
                 <w:sz w:val="9"/>
               </w:rPr>
             </w:pPr>
+            <w:proofErr w:type="spellStart"/>
             <w:r>
               <w:rPr>
                 <w:rFonts w:ascii="Arial" w:hAnsi="Arial"/>
@@ -4293,6 +4330,7 @@
               </w:rPr>
               <w:t>N.°</w:t>
             </w:r>
+            <w:proofErr w:type="spellEnd"/>
           </w:p>
         </w:tc>
         <w:tc>
@@ -4609,12 +4647,14 @@
                 <w:sz w:val="9"/>
               </w:rPr>
             </w:pPr>
+            <w:proofErr w:type="gramStart"/>
             <w:r>
               <w:rPr>
                 <w:sz w:val="9"/>
               </w:rPr>
               <w:t>TOTAL</w:t>
             </w:r>
+            <w:proofErr w:type="gramEnd"/>
             <w:r>
               <w:rPr>
                 <w:spacing w:val="-1"/>
@@ -4676,12 +4716,6 @@
                 <w:sz w:val="11"/>
               </w:rPr>
             </w:pPr>
-            <w:r>
-              <w:rPr>
-                <w:sz w:val="11"/>
-              </w:rPr>
-              <w:t>${chtotal}</w:t>
-            </w:r>
           </w:p>
         </w:tc>
       </w:tr>
@@ -4767,7 +4801,8 @@
               <w:rPr>
                 <w:rFonts w:ascii="Arial"/>
                 <w:b/>
-                <w:sz w:val="10"/>
+                <w:sz w:val="9"/>
+                <w:szCs w:val="9"/>
                 <w:lang w:val="es-PE"/>
               </w:rPr>
             </w:pPr>
@@ -4775,7 +4810,8 @@
               <w:rPr>
                 <w:rFonts w:ascii="Arial"/>
                 <w:b/>
-                <w:sz w:val="10"/>
+                <w:sz w:val="9"/>
+                <w:szCs w:val="9"/>
               </w:rPr>
               <w:t>$</w:t>
             </w:r>
@@ -4783,7 +4819,8 @@
               <w:rPr>
                 <w:rFonts w:ascii="Arial"/>
                 <w:b/>
-                <w:sz w:val="10"/>
+                <w:sz w:val="9"/>
+                <w:szCs w:val="9"/>
               </w:rPr>
               <w:t>{</w:t>
             </w:r>
@@ -4791,7 +4828,8 @@
               <w:rPr>
                 <w:rFonts w:ascii="Arial"/>
                 <w:b/>
-                <w:sz w:val="10"/>
+                <w:sz w:val="9"/>
+                <w:szCs w:val="9"/>
                 <w:lang w:val="es-PE"/>
               </w:rPr>
               <w:t>c/h_</w:t>
@@ -4800,7 +4838,8 @@
               <w:rPr>
                 <w:rFonts w:ascii="Arial"/>
                 <w:b/>
-                <w:sz w:val="10"/>
+                <w:sz w:val="9"/>
+                <w:szCs w:val="9"/>
                 <w:lang w:val="es-PE"/>
               </w:rPr>
               <w:t>u1</w:t>
@@ -4809,7 +4848,8 @@
               <w:rPr>
                 <w:rFonts w:ascii="Arial"/>
                 <w:b/>
-                <w:sz w:val="10"/>
+                <w:sz w:val="9"/>
+                <w:szCs w:val="9"/>
               </w:rPr>
               <w:t>}</w:t>
             </w:r>
@@ -4833,14 +4873,16 @@
               <w:rPr>
                 <w:rFonts w:ascii="Arial"/>
                 <w:b/>
-                <w:sz w:val="10"/>
+                <w:sz w:val="9"/>
+                <w:szCs w:val="9"/>
               </w:rPr>
             </w:pPr>
             <w:r>
               <w:rPr>
                 <w:rFonts w:ascii="Arial"/>
                 <w:b/>
-                <w:sz w:val="10"/>
+                <w:sz w:val="9"/>
+                <w:szCs w:val="9"/>
               </w:rPr>
               <w:t>$</w:t>
             </w:r>
@@ -4848,7 +4890,8 @@
               <w:rPr>
                 <w:rFonts w:ascii="Arial"/>
                 <w:b/>
-                <w:sz w:val="10"/>
+                <w:sz w:val="9"/>
+                <w:szCs w:val="9"/>
               </w:rPr>
               <w:t>{</w:t>
             </w:r>
@@ -4856,26 +4899,41 @@
               <w:rPr>
                 <w:rFonts w:ascii="Arial"/>
                 <w:b/>
-                <w:sz w:val="10"/>
+                <w:sz w:val="9"/>
+                <w:szCs w:val="9"/>
                 <w:lang w:val="es-PE"/>
               </w:rPr>
-              <w:t>c/h_</w:t>
-            </w:r>
+              <w:t>c/</w:t>
+            </w:r>
+            <w:proofErr w:type="spellStart"/>
             <w:r>
               <w:rPr>
                 <w:rFonts w:ascii="Arial"/>
                 <w:b/>
-                <w:sz w:val="10"/>
+                <w:sz w:val="9"/>
+                <w:szCs w:val="9"/>
+                <w:lang w:val="es-PE"/>
+              </w:rPr>
+              <w:t>h_</w:t>
+            </w:r>
+            <w:r>
+              <w:rPr>
+                <w:rFonts w:ascii="Arial"/>
+                <w:b/>
+                <w:sz w:val="9"/>
+                <w:szCs w:val="9"/>
                 <w:u w:val="single"/>
                 <w:lang w:val="es-PE"/>
               </w:rPr>
               <w:t>u</w:t>
             </w:r>
+            <w:proofErr w:type="spellEnd"/>
             <w:r>
               <w:rPr>
                 <w:rFonts w:ascii="Arial"/>
                 <w:b/>
-                <w:sz w:val="10"/>
+                <w:sz w:val="9"/>
+                <w:szCs w:val="9"/>
                 <w:u w:val="single"/>
               </w:rPr>
               <w:t>2</w:t>
@@ -4884,7 +4942,8 @@
               <w:rPr>
                 <w:rFonts w:ascii="Arial"/>
                 <w:b/>
-                <w:sz w:val="10"/>
+                <w:sz w:val="9"/>
+                <w:szCs w:val="9"/>
               </w:rPr>
               <w:t>}</w:t>
             </w:r>
@@ -4908,14 +4967,16 @@
               <w:rPr>
                 <w:rFonts w:ascii="Arial"/>
                 <w:b/>
-                <w:sz w:val="10"/>
+                <w:sz w:val="9"/>
+                <w:szCs w:val="9"/>
               </w:rPr>
             </w:pPr>
             <w:r>
               <w:rPr>
                 <w:rFonts w:ascii="Arial"/>
                 <w:b/>
-                <w:sz w:val="10"/>
+                <w:sz w:val="9"/>
+                <w:szCs w:val="9"/>
               </w:rPr>
               <w:t>$</w:t>
             </w:r>
@@ -4923,7 +4984,8 @@
               <w:rPr>
                 <w:rFonts w:ascii="Arial"/>
                 <w:b/>
-                <w:sz w:val="10"/>
+                <w:sz w:val="9"/>
+                <w:szCs w:val="9"/>
               </w:rPr>
               <w:t>{</w:t>
             </w:r>
@@ -4931,7 +4993,8 @@
               <w:rPr>
                 <w:rFonts w:ascii="Arial"/>
                 <w:b/>
-                <w:sz w:val="10"/>
+                <w:sz w:val="9"/>
+                <w:szCs w:val="9"/>
                 <w:lang w:val="es-PE"/>
               </w:rPr>
               <w:t>c/h</w:t>
@@ -4940,7 +5003,8 @@
               <w:rPr>
                 <w:rFonts w:ascii="Arial"/>
                 <w:b/>
-                <w:sz w:val="10"/>
+                <w:sz w:val="9"/>
+                <w:szCs w:val="9"/>
               </w:rPr>
               <w:t>_</w:t>
             </w:r>
@@ -4948,7 +5012,8 @@
               <w:rPr>
                 <w:rFonts w:ascii="Arial"/>
                 <w:b/>
-                <w:sz w:val="10"/>
+                <w:sz w:val="9"/>
+                <w:szCs w:val="9"/>
               </w:rPr>
               <w:t>u</w:t>
             </w:r>
@@ -4956,7 +5021,8 @@
               <w:rPr>
                 <w:rFonts w:ascii="Arial"/>
                 <w:b/>
-                <w:sz w:val="10"/>
+                <w:sz w:val="9"/>
+                <w:szCs w:val="9"/>
               </w:rPr>
               <w:t>3</w:t>
             </w:r>
@@ -4964,7 +5030,8 @@
               <w:rPr>
                 <w:rFonts w:ascii="Arial"/>
                 <w:b/>
-                <w:sz w:val="10"/>
+                <w:sz w:val="9"/>
+                <w:szCs w:val="9"/>
               </w:rPr>
               <w:t>}</w:t>
             </w:r>
@@ -4988,14 +5055,16 @@
               <w:rPr>
                 <w:rFonts w:ascii="Arial"/>
                 <w:b/>
-                <w:sz w:val="10"/>
+                <w:sz w:val="9"/>
+                <w:szCs w:val="9"/>
               </w:rPr>
             </w:pPr>
             <w:r>
               <w:rPr>
                 <w:rFonts w:ascii="Arial"/>
                 <w:b/>
-                <w:sz w:val="10"/>
+                <w:sz w:val="9"/>
+                <w:szCs w:val="9"/>
               </w:rPr>
               <w:t>$</w:t>
             </w:r>
@@ -5003,7 +5072,8 @@
               <w:rPr>
                 <w:rFonts w:ascii="Arial"/>
                 <w:b/>
-                <w:sz w:val="10"/>
+                <w:sz w:val="9"/>
+                <w:szCs w:val="9"/>
               </w:rPr>
               <w:t>{</w:t>
             </w:r>
@@ -5011,7 +5081,8 @@
               <w:rPr>
                 <w:rFonts w:ascii="Arial"/>
                 <w:b/>
-                <w:sz w:val="10"/>
+                <w:sz w:val="9"/>
+                <w:szCs w:val="9"/>
                 <w:lang w:val="es-PE"/>
               </w:rPr>
               <w:t>c/h</w:t>
@@ -5020,15 +5091,26 @@
               <w:rPr>
                 <w:rFonts w:ascii="Arial"/>
                 <w:b/>
-                <w:sz w:val="10"/>
-              </w:rPr>
-              <w:t>_u4</w:t>
+                <w:sz w:val="9"/>
+                <w:szCs w:val="9"/>
+              </w:rPr>
+              <w:t>_u</w:t>
             </w:r>
             <w:r>
               <w:rPr>
                 <w:rFonts w:ascii="Arial"/>
                 <w:b/>
-                <w:sz w:val="10"/>
+                <w:sz w:val="9"/>
+                <w:szCs w:val="9"/>
+              </w:rPr>
+              <w:t>4</w:t>
+            </w:r>
+            <w:r>
+              <w:rPr>
+                <w:rFonts w:ascii="Arial"/>
+                <w:b/>
+                <w:sz w:val="9"/>
+                <w:szCs w:val="9"/>
               </w:rPr>
               <w:t>}</w:t>
             </w:r>
@@ -5052,14 +5134,16 @@
               <w:rPr>
                 <w:rFonts w:ascii="Arial"/>
                 <w:b/>
-                <w:sz w:val="10"/>
+                <w:sz w:val="9"/>
+                <w:szCs w:val="9"/>
               </w:rPr>
             </w:pPr>
             <w:r>
               <w:rPr>
                 <w:rFonts w:ascii="Arial"/>
                 <w:b/>
-                <w:sz w:val="10"/>
+                <w:sz w:val="9"/>
+                <w:szCs w:val="9"/>
               </w:rPr>
               <w:t>$</w:t>
             </w:r>
@@ -5067,7 +5151,8 @@
               <w:rPr>
                 <w:rFonts w:ascii="Arial"/>
                 <w:b/>
-                <w:sz w:val="10"/>
+                <w:sz w:val="9"/>
+                <w:szCs w:val="9"/>
               </w:rPr>
               <w:t>{</w:t>
             </w:r>
@@ -5075,7 +5160,8 @@
               <w:rPr>
                 <w:rFonts w:ascii="Arial"/>
                 <w:b/>
-                <w:sz w:val="10"/>
+                <w:sz w:val="9"/>
+                <w:szCs w:val="9"/>
                 <w:lang w:val="es-PE"/>
               </w:rPr>
               <w:t>c/h</w:t>
@@ -5084,15 +5170,26 @@
               <w:rPr>
                 <w:rFonts w:ascii="Arial"/>
                 <w:b/>
-                <w:sz w:val="10"/>
-              </w:rPr>
-              <w:t>_u5</w:t>
+                <w:sz w:val="9"/>
+                <w:szCs w:val="9"/>
+              </w:rPr>
+              <w:t>_u</w:t>
             </w:r>
             <w:r>
               <w:rPr>
                 <w:rFonts w:ascii="Arial"/>
                 <w:b/>
-                <w:sz w:val="10"/>
+                <w:sz w:val="9"/>
+                <w:szCs w:val="9"/>
+              </w:rPr>
+              <w:t>5</w:t>
+            </w:r>
+            <w:r>
+              <w:rPr>
+                <w:rFonts w:ascii="Arial"/>
+                <w:b/>
+                <w:sz w:val="9"/>
+                <w:szCs w:val="9"/>
               </w:rPr>
               <w:t>}</w:t>
             </w:r>
@@ -5116,14 +5213,16 @@
               <w:rPr>
                 <w:rFonts w:ascii="Arial"/>
                 <w:b/>
-                <w:sz w:val="10"/>
+                <w:sz w:val="9"/>
+                <w:szCs w:val="9"/>
               </w:rPr>
             </w:pPr>
             <w:r>
               <w:rPr>
                 <w:rFonts w:ascii="Arial"/>
                 <w:b/>
-                <w:sz w:val="10"/>
+                <w:sz w:val="9"/>
+                <w:szCs w:val="9"/>
               </w:rPr>
               <w:t>$</w:t>
             </w:r>
@@ -5131,7 +5230,8 @@
               <w:rPr>
                 <w:rFonts w:ascii="Arial"/>
                 <w:b/>
-                <w:sz w:val="10"/>
+                <w:sz w:val="9"/>
+                <w:szCs w:val="9"/>
               </w:rPr>
               <w:t>{</w:t>
             </w:r>
@@ -5139,7 +5239,8 @@
               <w:rPr>
                 <w:rFonts w:ascii="Arial"/>
                 <w:b/>
-                <w:sz w:val="10"/>
+                <w:sz w:val="9"/>
+                <w:szCs w:val="9"/>
                 <w:lang w:val="es-PE"/>
               </w:rPr>
               <w:t>c/h</w:t>
@@ -5148,15 +5249,26 @@
               <w:rPr>
                 <w:rFonts w:ascii="Arial"/>
                 <w:b/>
-                <w:sz w:val="10"/>
-              </w:rPr>
-              <w:t>_u6</w:t>
+                <w:sz w:val="9"/>
+                <w:szCs w:val="9"/>
+              </w:rPr>
+              <w:t>_u</w:t>
             </w:r>
             <w:r>
               <w:rPr>
                 <w:rFonts w:ascii="Arial"/>
                 <w:b/>
-                <w:sz w:val="10"/>
+                <w:sz w:val="9"/>
+                <w:szCs w:val="9"/>
+              </w:rPr>
+              <w:t>6</w:t>
+            </w:r>
+            <w:r>
+              <w:rPr>
+                <w:rFonts w:ascii="Arial"/>
+                <w:b/>
+                <w:sz w:val="9"/>
+                <w:szCs w:val="9"/>
               </w:rPr>
               <w:t>}</w:t>
             </w:r>
@@ -5178,14 +5290,16 @@
               <w:jc w:val="center"/>
               <w:rPr>
                 <w:rFonts w:ascii="Times New Roman"/>
-                <w:sz w:val="10"/>
+                <w:sz w:val="9"/>
+                <w:szCs w:val="9"/>
               </w:rPr>
             </w:pPr>
             <w:r>
               <w:rPr>
                 <w:rFonts w:ascii="Arial"/>
                 <w:b/>
-                <w:sz w:val="10"/>
+                <w:sz w:val="9"/>
+                <w:szCs w:val="9"/>
               </w:rPr>
               <w:t>$</w:t>
             </w:r>
@@ -5193,7 +5307,8 @@
               <w:rPr>
                 <w:rFonts w:ascii="Arial"/>
                 <w:b/>
-                <w:sz w:val="10"/>
+                <w:sz w:val="9"/>
+                <w:szCs w:val="9"/>
               </w:rPr>
               <w:t>{</w:t>
             </w:r>
@@ -5201,7 +5316,8 @@
               <w:rPr>
                 <w:rFonts w:ascii="Arial"/>
                 <w:b/>
-                <w:sz w:val="10"/>
+                <w:sz w:val="9"/>
+                <w:szCs w:val="9"/>
                 <w:lang w:val="es-PE"/>
               </w:rPr>
               <w:t>c/h</w:t>
@@ -5210,15 +5326,26 @@
               <w:rPr>
                 <w:rFonts w:ascii="Arial"/>
                 <w:b/>
-                <w:sz w:val="10"/>
-              </w:rPr>
-              <w:t>_u7</w:t>
+                <w:sz w:val="9"/>
+                <w:szCs w:val="9"/>
+              </w:rPr>
+              <w:t>_u</w:t>
             </w:r>
             <w:r>
               <w:rPr>
                 <w:rFonts w:ascii="Arial"/>
                 <w:b/>
-                <w:sz w:val="10"/>
+                <w:sz w:val="9"/>
+                <w:szCs w:val="9"/>
+              </w:rPr>
+              <w:t>7</w:t>
+            </w:r>
+            <w:r>
+              <w:rPr>
+                <w:rFonts w:ascii="Arial"/>
+                <w:b/>
+                <w:sz w:val="9"/>
+                <w:szCs w:val="9"/>
               </w:rPr>
               <w:t>}</w:t>
             </w:r>
@@ -5242,14 +5369,16 @@
               <w:rPr>
                 <w:rFonts w:ascii="Arial"/>
                 <w:b/>
-                <w:sz w:val="10"/>
+                <w:sz w:val="9"/>
+                <w:szCs w:val="9"/>
               </w:rPr>
             </w:pPr>
             <w:r>
               <w:rPr>
                 <w:rFonts w:ascii="Arial"/>
                 <w:b/>
-                <w:sz w:val="10"/>
+                <w:sz w:val="9"/>
+                <w:szCs w:val="9"/>
               </w:rPr>
               <w:t>$</w:t>
             </w:r>
@@ -5257,7 +5386,8 @@
               <w:rPr>
                 <w:rFonts w:ascii="Arial"/>
                 <w:b/>
-                <w:sz w:val="10"/>
+                <w:sz w:val="9"/>
+                <w:szCs w:val="9"/>
               </w:rPr>
               <w:t>{</w:t>
             </w:r>
@@ -5265,7 +5395,8 @@
               <w:rPr>
                 <w:rFonts w:ascii="Arial"/>
                 <w:b/>
-                <w:sz w:val="10"/>
+                <w:sz w:val="9"/>
+                <w:szCs w:val="9"/>
                 <w:lang w:val="es-PE"/>
               </w:rPr>
               <w:t>c/h</w:t>
@@ -5274,15 +5405,26 @@
               <w:rPr>
                 <w:rFonts w:ascii="Arial"/>
                 <w:b/>
-                <w:sz w:val="10"/>
-              </w:rPr>
-              <w:t>_u8</w:t>
+                <w:sz w:val="9"/>
+                <w:szCs w:val="9"/>
+              </w:rPr>
+              <w:t>_u</w:t>
             </w:r>
             <w:r>
               <w:rPr>
                 <w:rFonts w:ascii="Arial"/>
                 <w:b/>
-                <w:sz w:val="10"/>
+                <w:sz w:val="9"/>
+                <w:szCs w:val="9"/>
+              </w:rPr>
+              <w:t>8</w:t>
+            </w:r>
+            <w:r>
+              <w:rPr>
+                <w:rFonts w:ascii="Arial"/>
+                <w:b/>
+                <w:sz w:val="9"/>
+                <w:szCs w:val="9"/>
               </w:rPr>
               <w:t>}</w:t>
             </w:r>
@@ -5304,14 +5446,16 @@
               <w:jc w:val="center"/>
               <w:rPr>
                 <w:rFonts w:ascii="Times New Roman"/>
-                <w:sz w:val="10"/>
+                <w:sz w:val="9"/>
+                <w:szCs w:val="9"/>
               </w:rPr>
             </w:pPr>
             <w:r>
               <w:rPr>
                 <w:rFonts w:ascii="Arial"/>
                 <w:b/>
-                <w:sz w:val="10"/>
+                <w:sz w:val="9"/>
+                <w:szCs w:val="9"/>
               </w:rPr>
               <w:t>$</w:t>
             </w:r>
@@ -5319,7 +5463,8 @@
               <w:rPr>
                 <w:rFonts w:ascii="Arial"/>
                 <w:b/>
-                <w:sz w:val="10"/>
+                <w:sz w:val="9"/>
+                <w:szCs w:val="9"/>
               </w:rPr>
               <w:t>{</w:t>
             </w:r>
@@ -5327,7 +5472,8 @@
               <w:rPr>
                 <w:rFonts w:ascii="Arial"/>
                 <w:b/>
-                <w:sz w:val="10"/>
+                <w:sz w:val="9"/>
+                <w:szCs w:val="9"/>
                 <w:lang w:val="es-PE"/>
               </w:rPr>
               <w:t>c/h</w:t>
@@ -5336,15 +5482,26 @@
               <w:rPr>
                 <w:rFonts w:ascii="Arial"/>
                 <w:b/>
-                <w:sz w:val="10"/>
-              </w:rPr>
-              <w:t>_u9</w:t>
+                <w:sz w:val="9"/>
+                <w:szCs w:val="9"/>
+              </w:rPr>
+              <w:t>_u</w:t>
             </w:r>
             <w:r>
               <w:rPr>
                 <w:rFonts w:ascii="Arial"/>
                 <w:b/>
-                <w:sz w:val="10"/>
+                <w:sz w:val="9"/>
+                <w:szCs w:val="9"/>
+              </w:rPr>
+              <w:t>9</w:t>
+            </w:r>
+            <w:r>
+              <w:rPr>
+                <w:rFonts w:ascii="Arial"/>
+                <w:b/>
+                <w:sz w:val="9"/>
+                <w:szCs w:val="9"/>
               </w:rPr>
               <w:t>}</w:t>
             </w:r>
@@ -5366,14 +5523,16 @@
               <w:jc w:val="center"/>
               <w:rPr>
                 <w:rFonts w:ascii="Times New Roman"/>
-                <w:sz w:val="10"/>
+                <w:sz w:val="9"/>
+                <w:szCs w:val="9"/>
               </w:rPr>
             </w:pPr>
             <w:r>
               <w:rPr>
                 <w:rFonts w:ascii="Arial"/>
                 <w:b/>
-                <w:sz w:val="10"/>
+                <w:sz w:val="9"/>
+                <w:szCs w:val="9"/>
               </w:rPr>
               <w:t>$</w:t>
             </w:r>
@@ -5381,7 +5540,8 @@
               <w:rPr>
                 <w:rFonts w:ascii="Arial"/>
                 <w:b/>
-                <w:sz w:val="10"/>
+                <w:sz w:val="9"/>
+                <w:szCs w:val="9"/>
               </w:rPr>
               <w:t>{</w:t>
             </w:r>
@@ -5389,7 +5549,8 @@
               <w:rPr>
                 <w:rFonts w:ascii="Arial"/>
                 <w:b/>
-                <w:sz w:val="10"/>
+                <w:sz w:val="9"/>
+                <w:szCs w:val="9"/>
                 <w:lang w:val="es-PE"/>
               </w:rPr>
               <w:t>c/h</w:t>
@@ -5398,15 +5559,26 @@
               <w:rPr>
                 <w:rFonts w:ascii="Arial"/>
                 <w:b/>
-                <w:sz w:val="10"/>
-              </w:rPr>
-              <w:t>_u10</w:t>
+                <w:sz w:val="9"/>
+                <w:szCs w:val="9"/>
+              </w:rPr>
+              <w:t>_u1</w:t>
             </w:r>
             <w:r>
               <w:rPr>
                 <w:rFonts w:ascii="Arial"/>
                 <w:b/>
-                <w:sz w:val="10"/>
+                <w:sz w:val="9"/>
+                <w:szCs w:val="9"/>
+              </w:rPr>
+              <w:t>0</w:t>
+            </w:r>
+            <w:r>
+              <w:rPr>
+                <w:rFonts w:ascii="Arial"/>
+                <w:b/>
+                <w:sz w:val="9"/>
+                <w:szCs w:val="9"/>
               </w:rPr>
               <w:t>}</w:t>
             </w:r>
@@ -5429,14 +5601,16 @@
               <w:rPr>
                 <w:rFonts w:ascii="Arial"/>
                 <w:b/>
-                <w:sz w:val="10"/>
+                <w:sz w:val="9"/>
+                <w:szCs w:val="9"/>
               </w:rPr>
             </w:pPr>
             <w:r>
               <w:rPr>
                 <w:rFonts w:ascii="Arial"/>
                 <w:b/>
-                <w:sz w:val="10"/>
+                <w:sz w:val="9"/>
+                <w:szCs w:val="9"/>
               </w:rPr>
               <w:t>$</w:t>
             </w:r>
@@ -5444,7 +5618,8 @@
               <w:rPr>
                 <w:rFonts w:ascii="Arial"/>
                 <w:b/>
-                <w:sz w:val="10"/>
+                <w:sz w:val="9"/>
+                <w:szCs w:val="9"/>
               </w:rPr>
               <w:t>{</w:t>
             </w:r>
@@ -5452,7 +5627,8 @@
               <w:rPr>
                 <w:rFonts w:ascii="Arial"/>
                 <w:b/>
-                <w:sz w:val="10"/>
+                <w:sz w:val="9"/>
+                <w:szCs w:val="9"/>
               </w:rPr>
               <w:t>c</w:t>
             </w:r>
@@ -5460,15 +5636,27 @@
               <w:rPr>
                 <w:rFonts w:ascii="Arial"/>
                 <w:b/>
-                <w:sz w:val="10"/>
-              </w:rPr>
-              <w:t>/h</w:t>
-            </w:r>
+                <w:sz w:val="9"/>
+                <w:szCs w:val="9"/>
+              </w:rPr>
+              <w:t>/</w:t>
+            </w:r>
+            <w:proofErr w:type="spellStart"/>
             <w:r>
               <w:rPr>
                 <w:rFonts w:ascii="Arial"/>
                 <w:b/>
-                <w:sz w:val="10"/>
+                <w:sz w:val="9"/>
+                <w:szCs w:val="9"/>
+              </w:rPr>
+              <w:t>h</w:t>
+            </w:r>
+            <w:r>
+              <w:rPr>
+                <w:rFonts w:ascii="Arial"/>
+                <w:b/>
+                <w:sz w:val="9"/>
+                <w:szCs w:val="9"/>
               </w:rPr>
               <w:t>_</w:t>
             </w:r>
@@ -5476,15 +5664,18 @@
               <w:rPr>
                 <w:rFonts w:ascii="Arial"/>
                 <w:b/>
-                <w:sz w:val="10"/>
+                <w:sz w:val="9"/>
+                <w:szCs w:val="9"/>
               </w:rPr>
               <w:t>efsrt</w:t>
             </w:r>
+            <w:proofErr w:type="spellEnd"/>
             <w:r>
               <w:rPr>
                 <w:rFonts w:ascii="Arial"/>
                 <w:b/>
-                <w:sz w:val="10"/>
+                <w:sz w:val="9"/>
+                <w:szCs w:val="9"/>
               </w:rPr>
               <w:t>}</w:t>
             </w:r>
@@ -19191,6 +19382,7 @@
                 <w:sz w:val="10"/>
               </w:rPr>
             </w:pPr>
+            <w:proofErr w:type="spellStart"/>
             <w:r>
               <w:rPr>
                 <w:rFonts w:ascii="Arial" w:hAnsi="Arial"/>
@@ -19200,6 +19392,7 @@
               </w:rPr>
               <w:t>N.°</w:t>
             </w:r>
+            <w:proofErr w:type="spellEnd"/>
           </w:p>
         </w:tc>
         <w:tc>
@@ -20174,7 +20367,21 @@
               <w:rPr>
                 <w:sz w:val="9"/>
               </w:rPr>
-              <w:t>${efsrt}</w:t>
+              <w:t>${</w:t>
+            </w:r>
+            <w:proofErr w:type="spellStart"/>
+            <w:r>
+              <w:rPr>
+                <w:sz w:val="9"/>
+              </w:rPr>
+              <w:t>efsrt</w:t>
+            </w:r>
+            <w:proofErr w:type="spellEnd"/>
+            <w:r>
+              <w:rPr>
+                <w:sz w:val="9"/>
+              </w:rPr>
+              <w:t>}</w:t>
             </w:r>
           </w:p>
         </w:tc>
@@ -20758,14 +20965,16 @@
               <w:rPr>
                 <w:rFonts w:ascii="Arial"/>
                 <w:b/>
-                <w:sz w:val="10"/>
+                <w:sz w:val="9"/>
+                <w:szCs w:val="9"/>
               </w:rPr>
             </w:pPr>
             <w:r>
               <w:rPr>
                 <w:rFonts w:ascii="Arial"/>
                 <w:b/>
-                <w:sz w:val="10"/>
+                <w:sz w:val="9"/>
+                <w:szCs w:val="9"/>
               </w:rPr>
               <w:t>${</w:t>
             </w:r>
@@ -20773,25 +20982,18 @@
               <w:rPr>
                 <w:rFonts w:ascii="Arial"/>
                 <w:b/>
-                <w:sz w:val="10"/>
+                <w:sz w:val="9"/>
+                <w:szCs w:val="9"/>
                 <w:lang w:val="es-PE"/>
               </w:rPr>
-              <w:t>c/h_</w:t>
+              <w:t>c/h_u1</w:t>
             </w:r>
             <w:r>
               <w:rPr>
                 <w:rFonts w:ascii="Arial"/>
                 <w:b/>
-                <w:sz w:val="10"/>
-                <w:lang w:val="es-PE"/>
-              </w:rPr>
-              <w:t>u1</w:t>
-            </w:r>
-            <w:r>
-              <w:rPr>
-                <w:rFonts w:ascii="Arial"/>
-                <w:b/>
-                <w:sz w:val="10"/>
+                <w:sz w:val="9"/>
+                <w:szCs w:val="9"/>
               </w:rPr>
               <w:t>}</w:t>
             </w:r>
@@ -20814,14 +21016,16 @@
               <w:rPr>
                 <w:rFonts w:ascii="Arial"/>
                 <w:b/>
-                <w:sz w:val="10"/>
+                <w:sz w:val="9"/>
+                <w:szCs w:val="9"/>
               </w:rPr>
             </w:pPr>
             <w:r>
               <w:rPr>
                 <w:rFonts w:ascii="Arial"/>
                 <w:b/>
-                <w:sz w:val="10"/>
+                <w:sz w:val="9"/>
+                <w:szCs w:val="9"/>
               </w:rPr>
               <w:t>${</w:t>
             </w:r>
@@ -20829,26 +21033,41 @@
               <w:rPr>
                 <w:rFonts w:ascii="Arial"/>
                 <w:b/>
-                <w:sz w:val="10"/>
+                <w:sz w:val="9"/>
+                <w:szCs w:val="9"/>
                 <w:lang w:val="es-PE"/>
               </w:rPr>
-              <w:t>c/h_</w:t>
-            </w:r>
+              <w:t>c/</w:t>
+            </w:r>
+            <w:proofErr w:type="spellStart"/>
             <w:r>
               <w:rPr>
                 <w:rFonts w:ascii="Arial"/>
                 <w:b/>
-                <w:sz w:val="10"/>
+                <w:sz w:val="9"/>
+                <w:szCs w:val="9"/>
+                <w:lang w:val="es-PE"/>
+              </w:rPr>
+              <w:t>h_</w:t>
+            </w:r>
+            <w:r>
+              <w:rPr>
+                <w:rFonts w:ascii="Arial"/>
+                <w:b/>
+                <w:sz w:val="9"/>
+                <w:szCs w:val="9"/>
                 <w:u w:val="single"/>
                 <w:lang w:val="es-PE"/>
               </w:rPr>
               <w:t>u</w:t>
             </w:r>
+            <w:proofErr w:type="spellEnd"/>
             <w:r>
               <w:rPr>
                 <w:rFonts w:ascii="Arial"/>
                 <w:b/>
-                <w:sz w:val="10"/>
+                <w:sz w:val="9"/>
+                <w:szCs w:val="9"/>
                 <w:u w:val="single"/>
               </w:rPr>
               <w:t>2</w:t>
@@ -20857,7 +21076,8 @@
               <w:rPr>
                 <w:rFonts w:ascii="Arial"/>
                 <w:b/>
-                <w:sz w:val="10"/>
+                <w:sz w:val="9"/>
+                <w:szCs w:val="9"/>
               </w:rPr>
               <w:t>}</w:t>
             </w:r>
@@ -20880,14 +21100,16 @@
               <w:rPr>
                 <w:rFonts w:ascii="Arial"/>
                 <w:b/>
-                <w:sz w:val="10"/>
+                <w:sz w:val="9"/>
+                <w:szCs w:val="9"/>
               </w:rPr>
             </w:pPr>
             <w:r>
               <w:rPr>
                 <w:rFonts w:ascii="Arial"/>
                 <w:b/>
-                <w:sz w:val="10"/>
+                <w:sz w:val="9"/>
+                <w:szCs w:val="9"/>
               </w:rPr>
               <w:t>${</w:t>
             </w:r>
@@ -20895,7 +21117,8 @@
               <w:rPr>
                 <w:rFonts w:ascii="Arial"/>
                 <w:b/>
-                <w:sz w:val="10"/>
+                <w:sz w:val="9"/>
+                <w:szCs w:val="9"/>
                 <w:lang w:val="es-PE"/>
               </w:rPr>
               <w:t>c/h</w:t>
@@ -20904,7 +21127,8 @@
               <w:rPr>
                 <w:rFonts w:ascii="Arial"/>
                 <w:b/>
-                <w:sz w:val="10"/>
+                <w:sz w:val="9"/>
+                <w:szCs w:val="9"/>
               </w:rPr>
               <w:t>_u3}</w:t>
             </w:r>
@@ -20927,14 +21151,16 @@
               <w:rPr>
                 <w:rFonts w:ascii="Arial"/>
                 <w:b/>
-                <w:sz w:val="10"/>
+                <w:sz w:val="9"/>
+                <w:szCs w:val="9"/>
               </w:rPr>
             </w:pPr>
             <w:r>
               <w:rPr>
                 <w:rFonts w:ascii="Arial"/>
                 <w:b/>
-                <w:sz w:val="10"/>
+                <w:sz w:val="9"/>
+                <w:szCs w:val="9"/>
               </w:rPr>
               <w:t>${</w:t>
             </w:r>
@@ -20942,7 +21168,8 @@
               <w:rPr>
                 <w:rFonts w:ascii="Arial"/>
                 <w:b/>
-                <w:sz w:val="10"/>
+                <w:sz w:val="9"/>
+                <w:szCs w:val="9"/>
                 <w:lang w:val="es-PE"/>
               </w:rPr>
               <w:t>c/h</w:t>
@@ -20951,7 +21178,8 @@
               <w:rPr>
                 <w:rFonts w:ascii="Arial"/>
                 <w:b/>
-                <w:sz w:val="10"/>
+                <w:sz w:val="9"/>
+                <w:szCs w:val="9"/>
               </w:rPr>
               <w:t>_u4}</w:t>
             </w:r>
@@ -20974,14 +21202,16 @@
               <w:rPr>
                 <w:rFonts w:ascii="Arial"/>
                 <w:b/>
-                <w:sz w:val="10"/>
+                <w:sz w:val="9"/>
+                <w:szCs w:val="9"/>
               </w:rPr>
             </w:pPr>
             <w:r>
               <w:rPr>
                 <w:rFonts w:ascii="Arial"/>
                 <w:b/>
-                <w:sz w:val="10"/>
+                <w:sz w:val="9"/>
+                <w:szCs w:val="9"/>
               </w:rPr>
               <w:t>${</w:t>
             </w:r>
@@ -20989,7 +21219,8 @@
               <w:rPr>
                 <w:rFonts w:ascii="Arial"/>
                 <w:b/>
-                <w:sz w:val="10"/>
+                <w:sz w:val="9"/>
+                <w:szCs w:val="9"/>
                 <w:lang w:val="es-PE"/>
               </w:rPr>
               <w:t>c/h</w:t>
@@ -20998,7 +21229,8 @@
               <w:rPr>
                 <w:rFonts w:ascii="Arial"/>
                 <w:b/>
-                <w:sz w:val="10"/>
+                <w:sz w:val="9"/>
+                <w:szCs w:val="9"/>
               </w:rPr>
               <w:t>_u5}</w:t>
             </w:r>
@@ -21021,14 +21253,16 @@
               <w:rPr>
                 <w:rFonts w:ascii="Arial"/>
                 <w:b/>
-                <w:sz w:val="10"/>
+                <w:sz w:val="9"/>
+                <w:szCs w:val="9"/>
               </w:rPr>
             </w:pPr>
             <w:r>
               <w:rPr>
                 <w:rFonts w:ascii="Arial"/>
                 <w:b/>
-                <w:sz w:val="10"/>
+                <w:sz w:val="9"/>
+                <w:szCs w:val="9"/>
               </w:rPr>
               <w:t>${</w:t>
             </w:r>
@@ -21036,7 +21270,8 @@
               <w:rPr>
                 <w:rFonts w:ascii="Arial"/>
                 <w:b/>
-                <w:sz w:val="10"/>
+                <w:sz w:val="9"/>
+                <w:szCs w:val="9"/>
                 <w:lang w:val="es-PE"/>
               </w:rPr>
               <w:t>c/h</w:t>
@@ -21045,7 +21280,8 @@
               <w:rPr>
                 <w:rFonts w:ascii="Arial"/>
                 <w:b/>
-                <w:sz w:val="10"/>
+                <w:sz w:val="9"/>
+                <w:szCs w:val="9"/>
               </w:rPr>
               <w:t>_u6}</w:t>
             </w:r>
@@ -21067,14 +21303,16 @@
               <w:ind w:left="63"/>
               <w:rPr>
                 <w:rFonts w:ascii="Times New Roman"/>
-                <w:sz w:val="8"/>
+                <w:sz w:val="9"/>
+                <w:szCs w:val="9"/>
               </w:rPr>
             </w:pPr>
             <w:r>
               <w:rPr>
                 <w:rFonts w:ascii="Arial"/>
                 <w:b/>
-                <w:sz w:val="10"/>
+                <w:sz w:val="9"/>
+                <w:szCs w:val="9"/>
               </w:rPr>
               <w:t>${</w:t>
             </w:r>
@@ -21082,7 +21320,8 @@
               <w:rPr>
                 <w:rFonts w:ascii="Arial"/>
                 <w:b/>
-                <w:sz w:val="10"/>
+                <w:sz w:val="9"/>
+                <w:szCs w:val="9"/>
                 <w:lang w:val="es-PE"/>
               </w:rPr>
               <w:t>c/h</w:t>
@@ -21091,7 +21330,8 @@
               <w:rPr>
                 <w:rFonts w:ascii="Arial"/>
                 <w:b/>
-                <w:sz w:val="10"/>
+                <w:sz w:val="9"/>
+                <w:szCs w:val="9"/>
               </w:rPr>
               <w:t>_u7}</w:t>
             </w:r>
@@ -21114,14 +21354,16 @@
               <w:rPr>
                 <w:rFonts w:ascii="Arial"/>
                 <w:b/>
-                <w:sz w:val="10"/>
+                <w:sz w:val="9"/>
+                <w:szCs w:val="9"/>
               </w:rPr>
             </w:pPr>
             <w:r>
               <w:rPr>
                 <w:rFonts w:ascii="Arial"/>
                 <w:b/>
-                <w:sz w:val="10"/>
+                <w:sz w:val="9"/>
+                <w:szCs w:val="9"/>
               </w:rPr>
               <w:t>${</w:t>
             </w:r>
@@ -21129,7 +21371,8 @@
               <w:rPr>
                 <w:rFonts w:ascii="Arial"/>
                 <w:b/>
-                <w:sz w:val="10"/>
+                <w:sz w:val="9"/>
+                <w:szCs w:val="9"/>
                 <w:lang w:val="es-PE"/>
               </w:rPr>
               <w:t>c/h</w:t>
@@ -21138,7 +21381,8 @@
               <w:rPr>
                 <w:rFonts w:ascii="Arial"/>
                 <w:b/>
-                <w:sz w:val="10"/>
+                <w:sz w:val="9"/>
+                <w:szCs w:val="9"/>
               </w:rPr>
               <w:t>_u8}</w:t>
             </w:r>
@@ -21161,14 +21405,16 @@
               <w:rPr>
                 <w:rFonts w:ascii="Arial"/>
                 <w:b/>
-                <w:sz w:val="10"/>
+                <w:sz w:val="9"/>
+                <w:szCs w:val="9"/>
               </w:rPr>
             </w:pPr>
             <w:r>
               <w:rPr>
                 <w:rFonts w:ascii="Arial"/>
                 <w:b/>
-                <w:sz w:val="10"/>
+                <w:sz w:val="9"/>
+                <w:szCs w:val="9"/>
               </w:rPr>
               <w:t>${</w:t>
             </w:r>
@@ -21176,7 +21422,8 @@
               <w:rPr>
                 <w:rFonts w:ascii="Arial"/>
                 <w:b/>
-                <w:sz w:val="10"/>
+                <w:sz w:val="9"/>
+                <w:szCs w:val="9"/>
                 <w:lang w:val="es-PE"/>
               </w:rPr>
               <w:t>c/h</w:t>
@@ -21185,7 +21432,8 @@
               <w:rPr>
                 <w:rFonts w:ascii="Arial"/>
                 <w:b/>
-                <w:sz w:val="10"/>
+                <w:sz w:val="9"/>
+                <w:szCs w:val="9"/>
               </w:rPr>
               <w:t>_u9}</w:t>
             </w:r>
@@ -21208,14 +21456,16 @@
               <w:rPr>
                 <w:rFonts w:ascii="Arial"/>
                 <w:b/>
-                <w:sz w:val="10"/>
+                <w:sz w:val="9"/>
+                <w:szCs w:val="9"/>
               </w:rPr>
             </w:pPr>
             <w:r>
               <w:rPr>
                 <w:rFonts w:ascii="Arial"/>
                 <w:b/>
-                <w:sz w:val="10"/>
+                <w:sz w:val="9"/>
+                <w:szCs w:val="9"/>
               </w:rPr>
               <w:t>${</w:t>
             </w:r>
@@ -21223,7 +21473,8 @@
               <w:rPr>
                 <w:rFonts w:ascii="Arial"/>
                 <w:b/>
-                <w:sz w:val="10"/>
+                <w:sz w:val="9"/>
+                <w:szCs w:val="9"/>
                 <w:lang w:val="es-PE"/>
               </w:rPr>
               <w:t>c/h</w:t>
@@ -21232,7 +21483,8 @@
               <w:rPr>
                 <w:rFonts w:ascii="Arial"/>
                 <w:b/>
-                <w:sz w:val="10"/>
+                <w:sz w:val="9"/>
+                <w:szCs w:val="9"/>
               </w:rPr>
               <w:t>_u10}</w:t>
             </w:r>
@@ -21255,16 +21507,38 @@
               <w:rPr>
                 <w:rFonts w:ascii="Arial"/>
                 <w:b/>
-                <w:sz w:val="10"/>
+                <w:sz w:val="9"/>
+                <w:szCs w:val="9"/>
               </w:rPr>
             </w:pPr>
             <w:r>
               <w:rPr>
                 <w:rFonts w:ascii="Arial"/>
                 <w:b/>
-                <w:sz w:val="10"/>
-              </w:rPr>
-              <w:t>${c/h_efsrt}</w:t>
+                <w:sz w:val="9"/>
+                <w:szCs w:val="9"/>
+              </w:rPr>
+              <w:t>${c/</w:t>
+            </w:r>
+            <w:proofErr w:type="spellStart"/>
+            <w:r>
+              <w:rPr>
+                <w:rFonts w:ascii="Arial"/>
+                <w:b/>
+                <w:sz w:val="9"/>
+                <w:szCs w:val="9"/>
+              </w:rPr>
+              <w:t>h_efsrt</w:t>
+            </w:r>
+            <w:proofErr w:type="spellEnd"/>
+            <w:r>
+              <w:rPr>
+                <w:rFonts w:ascii="Arial"/>
+                <w:b/>
+                <w:sz w:val="9"/>
+                <w:szCs w:val="9"/>
+              </w:rPr>
+              <w:t>}</w:t>
             </w:r>
           </w:p>
         </w:tc>
@@ -29335,20 +29609,745 @@
                 <w:spacing w:val="-5"/>
                 <w:sz w:val="10"/>
               </w:rPr>
+              <w:t>30</w:t>
+            </w:r>
+          </w:p>
+        </w:tc>
+        <w:tc>
+          <w:tcPr>
+            <w:tcW w:w="1387" w:type="dxa"/>
+            <w:tcBorders>
+              <w:top w:val="single" w:sz="4" w:space="0" w:color="000000"/>
+              <w:left w:val="single" w:sz="4" w:space="0" w:color="000000"/>
+              <w:bottom w:val="single" w:sz="4" w:space="0" w:color="000000"/>
+              <w:right w:val="single" w:sz="4" w:space="0" w:color="000000"/>
+            </w:tcBorders>
+          </w:tcPr>
+          <w:p>
+            <w:pPr>
+              <w:pStyle w:val="TableParagraph"/>
+              <w:jc w:val="center"/>
+              <w:rPr>
+                <w:rFonts w:ascii="Times New Roman"/>
+                <w:sz w:val="8"/>
+              </w:rPr>
+            </w:pPr>
+            <w:r>
+              <w:rPr>
+                <w:rFonts w:ascii="Arial" w:hAnsi="Arial" w:cs="Arial"/>
+                <w:sz w:val="13"/>
+                <w:szCs w:val="13"/>
+              </w:rPr>
+              <w:t>${cod_</w:t>
+            </w:r>
+            <w:r>
+              <w:rPr>
+                <w:rFonts w:ascii="Arial" w:hAnsi="Arial" w:cs="Arial"/>
+                <w:sz w:val="13"/>
+                <w:szCs w:val="13"/>
+              </w:rPr>
+              <w:t>30</w:t>
+            </w:r>
+            <w:r>
+              <w:rPr>
+                <w:rFonts w:ascii="Arial" w:hAnsi="Arial" w:cs="Arial"/>
+                <w:sz w:val="13"/>
+                <w:szCs w:val="13"/>
+              </w:rPr>
+              <w:t>}</w:t>
+            </w:r>
+          </w:p>
+        </w:tc>
+        <w:tc>
+          <w:tcPr>
+            <w:tcW w:w="4922" w:type="dxa"/>
+            <w:tcBorders>
+              <w:top w:val="single" w:sz="4" w:space="0" w:color="000000"/>
+              <w:left w:val="single" w:sz="4" w:space="0" w:color="000000"/>
+              <w:bottom w:val="single" w:sz="4" w:space="0" w:color="000000"/>
+              <w:right w:val="single" w:sz="4" w:space="0" w:color="000000"/>
+            </w:tcBorders>
+          </w:tcPr>
+          <w:p>
+            <w:pPr>
+              <w:pStyle w:val="TableParagraph"/>
+              <w:rPr>
+                <w:rFonts w:ascii="Times New Roman"/>
+                <w:sz w:val="8"/>
+              </w:rPr>
+            </w:pPr>
+            <w:r>
+              <w:rPr>
+                <w:rFonts w:ascii="Arial" w:hAnsi="Arial" w:cs="Arial"/>
+                <w:sz w:val="13"/>
+                <w:szCs w:val="13"/>
+              </w:rPr>
+              <w:t>${nom_</w:t>
+            </w:r>
+            <w:r>
+              <w:rPr>
+                <w:rFonts w:ascii="Arial" w:hAnsi="Arial" w:cs="Arial"/>
+                <w:sz w:val="13"/>
+                <w:szCs w:val="13"/>
+              </w:rPr>
+              <w:t>30</w:t>
+            </w:r>
+            <w:r>
+              <w:rPr>
+                <w:rFonts w:ascii="Arial" w:hAnsi="Arial" w:cs="Arial"/>
+                <w:sz w:val="13"/>
+                <w:szCs w:val="13"/>
+              </w:rPr>
+              <w:t>}</w:t>
+            </w:r>
+          </w:p>
+        </w:tc>
+        <w:tc>
+          <w:tcPr>
+            <w:tcW w:w="400" w:type="dxa"/>
+            <w:tcBorders>
+              <w:top w:val="single" w:sz="4" w:space="0" w:color="000000"/>
+              <w:left w:val="single" w:sz="4" w:space="0" w:color="000000"/>
+              <w:bottom w:val="single" w:sz="4" w:space="0" w:color="000000"/>
+              <w:right w:val="single" w:sz="4" w:space="0" w:color="000000"/>
+            </w:tcBorders>
+          </w:tcPr>
+          <w:p>
+            <w:pPr>
+              <w:pStyle w:val="TableParagraph"/>
+              <w:jc w:val="center"/>
+              <w:rPr>
+                <w:rFonts w:ascii="Arial" w:hAnsi="Arial" w:cs="Arial"/>
+                <w:b/>
+                <w:color w:val="001F60"/>
+                <w:spacing w:val="-5"/>
+                <w:sz w:val="13"/>
+              </w:rPr>
+            </w:pPr>
+            <w:r>
+              <w:rPr>
+                <w:rFonts w:ascii="Arial" w:hAnsi="Arial" w:cs="Arial"/>
+                <w:b/>
+                <w:color w:val="001F60"/>
+                <w:spacing w:val="-5"/>
+                <w:sz w:val="13"/>
+              </w:rPr>
+              <w:t>${u1_</w:t>
+            </w:r>
+            <w:r>
+              <w:rPr>
+                <w:rFonts w:ascii="Arial" w:hAnsi="Arial" w:cs="Arial"/>
+                <w:b/>
+                <w:color w:val="001F60"/>
+                <w:spacing w:val="-5"/>
+                <w:sz w:val="13"/>
+              </w:rPr>
+              <w:t>3</w:t>
+            </w:r>
+            <w:r>
+              <w:rPr>
+                <w:rFonts w:ascii="Arial" w:hAnsi="Arial" w:cs="Arial"/>
+                <w:b/>
+                <w:color w:val="001F60"/>
+                <w:spacing w:val="-5"/>
+                <w:sz w:val="13"/>
+              </w:rPr>
+              <w:lastRenderedPageBreak/>
+              <w:t>0</w:t>
+            </w:r>
+            <w:r>
+              <w:rPr>
+                <w:rFonts w:ascii="Arial" w:hAnsi="Arial" w:cs="Arial"/>
+                <w:b/>
+                <w:color w:val="001F60"/>
+                <w:spacing w:val="-5"/>
+                <w:sz w:val="13"/>
+              </w:rPr>
+              <w:t>}</w:t>
+            </w:r>
+          </w:p>
+        </w:tc>
+        <w:tc>
+          <w:tcPr>
+            <w:tcW w:w="422" w:type="dxa"/>
+            <w:tcBorders>
+              <w:top w:val="single" w:sz="4" w:space="0" w:color="000000"/>
+              <w:left w:val="single" w:sz="4" w:space="0" w:color="000000"/>
+              <w:bottom w:val="single" w:sz="4" w:space="0" w:color="000000"/>
+              <w:right w:val="single" w:sz="4" w:space="0" w:color="000000"/>
+            </w:tcBorders>
+          </w:tcPr>
+          <w:p>
+            <w:pPr>
+              <w:pStyle w:val="TableParagraph"/>
+              <w:jc w:val="center"/>
+              <w:rPr>
+                <w:rFonts w:ascii="Arial" w:hAnsi="Arial" w:cs="Arial"/>
+                <w:b/>
+                <w:color w:val="001F60"/>
+                <w:spacing w:val="-5"/>
+                <w:sz w:val="13"/>
+              </w:rPr>
+            </w:pPr>
+            <w:r>
+              <w:rPr>
+                <w:rFonts w:ascii="Arial" w:hAnsi="Arial" w:cs="Arial"/>
+                <w:b/>
+                <w:color w:val="001F60"/>
+                <w:spacing w:val="-5"/>
+                <w:sz w:val="13"/>
+              </w:rPr>
+              <w:lastRenderedPageBreak/>
+              <w:t>${u2_</w:t>
+            </w:r>
+            <w:r>
+              <w:rPr>
+                <w:rFonts w:ascii="Arial" w:hAnsi="Arial" w:cs="Arial"/>
+                <w:b/>
+                <w:color w:val="001F60"/>
+                <w:spacing w:val="-5"/>
+                <w:sz w:val="13"/>
+              </w:rPr>
+              <w:t>3</w:t>
+            </w:r>
+            <w:r>
+              <w:rPr>
+                <w:rFonts w:ascii="Arial" w:hAnsi="Arial" w:cs="Arial"/>
+                <w:b/>
+                <w:color w:val="001F60"/>
+                <w:spacing w:val="-5"/>
+                <w:sz w:val="13"/>
+              </w:rPr>
+              <w:lastRenderedPageBreak/>
+              <w:t>0</w:t>
+            </w:r>
+            <w:r>
+              <w:rPr>
+                <w:rFonts w:ascii="Arial" w:hAnsi="Arial" w:cs="Arial"/>
+                <w:b/>
+                <w:color w:val="001F60"/>
+                <w:spacing w:val="-5"/>
+                <w:sz w:val="13"/>
+              </w:rPr>
+              <w:t>}</w:t>
+            </w:r>
+          </w:p>
+        </w:tc>
+        <w:tc>
+          <w:tcPr>
+            <w:tcW w:w="348" w:type="dxa"/>
+            <w:tcBorders>
+              <w:top w:val="single" w:sz="4" w:space="0" w:color="000000"/>
+              <w:left w:val="single" w:sz="4" w:space="0" w:color="000000"/>
+              <w:bottom w:val="single" w:sz="4" w:space="0" w:color="000000"/>
+              <w:right w:val="single" w:sz="4" w:space="0" w:color="000000"/>
+            </w:tcBorders>
+          </w:tcPr>
+          <w:p>
+            <w:pPr>
+              <w:pStyle w:val="TableParagraph"/>
+              <w:jc w:val="center"/>
+              <w:rPr>
+                <w:rFonts w:ascii="Arial" w:hAnsi="Arial" w:cs="Arial"/>
+                <w:b/>
+                <w:color w:val="001F60"/>
+                <w:spacing w:val="-5"/>
+                <w:sz w:val="13"/>
+              </w:rPr>
+            </w:pPr>
+            <w:r>
+              <w:rPr>
+                <w:rFonts w:ascii="Arial" w:hAnsi="Arial" w:cs="Arial"/>
+                <w:b/>
+                <w:color w:val="001F60"/>
+                <w:spacing w:val="-5"/>
+                <w:sz w:val="13"/>
+              </w:rPr>
+              <w:lastRenderedPageBreak/>
+              <w:t>${u3_</w:t>
+            </w:r>
+            <w:r>
+              <w:rPr>
+                <w:rFonts w:ascii="Arial" w:hAnsi="Arial" w:cs="Arial"/>
+                <w:b/>
+                <w:color w:val="001F60"/>
+                <w:spacing w:val="-5"/>
+                <w:sz w:val="13"/>
+              </w:rPr>
               <w:lastRenderedPageBreak/>
               <w:t>30</w:t>
             </w:r>
-          </w:p>
-        </w:tc>
-        <w:tc>
-          <w:tcPr>
-            <w:tcW w:w="1387" w:type="dxa"/>
-            <w:tcBorders>
-              <w:top w:val="single" w:sz="4" w:space="0" w:color="000000"/>
-              <w:left w:val="single" w:sz="4" w:space="0" w:color="000000"/>
-              <w:bottom w:val="single" w:sz="4" w:space="0" w:color="000000"/>
-              <w:right w:val="single" w:sz="4" w:space="0" w:color="000000"/>
-            </w:tcBorders>
+            <w:r>
+              <w:rPr>
+                <w:rFonts w:ascii="Arial" w:hAnsi="Arial" w:cs="Arial"/>
+                <w:b/>
+                <w:color w:val="001F60"/>
+                <w:spacing w:val="-5"/>
+                <w:sz w:val="13"/>
+              </w:rPr>
+              <w:t>}</w:t>
+            </w:r>
+          </w:p>
+        </w:tc>
+        <w:tc>
+          <w:tcPr>
+            <w:tcW w:w="348" w:type="dxa"/>
+            <w:tcBorders>
+              <w:top w:val="single" w:sz="4" w:space="0" w:color="000000"/>
+              <w:left w:val="single" w:sz="4" w:space="0" w:color="000000"/>
+              <w:bottom w:val="single" w:sz="4" w:space="0" w:color="000000"/>
+              <w:right w:val="single" w:sz="4" w:space="0" w:color="000000"/>
+            </w:tcBorders>
+          </w:tcPr>
+          <w:p>
+            <w:pPr>
+              <w:pStyle w:val="TableParagraph"/>
+              <w:jc w:val="center"/>
+              <w:rPr>
+                <w:rFonts w:ascii="Arial" w:hAnsi="Arial" w:cs="Arial"/>
+                <w:b/>
+                <w:color w:val="001F60"/>
+                <w:spacing w:val="-5"/>
+                <w:sz w:val="13"/>
+              </w:rPr>
+            </w:pPr>
+            <w:r>
+              <w:rPr>
+                <w:rFonts w:ascii="Arial" w:hAnsi="Arial" w:cs="Arial"/>
+                <w:b/>
+                <w:color w:val="001F60"/>
+                <w:spacing w:val="-5"/>
+                <w:sz w:val="13"/>
+              </w:rPr>
+              <w:lastRenderedPageBreak/>
+              <w:t>${u4_</w:t>
+            </w:r>
+            <w:r>
+              <w:rPr>
+                <w:rFonts w:ascii="Arial" w:hAnsi="Arial" w:cs="Arial"/>
+                <w:b/>
+                <w:color w:val="001F60"/>
+                <w:spacing w:val="-5"/>
+                <w:sz w:val="13"/>
+              </w:rPr>
+              <w:lastRenderedPageBreak/>
+              <w:t>30</w:t>
+            </w:r>
+            <w:r>
+              <w:rPr>
+                <w:rFonts w:ascii="Arial" w:hAnsi="Arial" w:cs="Arial"/>
+                <w:b/>
+                <w:color w:val="001F60"/>
+                <w:spacing w:val="-5"/>
+                <w:sz w:val="13"/>
+              </w:rPr>
+              <w:t>}</w:t>
+            </w:r>
+          </w:p>
+        </w:tc>
+        <w:tc>
+          <w:tcPr>
+            <w:tcW w:w="348" w:type="dxa"/>
+            <w:tcBorders>
+              <w:top w:val="single" w:sz="4" w:space="0" w:color="000000"/>
+              <w:left w:val="single" w:sz="4" w:space="0" w:color="000000"/>
+              <w:bottom w:val="single" w:sz="4" w:space="0" w:color="000000"/>
+              <w:right w:val="single" w:sz="4" w:space="0" w:color="000000"/>
+            </w:tcBorders>
+          </w:tcPr>
+          <w:p>
+            <w:pPr>
+              <w:pStyle w:val="TableParagraph"/>
+              <w:jc w:val="center"/>
+              <w:rPr>
+                <w:rFonts w:ascii="Arial" w:hAnsi="Arial" w:cs="Arial"/>
+                <w:b/>
+                <w:color w:val="001F60"/>
+                <w:spacing w:val="-5"/>
+                <w:sz w:val="13"/>
+              </w:rPr>
+            </w:pPr>
+            <w:r>
+              <w:rPr>
+                <w:rFonts w:ascii="Arial" w:hAnsi="Arial" w:cs="Arial"/>
+                <w:b/>
+                <w:color w:val="001F60"/>
+                <w:spacing w:val="-5"/>
+                <w:sz w:val="13"/>
+              </w:rPr>
+              <w:lastRenderedPageBreak/>
+              <w:t>${u5_</w:t>
+            </w:r>
+            <w:r>
+              <w:rPr>
+                <w:rFonts w:ascii="Arial" w:hAnsi="Arial" w:cs="Arial"/>
+                <w:b/>
+                <w:color w:val="001F60"/>
+                <w:spacing w:val="-5"/>
+                <w:sz w:val="13"/>
+              </w:rPr>
+              <w:lastRenderedPageBreak/>
+              <w:t>30</w:t>
+            </w:r>
+            <w:r>
+              <w:rPr>
+                <w:rFonts w:ascii="Arial" w:hAnsi="Arial" w:cs="Arial"/>
+                <w:b/>
+                <w:color w:val="001F60"/>
+                <w:spacing w:val="-5"/>
+                <w:sz w:val="13"/>
+              </w:rPr>
+              <w:t>}</w:t>
+            </w:r>
+          </w:p>
+        </w:tc>
+        <w:tc>
+          <w:tcPr>
+            <w:tcW w:w="348" w:type="dxa"/>
+            <w:tcBorders>
+              <w:top w:val="single" w:sz="4" w:space="0" w:color="000000"/>
+              <w:left w:val="single" w:sz="4" w:space="0" w:color="000000"/>
+              <w:bottom w:val="single" w:sz="4" w:space="0" w:color="000000"/>
+              <w:right w:val="single" w:sz="4" w:space="0" w:color="000000"/>
+            </w:tcBorders>
+          </w:tcPr>
+          <w:p>
+            <w:pPr>
+              <w:pStyle w:val="TableParagraph"/>
+              <w:jc w:val="center"/>
+              <w:rPr>
+                <w:rFonts w:ascii="Arial" w:hAnsi="Arial" w:cs="Arial"/>
+                <w:b/>
+                <w:color w:val="001F60"/>
+                <w:spacing w:val="-5"/>
+                <w:sz w:val="13"/>
+              </w:rPr>
+            </w:pPr>
+            <w:r>
+              <w:rPr>
+                <w:rFonts w:ascii="Arial" w:hAnsi="Arial" w:cs="Arial"/>
+                <w:b/>
+                <w:color w:val="001F60"/>
+                <w:spacing w:val="-5"/>
+                <w:sz w:val="13"/>
+              </w:rPr>
+              <w:lastRenderedPageBreak/>
+              <w:t>${u6_</w:t>
+            </w:r>
+            <w:r>
+              <w:rPr>
+                <w:rFonts w:ascii="Arial" w:hAnsi="Arial" w:cs="Arial"/>
+                <w:b/>
+                <w:color w:val="001F60"/>
+                <w:spacing w:val="-5"/>
+                <w:sz w:val="13"/>
+              </w:rPr>
+              <w:lastRenderedPageBreak/>
+              <w:t>30</w:t>
+            </w:r>
+            <w:r>
+              <w:rPr>
+                <w:rFonts w:ascii="Arial" w:hAnsi="Arial" w:cs="Arial"/>
+                <w:b/>
+                <w:color w:val="001F60"/>
+                <w:spacing w:val="-5"/>
+                <w:sz w:val="13"/>
+              </w:rPr>
+              <w:t>}</w:t>
+            </w:r>
+          </w:p>
+        </w:tc>
+        <w:tc>
+          <w:tcPr>
+            <w:tcW w:w="348" w:type="dxa"/>
+            <w:tcBorders>
+              <w:top w:val="single" w:sz="4" w:space="0" w:color="000000"/>
+              <w:left w:val="single" w:sz="4" w:space="0" w:color="000000"/>
+              <w:bottom w:val="single" w:sz="4" w:space="0" w:color="000000"/>
+              <w:right w:val="single" w:sz="4" w:space="0" w:color="000000"/>
+            </w:tcBorders>
+          </w:tcPr>
+          <w:p>
+            <w:pPr>
+              <w:pStyle w:val="TableParagraph"/>
+              <w:jc w:val="center"/>
+              <w:rPr>
+                <w:rFonts w:ascii="Arial" w:hAnsi="Arial" w:cs="Arial"/>
+                <w:b/>
+                <w:color w:val="001F60"/>
+                <w:spacing w:val="-5"/>
+                <w:sz w:val="13"/>
+              </w:rPr>
+            </w:pPr>
+            <w:r>
+              <w:rPr>
+                <w:rFonts w:ascii="Arial" w:hAnsi="Arial" w:cs="Arial"/>
+                <w:b/>
+                <w:color w:val="001F60"/>
+                <w:spacing w:val="-5"/>
+                <w:sz w:val="13"/>
+              </w:rPr>
+              <w:lastRenderedPageBreak/>
+              <w:t>${u7_</w:t>
+            </w:r>
+            <w:r>
+              <w:rPr>
+                <w:rFonts w:ascii="Arial" w:hAnsi="Arial" w:cs="Arial"/>
+                <w:b/>
+                <w:color w:val="001F60"/>
+                <w:spacing w:val="-5"/>
+                <w:sz w:val="13"/>
+              </w:rPr>
+              <w:lastRenderedPageBreak/>
+              <w:t>30</w:t>
+            </w:r>
+            <w:r>
+              <w:rPr>
+                <w:rFonts w:ascii="Arial" w:hAnsi="Arial" w:cs="Arial"/>
+                <w:b/>
+                <w:color w:val="001F60"/>
+                <w:spacing w:val="-5"/>
+                <w:sz w:val="13"/>
+              </w:rPr>
+              <w:t>}</w:t>
+            </w:r>
+          </w:p>
+        </w:tc>
+        <w:tc>
+          <w:tcPr>
+            <w:tcW w:w="348" w:type="dxa"/>
+            <w:tcBorders>
+              <w:top w:val="single" w:sz="4" w:space="0" w:color="000000"/>
+              <w:left w:val="single" w:sz="4" w:space="0" w:color="000000"/>
+              <w:bottom w:val="single" w:sz="4" w:space="0" w:color="000000"/>
+              <w:right w:val="single" w:sz="4" w:space="0" w:color="000000"/>
+            </w:tcBorders>
+          </w:tcPr>
+          <w:p>
+            <w:pPr>
+              <w:pStyle w:val="TableParagraph"/>
+              <w:jc w:val="center"/>
+              <w:rPr>
+                <w:rFonts w:ascii="Arial" w:hAnsi="Arial" w:cs="Arial"/>
+                <w:b/>
+                <w:color w:val="001F60"/>
+                <w:spacing w:val="-5"/>
+                <w:sz w:val="13"/>
+              </w:rPr>
+            </w:pPr>
+            <w:r>
+              <w:rPr>
+                <w:rFonts w:ascii="Arial" w:hAnsi="Arial" w:cs="Arial"/>
+                <w:b/>
+                <w:color w:val="001F60"/>
+                <w:spacing w:val="-5"/>
+                <w:sz w:val="13"/>
+              </w:rPr>
+              <w:lastRenderedPageBreak/>
+              <w:t>${u8_</w:t>
+            </w:r>
+            <w:r>
+              <w:rPr>
+                <w:rFonts w:ascii="Arial" w:hAnsi="Arial" w:cs="Arial"/>
+                <w:b/>
+                <w:color w:val="001F60"/>
+                <w:spacing w:val="-5"/>
+                <w:sz w:val="13"/>
+              </w:rPr>
+              <w:lastRenderedPageBreak/>
+              <w:t>30</w:t>
+            </w:r>
+            <w:r>
+              <w:rPr>
+                <w:rFonts w:ascii="Arial" w:hAnsi="Arial" w:cs="Arial"/>
+                <w:b/>
+                <w:color w:val="001F60"/>
+                <w:spacing w:val="-5"/>
+                <w:sz w:val="13"/>
+              </w:rPr>
+              <w:t>}</w:t>
+            </w:r>
+          </w:p>
+        </w:tc>
+        <w:tc>
+          <w:tcPr>
+            <w:tcW w:w="348" w:type="dxa"/>
+            <w:tcBorders>
+              <w:top w:val="single" w:sz="4" w:space="0" w:color="000000"/>
+              <w:left w:val="single" w:sz="4" w:space="0" w:color="000000"/>
+              <w:bottom w:val="single" w:sz="4" w:space="0" w:color="000000"/>
+              <w:right w:val="single" w:sz="4" w:space="0" w:color="000000"/>
+            </w:tcBorders>
+          </w:tcPr>
+          <w:p>
+            <w:pPr>
+              <w:pStyle w:val="TableParagraph"/>
+              <w:jc w:val="center"/>
+              <w:rPr>
+                <w:rFonts w:ascii="Arial" w:hAnsi="Arial" w:cs="Arial"/>
+                <w:b/>
+                <w:color w:val="001F60"/>
+                <w:spacing w:val="-5"/>
+                <w:sz w:val="13"/>
+              </w:rPr>
+            </w:pPr>
+            <w:r>
+              <w:rPr>
+                <w:rFonts w:ascii="Arial" w:hAnsi="Arial" w:cs="Arial"/>
+                <w:b/>
+                <w:color w:val="001F60"/>
+                <w:spacing w:val="-5"/>
+                <w:sz w:val="13"/>
+              </w:rPr>
+              <w:lastRenderedPageBreak/>
+              <w:t>${u9_</w:t>
+            </w:r>
+            <w:r>
+              <w:rPr>
+                <w:rFonts w:ascii="Arial" w:hAnsi="Arial" w:cs="Arial"/>
+                <w:b/>
+                <w:color w:val="001F60"/>
+                <w:spacing w:val="-5"/>
+                <w:sz w:val="13"/>
+              </w:rPr>
+              <w:lastRenderedPageBreak/>
+              <w:t>30</w:t>
+            </w:r>
+            <w:r>
+              <w:rPr>
+                <w:rFonts w:ascii="Arial" w:hAnsi="Arial" w:cs="Arial"/>
+                <w:b/>
+                <w:color w:val="001F60"/>
+                <w:spacing w:val="-5"/>
+                <w:sz w:val="13"/>
+              </w:rPr>
+              <w:t>}</w:t>
+            </w:r>
+          </w:p>
+        </w:tc>
+        <w:tc>
+          <w:tcPr>
+            <w:tcW w:w="348" w:type="dxa"/>
+            <w:tcBorders>
+              <w:top w:val="single" w:sz="4" w:space="0" w:color="000000"/>
+              <w:left w:val="single" w:sz="4" w:space="0" w:color="000000"/>
+              <w:bottom w:val="single" w:sz="4" w:space="0" w:color="000000"/>
+              <w:right w:val="single" w:sz="4" w:space="0" w:color="000000"/>
+            </w:tcBorders>
+          </w:tcPr>
+          <w:p>
+            <w:pPr>
+              <w:pStyle w:val="TableParagraph"/>
+              <w:jc w:val="center"/>
+              <w:rPr>
+                <w:rFonts w:ascii="Arial" w:hAnsi="Arial" w:cs="Arial"/>
+                <w:b/>
+                <w:color w:val="001F60"/>
+                <w:spacing w:val="-5"/>
+                <w:sz w:val="13"/>
+              </w:rPr>
+            </w:pPr>
+            <w:r>
+              <w:rPr>
+                <w:rFonts w:ascii="Arial" w:hAnsi="Arial" w:cs="Arial"/>
+                <w:b/>
+                <w:color w:val="001F60"/>
+                <w:spacing w:val="-5"/>
+                <w:sz w:val="13"/>
+              </w:rPr>
+              <w:lastRenderedPageBreak/>
+              <w:t>${u10</w:t>
+            </w:r>
+            <w:r>
+              <w:rPr>
+                <w:rFonts w:ascii="Arial" w:hAnsi="Arial" w:cs="Arial"/>
+                <w:b/>
+                <w:color w:val="001F60"/>
+                <w:spacing w:val="-5"/>
+                <w:sz w:val="13"/>
+              </w:rPr>
+              <w:lastRenderedPageBreak/>
+              <w:t>_</w:t>
+            </w:r>
+            <w:r>
+              <w:rPr>
+                <w:rFonts w:ascii="Arial" w:hAnsi="Arial" w:cs="Arial"/>
+                <w:b/>
+                <w:color w:val="001F60"/>
+                <w:spacing w:val="-5"/>
+                <w:sz w:val="13"/>
+              </w:rPr>
+              <w:t>30</w:t>
+            </w:r>
+            <w:r>
+              <w:rPr>
+                <w:rFonts w:ascii="Arial" w:hAnsi="Arial" w:cs="Arial"/>
+                <w:b/>
+                <w:color w:val="001F60"/>
+                <w:spacing w:val="-5"/>
+                <w:sz w:val="13"/>
+              </w:rPr>
+              <w:t>}</w:t>
+            </w:r>
+          </w:p>
+        </w:tc>
+        <w:tc>
+          <w:tcPr>
+            <w:tcW w:w="348" w:type="dxa"/>
+            <w:tcBorders>
+              <w:top w:val="single" w:sz="4" w:space="0" w:color="000000"/>
+              <w:left w:val="single" w:sz="4" w:space="0" w:color="000000"/>
+              <w:bottom w:val="single" w:sz="4" w:space="0" w:color="000000"/>
+              <w:right w:val="single" w:sz="4" w:space="0" w:color="000000"/>
+            </w:tcBorders>
+            <w:vAlign w:val="bottom"/>
+          </w:tcPr>
+          <w:p>
+            <w:pPr>
+              <w:pStyle w:val="TableParagraph"/>
+              <w:jc w:val="center"/>
+              <w:rPr>
+                <w:rFonts w:ascii="Arial" w:hAnsi="Arial" w:cs="Arial"/>
+                <w:b/>
+                <w:color w:val="001F60"/>
+                <w:spacing w:val="-5"/>
+                <w:sz w:val="13"/>
+              </w:rPr>
+            </w:pPr>
+            <w:r>
+              <w:rPr>
+                <w:rFonts w:ascii="Arial" w:hAnsi="Arial" w:cs="Arial"/>
+                <w:b/>
+                <w:color w:val="001F60"/>
+                <w:spacing w:val="-5"/>
+                <w:sz w:val="13"/>
+              </w:rPr>
+              <w:lastRenderedPageBreak/>
+              <w:t>${not</w:t>
+            </w:r>
+            <w:r>
+              <w:rPr>
+                <w:rFonts w:ascii="Arial" w:hAnsi="Arial" w:cs="Arial"/>
+                <w:b/>
+                <w:color w:val="001F60"/>
+                <w:spacing w:val="-5"/>
+                <w:sz w:val="13"/>
+              </w:rPr>
+              <w:lastRenderedPageBreak/>
+              <w:t>a_efsrt30}</w:t>
+            </w:r>
+          </w:p>
+        </w:tc>
+        <w:tc>
+          <w:tcPr>
+            <w:tcW w:w="468" w:type="dxa"/>
+            <w:tcBorders>
+              <w:top w:val="single" w:sz="4" w:space="0" w:color="000000"/>
+              <w:left w:val="single" w:sz="4" w:space="0" w:color="000000"/>
+              <w:bottom w:val="single" w:sz="4" w:space="0" w:color="000000"/>
+              <w:right w:val="single" w:sz="4" w:space="0" w:color="000000"/>
+            </w:tcBorders>
+            <w:shd w:val="clear" w:color="auto" w:fill="F2F2F2"/>
           </w:tcPr>
           <w:p>
             <w:pPr>
@@ -29362,24 +30361,42 @@
             <w:r>
               <w:rPr>
                 <w:rFonts w:ascii="Arial" w:hAnsi="Arial" w:cs="Arial"/>
-                <w:sz w:val="13"/>
-                <w:szCs w:val="13"/>
-              </w:rPr>
-              <w:t>${cod_</w:t>
-            </w:r>
-            <w:r>
-              <w:rPr>
-                <w:rFonts w:ascii="Arial" w:hAnsi="Arial" w:cs="Arial"/>
-                <w:sz w:val="13"/>
-                <w:szCs w:val="13"/>
+                <w:b/>
+                <w:color w:val="001F60"/>
+                <w:spacing w:val="-5"/>
+                <w:sz w:val="13"/>
+              </w:rPr>
+              <w:lastRenderedPageBreak/>
+              <w:t>${logro</w:t>
+            </w:r>
+            <w:r>
+              <w:rPr>
+                <w:rFonts w:ascii="Arial" w:hAnsi="Arial" w:cs="Arial"/>
+                <w:b/>
+                <w:color w:val="001F60"/>
+                <w:spacing w:val="-5"/>
+                <w:sz w:val="13"/>
+              </w:rPr>
+              <w:lastRenderedPageBreak/>
+              <w:t>_</w:t>
+            </w:r>
+            <w:r>
+              <w:rPr>
+                <w:rFonts w:ascii="Arial" w:hAnsi="Arial" w:cs="Arial"/>
+                <w:b/>
+                <w:color w:val="001F60"/>
+                <w:spacing w:val="-5"/>
+                <w:sz w:val="13"/>
               </w:rPr>
               <w:t>30</w:t>
             </w:r>
             <w:r>
               <w:rPr>
                 <w:rFonts w:ascii="Arial" w:hAnsi="Arial" w:cs="Arial"/>
-                <w:sz w:val="13"/>
-                <w:szCs w:val="13"/>
+                <w:b/>
+                <w:color w:val="001F60"/>
+                <w:spacing w:val="-5"/>
+                <w:sz w:val="13"/>
               </w:rPr>
               <w:t>}</w:t>
             </w:r>
@@ -29387,17 +30404,18 @@
         </w:tc>
         <w:tc>
           <w:tcPr>
-            <w:tcW w:w="4922" w:type="dxa"/>
-            <w:tcBorders>
-              <w:top w:val="single" w:sz="4" w:space="0" w:color="000000"/>
-              <w:left w:val="single" w:sz="4" w:space="0" w:color="000000"/>
-              <w:bottom w:val="single" w:sz="4" w:space="0" w:color="000000"/>
-              <w:right w:val="single" w:sz="4" w:space="0" w:color="000000"/>
-            </w:tcBorders>
-          </w:tcPr>
-          <w:p>
-            <w:pPr>
-              <w:pStyle w:val="TableParagraph"/>
+            <w:tcW w:w="468" w:type="dxa"/>
+            <w:tcBorders>
+              <w:top w:val="single" w:sz="4" w:space="0" w:color="000000"/>
+              <w:left w:val="single" w:sz="4" w:space="0" w:color="000000"/>
+              <w:bottom w:val="single" w:sz="4" w:space="0" w:color="000000"/>
+              <w:right w:val="single" w:sz="4" w:space="0" w:color="000000"/>
+            </w:tcBorders>
+          </w:tcPr>
+          <w:p>
+            <w:pPr>
+              <w:pStyle w:val="TableParagraph"/>
+              <w:jc w:val="center"/>
               <w:rPr>
                 <w:rFonts w:ascii="Times New Roman"/>
                 <w:sz w:val="8"/>
@@ -29406,24 +30424,34 @@
             <w:r>
               <w:rPr>
                 <w:rFonts w:ascii="Arial" w:hAnsi="Arial" w:cs="Arial"/>
-                <w:sz w:val="13"/>
-                <w:szCs w:val="13"/>
-              </w:rPr>
-              <w:t>${nom_</w:t>
-            </w:r>
-            <w:r>
-              <w:rPr>
-                <w:rFonts w:ascii="Arial" w:hAnsi="Arial" w:cs="Arial"/>
-                <w:sz w:val="13"/>
-                <w:szCs w:val="13"/>
+                <w:spacing w:val="-5"/>
+                <w:sz w:val="13"/>
+              </w:rPr>
+              <w:lastRenderedPageBreak/>
+              <w:t>${aprob</w:t>
+            </w:r>
+            <w:r>
+              <w:rPr>
+                <w:rFonts w:ascii="Arial" w:hAnsi="Arial" w:cs="Arial"/>
+                <w:spacing w:val="-5"/>
+                <w:sz w:val="13"/>
+              </w:rPr>
+              <w:lastRenderedPageBreak/>
+              <w:t>_</w:t>
+            </w:r>
+            <w:r>
+              <w:rPr>
+                <w:rFonts w:ascii="Arial" w:hAnsi="Arial" w:cs="Arial"/>
+                <w:spacing w:val="-5"/>
+                <w:sz w:val="13"/>
               </w:rPr>
               <w:t>30</w:t>
             </w:r>
             <w:r>
               <w:rPr>
                 <w:rFonts w:ascii="Arial" w:hAnsi="Arial" w:cs="Arial"/>
-                <w:sz w:val="13"/>
-                <w:szCs w:val="13"/>
+                <w:spacing w:val="-5"/>
+                <w:sz w:val="13"/>
               </w:rPr>
               <w:t>}</w:t>
             </w:r>
@@ -29431,589 +30459,13 @@
         </w:tc>
         <w:tc>
           <w:tcPr>
-            <w:tcW w:w="400" w:type="dxa"/>
-            <w:tcBorders>
-              <w:top w:val="single" w:sz="4" w:space="0" w:color="000000"/>
-              <w:left w:val="single" w:sz="4" w:space="0" w:color="000000"/>
-              <w:bottom w:val="single" w:sz="4" w:space="0" w:color="000000"/>
-              <w:right w:val="single" w:sz="4" w:space="0" w:color="000000"/>
-            </w:tcBorders>
-          </w:tcPr>
-          <w:p>
-            <w:pPr>
-              <w:pStyle w:val="TableParagraph"/>
-              <w:jc w:val="center"/>
-              <w:rPr>
-                <w:rFonts w:ascii="Arial" w:hAnsi="Arial" w:cs="Arial"/>
-                <w:b/>
-                <w:color w:val="001F60"/>
-                <w:spacing w:val="-5"/>
-                <w:sz w:val="13"/>
-              </w:rPr>
-            </w:pPr>
-            <w:r>
-              <w:rPr>
-                <w:rFonts w:ascii="Arial" w:hAnsi="Arial" w:cs="Arial"/>
-                <w:b/>
-                <w:color w:val="001F60"/>
-                <w:spacing w:val="-5"/>
-                <w:sz w:val="13"/>
-              </w:rPr>
-              <w:t>${u1_</w:t>
-            </w:r>
-            <w:r>
-              <w:rPr>
-                <w:rFonts w:ascii="Arial" w:hAnsi="Arial" w:cs="Arial"/>
-                <w:b/>
-                <w:color w:val="001F60"/>
-                <w:spacing w:val="-5"/>
-                <w:sz w:val="13"/>
-              </w:rPr>
-              <w:t>30</w:t>
-            </w:r>
-            <w:r>
-              <w:rPr>
-                <w:rFonts w:ascii="Arial" w:hAnsi="Arial" w:cs="Arial"/>
-                <w:b/>
-                <w:color w:val="001F60"/>
-                <w:spacing w:val="-5"/>
-                <w:sz w:val="13"/>
-              </w:rPr>
-              <w:t>}</w:t>
-            </w:r>
-          </w:p>
-        </w:tc>
-        <w:tc>
-          <w:tcPr>
-            <w:tcW w:w="422" w:type="dxa"/>
-            <w:tcBorders>
-              <w:top w:val="single" w:sz="4" w:space="0" w:color="000000"/>
-              <w:left w:val="single" w:sz="4" w:space="0" w:color="000000"/>
-              <w:bottom w:val="single" w:sz="4" w:space="0" w:color="000000"/>
-              <w:right w:val="single" w:sz="4" w:space="0" w:color="000000"/>
-            </w:tcBorders>
-          </w:tcPr>
-          <w:p>
-            <w:pPr>
-              <w:pStyle w:val="TableParagraph"/>
-              <w:jc w:val="center"/>
-              <w:rPr>
-                <w:rFonts w:ascii="Arial" w:hAnsi="Arial" w:cs="Arial"/>
-                <w:b/>
-                <w:color w:val="001F60"/>
-                <w:spacing w:val="-5"/>
-                <w:sz w:val="13"/>
-              </w:rPr>
-            </w:pPr>
-            <w:r>
-              <w:rPr>
-                <w:rFonts w:ascii="Arial" w:hAnsi="Arial" w:cs="Arial"/>
-                <w:b/>
-                <w:color w:val="001F60"/>
-                <w:spacing w:val="-5"/>
-                <w:sz w:val="13"/>
-              </w:rPr>
-              <w:t>${u2_</w:t>
-            </w:r>
-            <w:r>
-              <w:rPr>
-                <w:rFonts w:ascii="Arial" w:hAnsi="Arial" w:cs="Arial"/>
-                <w:b/>
-                <w:color w:val="001F60"/>
-                <w:spacing w:val="-5"/>
-                <w:sz w:val="13"/>
-              </w:rPr>
-              <w:t>30</w:t>
-            </w:r>
-            <w:r>
-              <w:rPr>
-                <w:rFonts w:ascii="Arial" w:hAnsi="Arial" w:cs="Arial"/>
-                <w:b/>
-                <w:color w:val="001F60"/>
-                <w:spacing w:val="-5"/>
-                <w:sz w:val="13"/>
-              </w:rPr>
-              <w:t>}</w:t>
-            </w:r>
-          </w:p>
-        </w:tc>
-        <w:tc>
-          <w:tcPr>
-            <w:tcW w:w="348" w:type="dxa"/>
-            <w:tcBorders>
-              <w:top w:val="single" w:sz="4" w:space="0" w:color="000000"/>
-              <w:left w:val="single" w:sz="4" w:space="0" w:color="000000"/>
-              <w:bottom w:val="single" w:sz="4" w:space="0" w:color="000000"/>
-              <w:right w:val="single" w:sz="4" w:space="0" w:color="000000"/>
-            </w:tcBorders>
-          </w:tcPr>
-          <w:p>
-            <w:pPr>
-              <w:pStyle w:val="TableParagraph"/>
-              <w:jc w:val="center"/>
-              <w:rPr>
-                <w:rFonts w:ascii="Arial" w:hAnsi="Arial" w:cs="Arial"/>
-                <w:b/>
-                <w:color w:val="001F60"/>
-                <w:spacing w:val="-5"/>
-                <w:sz w:val="13"/>
-              </w:rPr>
-            </w:pPr>
-            <w:r>
-              <w:rPr>
-                <w:rFonts w:ascii="Arial" w:hAnsi="Arial" w:cs="Arial"/>
-                <w:b/>
-                <w:color w:val="001F60"/>
-                <w:spacing w:val="-5"/>
-                <w:sz w:val="13"/>
-              </w:rPr>
-              <w:t>${u3_</w:t>
-            </w:r>
-            <w:r>
-              <w:rPr>
-                <w:rFonts w:ascii="Arial" w:hAnsi="Arial" w:cs="Arial"/>
-                <w:b/>
-                <w:color w:val="001F60"/>
-                <w:spacing w:val="-5"/>
-                <w:sz w:val="13"/>
-              </w:rPr>
-              <w:t>30</w:t>
-            </w:r>
-            <w:r>
-              <w:rPr>
-                <w:rFonts w:ascii="Arial" w:hAnsi="Arial" w:cs="Arial"/>
-                <w:b/>
-                <w:color w:val="001F60"/>
-                <w:spacing w:val="-5"/>
-                <w:sz w:val="13"/>
-              </w:rPr>
-              <w:t>}</w:t>
-            </w:r>
-          </w:p>
-        </w:tc>
-        <w:tc>
-          <w:tcPr>
-            <w:tcW w:w="348" w:type="dxa"/>
-            <w:tcBorders>
-              <w:top w:val="single" w:sz="4" w:space="0" w:color="000000"/>
-              <w:left w:val="single" w:sz="4" w:space="0" w:color="000000"/>
-              <w:bottom w:val="single" w:sz="4" w:space="0" w:color="000000"/>
-              <w:right w:val="single" w:sz="4" w:space="0" w:color="000000"/>
-            </w:tcBorders>
-          </w:tcPr>
-          <w:p>
-            <w:pPr>
-              <w:pStyle w:val="TableParagraph"/>
-              <w:jc w:val="center"/>
-              <w:rPr>
-                <w:rFonts w:ascii="Arial" w:hAnsi="Arial" w:cs="Arial"/>
-                <w:b/>
-                <w:color w:val="001F60"/>
-                <w:spacing w:val="-5"/>
-                <w:sz w:val="13"/>
-              </w:rPr>
-            </w:pPr>
-            <w:r>
-              <w:rPr>
-                <w:rFonts w:ascii="Arial" w:hAnsi="Arial" w:cs="Arial"/>
-                <w:b/>
-                <w:color w:val="001F60"/>
-                <w:spacing w:val="-5"/>
-                <w:sz w:val="13"/>
-              </w:rPr>
-              <w:t>${u4_</w:t>
-            </w:r>
-            <w:r>
-              <w:rPr>
-                <w:rFonts w:ascii="Arial" w:hAnsi="Arial" w:cs="Arial"/>
-                <w:b/>
-                <w:color w:val="001F60"/>
-                <w:spacing w:val="-5"/>
-                <w:sz w:val="13"/>
-              </w:rPr>
-              <w:t>30</w:t>
-            </w:r>
-            <w:r>
-              <w:rPr>
-                <w:rFonts w:ascii="Arial" w:hAnsi="Arial" w:cs="Arial"/>
-                <w:b/>
-                <w:color w:val="001F60"/>
-                <w:spacing w:val="-5"/>
-                <w:sz w:val="13"/>
-              </w:rPr>
-              <w:t>}</w:t>
-            </w:r>
-          </w:p>
-        </w:tc>
-        <w:tc>
-          <w:tcPr>
-            <w:tcW w:w="348" w:type="dxa"/>
-            <w:tcBorders>
-              <w:top w:val="single" w:sz="4" w:space="0" w:color="000000"/>
-              <w:left w:val="single" w:sz="4" w:space="0" w:color="000000"/>
-              <w:bottom w:val="single" w:sz="4" w:space="0" w:color="000000"/>
-              <w:right w:val="single" w:sz="4" w:space="0" w:color="000000"/>
-            </w:tcBorders>
-          </w:tcPr>
-          <w:p>
-            <w:pPr>
-              <w:pStyle w:val="TableParagraph"/>
-              <w:jc w:val="center"/>
-              <w:rPr>
-                <w:rFonts w:ascii="Arial" w:hAnsi="Arial" w:cs="Arial"/>
-                <w:b/>
-                <w:color w:val="001F60"/>
-                <w:spacing w:val="-5"/>
-                <w:sz w:val="13"/>
-              </w:rPr>
-            </w:pPr>
-            <w:r>
-              <w:rPr>
-                <w:rFonts w:ascii="Arial" w:hAnsi="Arial" w:cs="Arial"/>
-                <w:b/>
-                <w:color w:val="001F60"/>
-                <w:spacing w:val="-5"/>
-                <w:sz w:val="13"/>
-              </w:rPr>
-              <w:t>${u5_</w:t>
-            </w:r>
-            <w:r>
-              <w:rPr>
-                <w:rFonts w:ascii="Arial" w:hAnsi="Arial" w:cs="Arial"/>
-                <w:b/>
-                <w:color w:val="001F60"/>
-                <w:spacing w:val="-5"/>
-                <w:sz w:val="13"/>
-              </w:rPr>
-              <w:t>30</w:t>
-            </w:r>
-            <w:r>
-              <w:rPr>
-                <w:rFonts w:ascii="Arial" w:hAnsi="Arial" w:cs="Arial"/>
-                <w:b/>
-                <w:color w:val="001F60"/>
-                <w:spacing w:val="-5"/>
-                <w:sz w:val="13"/>
-              </w:rPr>
-              <w:t>}</w:t>
-            </w:r>
-          </w:p>
-        </w:tc>
-        <w:tc>
-          <w:tcPr>
-            <w:tcW w:w="348" w:type="dxa"/>
-            <w:tcBorders>
-              <w:top w:val="single" w:sz="4" w:space="0" w:color="000000"/>
-              <w:left w:val="single" w:sz="4" w:space="0" w:color="000000"/>
-              <w:bottom w:val="single" w:sz="4" w:space="0" w:color="000000"/>
-              <w:right w:val="single" w:sz="4" w:space="0" w:color="000000"/>
-            </w:tcBorders>
-          </w:tcPr>
-          <w:p>
-            <w:pPr>
-              <w:pStyle w:val="TableParagraph"/>
-              <w:jc w:val="center"/>
-              <w:rPr>
-                <w:rFonts w:ascii="Arial" w:hAnsi="Arial" w:cs="Arial"/>
-                <w:b/>
-                <w:color w:val="001F60"/>
-                <w:spacing w:val="-5"/>
-                <w:sz w:val="13"/>
-              </w:rPr>
-            </w:pPr>
-            <w:r>
-              <w:rPr>
-                <w:rFonts w:ascii="Arial" w:hAnsi="Arial" w:cs="Arial"/>
-                <w:b/>
-                <w:color w:val="001F60"/>
-                <w:spacing w:val="-5"/>
-                <w:sz w:val="13"/>
-              </w:rPr>
-              <w:t>${u6_</w:t>
-            </w:r>
-            <w:r>
-              <w:rPr>
-                <w:rFonts w:ascii="Arial" w:hAnsi="Arial" w:cs="Arial"/>
-                <w:b/>
-                <w:color w:val="001F60"/>
-                <w:spacing w:val="-5"/>
-                <w:sz w:val="13"/>
-              </w:rPr>
-              <w:t>30</w:t>
-            </w:r>
-            <w:r>
-              <w:rPr>
-                <w:rFonts w:ascii="Arial" w:hAnsi="Arial" w:cs="Arial"/>
-                <w:b/>
-                <w:color w:val="001F60"/>
-                <w:spacing w:val="-5"/>
-                <w:sz w:val="13"/>
-              </w:rPr>
-              <w:t>}</w:t>
-            </w:r>
-          </w:p>
-        </w:tc>
-        <w:tc>
-          <w:tcPr>
-            <w:tcW w:w="348" w:type="dxa"/>
-            <w:tcBorders>
-              <w:top w:val="single" w:sz="4" w:space="0" w:color="000000"/>
-              <w:left w:val="single" w:sz="4" w:space="0" w:color="000000"/>
-              <w:bottom w:val="single" w:sz="4" w:space="0" w:color="000000"/>
-              <w:right w:val="single" w:sz="4" w:space="0" w:color="000000"/>
-            </w:tcBorders>
-          </w:tcPr>
-          <w:p>
-            <w:pPr>
-              <w:pStyle w:val="TableParagraph"/>
-              <w:jc w:val="center"/>
-              <w:rPr>
-                <w:rFonts w:ascii="Arial" w:hAnsi="Arial" w:cs="Arial"/>
-                <w:b/>
-                <w:color w:val="001F60"/>
-                <w:spacing w:val="-5"/>
-                <w:sz w:val="13"/>
-              </w:rPr>
-            </w:pPr>
-            <w:r>
-              <w:rPr>
-                <w:rFonts w:ascii="Arial" w:hAnsi="Arial" w:cs="Arial"/>
-                <w:b/>
-                <w:color w:val="001F60"/>
-                <w:spacing w:val="-5"/>
-                <w:sz w:val="13"/>
-              </w:rPr>
-              <w:t>${u7_</w:t>
-            </w:r>
-            <w:r>
-              <w:rPr>
-                <w:rFonts w:ascii="Arial" w:hAnsi="Arial" w:cs="Arial"/>
-                <w:b/>
-                <w:color w:val="001F60"/>
-                <w:spacing w:val="-5"/>
-                <w:sz w:val="13"/>
-              </w:rPr>
-              <w:t>30</w:t>
-            </w:r>
-            <w:r>
-              <w:rPr>
-                <w:rFonts w:ascii="Arial" w:hAnsi="Arial" w:cs="Arial"/>
-                <w:b/>
-                <w:color w:val="001F60"/>
-                <w:spacing w:val="-5"/>
-                <w:sz w:val="13"/>
-              </w:rPr>
-              <w:t>}</w:t>
-            </w:r>
-          </w:p>
-        </w:tc>
-        <w:tc>
-          <w:tcPr>
-            <w:tcW w:w="348" w:type="dxa"/>
-            <w:tcBorders>
-              <w:top w:val="single" w:sz="4" w:space="0" w:color="000000"/>
-              <w:left w:val="single" w:sz="4" w:space="0" w:color="000000"/>
-              <w:bottom w:val="single" w:sz="4" w:space="0" w:color="000000"/>
-              <w:right w:val="single" w:sz="4" w:space="0" w:color="000000"/>
-            </w:tcBorders>
-          </w:tcPr>
-          <w:p>
-            <w:pPr>
-              <w:pStyle w:val="TableParagraph"/>
-              <w:jc w:val="center"/>
-              <w:rPr>
-                <w:rFonts w:ascii="Arial" w:hAnsi="Arial" w:cs="Arial"/>
-                <w:b/>
-                <w:color w:val="001F60"/>
-                <w:spacing w:val="-5"/>
-                <w:sz w:val="13"/>
-              </w:rPr>
-            </w:pPr>
-            <w:r>
-              <w:rPr>
-                <w:rFonts w:ascii="Arial" w:hAnsi="Arial" w:cs="Arial"/>
-                <w:b/>
-                <w:color w:val="001F60"/>
-                <w:spacing w:val="-5"/>
-                <w:sz w:val="13"/>
-              </w:rPr>
-              <w:t>${u8_</w:t>
-            </w:r>
-            <w:r>
-              <w:rPr>
-                <w:rFonts w:ascii="Arial" w:hAnsi="Arial" w:cs="Arial"/>
-                <w:b/>
-                <w:color w:val="001F60"/>
-                <w:spacing w:val="-5"/>
-                <w:sz w:val="13"/>
-              </w:rPr>
-              <w:t>30</w:t>
-            </w:r>
-            <w:r>
-              <w:rPr>
-                <w:rFonts w:ascii="Arial" w:hAnsi="Arial" w:cs="Arial"/>
-                <w:b/>
-                <w:color w:val="001F60"/>
-                <w:spacing w:val="-5"/>
-                <w:sz w:val="13"/>
-              </w:rPr>
-              <w:t>}</w:t>
-            </w:r>
-          </w:p>
-        </w:tc>
-        <w:tc>
-          <w:tcPr>
-            <w:tcW w:w="348" w:type="dxa"/>
-            <w:tcBorders>
-              <w:top w:val="single" w:sz="4" w:space="0" w:color="000000"/>
-              <w:left w:val="single" w:sz="4" w:space="0" w:color="000000"/>
-              <w:bottom w:val="single" w:sz="4" w:space="0" w:color="000000"/>
-              <w:right w:val="single" w:sz="4" w:space="0" w:color="000000"/>
-            </w:tcBorders>
-          </w:tcPr>
-          <w:p>
-            <w:pPr>
-              <w:pStyle w:val="TableParagraph"/>
-              <w:jc w:val="center"/>
-              <w:rPr>
-                <w:rFonts w:ascii="Arial" w:hAnsi="Arial" w:cs="Arial"/>
-                <w:b/>
-                <w:color w:val="001F60"/>
-                <w:spacing w:val="-5"/>
-                <w:sz w:val="13"/>
-              </w:rPr>
-            </w:pPr>
-            <w:r>
-              <w:rPr>
-                <w:rFonts w:ascii="Arial" w:hAnsi="Arial" w:cs="Arial"/>
-                <w:b/>
-                <w:color w:val="001F60"/>
-                <w:spacing w:val="-5"/>
-                <w:sz w:val="13"/>
-              </w:rPr>
-              <w:t>${u9_</w:t>
-            </w:r>
-            <w:r>
-              <w:rPr>
-                <w:rFonts w:ascii="Arial" w:hAnsi="Arial" w:cs="Arial"/>
-                <w:b/>
-                <w:color w:val="001F60"/>
-                <w:spacing w:val="-5"/>
-                <w:sz w:val="13"/>
-              </w:rPr>
-              <w:t>30</w:t>
-            </w:r>
-            <w:r>
-              <w:rPr>
-                <w:rFonts w:ascii="Arial" w:hAnsi="Arial" w:cs="Arial"/>
-                <w:b/>
-                <w:color w:val="001F60"/>
-                <w:spacing w:val="-5"/>
-                <w:sz w:val="13"/>
-              </w:rPr>
-              <w:t>}</w:t>
-            </w:r>
-          </w:p>
-        </w:tc>
-        <w:tc>
-          <w:tcPr>
-            <w:tcW w:w="348" w:type="dxa"/>
-            <w:tcBorders>
-              <w:top w:val="single" w:sz="4" w:space="0" w:color="000000"/>
-              <w:left w:val="single" w:sz="4" w:space="0" w:color="000000"/>
-              <w:bottom w:val="single" w:sz="4" w:space="0" w:color="000000"/>
-              <w:right w:val="single" w:sz="4" w:space="0" w:color="000000"/>
-            </w:tcBorders>
-          </w:tcPr>
-          <w:p>
-            <w:pPr>
-              <w:pStyle w:val="TableParagraph"/>
-              <w:jc w:val="center"/>
-              <w:rPr>
-                <w:rFonts w:ascii="Arial" w:hAnsi="Arial" w:cs="Arial"/>
-                <w:b/>
-                <w:color w:val="001F60"/>
-                <w:spacing w:val="-5"/>
-                <w:sz w:val="13"/>
-              </w:rPr>
-            </w:pPr>
-            <w:r>
-              <w:rPr>
-                <w:rFonts w:ascii="Arial" w:hAnsi="Arial" w:cs="Arial"/>
-                <w:b/>
-                <w:color w:val="001F60"/>
-                <w:spacing w:val="-5"/>
-                <w:sz w:val="13"/>
-              </w:rPr>
-              <w:t>${u10_</w:t>
-            </w:r>
-            <w:r>
-              <w:rPr>
-                <w:rFonts w:ascii="Arial" w:hAnsi="Arial" w:cs="Arial"/>
-                <w:b/>
-                <w:color w:val="001F60"/>
-                <w:spacing w:val="-5"/>
-                <w:sz w:val="13"/>
-              </w:rPr>
-              <w:t>30</w:t>
-            </w:r>
-            <w:r>
-              <w:rPr>
-                <w:rFonts w:ascii="Arial" w:hAnsi="Arial" w:cs="Arial"/>
-                <w:b/>
-                <w:color w:val="001F60"/>
-                <w:spacing w:val="-5"/>
-                <w:sz w:val="13"/>
-              </w:rPr>
-              <w:t>}</w:t>
-            </w:r>
-          </w:p>
-        </w:tc>
-        <w:tc>
-          <w:tcPr>
-            <w:tcW w:w="348" w:type="dxa"/>
-            <w:tcBorders>
-              <w:top w:val="single" w:sz="4" w:space="0" w:color="000000"/>
-              <w:left w:val="single" w:sz="4" w:space="0" w:color="000000"/>
-              <w:bottom w:val="single" w:sz="4" w:space="0" w:color="000000"/>
-              <w:right w:val="single" w:sz="4" w:space="0" w:color="000000"/>
-            </w:tcBorders>
-            <w:vAlign w:val="bottom"/>
-          </w:tcPr>
-          <w:p>
-            <w:pPr>
-              <w:pStyle w:val="TableParagraph"/>
-              <w:jc w:val="center"/>
-              <w:rPr>
-                <w:rFonts w:ascii="Arial" w:hAnsi="Arial" w:cs="Arial"/>
-                <w:b/>
-                <w:color w:val="001F60"/>
-                <w:spacing w:val="-5"/>
-                <w:sz w:val="13"/>
-              </w:rPr>
-            </w:pPr>
-            <w:r>
-              <w:rPr>
-                <w:rFonts w:ascii="Arial" w:hAnsi="Arial" w:cs="Arial"/>
-                <w:b/>
-                <w:color w:val="001F60"/>
-                <w:spacing w:val="-5"/>
-                <w:sz w:val="13"/>
-              </w:rPr>
-              <w:t>${nota_efsrt30}</w:t>
-            </w:r>
-          </w:p>
-        </w:tc>
-        <w:tc>
-          <w:tcPr>
-            <w:tcW w:w="468" w:type="dxa"/>
-            <w:tcBorders>
-              <w:top w:val="single" w:sz="4" w:space="0" w:color="000000"/>
-              <w:left w:val="single" w:sz="4" w:space="0" w:color="000000"/>
-              <w:bottom w:val="single" w:sz="4" w:space="0" w:color="000000"/>
-              <w:right w:val="single" w:sz="4" w:space="0" w:color="000000"/>
-            </w:tcBorders>
-            <w:shd w:val="clear" w:color="auto" w:fill="F2F2F2"/>
+            <w:tcW w:w="408" w:type="dxa"/>
+            <w:tcBorders>
+              <w:top w:val="single" w:sz="4" w:space="0" w:color="000000"/>
+              <w:left w:val="single" w:sz="4" w:space="0" w:color="000000"/>
+              <w:bottom w:val="single" w:sz="4" w:space="0" w:color="000000"/>
+              <w:right w:val="single" w:sz="4" w:space="0" w:color="000000"/>
+            </w:tcBorders>
           </w:tcPr>
           <w:p>
             <w:pPr>
@@ -30027,18 +30479,24 @@
             <w:r>
               <w:rPr>
                 <w:rFonts w:ascii="Arial" w:hAnsi="Arial" w:cs="Arial"/>
-                <w:b/>
-                <w:color w:val="001F60"/>
-                <w:spacing w:val="-5"/>
-                <w:sz w:val="13"/>
-              </w:rPr>
-              <w:t>${logro_</w:t>
-            </w:r>
-            <w:r>
-              <w:rPr>
-                <w:rFonts w:ascii="Arial" w:hAnsi="Arial" w:cs="Arial"/>
-                <w:b/>
-                <w:color w:val="001F60"/>
+                <w:spacing w:val="-5"/>
+                <w:sz w:val="13"/>
+              </w:rPr>
+              <w:lastRenderedPageBreak/>
+              <w:t>${desa</w:t>
+            </w:r>
+            <w:r>
+              <w:rPr>
+                <w:rFonts w:ascii="Arial" w:hAnsi="Arial" w:cs="Arial"/>
+                <w:spacing w:val="-5"/>
+                <w:sz w:val="13"/>
+              </w:rPr>
+              <w:lastRenderedPageBreak/>
+              <w:t>p_</w:t>
+            </w:r>
+            <w:r>
+              <w:rPr>
+                <w:rFonts w:ascii="Arial" w:hAnsi="Arial" w:cs="Arial"/>
                 <w:spacing w:val="-5"/>
                 <w:sz w:val="13"/>
               </w:rPr>
@@ -30047,8 +30505,6 @@
             <w:r>
               <w:rPr>
                 <w:rFonts w:ascii="Arial" w:hAnsi="Arial" w:cs="Arial"/>
-                <w:b/>
-                <w:color w:val="001F60"/>
                 <w:spacing w:val="-5"/>
                 <w:sz w:val="13"/>
               </w:rPr>
@@ -30058,12 +30514,11 @@
         </w:tc>
         <w:tc>
           <w:tcPr>
-            <w:tcW w:w="468" w:type="dxa"/>
-            <w:tcBorders>
-              <w:top w:val="single" w:sz="4" w:space="0" w:color="000000"/>
-              <w:left w:val="single" w:sz="4" w:space="0" w:color="000000"/>
-              <w:bottom w:val="single" w:sz="4" w:space="0" w:color="000000"/>
-              <w:right w:val="single" w:sz="4" w:space="0" w:color="000000"/>
+            <w:tcW w:w="2598" w:type="dxa"/>
+            <w:tcBorders>
+              <w:top w:val="single" w:sz="4" w:space="0" w:color="000000"/>
+              <w:left w:val="single" w:sz="4" w:space="0" w:color="000000"/>
+              <w:bottom w:val="single" w:sz="4" w:space="0" w:color="000000"/>
             </w:tcBorders>
           </w:tcPr>
           <w:p>
@@ -30081,95 +30536,7 @@
                 <w:spacing w:val="-5"/>
                 <w:sz w:val="13"/>
               </w:rPr>
-              <w:t>${aprob_</w:t>
-            </w:r>
-            <w:r>
-              <w:rPr>
-                <w:rFonts w:ascii="Arial" w:hAnsi="Arial" w:cs="Arial"/>
-                <w:spacing w:val="-5"/>
-                <w:sz w:val="13"/>
-              </w:rPr>
-              <w:t>30</w:t>
-            </w:r>
-            <w:r>
-              <w:rPr>
-                <w:rFonts w:ascii="Arial" w:hAnsi="Arial" w:cs="Arial"/>
-                <w:spacing w:val="-5"/>
-                <w:sz w:val="13"/>
-              </w:rPr>
-              <w:t>}</w:t>
-            </w:r>
-          </w:p>
-        </w:tc>
-        <w:tc>
-          <w:tcPr>
-            <w:tcW w:w="408" w:type="dxa"/>
-            <w:tcBorders>
-              <w:top w:val="single" w:sz="4" w:space="0" w:color="000000"/>
-              <w:left w:val="single" w:sz="4" w:space="0" w:color="000000"/>
-              <w:bottom w:val="single" w:sz="4" w:space="0" w:color="000000"/>
-              <w:right w:val="single" w:sz="4" w:space="0" w:color="000000"/>
-            </w:tcBorders>
-          </w:tcPr>
-          <w:p>
-            <w:pPr>
-              <w:pStyle w:val="TableParagraph"/>
-              <w:jc w:val="center"/>
-              <w:rPr>
-                <w:rFonts w:ascii="Times New Roman"/>
-                <w:sz w:val="8"/>
-              </w:rPr>
-            </w:pPr>
-            <w:r>
-              <w:rPr>
-                <w:rFonts w:ascii="Arial" w:hAnsi="Arial" w:cs="Arial"/>
-                <w:spacing w:val="-5"/>
-                <w:sz w:val="13"/>
-              </w:rPr>
-              <w:t>${desap_</w:t>
-            </w:r>
-            <w:r>
-              <w:rPr>
-                <w:rFonts w:ascii="Arial" w:hAnsi="Arial" w:cs="Arial"/>
-                <w:spacing w:val="-5"/>
-                <w:sz w:val="13"/>
-              </w:rPr>
-              <w:t>30</w:t>
-            </w:r>
-            <w:r>
-              <w:rPr>
-                <w:rFonts w:ascii="Arial" w:hAnsi="Arial" w:cs="Arial"/>
-                <w:spacing w:val="-5"/>
-                <w:sz w:val="13"/>
-              </w:rPr>
-              <w:t>}</w:t>
-            </w:r>
-          </w:p>
-        </w:tc>
-        <w:tc>
-          <w:tcPr>
-            <w:tcW w:w="2598" w:type="dxa"/>
-            <w:tcBorders>
-              <w:top w:val="single" w:sz="4" w:space="0" w:color="000000"/>
-              <w:left w:val="single" w:sz="4" w:space="0" w:color="000000"/>
-              <w:bottom w:val="single" w:sz="4" w:space="0" w:color="000000"/>
-            </w:tcBorders>
-          </w:tcPr>
-          <w:p>
-            <w:pPr>
-              <w:pStyle w:val="TableParagraph"/>
-              <w:jc w:val="center"/>
-              <w:rPr>
-                <w:rFonts w:ascii="Times New Roman"/>
-                <w:sz w:val="8"/>
-              </w:rPr>
-            </w:pPr>
-            <w:r>
-              <w:rPr>
-                <w:rFonts w:ascii="Arial" w:hAnsi="Arial" w:cs="Arial"/>
-                <w:spacing w:val="-5"/>
-                <w:sz w:val="13"/>
-              </w:rPr>
+              <w:lastRenderedPageBreak/>
               <w:t>${obs_</w:t>
             </w:r>
             <w:r>
@@ -39186,16 +39553,16 @@
               <w:ind w:right="-15"/>
               <w:rPr>
                 <w:rFonts w:ascii="Arial" w:hAnsi="Arial" w:cs="Arial"/>
-                <w:sz w:val="10"/>
-                <w:szCs w:val="10"/>
+                <w:sz w:val="9"/>
+                <w:szCs w:val="9"/>
               </w:rPr>
             </w:pPr>
             <w:r>
               <w:rPr>
                 <w:rFonts w:ascii="Arial" w:hAnsi="Arial" w:cs="Arial"/>
                 <w:color w:val="000000"/>
-                <w:sz w:val="10"/>
-                <w:szCs w:val="10"/>
+                <w:sz w:val="9"/>
+                <w:szCs w:val="9"/>
               </w:rPr>
               <w:t>${capacidad_u1}</w:t>
             </w:r>
@@ -39251,16 +39618,16 @@
               <w:spacing w:before="16"/>
               <w:rPr>
                 <w:rFonts w:ascii="Arial" w:hAnsi="Arial" w:cs="Arial"/>
-                <w:sz w:val="10"/>
-                <w:szCs w:val="10"/>
+                <w:sz w:val="9"/>
+                <w:szCs w:val="9"/>
               </w:rPr>
             </w:pPr>
             <w:r>
               <w:rPr>
                 <w:rFonts w:ascii="Arial" w:hAnsi="Arial" w:cs="Arial"/>
                 <w:color w:val="000000"/>
-                <w:sz w:val="10"/>
-                <w:szCs w:val="10"/>
+                <w:sz w:val="9"/>
+                <w:szCs w:val="9"/>
               </w:rPr>
               <w:t>${capacidad_u2}</w:t>
             </w:r>
@@ -39316,16 +39683,16 @@
               <w:spacing w:before="16"/>
               <w:rPr>
                 <w:rFonts w:ascii="Arial" w:hAnsi="Arial" w:cs="Arial"/>
-                <w:sz w:val="10"/>
-                <w:szCs w:val="10"/>
+                <w:sz w:val="9"/>
+                <w:szCs w:val="9"/>
               </w:rPr>
             </w:pPr>
             <w:r>
               <w:rPr>
                 <w:rFonts w:ascii="Arial" w:hAnsi="Arial" w:cs="Arial"/>
                 <w:color w:val="000000"/>
-                <w:sz w:val="10"/>
-                <w:szCs w:val="10"/>
+                <w:sz w:val="9"/>
+                <w:szCs w:val="9"/>
               </w:rPr>
               <w:t>${capacidad_u3}</w:t>
             </w:r>
@@ -39381,16 +39748,16 @@
               <w:spacing w:before="16"/>
               <w:rPr>
                 <w:rFonts w:ascii="Arial" w:hAnsi="Arial" w:cs="Arial"/>
-                <w:sz w:val="10"/>
-                <w:szCs w:val="10"/>
+                <w:sz w:val="9"/>
+                <w:szCs w:val="9"/>
               </w:rPr>
             </w:pPr>
             <w:r>
               <w:rPr>
                 <w:rFonts w:ascii="Arial" w:hAnsi="Arial" w:cs="Arial"/>
                 <w:color w:val="000000"/>
-                <w:sz w:val="10"/>
-                <w:szCs w:val="10"/>
+                <w:sz w:val="9"/>
+                <w:szCs w:val="9"/>
               </w:rPr>
               <w:t>${capacidad_u4}</w:t>
             </w:r>
@@ -39446,16 +39813,16 @@
               <w:spacing w:before="16"/>
               <w:rPr>
                 <w:rFonts w:ascii="Arial" w:hAnsi="Arial" w:cs="Arial"/>
-                <w:sz w:val="10"/>
-                <w:szCs w:val="10"/>
+                <w:sz w:val="9"/>
+                <w:szCs w:val="9"/>
               </w:rPr>
             </w:pPr>
             <w:r>
               <w:rPr>
                 <w:rFonts w:ascii="Arial" w:hAnsi="Arial" w:cs="Arial"/>
                 <w:color w:val="000000"/>
-                <w:sz w:val="10"/>
-                <w:szCs w:val="10"/>
+                <w:sz w:val="9"/>
+                <w:szCs w:val="9"/>
               </w:rPr>
               <w:t>${capacidad_u5}</w:t>
             </w:r>
@@ -39511,16 +39878,16 @@
               <w:spacing w:before="16"/>
               <w:rPr>
                 <w:rFonts w:ascii="Arial" w:hAnsi="Arial" w:cs="Arial"/>
-                <w:sz w:val="10"/>
-                <w:szCs w:val="10"/>
+                <w:sz w:val="9"/>
+                <w:szCs w:val="9"/>
               </w:rPr>
             </w:pPr>
             <w:r>
               <w:rPr>
                 <w:rFonts w:ascii="Arial" w:hAnsi="Arial" w:cs="Arial"/>
                 <w:color w:val="000000"/>
-                <w:sz w:val="10"/>
-                <w:szCs w:val="10"/>
+                <w:sz w:val="9"/>
+                <w:szCs w:val="9"/>
               </w:rPr>
               <w:t>${capacidad_u6}</w:t>
             </w:r>
@@ -39574,19 +39941,18 @@
             <w:pPr>
               <w:pStyle w:val="TableParagraph"/>
               <w:spacing w:before="16"/>
-              <w:ind w:left="27"/>
-              <w:rPr>
-                <w:rFonts w:ascii="Arial" w:hAnsi="Arial" w:cs="Arial"/>
-                <w:sz w:val="10"/>
-                <w:szCs w:val="10"/>
+              <w:rPr>
+                <w:rFonts w:ascii="Arial" w:hAnsi="Arial" w:cs="Arial"/>
+                <w:sz w:val="9"/>
+                <w:szCs w:val="9"/>
               </w:rPr>
             </w:pPr>
             <w:r>
               <w:rPr>
                 <w:rFonts w:ascii="Arial" w:hAnsi="Arial" w:cs="Arial"/>
                 <w:color w:val="000000"/>
-                <w:sz w:val="10"/>
-                <w:szCs w:val="10"/>
+                <w:sz w:val="9"/>
+                <w:szCs w:val="9"/>
               </w:rPr>
               <w:t>${capacidad_u7}</w:t>
             </w:r>
@@ -39640,19 +40006,18 @@
             <w:pPr>
               <w:pStyle w:val="TableParagraph"/>
               <w:spacing w:before="16"/>
-              <w:ind w:left="27"/>
-              <w:rPr>
-                <w:rFonts w:ascii="Arial" w:hAnsi="Arial" w:cs="Arial"/>
-                <w:sz w:val="10"/>
-                <w:szCs w:val="10"/>
+              <w:rPr>
+                <w:rFonts w:ascii="Arial" w:hAnsi="Arial" w:cs="Arial"/>
+                <w:sz w:val="9"/>
+                <w:szCs w:val="9"/>
               </w:rPr>
             </w:pPr>
             <w:r>
               <w:rPr>
                 <w:rFonts w:ascii="Arial" w:hAnsi="Arial" w:cs="Arial"/>
                 <w:color w:val="000000"/>
-                <w:sz w:val="10"/>
-                <w:szCs w:val="10"/>
+                <w:sz w:val="9"/>
+                <w:szCs w:val="9"/>
               </w:rPr>
               <w:t>${capacidad_u8}</w:t>
             </w:r>
@@ -39706,19 +40071,18 @@
             <w:pPr>
               <w:pStyle w:val="TableParagraph"/>
               <w:spacing w:before="16"/>
-              <w:ind w:left="27"/>
-              <w:rPr>
-                <w:rFonts w:ascii="Arial" w:hAnsi="Arial" w:cs="Arial"/>
-                <w:sz w:val="10"/>
-                <w:szCs w:val="10"/>
+              <w:rPr>
+                <w:rFonts w:ascii="Arial" w:hAnsi="Arial" w:cs="Arial"/>
+                <w:sz w:val="9"/>
+                <w:szCs w:val="9"/>
               </w:rPr>
             </w:pPr>
             <w:r>
               <w:rPr>
                 <w:rFonts w:ascii="Arial" w:hAnsi="Arial" w:cs="Arial"/>
                 <w:color w:val="000000"/>
-                <w:sz w:val="10"/>
-                <w:szCs w:val="10"/>
+                <w:sz w:val="9"/>
+                <w:szCs w:val="9"/>
               </w:rPr>
               <w:t>${capacidad_u9}</w:t>
             </w:r>
@@ -39770,19 +40134,18 @@
             <w:pPr>
               <w:pStyle w:val="TableParagraph"/>
               <w:spacing w:before="16"/>
-              <w:ind w:left="27"/>
-              <w:rPr>
-                <w:rFonts w:ascii="Arial" w:hAnsi="Arial" w:cs="Arial"/>
-                <w:sz w:val="10"/>
-                <w:szCs w:val="10"/>
+              <w:rPr>
+                <w:rFonts w:ascii="Arial" w:hAnsi="Arial" w:cs="Arial"/>
+                <w:sz w:val="9"/>
+                <w:szCs w:val="9"/>
               </w:rPr>
             </w:pPr>
             <w:r>
               <w:rPr>
                 <w:rFonts w:ascii="Arial" w:hAnsi="Arial" w:cs="Arial"/>
                 <w:color w:val="000000"/>
-                <w:sz w:val="10"/>
-                <w:szCs w:val="10"/>
+                <w:sz w:val="9"/>
+                <w:szCs w:val="9"/>
               </w:rPr>
               <w:t>${capacidad_u10}</w:t>
             </w:r>
@@ -44585,7 +44948,7 @@
           </mc:Choice>
           <mc:Fallback>
             <w:pict>
-              <v:shape w14:anchorId="3392401A" id="Graphic 5" o:spid="_x0000_s1026" style="position:absolute;margin-left:181.45pt;margin-top:22.6pt;width:99.25pt;height:.85pt;z-index:-15727104;visibility:visible;mso-wrap-style:square;mso-wrap-distance-left:0;mso-wrap-distance-top:0;mso-wrap-distance-right:0;mso-wrap-distance-bottom:0;mso-position-horizontal:absolute;mso-position-horizontal-relative:page;mso-position-vertical:absolute;mso-position-vertical-relative:text;v-text-anchor:top" coordsize="1260475,10795" o:gfxdata="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" path="m1260347,10667l,10667,,,1260347,r,10667xe" fillcolor="black" stroked="f">
+              <v:shape w14:anchorId="3ED5D2A7" id="Graphic 5" o:spid="_x0000_s1026" style="position:absolute;margin-left:181.45pt;margin-top:22.6pt;width:99.25pt;height:.85pt;z-index:-15727104;visibility:visible;mso-wrap-style:square;mso-wrap-distance-left:0;mso-wrap-distance-top:0;mso-wrap-distance-right:0;mso-wrap-distance-bottom:0;mso-position-horizontal:absolute;mso-position-horizontal-relative:page;mso-position-vertical:absolute;mso-position-vertical-relative:text;v-text-anchor:top" coordsize="1260475,10795" o:gfxdata="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" path="m1260347,10667l,10667,,,1260347,r,10667xe" fillcolor="black" stroked="f">
                 <v:path arrowok="t"/>
                 <w10:wrap type="topAndBottom" anchorx="page"/>
               </v:shape>
@@ -44672,7 +45035,7 @@
           </mc:Choice>
           <mc:Fallback>
             <w:pict>
-              <v:shape w14:anchorId="6A72BF2B" id="Graphic 6" o:spid="_x0000_s1026" style="position:absolute;margin-left:440.05pt;margin-top:22.6pt;width:121.95pt;height:.85pt;z-index:-15726592;visibility:visible;mso-wrap-style:square;mso-wrap-distance-left:0;mso-wrap-distance-top:0;mso-wrap-distance-right:0;mso-wrap-distance-bottom:0;mso-position-horizontal:absolute;mso-position-horizontal-relative:page;mso-position-vertical:absolute;mso-position-vertical-relative:text;v-text-anchor:top" coordsize="1548765,10795" o:gfxdata="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" path="m1548384,10667l,10667,,,1548384,r,10667xe" fillcolor="black" stroked="f">
+              <v:shape w14:anchorId="77A274F5" id="Graphic 6" o:spid="_x0000_s1026" style="position:absolute;margin-left:440.05pt;margin-top:22.6pt;width:121.95pt;height:.85pt;z-index:-15726592;visibility:visible;mso-wrap-style:square;mso-wrap-distance-left:0;mso-wrap-distance-top:0;mso-wrap-distance-right:0;mso-wrap-distance-bottom:0;mso-position-horizontal:absolute;mso-position-horizontal-relative:page;mso-position-vertical:absolute;mso-position-vertical-relative:text;v-text-anchor:top" coordsize="1548765,10795" o:gfxdata="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" path="m1548384,10667l,10667,,,1548384,r,10667xe" fillcolor="black" stroked="f">
                 <v:path arrowok="t"/>
                 <w10:wrap type="topAndBottom" anchorx="page"/>
               </v:shape>
@@ -44728,7 +45091,7 @@
 </file>
 
 <file path=word/endnotes.xml><?xml version="1.0" encoding="utf-8"?>
-<w:endnotes xmlns:wpc="http://schemas.microsoft.com/office/word/2010/wordprocessingCanvas" xmlns:cx="http://schemas.microsoft.com/office/drawing/2014/chartex" xmlns:cx1="http://schemas.microsoft.com/office/drawing/2015/9/8/chartex" xmlns:cx2="http://schemas.microsoft.com/office/drawing/2015/10/21/chartex" xmlns:cx3="http://schemas.microsoft.com/office/drawing/2016/5/9/chartex" xmlns:cx4="http://schemas.microsoft.com/office/drawing/2016/5/10/chartex" xmlns:cx5="http://schemas.microsoft.com/office/drawing/2016/5/11/chartex" xmlns:cx6="http://schemas.microsoft.com/office/drawing/2016/5/12/chartex" xmlns:cx7="http://schemas.microsoft.com/office/drawing/2016/5/13/chartex" xmlns:cx8="http://schemas.microsoft.com/office/drawing/2016/5/14/chartex" xmlns:mc="http://schemas.openxmlformats.org/markup-compatibility/2006" xmlns:aink="http://schemas.microsoft.com/office/drawing/2016/ink" xmlns:am3d="http://schemas.microsoft.com/office/drawing/2017/model3d" xmlns:o="urn:schemas-microsoft-com:office:office" xmlns:oel="http://schemas.microsoft.com/office/2019/extlst" xmlns:r="http://schemas.openxmlformats.org/officeDocument/2006/relationships" xmlns:m="http://schemas.openxmlformats.org/officeDocument/2006/math" xmlns:v="urn:schemas-microsoft-com:vml" xmlns:wp14="http://schemas.microsoft.com/office/word/2010/wordprocessingDrawing" xmlns:wp="http://schemas.openxmlformats.org/drawingml/2006/wordprocessingDrawing" xmlns:w10="urn:schemas-microsoft-com:office:word" xmlns:w="http://schemas.openxmlformats.org/wordprocessingml/2006/main" xmlns:w14="http://schemas.microsoft.com/office/word/2010/wordml" xmlns:w15="http://schemas.microsoft.com/office/word/2012/wordml" xmlns:w16cex="http://schemas.microsoft.com/office/word/2018/wordml/cex" xmlns:w16cid="http://schemas.microsoft.com/office/word/2016/wordml/cid" xmlns:w16="http://schemas.microsoft.com/office/word/2018/wordml" xmlns:w16du="http://schemas.microsoft.com/office/word/2023/wordml/word16du" xmlns:w16sdtdh="http://schemas.microsoft.com/office/word/2020/wordml/sdtdatahash" xmlns:w16sdtfl="http://schemas.microsoft.com/office/word/2024/wordml/sdtformatlock" xmlns:w16se="http://schemas.microsoft.com/office/word/2015/wordml/symex" xmlns:wpg="http://schemas.microsoft.com/office/word/2010/wordprocessingGroup" xmlns:wpi="http://schemas.microsoft.com/office/word/2010/wordprocessingInk" xmlns:wne="http://schemas.microsoft.com/office/word/2006/wordml" xmlns:wps="http://schemas.microsoft.com/office/word/2010/wordprocessingShape" mc:Ignorable="w14 w15 w16se w16cid w16 w16cex w16sdtdh w16sdtfl w16du wp14">
+<w:endnotes xmlns:wpc="http://schemas.microsoft.com/office/word/2010/wordprocessingCanvas" xmlns:cx="http://schemas.microsoft.com/office/drawing/2014/chartex" xmlns:cx1="http://schemas.microsoft.com/office/drawing/2015/9/8/chartex" xmlns:cx2="http://schemas.microsoft.com/office/drawing/2015/10/21/chartex" xmlns:cx3="http://schemas.microsoft.com/office/drawing/2016/5/9/chartex" xmlns:cx4="http://schemas.microsoft.com/office/drawing/2016/5/10/chartex" xmlns:cx5="http://schemas.microsoft.com/office/drawing/2016/5/11/chartex" xmlns:cx6="http://schemas.microsoft.com/office/drawing/2016/5/12/chartex" xmlns:cx7="http://schemas.microsoft.com/office/drawing/2016/5/13/chartex" xmlns:cx8="http://schemas.microsoft.com/office/drawing/2016/5/14/chartex" xmlns:mc="http://schemas.openxmlformats.org/markup-compatibility/2006" xmlns:aink="http://schemas.microsoft.com/office/drawing/2016/ink" xmlns:am3d="http://schemas.microsoft.com/office/drawing/2017/model3d" xmlns:o="urn:schemas-microsoft-com:office:office" xmlns:oel="http://schemas.microsoft.com/office/2019/extlst" xmlns:r="http://schemas.openxmlformats.org/officeDocument/2006/relationships" xmlns:m="http://schemas.openxmlformats.org/officeDocument/2006/math" xmlns:v="urn:schemas-microsoft-com:vml" xmlns:wp14="http://schemas.microsoft.com/office/word/2010/wordprocessingDrawing" xmlns:wp="http://schemas.openxmlformats.org/drawingml/2006/wordprocessingDrawing" xmlns:w10="urn:schemas-microsoft-com:office:word" xmlns:w="http://schemas.openxmlformats.org/wordprocessingml/2006/main" xmlns:w14="http://schemas.microsoft.com/office/word/2010/wordml" xmlns:w15="http://schemas.microsoft.com/office/word/2012/wordml" xmlns:w16cex="http://schemas.microsoft.com/office/word/2018/wordml/cex" xmlns:w16cid="http://schemas.microsoft.com/office/word/2016/wordml/cid" xmlns:w16="http://schemas.microsoft.com/office/word/2018/wordml" xmlns:w16sdtdh="http://schemas.microsoft.com/office/word/2020/wordml/sdtdatahash" xmlns:w16se="http://schemas.microsoft.com/office/word/2015/wordml/symex" xmlns:wpg="http://schemas.microsoft.com/office/word/2010/wordprocessingGroup" xmlns:wpi="http://schemas.microsoft.com/office/word/2010/wordprocessingInk" xmlns:wne="http://schemas.microsoft.com/office/word/2006/wordml" xmlns:wps="http://schemas.microsoft.com/office/word/2010/wordprocessingShape" mc:Ignorable="w14 w15 w16se w16cid w16 w16cex w16sdtdh wp14">
   <w:endnote w:type="separator" w:id="-1">
     <w:p>
       <w:r>
@@ -44747,7 +45110,7 @@
 </file>
 
 <file path=word/footnotes.xml><?xml version="1.0" encoding="utf-8"?>
-<w:footnotes xmlns:wpc="http://schemas.microsoft.com/office/word/2010/wordprocessingCanvas" xmlns:cx="http://schemas.microsoft.com/office/drawing/2014/chartex" xmlns:cx1="http://schemas.microsoft.com/office/drawing/2015/9/8/chartex" xmlns:cx2="http://schemas.microsoft.com/office/drawing/2015/10/21/chartex" xmlns:cx3="http://schemas.microsoft.com/office/drawing/2016/5/9/chartex" xmlns:cx4="http://schemas.microsoft.com/office/drawing/2016/5/10/chartex" xmlns:cx5="http://schemas.microsoft.com/office/drawing/2016/5/11/chartex" xmlns:cx6="http://schemas.microsoft.com/office/drawing/2016/5/12/chartex" xmlns:cx7="http://schemas.microsoft.com/office/drawing/2016/5/13/chartex" xmlns:cx8="http://schemas.microsoft.com/office/drawing/2016/5/14/chartex" xmlns:mc="http://schemas.openxmlformats.org/markup-compatibility/2006" xmlns:aink="http://schemas.microsoft.com/office/drawing/2016/ink" xmlns:am3d="http://schemas.microsoft.com/office/drawing/2017/model3d" xmlns:o="urn:schemas-microsoft-com:office:office" xmlns:oel="http://schemas.microsoft.com/office/2019/extlst" xmlns:r="http://schemas.openxmlformats.org/officeDocument/2006/relationships" xmlns:m="http://schemas.openxmlformats.org/officeDocument/2006/math" xmlns:v="urn:schemas-microsoft-com:vml" xmlns:wp14="http://schemas.microsoft.com/office/word/2010/wordprocessingDrawing" xmlns:wp="http://schemas.openxmlformats.org/drawingml/2006/wordprocessingDrawing" xmlns:w10="urn:schemas-microsoft-com:office:word" xmlns:w="http://schemas.openxmlformats.org/wordprocessingml/2006/main" xmlns:w14="http://schemas.microsoft.com/office/word/2010/wordml" xmlns:w15="http://schemas.microsoft.com/office/word/2012/wordml" xmlns:w16cex="http://schemas.microsoft.com/office/word/2018/wordml/cex" xmlns:w16cid="http://schemas.microsoft.com/office/word/2016/wordml/cid" xmlns:w16="http://schemas.microsoft.com/office/word/2018/wordml" xmlns:w16du="http://schemas.microsoft.com/office/word/2023/wordml/word16du" xmlns:w16sdtdh="http://schemas.microsoft.com/office/word/2020/wordml/sdtdatahash" xmlns:w16sdtfl="http://schemas.microsoft.com/office/word/2024/wordml/sdtformatlock" xmlns:w16se="http://schemas.microsoft.com/office/word/2015/wordml/symex" xmlns:wpg="http://schemas.microsoft.com/office/word/2010/wordprocessingGroup" xmlns:wpi="http://schemas.microsoft.com/office/word/2010/wordprocessingInk" xmlns:wne="http://schemas.microsoft.com/office/word/2006/wordml" xmlns:wps="http://schemas.microsoft.com/office/word/2010/wordprocessingShape" mc:Ignorable="w14 w15 w16se w16cid w16 w16cex w16sdtdh w16sdtfl w16du wp14">
+<w:footnotes xmlns:wpc="http://schemas.microsoft.com/office/word/2010/wordprocessingCanvas" xmlns:cx="http://schemas.microsoft.com/office/drawing/2014/chartex" xmlns:cx1="http://schemas.microsoft.com/office/drawing/2015/9/8/chartex" xmlns:cx2="http://schemas.microsoft.com/office/drawing/2015/10/21/chartex" xmlns:cx3="http://schemas.microsoft.com/office/drawing/2016/5/9/chartex" xmlns:cx4="http://schemas.microsoft.com/office/drawing/2016/5/10/chartex" xmlns:cx5="http://schemas.microsoft.com/office/drawing/2016/5/11/chartex" xmlns:cx6="http://schemas.microsoft.com/office/drawing/2016/5/12/chartex" xmlns:cx7="http://schemas.microsoft.com/office/drawing/2016/5/13/chartex" xmlns:cx8="http://schemas.microsoft.com/office/drawing/2016/5/14/chartex" xmlns:mc="http://schemas.openxmlformats.org/markup-compatibility/2006" xmlns:aink="http://schemas.microsoft.com/office/drawing/2016/ink" xmlns:am3d="http://schemas.microsoft.com/office/drawing/2017/model3d" xmlns:o="urn:schemas-microsoft-com:office:office" xmlns:oel="http://schemas.microsoft.com/office/2019/extlst" xmlns:r="http://schemas.openxmlformats.org/officeDocument/2006/relationships" xmlns:m="http://schemas.openxmlformats.org/officeDocument/2006/math" xmlns:v="urn:schemas-microsoft-com:vml" xmlns:wp14="http://schemas.microsoft.com/office/word/2010/wordprocessingDrawing" xmlns:wp="http://schemas.openxmlformats.org/drawingml/2006/wordprocessingDrawing" xmlns:w10="urn:schemas-microsoft-com:office:word" xmlns:w="http://schemas.openxmlformats.org/wordprocessingml/2006/main" xmlns:w14="http://schemas.microsoft.com/office/word/2010/wordml" xmlns:w15="http://schemas.microsoft.com/office/word/2012/wordml" xmlns:w16cex="http://schemas.microsoft.com/office/word/2018/wordml/cex" xmlns:w16cid="http://schemas.microsoft.com/office/word/2016/wordml/cid" xmlns:w16="http://schemas.microsoft.com/office/word/2018/wordml" xmlns:w16sdtdh="http://schemas.microsoft.com/office/word/2020/wordml/sdtdatahash" xmlns:w16se="http://schemas.microsoft.com/office/word/2015/wordml/symex" xmlns:wpg="http://schemas.microsoft.com/office/word/2010/wordprocessingGroup" xmlns:wpi="http://schemas.microsoft.com/office/word/2010/wordprocessingInk" xmlns:wne="http://schemas.microsoft.com/office/word/2006/wordml" xmlns:wps="http://schemas.microsoft.com/office/word/2010/wordprocessingShape" mc:Ignorable="w14 w15 w16se w16cid w16 w16cex w16sdtdh wp14">
   <w:footnote w:type="separator" w:id="-1">
     <w:p>
       <w:r>
@@ -44766,7 +45129,7 @@
 </file>
 
 <file path=word/styles.xml><?xml version="1.0" encoding="utf-8"?>
-<w:styles xmlns:mc="http://schemas.openxmlformats.org/markup-compatibility/2006" xmlns:r="http://schemas.openxmlformats.org/officeDocument/2006/relationships" xmlns:w="http://schemas.openxmlformats.org/wordprocessingml/2006/main" xmlns:w14="http://schemas.microsoft.com/office/word/2010/wordml" xmlns:w15="http://schemas.microsoft.com/office/word/2012/wordml" xmlns:w16cex="http://schemas.microsoft.com/office/word/2018/wordml/cex" xmlns:w16cid="http://schemas.microsoft.com/office/word/2016/wordml/cid" xmlns:w16="http://schemas.microsoft.com/office/word/2018/wordml" xmlns:w16du="http://schemas.microsoft.com/office/word/2023/wordml/word16du" xmlns:w16sdtdh="http://schemas.microsoft.com/office/word/2020/wordml/sdtdatahash" xmlns:w16sdtfl="http://schemas.microsoft.com/office/word/2024/wordml/sdtformatlock" xmlns:w16se="http://schemas.microsoft.com/office/word/2015/wordml/symex" mc:Ignorable="w14 w15 w16se w16cid w16 w16cex w16sdtdh w16sdtfl w16du">
+<w:styles xmlns:mc="http://schemas.openxmlformats.org/markup-compatibility/2006" xmlns:r="http://schemas.openxmlformats.org/officeDocument/2006/relationships" xmlns:w="http://schemas.openxmlformats.org/wordprocessingml/2006/main" xmlns:w14="http://schemas.microsoft.com/office/word/2010/wordml" xmlns:w15="http://schemas.microsoft.com/office/word/2012/wordml" xmlns:w16cex="http://schemas.microsoft.com/office/word/2018/wordml/cex" xmlns:w16cid="http://schemas.microsoft.com/office/word/2016/wordml/cid" xmlns:w16="http://schemas.microsoft.com/office/word/2018/wordml" xmlns:w16sdtdh="http://schemas.microsoft.com/office/word/2020/wordml/sdtdatahash" xmlns:w16se="http://schemas.microsoft.com/office/word/2015/wordml/symex" mc:Ignorable="w14 w15 w16se w16cid w16 w16cex w16sdtdh">
   <w:docDefaults>
     <w:rPrDefault>
       <w:rPr>
@@ -45191,7 +45554,6 @@
   <w:style w:type="character" w:default="1" w:styleId="Fuentedeprrafopredeter">
     <w:name w:val="Default Paragraph Font"/>
     <w:uiPriority w:val="1"/>
-    <w:semiHidden/>
     <w:unhideWhenUsed/>
   </w:style>
   <w:style w:type="table" w:default="1" w:styleId="Tablanormal">

</xml_diff>

<commit_message>
fix: se agrego una tabla unidades_didacticas ugel que sera consumido desde notas y acta de matriculas
</commit_message>
<xml_diff>
--- a/public/plantillas/ACTA.docx
+++ b/public/plantillas/ACTA.docx
@@ -153,7 +153,6 @@
         </w:rPr>
         <w:t>${</w:t>
       </w:r>
-      <w:proofErr w:type="spellStart"/>
       <w:r>
         <w:rPr>
           <w:rFonts w:ascii="Arial" w:hAnsi="Arial"/>
@@ -161,7 +160,6 @@
         </w:rPr>
         <w:t>anio</w:t>
       </w:r>
-      <w:proofErr w:type="spellEnd"/>
       <w:r>
         <w:rPr>
           <w:rFonts w:ascii="Arial" w:hAnsi="Arial"/>
@@ -340,14 +338,12 @@
               </w:rPr>
               <w:t>${</w:t>
             </w:r>
-            <w:proofErr w:type="spellStart"/>
             <w:r>
               <w:rPr>
                 <w:sz w:val="11"/>
               </w:rPr>
               <w:t>cetpro</w:t>
             </w:r>
-            <w:proofErr w:type="spellEnd"/>
             <w:r>
               <w:rPr>
                 <w:sz w:val="11"/>
@@ -910,21 +906,7 @@
               <w:rPr>
                 <w:sz w:val="9"/>
               </w:rPr>
-              <w:t>${</w:t>
-            </w:r>
-            <w:proofErr w:type="spellStart"/>
-            <w:r>
-              <w:rPr>
-                <w:sz w:val="9"/>
-              </w:rPr>
-              <w:t>efsrt</w:t>
-            </w:r>
-            <w:proofErr w:type="spellEnd"/>
-            <w:r>
-              <w:rPr>
-                <w:sz w:val="9"/>
-              </w:rPr>
-              <w:t>}</w:t>
+              <w:t>${efsrt}</w:t>
             </w:r>
           </w:p>
         </w:tc>
@@ -1349,14 +1331,12 @@
               </w:rPr>
               <w:t xml:space="preserve"> </w:t>
             </w:r>
-            <w:proofErr w:type="spellStart"/>
             <w:r>
               <w:rPr>
                 <w:sz w:val="11"/>
               </w:rPr>
               <w:t>Nº</w:t>
             </w:r>
-            <w:proofErr w:type="spellEnd"/>
             <w:r>
               <w:rPr>
                 <w:spacing w:val="2"/>
@@ -1388,19 +1368,11 @@
                 <w:sz w:val="11"/>
               </w:rPr>
             </w:pPr>
-            <w:proofErr w:type="spellStart"/>
             <w:r>
               <w:rPr>
                 <w:sz w:val="11"/>
               </w:rPr>
-              <w:t>Nº</w:t>
-            </w:r>
-            <w:proofErr w:type="spellEnd"/>
-            <w:r>
-              <w:rPr>
-                <w:sz w:val="11"/>
-              </w:rPr>
-              <w:t xml:space="preserve"> </w:t>
+              <w:t xml:space="preserve">Nº </w:t>
             </w:r>
             <w:r>
               <w:rPr>
@@ -1500,19 +1472,11 @@
               </w:rPr>
               <w:t xml:space="preserve"> </w:t>
             </w:r>
-            <w:proofErr w:type="spellStart"/>
             <w:r>
               <w:rPr>
                 <w:sz w:val="10"/>
               </w:rPr>
-              <w:t>N°</w:t>
-            </w:r>
-            <w:proofErr w:type="spellEnd"/>
-            <w:r>
-              <w:rPr>
-                <w:sz w:val="10"/>
-              </w:rPr>
-              <w:t xml:space="preserve"> 06335</w:t>
+              <w:t>N° 06335</w:t>
             </w:r>
             <w:r>
               <w:rPr>
@@ -4320,7 +4284,6 @@
                 <w:sz w:val="9"/>
               </w:rPr>
             </w:pPr>
-            <w:proofErr w:type="spellStart"/>
             <w:r>
               <w:rPr>
                 <w:rFonts w:ascii="Arial" w:hAnsi="Arial"/>
@@ -4330,7 +4293,6 @@
               </w:rPr>
               <w:t>N.°</w:t>
             </w:r>
-            <w:proofErr w:type="spellEnd"/>
           </w:p>
         </w:tc>
         <w:tc>
@@ -4647,14 +4609,12 @@
                 <w:sz w:val="9"/>
               </w:rPr>
             </w:pPr>
-            <w:proofErr w:type="gramStart"/>
             <w:r>
               <w:rPr>
                 <w:sz w:val="9"/>
               </w:rPr>
               <w:t>TOTAL</w:t>
             </w:r>
-            <w:proofErr w:type="gramEnd"/>
             <w:r>
               <w:rPr>
                 <w:spacing w:val="-1"/>
@@ -4716,6 +4676,25 @@
                 <w:sz w:val="11"/>
               </w:rPr>
             </w:pPr>
+            <w:r>
+              <w:rPr>
+                <w:sz w:val="11"/>
+              </w:rPr>
+              <w:t>${</w:t>
+            </w:r>
+            <w:r>
+              <w:rPr>
+                <w:sz w:val="11"/>
+                <w:u w:val="single"/>
+              </w:rPr>
+              <w:t>chtotal</w:t>
+            </w:r>
+            <w:r>
+              <w:rPr>
+                <w:sz w:val="11"/>
+              </w:rPr>
+              <w:t>}</w:t>
+            </w:r>
           </w:p>
         </w:tc>
       </w:tr>
@@ -4903,18 +4882,7 @@
                 <w:szCs w:val="9"/>
                 <w:lang w:val="es-PE"/>
               </w:rPr>
-              <w:t>c/</w:t>
-            </w:r>
-            <w:proofErr w:type="spellStart"/>
-            <w:r>
-              <w:rPr>
-                <w:rFonts w:ascii="Arial"/>
-                <w:b/>
-                <w:sz w:val="9"/>
-                <w:szCs w:val="9"/>
-                <w:lang w:val="es-PE"/>
-              </w:rPr>
-              <w:t>h_</w:t>
+              <w:t>c/h_</w:t>
             </w:r>
             <w:r>
               <w:rPr>
@@ -4927,7 +4895,6 @@
               </w:rPr>
               <w:t>u</w:t>
             </w:r>
-            <w:proofErr w:type="spellEnd"/>
             <w:r>
               <w:rPr>
                 <w:rFonts w:ascii="Arial"/>
@@ -5639,9 +5606,8 @@
                 <w:sz w:val="9"/>
                 <w:szCs w:val="9"/>
               </w:rPr>
-              <w:t>/</w:t>
-            </w:r>
-            <w:proofErr w:type="spellStart"/>
+              <w:t>/h</w:t>
+            </w:r>
             <w:r>
               <w:rPr>
                 <w:rFonts w:ascii="Arial"/>
@@ -5649,7 +5615,7 @@
                 <w:sz w:val="9"/>
                 <w:szCs w:val="9"/>
               </w:rPr>
-              <w:t>h</w:t>
+              <w:t>_</w:t>
             </w:r>
             <w:r>
               <w:rPr>
@@ -5658,18 +5624,8 @@
                 <w:sz w:val="9"/>
                 <w:szCs w:val="9"/>
               </w:rPr>
-              <w:t>_</w:t>
-            </w:r>
-            <w:r>
-              <w:rPr>
-                <w:rFonts w:ascii="Arial"/>
-                <w:b/>
-                <w:sz w:val="9"/>
-                <w:szCs w:val="9"/>
-              </w:rPr>
               <w:t>efsrt</w:t>
             </w:r>
-            <w:proofErr w:type="spellEnd"/>
             <w:r>
               <w:rPr>
                 <w:rFonts w:ascii="Arial"/>
@@ -19382,7 +19338,6 @@
                 <w:sz w:val="10"/>
               </w:rPr>
             </w:pPr>
-            <w:proofErr w:type="spellStart"/>
             <w:r>
               <w:rPr>
                 <w:rFonts w:ascii="Arial" w:hAnsi="Arial"/>
@@ -19392,7 +19347,6 @@
               </w:rPr>
               <w:t>N.°</w:t>
             </w:r>
-            <w:proofErr w:type="spellEnd"/>
           </w:p>
         </w:tc>
         <w:tc>
@@ -20367,21 +20321,7 @@
               <w:rPr>
                 <w:sz w:val="9"/>
               </w:rPr>
-              <w:t>${</w:t>
-            </w:r>
-            <w:proofErr w:type="spellStart"/>
-            <w:r>
-              <w:rPr>
-                <w:sz w:val="9"/>
-              </w:rPr>
-              <w:t>efsrt</w:t>
-            </w:r>
-            <w:proofErr w:type="spellEnd"/>
-            <w:r>
-              <w:rPr>
-                <w:sz w:val="9"/>
-              </w:rPr>
-              <w:t>}</w:t>
+              <w:t>${efsrt}</w:t>
             </w:r>
           </w:p>
         </w:tc>
@@ -21037,18 +20977,7 @@
                 <w:szCs w:val="9"/>
                 <w:lang w:val="es-PE"/>
               </w:rPr>
-              <w:t>c/</w:t>
-            </w:r>
-            <w:proofErr w:type="spellStart"/>
-            <w:r>
-              <w:rPr>
-                <w:rFonts w:ascii="Arial"/>
-                <w:b/>
-                <w:sz w:val="9"/>
-                <w:szCs w:val="9"/>
-                <w:lang w:val="es-PE"/>
-              </w:rPr>
-              <w:t>h_</w:t>
+              <w:t>c/h_</w:t>
             </w:r>
             <w:r>
               <w:rPr>
@@ -21061,7 +20990,6 @@
               </w:rPr>
               <w:t>u</w:t>
             </w:r>
-            <w:proofErr w:type="spellEnd"/>
             <w:r>
               <w:rPr>
                 <w:rFonts w:ascii="Arial"/>
@@ -21518,27 +21446,7 @@
                 <w:sz w:val="9"/>
                 <w:szCs w:val="9"/>
               </w:rPr>
-              <w:t>${c/</w:t>
-            </w:r>
-            <w:proofErr w:type="spellStart"/>
-            <w:r>
-              <w:rPr>
-                <w:rFonts w:ascii="Arial"/>
-                <w:b/>
-                <w:sz w:val="9"/>
-                <w:szCs w:val="9"/>
-              </w:rPr>
-              <w:t>h_efsrt</w:t>
-            </w:r>
-            <w:proofErr w:type="spellEnd"/>
-            <w:r>
-              <w:rPr>
-                <w:rFonts w:ascii="Arial"/>
-                <w:b/>
-                <w:sz w:val="9"/>
-                <w:szCs w:val="9"/>
-              </w:rPr>
-              <w:t>}</w:t>
+              <w:t>${c/h_efsrt}</w:t>
             </w:r>
           </w:p>
         </w:tc>
@@ -39746,6 +39654,7 @@
             <w:pPr>
               <w:pStyle w:val="TableParagraph"/>
               <w:spacing w:before="16"/>
+              <w:ind w:left="720" w:hanging="720"/>
               <w:rPr>
                 <w:rFonts w:ascii="Arial" w:hAnsi="Arial" w:cs="Arial"/>
                 <w:sz w:val="9"/>
@@ -40020,134 +39929,6 @@
                 <w:szCs w:val="9"/>
               </w:rPr>
               <w:t>${capacidad_u8}</w:t>
-            </w:r>
-          </w:p>
-        </w:tc>
-      </w:tr>
-      <w:tr>
-        <w:trPr>
-          <w:trHeight w:val="163"/>
-        </w:trPr>
-        <w:tc>
-          <w:tcPr>
-            <w:tcW w:w="5507" w:type="dxa"/>
-            <w:tcBorders>
-              <w:top w:val="single" w:sz="4" w:space="0" w:color="000000"/>
-              <w:bottom w:val="single" w:sz="4" w:space="0" w:color="000000"/>
-              <w:right w:val="single" w:sz="4" w:space="0" w:color="000000"/>
-            </w:tcBorders>
-          </w:tcPr>
-          <w:p>
-            <w:pPr>
-              <w:pStyle w:val="TableParagraph"/>
-              <w:spacing w:before="16"/>
-              <w:ind w:left="21"/>
-              <w:rPr>
-                <w:rFonts w:ascii="Arial" w:hAnsi="Arial" w:cs="Arial"/>
-                <w:sz w:val="10"/>
-                <w:szCs w:val="10"/>
-              </w:rPr>
-            </w:pPr>
-            <w:r>
-              <w:rPr>
-                <w:rFonts w:ascii="Arial" w:hAnsi="Arial" w:cs="Arial"/>
-                <w:sz w:val="10"/>
-                <w:szCs w:val="10"/>
-              </w:rPr>
-              <w:t>${titulo_u9}</w:t>
-            </w:r>
-          </w:p>
-        </w:tc>
-        <w:tc>
-          <w:tcPr>
-            <w:tcW w:w="9011" w:type="dxa"/>
-            <w:tcBorders>
-              <w:top w:val="single" w:sz="4" w:space="0" w:color="000000"/>
-              <w:left w:val="single" w:sz="4" w:space="0" w:color="000000"/>
-              <w:bottom w:val="single" w:sz="4" w:space="0" w:color="000000"/>
-            </w:tcBorders>
-          </w:tcPr>
-          <w:p>
-            <w:pPr>
-              <w:pStyle w:val="TableParagraph"/>
-              <w:spacing w:before="16"/>
-              <w:rPr>
-                <w:rFonts w:ascii="Arial" w:hAnsi="Arial" w:cs="Arial"/>
-                <w:sz w:val="9"/>
-                <w:szCs w:val="9"/>
-              </w:rPr>
-            </w:pPr>
-            <w:r>
-              <w:rPr>
-                <w:rFonts w:ascii="Arial" w:hAnsi="Arial" w:cs="Arial"/>
-                <w:color w:val="000000"/>
-                <w:sz w:val="9"/>
-                <w:szCs w:val="9"/>
-              </w:rPr>
-              <w:t>${capacidad_u9}</w:t>
-            </w:r>
-          </w:p>
-        </w:tc>
-      </w:tr>
-      <w:tr>
-        <w:trPr>
-          <w:trHeight w:val="163"/>
-        </w:trPr>
-        <w:tc>
-          <w:tcPr>
-            <w:tcW w:w="5507" w:type="dxa"/>
-            <w:tcBorders>
-              <w:top w:val="single" w:sz="4" w:space="0" w:color="000000"/>
-              <w:right w:val="single" w:sz="4" w:space="0" w:color="000000"/>
-            </w:tcBorders>
-          </w:tcPr>
-          <w:p>
-            <w:pPr>
-              <w:pStyle w:val="TableParagraph"/>
-              <w:spacing w:before="16"/>
-              <w:ind w:left="21"/>
-              <w:rPr>
-                <w:rFonts w:ascii="Arial" w:hAnsi="Arial" w:cs="Arial"/>
-                <w:sz w:val="10"/>
-                <w:szCs w:val="10"/>
-              </w:rPr>
-            </w:pPr>
-            <w:r>
-              <w:rPr>
-                <w:rFonts w:ascii="Arial" w:hAnsi="Arial" w:cs="Arial"/>
-                <w:sz w:val="10"/>
-                <w:szCs w:val="10"/>
-              </w:rPr>
-              <w:t>${titulo_u10}</w:t>
-            </w:r>
-          </w:p>
-        </w:tc>
-        <w:tc>
-          <w:tcPr>
-            <w:tcW w:w="9011" w:type="dxa"/>
-            <w:tcBorders>
-              <w:top w:val="single" w:sz="4" w:space="0" w:color="000000"/>
-              <w:left w:val="single" w:sz="4" w:space="0" w:color="000000"/>
-            </w:tcBorders>
-          </w:tcPr>
-          <w:p>
-            <w:pPr>
-              <w:pStyle w:val="TableParagraph"/>
-              <w:spacing w:before="16"/>
-              <w:rPr>
-                <w:rFonts w:ascii="Arial" w:hAnsi="Arial" w:cs="Arial"/>
-                <w:sz w:val="9"/>
-                <w:szCs w:val="9"/>
-              </w:rPr>
-            </w:pPr>
-            <w:r>
-              <w:rPr>
-                <w:rFonts w:ascii="Arial" w:hAnsi="Arial" w:cs="Arial"/>
-                <w:color w:val="000000"/>
-                <w:sz w:val="9"/>
-                <w:szCs w:val="9"/>
-              </w:rPr>
-              <w:t>${capacidad_u10}</w:t>
             </w:r>
           </w:p>
         </w:tc>
@@ -44948,7 +44729,7 @@
           </mc:Choice>
           <mc:Fallback>
             <w:pict>
-              <v:shape w14:anchorId="3ED5D2A7" id="Graphic 5" o:spid="_x0000_s1026" style="position:absolute;margin-left:181.45pt;margin-top:22.6pt;width:99.25pt;height:.85pt;z-index:-15727104;visibility:visible;mso-wrap-style:square;mso-wrap-distance-left:0;mso-wrap-distance-top:0;mso-wrap-distance-right:0;mso-wrap-distance-bottom:0;mso-position-horizontal:absolute;mso-position-horizontal-relative:page;mso-position-vertical:absolute;mso-position-vertical-relative:text;v-text-anchor:top" coordsize="1260475,10795" o:gfxdata="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" path="m1260347,10667l,10667,,,1260347,r,10667xe" fillcolor="black" stroked="f">
+              <v:shape w14:anchorId="4346725C" id="Graphic 5" o:spid="_x0000_s1026" style="position:absolute;margin-left:181.45pt;margin-top:22.6pt;width:99.25pt;height:.85pt;z-index:-15727104;visibility:visible;mso-wrap-style:square;mso-wrap-distance-left:0;mso-wrap-distance-top:0;mso-wrap-distance-right:0;mso-wrap-distance-bottom:0;mso-position-horizontal:absolute;mso-position-horizontal-relative:page;mso-position-vertical:absolute;mso-position-vertical-relative:text;v-text-anchor:top" coordsize="1260475,10795" o:gfxdata="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" path="m1260347,10667l,10667,,,1260347,r,10667xe" fillcolor="black" stroked="f">
                 <v:path arrowok="t"/>
                 <w10:wrap type="topAndBottom" anchorx="page"/>
               </v:shape>
@@ -45035,7 +44816,7 @@
           </mc:Choice>
           <mc:Fallback>
             <w:pict>
-              <v:shape w14:anchorId="77A274F5" id="Graphic 6" o:spid="_x0000_s1026" style="position:absolute;margin-left:440.05pt;margin-top:22.6pt;width:121.95pt;height:.85pt;z-index:-15726592;visibility:visible;mso-wrap-style:square;mso-wrap-distance-left:0;mso-wrap-distance-top:0;mso-wrap-distance-right:0;mso-wrap-distance-bottom:0;mso-position-horizontal:absolute;mso-position-horizontal-relative:page;mso-position-vertical:absolute;mso-position-vertical-relative:text;v-text-anchor:top" coordsize="1548765,10795" o:gfxdata="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" path="m1548384,10667l,10667,,,1548384,r,10667xe" fillcolor="black" stroked="f">
+              <v:shape w14:anchorId="295D68B8" id="Graphic 6" o:spid="_x0000_s1026" style="position:absolute;margin-left:440.05pt;margin-top:22.6pt;width:121.95pt;height:.85pt;z-index:-15726592;visibility:visible;mso-wrap-style:square;mso-wrap-distance-left:0;mso-wrap-distance-top:0;mso-wrap-distance-right:0;mso-wrap-distance-bottom:0;mso-position-horizontal:absolute;mso-position-horizontal-relative:page;mso-position-vertical:absolute;mso-position-vertical-relative:text;v-text-anchor:top" coordsize="1548765,10795" o:gfxdata="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" path="m1548384,10667l,10667,,,1548384,r,10667xe" fillcolor="black" stroked="f">
                 <v:path arrowok="t"/>
                 <w10:wrap type="topAndBottom" anchorx="page"/>
               </v:shape>

</xml_diff>

<commit_message>
fix: se corrigio el problema efsrt que mostraba dos veces las notas
</commit_message>
<xml_diff>
--- a/public/plantillas/ACTA.docx
+++ b/public/plantillas/ACTA.docx
@@ -153,6 +153,7 @@
         </w:rPr>
         <w:t>${</w:t>
       </w:r>
+      <w:proofErr w:type="spellStart"/>
       <w:r>
         <w:rPr>
           <w:rFonts w:ascii="Arial" w:hAnsi="Arial"/>
@@ -160,6 +161,7 @@
         </w:rPr>
         <w:t>anio</w:t>
       </w:r>
+      <w:proofErr w:type="spellEnd"/>
       <w:r>
         <w:rPr>
           <w:rFonts w:ascii="Arial" w:hAnsi="Arial"/>
@@ -338,12 +340,14 @@
               </w:rPr>
               <w:t>${</w:t>
             </w:r>
+            <w:proofErr w:type="spellStart"/>
             <w:r>
               <w:rPr>
                 <w:sz w:val="11"/>
               </w:rPr>
               <w:t>cetpro</w:t>
             </w:r>
+            <w:proofErr w:type="spellEnd"/>
             <w:r>
               <w:rPr>
                 <w:sz w:val="11"/>
@@ -906,7 +910,21 @@
               <w:rPr>
                 <w:sz w:val="9"/>
               </w:rPr>
-              <w:t>${efsrt}</w:t>
+              <w:t>${</w:t>
+            </w:r>
+            <w:proofErr w:type="spellStart"/>
+            <w:r>
+              <w:rPr>
+                <w:sz w:val="9"/>
+              </w:rPr>
+              <w:t>efsrt</w:t>
+            </w:r>
+            <w:proofErr w:type="spellEnd"/>
+            <w:r>
+              <w:rPr>
+                <w:sz w:val="9"/>
+              </w:rPr>
+              <w:t>}</w:t>
             </w:r>
           </w:p>
         </w:tc>
@@ -1331,12 +1349,14 @@
               </w:rPr>
               <w:t xml:space="preserve"> </w:t>
             </w:r>
+            <w:proofErr w:type="spellStart"/>
             <w:r>
               <w:rPr>
                 <w:sz w:val="11"/>
               </w:rPr>
               <w:t>Nº</w:t>
             </w:r>
+            <w:proofErr w:type="spellEnd"/>
             <w:r>
               <w:rPr>
                 <w:spacing w:val="2"/>
@@ -1368,11 +1388,19 @@
                 <w:sz w:val="11"/>
               </w:rPr>
             </w:pPr>
+            <w:proofErr w:type="spellStart"/>
             <w:r>
               <w:rPr>
                 <w:sz w:val="11"/>
               </w:rPr>
-              <w:t xml:space="preserve">Nº </w:t>
+              <w:t>Nº</w:t>
+            </w:r>
+            <w:proofErr w:type="spellEnd"/>
+            <w:r>
+              <w:rPr>
+                <w:sz w:val="11"/>
+              </w:rPr>
+              <w:t xml:space="preserve"> </w:t>
             </w:r>
             <w:r>
               <w:rPr>
@@ -1472,11 +1500,19 @@
               </w:rPr>
               <w:t xml:space="preserve"> </w:t>
             </w:r>
+            <w:proofErr w:type="spellStart"/>
             <w:r>
               <w:rPr>
                 <w:sz w:val="10"/>
               </w:rPr>
-              <w:t>N° 06335</w:t>
+              <w:t>N°</w:t>
+            </w:r>
+            <w:proofErr w:type="spellEnd"/>
+            <w:r>
+              <w:rPr>
+                <w:sz w:val="10"/>
+              </w:rPr>
+              <w:t xml:space="preserve"> 06335</w:t>
             </w:r>
             <w:r>
               <w:rPr>
@@ -4284,6 +4320,7 @@
                 <w:sz w:val="9"/>
               </w:rPr>
             </w:pPr>
+            <w:proofErr w:type="spellStart"/>
             <w:r>
               <w:rPr>
                 <w:rFonts w:ascii="Arial" w:hAnsi="Arial"/>
@@ -4293,6 +4330,7 @@
               </w:rPr>
               <w:t>N.°</w:t>
             </w:r>
+            <w:proofErr w:type="spellEnd"/>
           </w:p>
         </w:tc>
         <w:tc>
@@ -4609,12 +4647,14 @@
                 <w:sz w:val="9"/>
               </w:rPr>
             </w:pPr>
+            <w:proofErr w:type="gramStart"/>
             <w:r>
               <w:rPr>
                 <w:sz w:val="9"/>
               </w:rPr>
               <w:t>TOTAL</w:t>
             </w:r>
+            <w:proofErr w:type="gramEnd"/>
             <w:r>
               <w:rPr>
                 <w:spacing w:val="-1"/>
@@ -4682,6 +4722,7 @@
               </w:rPr>
               <w:t>${</w:t>
             </w:r>
+            <w:proofErr w:type="spellStart"/>
             <w:r>
               <w:rPr>
                 <w:sz w:val="11"/>
@@ -4689,6 +4730,7 @@
               </w:rPr>
               <w:t>chtotal</w:t>
             </w:r>
+            <w:proofErr w:type="spellEnd"/>
             <w:r>
               <w:rPr>
                 <w:sz w:val="11"/>
@@ -4882,7 +4924,18 @@
                 <w:szCs w:val="9"/>
                 <w:lang w:val="es-PE"/>
               </w:rPr>
-              <w:t>c/h_</w:t>
+              <w:t>c/</w:t>
+            </w:r>
+            <w:proofErr w:type="spellStart"/>
+            <w:r>
+              <w:rPr>
+                <w:rFonts w:ascii="Arial"/>
+                <w:b/>
+                <w:sz w:val="9"/>
+                <w:szCs w:val="9"/>
+                <w:lang w:val="es-PE"/>
+              </w:rPr>
+              <w:t>h_</w:t>
             </w:r>
             <w:r>
               <w:rPr>
@@ -4895,6 +4948,7 @@
               </w:rPr>
               <w:t>u</w:t>
             </w:r>
+            <w:proofErr w:type="spellEnd"/>
             <w:r>
               <w:rPr>
                 <w:rFonts w:ascii="Arial"/>
@@ -5606,8 +5660,9 @@
                 <w:sz w:val="9"/>
                 <w:szCs w:val="9"/>
               </w:rPr>
-              <w:t>/h</w:t>
-            </w:r>
+              <w:t>/</w:t>
+            </w:r>
+            <w:proofErr w:type="spellStart"/>
             <w:r>
               <w:rPr>
                 <w:rFonts w:ascii="Arial"/>
@@ -5615,7 +5670,7 @@
                 <w:sz w:val="9"/>
                 <w:szCs w:val="9"/>
               </w:rPr>
-              <w:t>_</w:t>
+              <w:t>h</w:t>
             </w:r>
             <w:r>
               <w:rPr>
@@ -5624,8 +5679,18 @@
                 <w:sz w:val="9"/>
                 <w:szCs w:val="9"/>
               </w:rPr>
+              <w:t>_</w:t>
+            </w:r>
+            <w:r>
+              <w:rPr>
+                <w:rFonts w:ascii="Arial"/>
+                <w:b/>
+                <w:sz w:val="9"/>
+                <w:szCs w:val="9"/>
+              </w:rPr>
               <w:t>efsrt</w:t>
             </w:r>
+            <w:proofErr w:type="spellEnd"/>
             <w:r>
               <w:rPr>
                 <w:rFonts w:ascii="Arial"/>
@@ -19338,6 +19403,7 @@
                 <w:sz w:val="10"/>
               </w:rPr>
             </w:pPr>
+            <w:proofErr w:type="spellStart"/>
             <w:r>
               <w:rPr>
                 <w:rFonts w:ascii="Arial" w:hAnsi="Arial"/>
@@ -19347,6 +19413,7 @@
               </w:rPr>
               <w:t>N.°</w:t>
             </w:r>
+            <w:proofErr w:type="spellEnd"/>
           </w:p>
         </w:tc>
         <w:tc>
@@ -20321,7 +20388,21 @@
               <w:rPr>
                 <w:sz w:val="9"/>
               </w:rPr>
-              <w:t>${efsrt}</w:t>
+              <w:t>${</w:t>
+            </w:r>
+            <w:proofErr w:type="spellStart"/>
+            <w:r>
+              <w:rPr>
+                <w:sz w:val="9"/>
+              </w:rPr>
+              <w:t>efsrt</w:t>
+            </w:r>
+            <w:proofErr w:type="spellEnd"/>
+            <w:r>
+              <w:rPr>
+                <w:sz w:val="9"/>
+              </w:rPr>
+              <w:t>}</w:t>
             </w:r>
           </w:p>
         </w:tc>
@@ -20977,7 +21058,18 @@
                 <w:szCs w:val="9"/>
                 <w:lang w:val="es-PE"/>
               </w:rPr>
-              <w:t>c/h_</w:t>
+              <w:t>c/</w:t>
+            </w:r>
+            <w:proofErr w:type="spellStart"/>
+            <w:r>
+              <w:rPr>
+                <w:rFonts w:ascii="Arial"/>
+                <w:b/>
+                <w:sz w:val="9"/>
+                <w:szCs w:val="9"/>
+                <w:lang w:val="es-PE"/>
+              </w:rPr>
+              <w:t>h_</w:t>
             </w:r>
             <w:r>
               <w:rPr>
@@ -20990,6 +21082,7 @@
               </w:rPr>
               <w:t>u</w:t>
             </w:r>
+            <w:proofErr w:type="spellEnd"/>
             <w:r>
               <w:rPr>
                 <w:rFonts w:ascii="Arial"/>
@@ -21446,7 +21539,27 @@
                 <w:sz w:val="9"/>
                 <w:szCs w:val="9"/>
               </w:rPr>
-              <w:t>${c/h_efsrt}</w:t>
+              <w:t>${c/</w:t>
+            </w:r>
+            <w:proofErr w:type="spellStart"/>
+            <w:r>
+              <w:rPr>
+                <w:rFonts w:ascii="Arial"/>
+                <w:b/>
+                <w:sz w:val="9"/>
+                <w:szCs w:val="9"/>
+              </w:rPr>
+              <w:t>h_efsrt</w:t>
+            </w:r>
+            <w:proofErr w:type="spellEnd"/>
+            <w:r>
+              <w:rPr>
+                <w:rFonts w:ascii="Arial"/>
+                <w:b/>
+                <w:sz w:val="9"/>
+                <w:szCs w:val="9"/>
+              </w:rPr>
+              <w:t>}</w:t>
             </w:r>
           </w:p>
         </w:tc>
@@ -39591,6 +39704,7 @@
               <w:spacing w:before="16"/>
               <w:rPr>
                 <w:rFonts w:ascii="Arial" w:hAnsi="Arial" w:cs="Arial"/>
+                <w:color w:val="000000"/>
                 <w:sz w:val="9"/>
                 <w:szCs w:val="9"/>
               </w:rPr>
@@ -39654,7 +39768,6 @@
             <w:pPr>
               <w:pStyle w:val="TableParagraph"/>
               <w:spacing w:before="16"/>
-              <w:ind w:left="720" w:hanging="720"/>
               <w:rPr>
                 <w:rFonts w:ascii="Arial" w:hAnsi="Arial" w:cs="Arial"/>
                 <w:sz w:val="9"/>
@@ -44729,7 +44842,7 @@
           </mc:Choice>
           <mc:Fallback>
             <w:pict>
-              <v:shape w14:anchorId="4346725C" id="Graphic 5" o:spid="_x0000_s1026" style="position:absolute;margin-left:181.45pt;margin-top:22.6pt;width:99.25pt;height:.85pt;z-index:-15727104;visibility:visible;mso-wrap-style:square;mso-wrap-distance-left:0;mso-wrap-distance-top:0;mso-wrap-distance-right:0;mso-wrap-distance-bottom:0;mso-position-horizontal:absolute;mso-position-horizontal-relative:page;mso-position-vertical:absolute;mso-position-vertical-relative:text;v-text-anchor:top" coordsize="1260475,10795" o:gfxdata="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" path="m1260347,10667l,10667,,,1260347,r,10667xe" fillcolor="black" stroked="f">
+              <v:shape w14:anchorId="7AE5E065" id="Graphic 5" o:spid="_x0000_s1026" style="position:absolute;margin-left:181.45pt;margin-top:22.6pt;width:99.25pt;height:.85pt;z-index:-15727104;visibility:visible;mso-wrap-style:square;mso-wrap-distance-left:0;mso-wrap-distance-top:0;mso-wrap-distance-right:0;mso-wrap-distance-bottom:0;mso-position-horizontal:absolute;mso-position-horizontal-relative:page;mso-position-vertical:absolute;mso-position-vertical-relative:text;v-text-anchor:top" coordsize="1260475,10795" o:gfxdata="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" path="m1260347,10667l,10667,,,1260347,r,10667xe" fillcolor="black" stroked="f">
                 <v:path arrowok="t"/>
                 <w10:wrap type="topAndBottom" anchorx="page"/>
               </v:shape>
@@ -44816,7 +44929,7 @@
           </mc:Choice>
           <mc:Fallback>
             <w:pict>
-              <v:shape w14:anchorId="295D68B8" id="Graphic 6" o:spid="_x0000_s1026" style="position:absolute;margin-left:440.05pt;margin-top:22.6pt;width:121.95pt;height:.85pt;z-index:-15726592;visibility:visible;mso-wrap-style:square;mso-wrap-distance-left:0;mso-wrap-distance-top:0;mso-wrap-distance-right:0;mso-wrap-distance-bottom:0;mso-position-horizontal:absolute;mso-position-horizontal-relative:page;mso-position-vertical:absolute;mso-position-vertical-relative:text;v-text-anchor:top" coordsize="1548765,10795" o:gfxdata="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" path="m1548384,10667l,10667,,,1548384,r,10667xe" fillcolor="black" stroked="f">
+              <v:shape w14:anchorId="23665B90" id="Graphic 6" o:spid="_x0000_s1026" style="position:absolute;margin-left:440.05pt;margin-top:22.6pt;width:121.95pt;height:.85pt;z-index:-15726592;visibility:visible;mso-wrap-style:square;mso-wrap-distance-left:0;mso-wrap-distance-top:0;mso-wrap-distance-right:0;mso-wrap-distance-bottom:0;mso-position-horizontal:absolute;mso-position-horizontal-relative:page;mso-position-vertical:absolute;mso-position-vertical-relative:text;v-text-anchor:top" coordsize="1548765,10795" o:gfxdata="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" path="m1548384,10667l,10667,,,1548384,r,10667xe" fillcolor="black" stroked="f">
                 <v:path arrowok="t"/>
                 <w10:wrap type="topAndBottom" anchorx="page"/>
               </v:shape>

</xml_diff>